<commit_message>
Gewichtmessung auf 20 mal wiederholt - Kleine anpassungen bei distanz - DOKU mit Tiefenkamera Bilder
</commit_message>
<xml_diff>
--- a/D_Documentation/Doku-Felix.docx
+++ b/D_Documentation/Doku-Felix.docx
@@ -5208,8 +5208,17 @@
           <w:color w:val="0066FF"/>
           <w:szCs w:val="28"/>
         </w:rPr>
-        <w:t>Text (FV = Text): ….</w:t>
-      </w:r>
+        <w:t>Text (FV = Text):</w:t>
+      </w:r>
+      <w:proofErr w:type="gramStart"/>
+      <w:r>
+        <w:rPr>
+          <w:color w:val="0066FF"/>
+          <w:szCs w:val="28"/>
+        </w:rPr>
+        <w:t xml:space="preserve"> ….</w:t>
+      </w:r>
+      <w:proofErr w:type="gramEnd"/>
     </w:p>
     <w:p>
       <w:pPr>
@@ -5360,7 +5369,14 @@
         <w:rPr>
           <w:color w:val="0066FF"/>
         </w:rPr>
-        <w:t xml:space="preserve">(FV = Text) Beschreibung der theoretischen Grundlagen. Wichtig dabei ist die Angabe der verwendeten Literatur- und Internetquellen, sowie die korrekte Angabe der Verwendung KI, wenn von dieser </w:t>
+        <w:t xml:space="preserve">(FV = Text) Beschreibung der theoretischen Grundlagen. Wichtig dabei ist die Angabe der verwendeten Literatur- und Internetquellen, sowie die korrekte Angabe der Verwendung KI, wenn </w:t>
+      </w:r>
+      <w:proofErr w:type="gramStart"/>
+      <w:r>
+        <w:rPr>
+          <w:color w:val="0066FF"/>
+        </w:rPr>
+        <w:t xml:space="preserve">von dieser </w:t>
       </w:r>
       <w:r>
         <w:rPr>
@@ -5369,6 +5385,7 @@
         </w:rPr>
         <w:t>fachliche Inhalte</w:t>
       </w:r>
+      <w:proofErr w:type="gramEnd"/>
       <w:r>
         <w:rPr>
           <w:color w:val="0066FF"/>
@@ -6353,14 +6370,28 @@
         <w:rPr>
           <w:color w:val="0066FF"/>
         </w:rPr>
-        <w:t xml:space="preserve">(FV = Text) Diese Abschnitte sind individuell mit Ihren </w:t>
+        <w:t xml:space="preserve">(FV = Text) Diese Abschnitte sind individuell </w:t>
+      </w:r>
+      <w:proofErr w:type="gramStart"/>
+      <w:r>
+        <w:rPr>
+          <w:color w:val="0066FF"/>
+        </w:rPr>
+        <w:t xml:space="preserve">mit Ihren </w:t>
       </w:r>
       <w:proofErr w:type="spellStart"/>
       <w:r>
         <w:rPr>
           <w:color w:val="0066FF"/>
         </w:rPr>
-        <w:t>Betreuer:innen</w:t>
+        <w:t>Betreuer</w:t>
+      </w:r>
+      <w:proofErr w:type="gramEnd"/>
+      <w:r>
+        <w:rPr>
+          <w:color w:val="0066FF"/>
+        </w:rPr>
+        <w:t>:innen</w:t>
       </w:r>
       <w:proofErr w:type="spellEnd"/>
       <w:r>
@@ -6415,7 +6446,21 @@
         <w:rPr>
           <w:color w:val="0066FF"/>
         </w:rPr>
-        <w:t>(FV = Text) Hier werden die wichtigsten Fakten der individuellen Aufgabe des Schülers / der Schülerin kurz zusammengefasst werden.</w:t>
+        <w:t xml:space="preserve">(FV = Text) </w:t>
+      </w:r>
+      <w:proofErr w:type="gramStart"/>
+      <w:r>
+        <w:rPr>
+          <w:color w:val="0066FF"/>
+        </w:rPr>
+        <w:t>Hier</w:t>
+      </w:r>
+      <w:proofErr w:type="gramEnd"/>
+      <w:r>
+        <w:rPr>
+          <w:color w:val="0066FF"/>
+        </w:rPr>
+        <w:t xml:space="preserve"> werden die wichtigsten Fakten der individuellen Aufgabe des Schülers / der Schülerin kurz zusammengefasst werden.</w:t>
       </w:r>
     </w:p>
     <w:p>
@@ -6672,6 +6717,7 @@
         </w:rPr>
         <w:t xml:space="preserve">Als geplantes Ergebnis entsteht eine vollständig integrierte Softwarelösung, welche die Sensoransteuerung, Datenauswertung und Visualisierung </w:t>
       </w:r>
+      <w:proofErr w:type="gramStart"/>
       <w:r>
         <w:rPr>
           <w:lang w:val="de-AT" w:eastAsia="de-AT"/>
@@ -6684,6 +6730,7 @@
         </w:rPr>
         <w:t>t</w:t>
       </w:r>
+      <w:proofErr w:type="gramEnd"/>
       <w:r>
         <w:rPr>
           <w:lang w:val="de-AT" w:eastAsia="de-AT"/>
@@ -8370,7 +8417,14 @@
         <w:rPr>
           <w:lang w:val="de-AT"/>
         </w:rPr>
-        <w:t xml:space="preserve"> vielleicht bei </w:t>
+        <w:t xml:space="preserve"> vielleicht </w:t>
+      </w:r>
+      <w:proofErr w:type="gramStart"/>
+      <w:r>
+        <w:rPr>
+          <w:lang w:val="de-AT"/>
+        </w:rPr>
+        <w:t xml:space="preserve">bei </w:t>
       </w:r>
       <w:r>
         <w:rPr>
@@ -8390,6 +8444,7 @@
         </w:rPr>
         <w:t>Erklärung</w:t>
       </w:r>
+      <w:proofErr w:type="gramEnd"/>
       <w:r>
         <w:rPr>
           <w:lang w:val="de-AT"/>
@@ -9296,6 +9351,7 @@
         </w:rPr>
         <w:t xml:space="preserve"> 8 verwenden, um </w:t>
       </w:r>
+      <w:proofErr w:type="gramStart"/>
       <w:r>
         <w:rPr>
           <w:lang w:val="de-AT"/>
@@ -9314,6 +9370,7 @@
         </w:rPr>
         <w:t xml:space="preserve"> Barcode</w:t>
       </w:r>
+      <w:proofErr w:type="gramEnd"/>
       <w:r>
         <w:rPr>
           <w:lang w:val="de-AT"/>
@@ -10801,7 +10858,11 @@
         </w:numPr>
       </w:pPr>
       <w:r>
-        <w:t xml:space="preserve">Kamera bzw. Bildverarbeitung zur </w:t>
+        <w:t xml:space="preserve">Kamera bzw. Bildverarbeitung </w:t>
+      </w:r>
+      <w:proofErr w:type="gramStart"/>
+      <w:r>
+        <w:t xml:space="preserve">zur </w:t>
       </w:r>
       <w:r>
         <w:t>Barco</w:t>
@@ -10809,6 +10870,7 @@
       <w:r>
         <w:t>de</w:t>
       </w:r>
+      <w:proofErr w:type="gramEnd"/>
       <w:r>
         <w:noBreakHyphen/>
         <w:t>Erkennung</w:t>
@@ -11257,7 +11319,49 @@
         <w:rPr>
           <w:lang w:val="de-AT"/>
         </w:rPr>
-        <w:t>Im Rahmen der Entwicklung wurde eine zuverlässige Methode zur dreidimensionalen Vermessung von Objekten mittels Stereo-Vision untersucht. Dabei wurden verschiedene Ansätze analysiert und praktisch getestet – von der vollständigen Punktwolkenverarbeitung (Point Cloud) bis hin zu vereinfachten pixelbasierten Verfahren.</w:t>
+        <w:t>Im Rahmen der Entwicklung wurde eine zuverlässige Methode zur dreidimensionalen Vermessung von Objekten mittels Stereo-Vision untersucht. Dabei wurden</w:t>
+      </w:r>
+      <w:r>
+        <w:rPr>
+          <w:lang w:val="de-AT"/>
+        </w:rPr>
+        <w:t xml:space="preserve"> zwei</w:t>
+      </w:r>
+      <w:r>
+        <w:rPr>
+          <w:lang w:val="de-AT"/>
+        </w:rPr>
+        <w:t xml:space="preserve"> verschiedene Ansätze analysiert und praktisch getestet</w:t>
+      </w:r>
+      <w:r>
+        <w:rPr>
+          <w:lang w:val="de-AT"/>
+        </w:rPr>
+        <w:t xml:space="preserve">, </w:t>
+      </w:r>
+      <w:r>
+        <w:rPr>
+          <w:lang w:val="de-AT"/>
+        </w:rPr>
+        <w:t xml:space="preserve">von der vollständigen Punktwolkenverarbeitung (Point Cloud) bis </w:t>
+      </w:r>
+      <w:r>
+        <w:rPr>
+          <w:lang w:val="de-AT"/>
+        </w:rPr>
+        <w:t>zu</w:t>
+      </w:r>
+      <w:r>
+        <w:rPr>
+          <w:lang w:val="de-AT"/>
+        </w:rPr>
+        <w:t xml:space="preserve"> dem vereinfachten pixelbasierten Verfahren</w:t>
+      </w:r>
+      <w:r>
+        <w:rPr>
+          <w:lang w:val="de-AT"/>
+        </w:rPr>
+        <w:t>.</w:t>
       </w:r>
       <w:r>
         <w:rPr>
@@ -11318,28 +11422,33 @@
         <w:rPr>
           <w:lang w:val="de-AT"/>
         </w:rPr>
-        <w:t>wurde der Fokus auf die Verarbeitung einer Punktwolke gelegt. Dieser Ansatz stellt grundsätzlich die technisch sauberste Lösung dar, da die Tiefenkamera hierbei direkt dreidimensionale Koordinatenpunkte (X, Y, Z) liefert. Der wesentliche Vorteil besteht darin, dass reale Raumkoordinaten unmittelbar zur Verfügung stehen und geometrische Berechnungen ohne zusätzliche Umrechnungsfaktoren erfolgen können. Zudem wäre dieser Ansatz im Hinblick auf die Systemarchitektur vorteilhaft gewesen, da ein Teil der Tiefenberechnung direkt auf der Kamera erfolgt und somit die CPU-Last auf dem Raspberry Pi reduziert wird. Dies ist insbesondere relevant, da die Artikel</w:t>
-      </w:r>
-      <w:r>
-        <w:rPr>
-          <w:lang w:val="de-AT"/>
-        </w:rPr>
-        <w:softHyphen/>
-        <w:t>erfassung parallel zu weiteren Prozessen ausgeführt wird.</w:t>
-      </w:r>
-    </w:p>
-    <w:p>
-      <w:pPr>
-        <w:pStyle w:val="Text"/>
-        <w:rPr>
-          <w:lang w:val="de-AT"/>
-        </w:rPr>
-      </w:pPr>
-      <w:r>
-        <w:rPr>
-          <w:lang w:val="de-AT"/>
-        </w:rPr>
-        <w:t>Theoretisch wäre mit einer korrekt implementierten Punktwolkenauswertung eine Messgenauigkeit im Bereich von ±5 mm realisierbar gewesen. Trotz intensiver Versuche und iterativer Optimierung</w:t>
+        <w:t>wurde der Fokus auf die Verarbeitung einer Punktwolke gelegt. Dieser Ansatz stellt grundsätzlich die technisch sauberste Lösung dar, da die Tiefenkamera hierbei direkt dreidimensionale Koordinatenpunkte (X, Y, Z) liefert. Der wesentliche Vorteil besteht darin, dass reale Raumkoordinaten unmittelbar zur Verfügung stehen und geometrische Berechnungen ohne zusätzliche Umrechnungsfaktoren erfolgen können. Zudem wäre dieser Ansatz im Hinblick auf die Systemarchitektur vorteilhaft gewesen, da ein Teil der Tiefenberechnung direkt auf der Kamera erfolgt und somit die CPU-</w:t>
+      </w:r>
+      <w:r>
+        <w:rPr>
+          <w:lang w:val="de-AT"/>
+        </w:rPr>
+        <w:t>Belastung</w:t>
+      </w:r>
+      <w:r>
+        <w:rPr>
+          <w:lang w:val="de-AT"/>
+        </w:rPr>
+        <w:t xml:space="preserve"> auf dem Raspberry Pi reduziert wird.</w:t>
+      </w:r>
+    </w:p>
+    <w:p>
+      <w:pPr>
+        <w:pStyle w:val="Text"/>
+        <w:rPr>
+          <w:lang w:val="de-AT"/>
+        </w:rPr>
+      </w:pPr>
+      <w:r>
+        <w:rPr>
+          <w:lang w:val="de-AT"/>
+        </w:rPr>
+        <w:t>Theoretisch wäre mit einer korrekt implementierten Punktwolkenauswertung eine Messgenauigkeit im Bereich von ±5 mm realisierbar gewesen. Trotz intensiver Versuche</w:t>
       </w:r>
       <w:r>
         <w:rPr>
@@ -11351,7 +11460,31 @@
         <w:rPr>
           <w:lang w:val="de-AT"/>
         </w:rPr>
-        <w:t>einschließlich KI-gestützter Unterstützung</w:t>
+        <w:t>iterativer Optimierung</w:t>
+      </w:r>
+      <w:r>
+        <w:rPr>
+          <w:lang w:val="de-AT"/>
+        </w:rPr>
+        <w:t xml:space="preserve"> und</w:t>
+      </w:r>
+      <w:r>
+        <w:rPr>
+          <w:lang w:val="de-AT"/>
+        </w:rPr>
+        <w:t xml:space="preserve"> </w:t>
+      </w:r>
+      <w:r>
+        <w:rPr>
+          <w:lang w:val="de-AT"/>
+        </w:rPr>
+        <w:t xml:space="preserve">einschließlich </w:t>
+      </w:r>
+      <w:r>
+        <w:rPr>
+          <w:lang w:val="de-AT"/>
+        </w:rPr>
+        <w:t>KI-Unterstützung</w:t>
       </w:r>
       <w:r>
         <w:rPr>
@@ -11363,7 +11496,19 @@
         <w:rPr>
           <w:lang w:val="de-AT"/>
         </w:rPr>
-        <w:t>konnte jedoch keine stabile Implementierung erreicht werden. Die resultierende Messabweichung lag bei bis zu ±</w:t>
+        <w:t xml:space="preserve">konnte jedoch keine stabile Implementierung erreicht werden. Die resultierende Messabweichung </w:t>
+      </w:r>
+      <w:r>
+        <w:rPr>
+          <w:lang w:val="de-AT"/>
+        </w:rPr>
+        <w:t>lag</w:t>
+      </w:r>
+      <w:r>
+        <w:rPr>
+          <w:lang w:val="de-AT"/>
+        </w:rPr>
+        <w:t xml:space="preserve"> bei bis zu ±</w:t>
       </w:r>
       <w:r>
         <w:rPr>
@@ -11389,7 +11534,6 @@
         <w:rPr>
           <w:lang w:val="de-AT"/>
         </w:rPr>
-        <w:lastRenderedPageBreak/>
         <w:t>Aus diesem Grund wurde von der Punktwolkenlösung Abstand genommen und ein alternativer Ansatz</w:t>
       </w:r>
       <w:r>
@@ -11404,14 +11548,6 @@
         </w:rPr>
         <w:t>.</w:t>
       </w:r>
-    </w:p>
-    <w:p>
-      <w:pPr>
-        <w:pStyle w:val="Text"/>
-        <w:rPr>
-          <w:lang w:val="de-AT"/>
-        </w:rPr>
-      </w:pPr>
     </w:p>
     <w:p>
       <w:pPr>
@@ -11427,6 +11563,7 @@
           <w:b/>
           <w:bCs/>
         </w:rPr>
+        <w:lastRenderedPageBreak/>
         <w:t>Distanzabhängige Pixel-Umrechnung</w:t>
       </w:r>
     </w:p>
@@ -11441,24 +11578,712 @@
         <w:rPr>
           <w:lang w:val="de-AT"/>
         </w:rPr>
-        <w:t>Schlussendlich wurde eine vereinfachte, jedoch robuste Methode auf Basis der Distanzmessung umgesetzt. Das Verfahren beruht auf der Kombination aus gemessener Objektentfernung und einem distanzabhängigen Kalibrierfaktor zur Umrechnung von Pixeln in reale Längeneinheiten.</w:t>
-      </w:r>
-    </w:p>
-    <w:p>
-      <w:pPr>
-        <w:pStyle w:val="Text"/>
-        <w:rPr>
-          <w:lang w:val="de-AT"/>
-        </w:rPr>
-      </w:pPr>
-      <w:r>
-        <w:rPr>
-          <w:lang w:val="de-AT"/>
-        </w:rPr>
-        <w:t>Ablauf</w:t>
-      </w:r>
-      <w:r>
-        <w:rPr>
+        <w:t>Für die Realisierung der Abmessungen</w:t>
+      </w:r>
+      <w:r>
+        <w:rPr>
+          <w:lang w:val="de-AT"/>
+        </w:rPr>
+        <w:t xml:space="preserve"> wurde eine vereinfachte, jedoch robuste Methode auf Basis der Distanzmessung umgesetzt. Das Verfahren beruht auf der Kombination aus gemessener Objektentfernung und einem distanzabhängigen Kalibrierfaktor zur Umrechnung von Pixeln in reale Längeneinheiten.</w:t>
+      </w:r>
+    </w:p>
+    <w:p>
+      <w:pPr>
+        <w:pStyle w:val="Text"/>
+        <w:rPr>
+          <w:lang w:val="de-AT"/>
+        </w:rPr>
+      </w:pPr>
+    </w:p>
+    <w:p>
+      <w:pPr>
+        <w:pStyle w:val="Text"/>
+        <w:rPr>
+          <w:b/>
+          <w:lang w:val="de-AT"/>
+        </w:rPr>
+      </w:pPr>
+      <w:r>
+        <w:rPr>
+          <w:b/>
+          <w:lang w:val="de-AT"/>
+        </w:rPr>
+        <w:t>Programm Ablauf</w:t>
+      </w:r>
+    </w:p>
+    <w:p>
+      <w:pPr>
+        <w:pStyle w:val="Text"/>
+        <w:rPr>
+          <w:lang w:val="de-AT"/>
+        </w:rPr>
+      </w:pPr>
+      <w:r>
+        <w:rPr>
+          <w:lang w:val="de-AT"/>
+        </w:rPr>
+        <w:t xml:space="preserve">Zunächst wird eine Kalibrierungsdatei geladen. Diese enthält die zentralen Referenzwerte, insbesondere den Abstand zwischen Kamera und </w:t>
+      </w:r>
+      <w:proofErr w:type="spellStart"/>
+      <w:r>
+        <w:rPr>
+          <w:lang w:val="de-AT"/>
+        </w:rPr>
+        <w:t>Wägeplatte</w:t>
+      </w:r>
+      <w:proofErr w:type="spellEnd"/>
+      <w:r>
+        <w:rPr>
+          <w:lang w:val="de-AT"/>
+        </w:rPr>
+        <w:t xml:space="preserve"> sowie den zugehörigen Umrechnungsfaktor in Millimeter pro Pixel.</w:t>
+      </w:r>
+    </w:p>
+    <w:p>
+      <w:pPr>
+        <w:pStyle w:val="Text"/>
+        <w:rPr>
+          <w:lang w:val="de-AT"/>
+        </w:rPr>
+      </w:pPr>
+      <w:r>
+        <w:rPr>
+          <w:lang w:val="de-AT"/>
+        </w:rPr>
+        <w:t xml:space="preserve">Anschließend wird </w:t>
+      </w:r>
+      <w:r>
+        <w:rPr>
+          <w:lang w:val="de-AT"/>
+        </w:rPr>
+        <w:t xml:space="preserve">das </w:t>
+      </w:r>
+      <w:r>
+        <w:rPr>
+          <w:lang w:val="de-AT"/>
+        </w:rPr>
+        <w:t>Tiefenbild aufgenommen. In einem Vorverarbeitungsschritt werden</w:t>
+      </w:r>
+      <w:r>
+        <w:rPr>
+          <w:lang w:val="de-AT"/>
+        </w:rPr>
+        <w:t>, dann</w:t>
+      </w:r>
+      <w:r>
+        <w:rPr>
+          <w:lang w:val="de-AT"/>
+        </w:rPr>
+        <w:t xml:space="preserve"> alle Pixel entfernt</w:t>
+      </w:r>
+      <w:r>
+        <w:rPr>
+          <w:lang w:val="de-AT"/>
+        </w:rPr>
+        <w:t>,</w:t>
+      </w:r>
+      <w:r>
+        <w:rPr>
+          <w:lang w:val="de-AT"/>
+        </w:rPr>
+        <w:t xml:space="preserve"> die außerhalb der definierten Region </w:t>
+      </w:r>
+      <w:proofErr w:type="spellStart"/>
+      <w:r>
+        <w:rPr>
+          <w:lang w:val="de-AT"/>
+        </w:rPr>
+        <w:t>of</w:t>
+      </w:r>
+      <w:proofErr w:type="spellEnd"/>
+      <w:r>
+        <w:rPr>
+          <w:lang w:val="de-AT"/>
+        </w:rPr>
+        <w:t xml:space="preserve"> Interest (ROI) liegen oder deren Tiefenwert außerhalb des zulässigen Bereichs zur </w:t>
+      </w:r>
+      <w:proofErr w:type="spellStart"/>
+      <w:r>
+        <w:rPr>
+          <w:lang w:val="de-AT"/>
+        </w:rPr>
+        <w:t>Wägeplatte</w:t>
+      </w:r>
+      <w:proofErr w:type="spellEnd"/>
+      <w:r>
+        <w:rPr>
+          <w:lang w:val="de-AT"/>
+        </w:rPr>
+        <w:t xml:space="preserve"> liegt. Dadurch bleiben ausschließlich jene Punkte erhalten, die dem </w:t>
+      </w:r>
+      <w:r>
+        <w:rPr>
+          <w:lang w:val="de-AT"/>
+        </w:rPr>
+        <w:t>zu vermessende</w:t>
+      </w:r>
+      <w:r>
+        <w:rPr>
+          <w:lang w:val="de-AT"/>
+        </w:rPr>
+        <w:t>m</w:t>
+      </w:r>
+      <w:r>
+        <w:rPr>
+          <w:lang w:val="de-AT"/>
+        </w:rPr>
+        <w:t xml:space="preserve"> Objekt</w:t>
+      </w:r>
+      <w:r>
+        <w:rPr>
+          <w:lang w:val="de-AT"/>
+        </w:rPr>
+        <w:t xml:space="preserve"> zugeordnet werden können.</w:t>
+      </w:r>
+    </w:p>
+    <w:p>
+      <w:pPr>
+        <w:pStyle w:val="Text"/>
+        <w:rPr>
+          <w:lang w:val="de-AT"/>
+        </w:rPr>
+      </w:pPr>
+      <w:r>
+        <w:rPr>
+          <w:lang w:val="de-AT"/>
+        </w:rPr>
+        <w:t xml:space="preserve">Die verbleibenden Objektpunkte werden mithilfe einer </w:t>
+      </w:r>
+      <w:proofErr w:type="spellStart"/>
+      <w:r>
+        <w:rPr>
+          <w:lang w:val="de-AT"/>
+        </w:rPr>
+        <w:t>Bounding</w:t>
+      </w:r>
+      <w:proofErr w:type="spellEnd"/>
+      <w:r>
+        <w:rPr>
+          <w:lang w:val="de-AT"/>
+        </w:rPr>
+        <w:t xml:space="preserve"> Box analysiert. Die ermittelten Kantenlängen werden zunächst in Pixeln bestimmt. Abschließend erfolgt die Umrechnung in reale Maßeinheiten, indem die Pixelwerte mit dem zuvor geladenen Kalibrierfaktor multipliziert werden.</w:t>
+      </w:r>
+    </w:p>
+    <w:p>
+      <w:pPr>
+        <w:pStyle w:val="Text"/>
+        <w:rPr>
+          <w:lang w:val="de-AT"/>
+        </w:rPr>
+      </w:pPr>
+    </w:p>
+    <w:p>
+      <w:pPr>
+        <w:pStyle w:val="Text"/>
+        <w:rPr>
+          <w:lang w:val="de-AT"/>
+        </w:rPr>
+      </w:pPr>
+      <w:r>
+        <w:rPr>
+          <w:lang w:val="de-AT"/>
+        </w:rPr>
+        <w:t>Auf diese Weise wird eine funktionsfähige und reproduzierbare Pixel-Umrechnung zur Bestimmung realer Objektabmessungen gewährleistet.</w:t>
+      </w:r>
+    </w:p>
+    <w:p>
+      <w:pPr>
+        <w:jc w:val="left"/>
+        <w:rPr>
+          <w:lang w:val="de-AT"/>
+        </w:rPr>
+      </w:pPr>
+      <w:r>
+        <w:rPr>
+          <w:lang w:val="de-AT"/>
+        </w:rPr>
+        <w:br w:type="page"/>
+      </w:r>
+    </w:p>
+    <w:p>
+      <w:pPr>
+        <w:pStyle w:val="StandardWeb"/>
+        <w:rPr>
+          <w:rFonts w:ascii="Arial" w:hAnsi="Arial"/>
+          <w:b/>
+          <w:bCs/>
+          <w:sz w:val="28"/>
+        </w:rPr>
+      </w:pPr>
+      <w:r>
+        <w:rPr>
+          <w:rFonts w:ascii="Arial" w:hAnsi="Arial"/>
+          <w:b/>
+          <w:bCs/>
+          <w:sz w:val="28"/>
+        </w:rPr>
+        <w:lastRenderedPageBreak/>
+        <w:t>Visualisierung und Filterung des Tiefenbildes</w:t>
+      </w:r>
+    </w:p>
+    <w:p>
+      <w:pPr>
+        <w:pStyle w:val="Text"/>
+      </w:pPr>
+      <w:r>
+        <w:t>Zur Analyse der Tiefendaten wurde das Tiefenbild mittels JET-Farbskala dargestellt (siehe Abbildung). Dabei kennzeichnet Rot geringe Distanzen, Grün mittlere Entfernungen und Blau weiter entfernte Bereiche. Diese Darstellung dient ausschließlich der visuellen Kontrolle und erleichtert die Bewertung der erfassten Tiefenstruktur.</w:t>
+      </w:r>
+    </w:p>
+    <w:p>
+      <w:pPr>
+        <w:pStyle w:val="Text"/>
+        <w:jc w:val="center"/>
+        <w:rPr>
+          <w:lang w:val="de-AT"/>
+        </w:rPr>
+      </w:pPr>
+      <w:r>
+        <w:rPr>
+          <w:lang w:val="de-AT"/>
+        </w:rPr>
+        <w:drawing>
+          <wp:inline distT="0" distB="0" distL="0" distR="0" wp14:anchorId="529F68B3" wp14:editId="347B073E">
+            <wp:extent cx="3794760" cy="2477148"/>
+            <wp:effectExtent l="0" t="0" r="0" b="0"/>
+            <wp:docPr id="835925023" name="Grafik 1" descr="Ein Bild, das Karte, Screenshot enthält.&#10;&#10;KI-generierte Inhalte können fehlerhaft sein."/>
+            <wp:cNvGraphicFramePr>
+              <a:graphicFrameLocks xmlns:a="http://schemas.openxmlformats.org/drawingml/2006/main" noChangeAspect="1"/>
+            </wp:cNvGraphicFramePr>
+            <a:graphic xmlns:a="http://schemas.openxmlformats.org/drawingml/2006/main">
+              <a:graphicData uri="http://schemas.openxmlformats.org/drawingml/2006/picture">
+                <pic:pic xmlns:pic="http://schemas.openxmlformats.org/drawingml/2006/picture">
+                  <pic:nvPicPr>
+                    <pic:cNvPr id="835925023" name="Grafik 1" descr="Ein Bild, das Karte, Screenshot enthält.&#10;&#10;KI-generierte Inhalte können fehlerhaft sein."/>
+                    <pic:cNvPicPr/>
+                  </pic:nvPicPr>
+                  <pic:blipFill>
+                    <a:blip r:embed="rId52"/>
+                    <a:stretch>
+                      <a:fillRect/>
+                    </a:stretch>
+                  </pic:blipFill>
+                  <pic:spPr>
+                    <a:xfrm>
+                      <a:off x="0" y="0"/>
+                      <a:ext cx="3815435" cy="2490644"/>
+                    </a:xfrm>
+                    <a:prstGeom prst="rect">
+                      <a:avLst/>
+                    </a:prstGeom>
+                  </pic:spPr>
+                </pic:pic>
+              </a:graphicData>
+            </a:graphic>
+          </wp:inline>
+        </w:drawing>
+      </w:r>
+    </w:p>
+    <w:p>
+      <w:pPr>
+        <w:pStyle w:val="Beschriftung"/>
+        <w:rPr>
+          <w:color w:val="0066FF"/>
+        </w:rPr>
+      </w:pPr>
+      <w:r>
+        <w:t xml:space="preserve">Abbildung </w:t>
+      </w:r>
+      <w:r>
+        <w:fldChar w:fldCharType="begin"/>
+      </w:r>
+      <w:r>
+        <w:instrText xml:space="preserve"> SEQ Abbildung \* ARABIC </w:instrText>
+      </w:r>
+      <w:r>
+        <w:fldChar w:fldCharType="separate"/>
+      </w:r>
+      <w:r>
+        <w:t>1</w:t>
+      </w:r>
+      <w:r>
+        <w:fldChar w:fldCharType="end"/>
+      </w:r>
+      <w:r>
+        <w:t xml:space="preserve">: </w:t>
+      </w:r>
+      <w:r>
+        <w:t xml:space="preserve">JET – Farbskala mit </w:t>
+      </w:r>
+      <w:r>
+        <w:t>minimal</w:t>
+      </w:r>
+      <w:r>
+        <w:t xml:space="preserve"> Distanzmessung</w:t>
+      </w:r>
+      <w:r>
+        <w:t xml:space="preserve"> vom ROI</w:t>
+      </w:r>
+    </w:p>
+    <w:p>
+      <w:pPr>
+        <w:pStyle w:val="Text"/>
+        <w:rPr>
+          <w:lang w:val="de-AT"/>
+        </w:rPr>
+      </w:pPr>
+      <w:r>
+        <w:rPr>
+          <w:lang w:val="de-AT"/>
+        </w:rPr>
+        <w:t xml:space="preserve">Für die Messung wird eine definierte ROI festgelegt (siehe Abbildung). Dadurch wird der auszuwertende Bereich gezielt auf die </w:t>
+      </w:r>
+      <w:proofErr w:type="spellStart"/>
+      <w:r>
+        <w:rPr>
+          <w:lang w:val="de-AT"/>
+        </w:rPr>
+        <w:t>Wägeplatte</w:t>
+      </w:r>
+      <w:proofErr w:type="spellEnd"/>
+      <w:r>
+        <w:rPr>
+          <w:lang w:val="de-AT"/>
+        </w:rPr>
+        <w:t xml:space="preserve"> begrenzt und irrelevante Bildbereiche werden ausgeschlossen</w:t>
+      </w:r>
+      <w:r>
+        <w:rPr>
+          <w:lang w:val="de-AT"/>
+        </w:rPr>
+        <w:t xml:space="preserve"> (siehe Abbildung)</w:t>
+      </w:r>
+      <w:r>
+        <w:rPr>
+          <w:lang w:val="de-AT"/>
+        </w:rPr>
+        <w:t>.</w:t>
+      </w:r>
+    </w:p>
+    <w:p>
+      <w:pPr>
+        <w:pStyle w:val="Text"/>
+        <w:jc w:val="center"/>
+        <w:rPr>
+          <w:lang w:val="de-AT"/>
+        </w:rPr>
+      </w:pPr>
+      <w:r>
+        <w:rPr>
+          <w:lang w:val="de-AT"/>
+        </w:rPr>
+        <w:drawing>
+          <wp:inline distT="0" distB="0" distL="0" distR="0" wp14:anchorId="5E2B8269" wp14:editId="53974DAD">
+            <wp:extent cx="3703320" cy="2481462"/>
+            <wp:effectExtent l="0" t="0" r="0" b="0"/>
+            <wp:docPr id="60036506" name="Grafik 1" descr="Ein Bild, das Text, Screenshot enthält.&#10;&#10;KI-generierte Inhalte können fehlerhaft sein."/>
+            <wp:cNvGraphicFramePr>
+              <a:graphicFrameLocks xmlns:a="http://schemas.openxmlformats.org/drawingml/2006/main" noChangeAspect="1"/>
+            </wp:cNvGraphicFramePr>
+            <a:graphic xmlns:a="http://schemas.openxmlformats.org/drawingml/2006/main">
+              <a:graphicData uri="http://schemas.openxmlformats.org/drawingml/2006/picture">
+                <pic:pic xmlns:pic="http://schemas.openxmlformats.org/drawingml/2006/picture">
+                  <pic:nvPicPr>
+                    <pic:cNvPr id="60036506" name="Grafik 1" descr="Ein Bild, das Text, Screenshot enthält.&#10;&#10;KI-generierte Inhalte können fehlerhaft sein."/>
+                    <pic:cNvPicPr/>
+                  </pic:nvPicPr>
+                  <pic:blipFill>
+                    <a:blip r:embed="rId53"/>
+                    <a:stretch>
+                      <a:fillRect/>
+                    </a:stretch>
+                  </pic:blipFill>
+                  <pic:spPr>
+                    <a:xfrm>
+                      <a:off x="0" y="0"/>
+                      <a:ext cx="3721362" cy="2493552"/>
+                    </a:xfrm>
+                    <a:prstGeom prst="rect">
+                      <a:avLst/>
+                    </a:prstGeom>
+                  </pic:spPr>
+                </pic:pic>
+              </a:graphicData>
+            </a:graphic>
+          </wp:inline>
+        </w:drawing>
+      </w:r>
+    </w:p>
+    <w:p>
+      <w:pPr>
+        <w:pStyle w:val="Beschriftung"/>
+        <w:rPr>
+          <w:color w:val="0066FF"/>
+        </w:rPr>
+      </w:pPr>
+      <w:r>
+        <w:t xml:space="preserve">Abbildung </w:t>
+      </w:r>
+      <w:r>
+        <w:fldChar w:fldCharType="begin"/>
+      </w:r>
+      <w:r>
+        <w:instrText xml:space="preserve"> SEQ Abbildung \* ARABIC </w:instrText>
+      </w:r>
+      <w:r>
+        <w:fldChar w:fldCharType="separate"/>
+      </w:r>
+      <w:r>
+        <w:t>1</w:t>
+      </w:r>
+      <w:r>
+        <w:fldChar w:fldCharType="end"/>
+      </w:r>
+      <w:r>
+        <w:t xml:space="preserve">: </w:t>
+      </w:r>
+      <w:r>
+        <w:t>JET – Farbskala mit unbekannten Punkten im ROI</w:t>
+      </w:r>
+    </w:p>
+    <w:p>
+      <w:pPr>
+        <w:pStyle w:val="Text"/>
+        <w:rPr>
+          <w:lang w:val="de-AT"/>
+        </w:rPr>
+      </w:pPr>
+      <w:r>
+        <w:rPr>
+          <w:lang w:val="de-AT"/>
+        </w:rPr>
+        <w:lastRenderedPageBreak/>
+        <w:t xml:space="preserve">Zusätzlich erfolgt eine Tiefenfilterung. Dabei werden alle Punkte entfernt, deren Z-Wert unterhalb des Referenzabstands zur </w:t>
+      </w:r>
+      <w:proofErr w:type="spellStart"/>
+      <w:r>
+        <w:rPr>
+          <w:lang w:val="de-AT"/>
+        </w:rPr>
+        <w:t>Wägeplatte</w:t>
+      </w:r>
+      <w:proofErr w:type="spellEnd"/>
+      <w:r>
+        <w:rPr>
+          <w:lang w:val="de-AT"/>
+        </w:rPr>
+        <w:t xml:space="preserve"> liegt. Ein zusätzlicher Toleranzbereich von +1 cm berücksichtigt mögliches </w:t>
+      </w:r>
+      <w:proofErr w:type="spellStart"/>
+      <w:r>
+        <w:rPr>
+          <w:lang w:val="de-AT"/>
+        </w:rPr>
+        <w:t>Sensorauschen</w:t>
+      </w:r>
+      <w:proofErr w:type="spellEnd"/>
+      <w:r>
+        <w:rPr>
+          <w:lang w:val="de-AT"/>
+        </w:rPr>
+        <w:t xml:space="preserve"> und verhindert Fehlklassifikationen bei kleinen Objekten.</w:t>
+      </w:r>
+    </w:p>
+    <w:p>
+      <w:pPr>
+        <w:pStyle w:val="Text"/>
+        <w:jc w:val="center"/>
+        <w:rPr>
+          <w:lang w:val="de-AT"/>
+        </w:rPr>
+      </w:pPr>
+      <w:r>
+        <w:rPr>
+          <w:lang w:val="de-AT"/>
+        </w:rPr>
+        <w:drawing>
+          <wp:inline distT="0" distB="0" distL="0" distR="0" wp14:anchorId="66F51B54" wp14:editId="4305E973">
+            <wp:extent cx="4297680" cy="2606905"/>
+            <wp:effectExtent l="0" t="0" r="0" b="0"/>
+            <wp:docPr id="1594431449" name="Grafik 1" descr="Ein Bild, das Text, Screenshot, Diagramm enthält.&#10;&#10;KI-generierte Inhalte können fehlerhaft sein."/>
+            <wp:cNvGraphicFramePr>
+              <a:graphicFrameLocks xmlns:a="http://schemas.openxmlformats.org/drawingml/2006/main" noChangeAspect="1"/>
+            </wp:cNvGraphicFramePr>
+            <a:graphic xmlns:a="http://schemas.openxmlformats.org/drawingml/2006/main">
+              <a:graphicData uri="http://schemas.openxmlformats.org/drawingml/2006/picture">
+                <pic:pic xmlns:pic="http://schemas.openxmlformats.org/drawingml/2006/picture">
+                  <pic:nvPicPr>
+                    <pic:cNvPr id="590077543" name="Grafik 1" descr="Ein Bild, das Text, Screenshot, Diagramm enthält.&#10;&#10;KI-generierte Inhalte können fehlerhaft sein."/>
+                    <pic:cNvPicPr/>
+                  </pic:nvPicPr>
+                  <pic:blipFill rotWithShape="1">
+                    <a:blip r:embed="rId54"/>
+                    <a:srcRect b="8321"/>
+                    <a:stretch>
+                      <a:fillRect/>
+                    </a:stretch>
+                  </pic:blipFill>
+                  <pic:spPr bwMode="auto">
+                    <a:xfrm>
+                      <a:off x="0" y="0"/>
+                      <a:ext cx="4324060" cy="2622906"/>
+                    </a:xfrm>
+                    <a:prstGeom prst="rect">
+                      <a:avLst/>
+                    </a:prstGeom>
+                    <a:ln>
+                      <a:noFill/>
+                    </a:ln>
+                    <a:extLst>
+                      <a:ext uri="{53640926-AAD7-44D8-BBD7-CCE9431645EC}">
+                        <a14:shadowObscured xmlns:a14="http://schemas.microsoft.com/office/drawing/2010/main"/>
+                      </a:ext>
+                    </a:extLst>
+                  </pic:spPr>
+                </pic:pic>
+              </a:graphicData>
+            </a:graphic>
+          </wp:inline>
+        </w:drawing>
+      </w:r>
+    </w:p>
+    <w:p>
+      <w:pPr>
+        <w:pStyle w:val="Beschriftung"/>
+        <w:rPr>
+          <w:color w:val="0066FF"/>
+        </w:rPr>
+      </w:pPr>
+      <w:r>
+        <w:t xml:space="preserve">Abbildung </w:t>
+      </w:r>
+      <w:r>
+        <w:fldChar w:fldCharType="begin"/>
+      </w:r>
+      <w:r>
+        <w:instrText xml:space="preserve"> SEQ Abbildung \* ARABIC </w:instrText>
+      </w:r>
+      <w:r>
+        <w:fldChar w:fldCharType="separate"/>
+      </w:r>
+      <w:r>
+        <w:t>1</w:t>
+      </w:r>
+      <w:r>
+        <w:fldChar w:fldCharType="end"/>
+      </w:r>
+      <w:r>
+        <w:t xml:space="preserve">: </w:t>
+      </w:r>
+      <w:r>
+        <w:t>Tiefenwerten nach Objekt Filterung</w:t>
+      </w:r>
+    </w:p>
+    <w:p>
+      <w:pPr>
+        <w:pStyle w:val="Text"/>
+        <w:rPr>
+          <w:lang w:val="de-AT"/>
+        </w:rPr>
+      </w:pPr>
+      <w:r>
+        <w:rPr>
+          <w:lang w:val="de-AT"/>
+        </w:rPr>
+        <w:t>Zu Beginn der Entwicklungsphase wurde die Pixelauswertung visuell überprüft, um die Kalibrierung der Umrechnungsfaktoren zu kontrollieren. Die blau markierten Messbereiche erleichterten dabei das Erkennen möglicher Fehler (siehe Abbildung). In der finalen Implementierung erfolgt die Objekterkennung automatisch, und die berechneten Abmessungen werden direkt an das Interface übergeben.</w:t>
+      </w:r>
+    </w:p>
+    <w:p>
+      <w:pPr>
+        <w:pStyle w:val="Text"/>
+        <w:rPr>
+          <w:lang w:val="de-AT"/>
+        </w:rPr>
+      </w:pPr>
+    </w:p>
+    <w:p>
+      <w:pPr>
+        <w:pStyle w:val="Text"/>
+        <w:rPr>
+          <w:lang w:val="de-AT"/>
+        </w:rPr>
+      </w:pPr>
+    </w:p>
+    <w:p>
+      <w:pPr>
+        <w:pStyle w:val="Text"/>
+        <w:rPr>
+          <w:lang w:val="de-AT"/>
+        </w:rPr>
+      </w:pPr>
+    </w:p>
+    <w:p>
+      <w:pPr>
+        <w:pStyle w:val="Text"/>
+        <w:rPr>
+          <w:lang w:val="de-AT"/>
+        </w:rPr>
+      </w:pPr>
+    </w:p>
+    <w:p>
+      <w:pPr>
+        <w:pStyle w:val="Text"/>
+        <w:rPr>
+          <w:lang w:val="de-AT"/>
+        </w:rPr>
+      </w:pPr>
+    </w:p>
+    <w:p>
+      <w:pPr>
+        <w:pStyle w:val="Text"/>
+        <w:rPr>
+          <w:lang w:val="de-AT"/>
+        </w:rPr>
+      </w:pPr>
+    </w:p>
+    <w:p>
+      <w:pPr>
+        <w:pStyle w:val="Text"/>
+        <w:rPr>
+          <w:lang w:val="de-AT"/>
+        </w:rPr>
+      </w:pPr>
+    </w:p>
+    <w:p>
+      <w:pPr>
+        <w:pStyle w:val="Text"/>
+        <w:rPr>
+          <w:lang w:val="de-AT"/>
+        </w:rPr>
+      </w:pPr>
+    </w:p>
+    <w:p>
+      <w:pPr>
+        <w:pStyle w:val="Text"/>
+        <w:rPr>
+          <w:lang w:val="de-AT"/>
+        </w:rPr>
+      </w:pPr>
+      <w:r>
+        <w:rPr>
+          <w:b/>
+          <w:bCs/>
+          <w:lang w:val="de-AT"/>
+        </w:rPr>
+        <w:lastRenderedPageBreak/>
+        <w:t>Gemessene Werte</w:t>
+      </w:r>
+      <w:r>
+        <w:rPr>
+          <w:b/>
+          <w:bCs/>
+          <w:lang w:val="de-AT"/>
+        </w:rPr>
+        <w:t xml:space="preserve"> von Vans-Schuh</w:t>
+      </w:r>
+      <w:r>
+        <w:rPr>
+          <w:b/>
+          <w:bCs/>
           <w:lang w:val="de-AT"/>
         </w:rPr>
         <w:t>:</w:t>
@@ -11469,7 +12294,7 @@
         <w:pStyle w:val="Text"/>
         <w:numPr>
           <w:ilvl w:val="0"/>
-          <w:numId w:val="34"/>
+          <w:numId w:val="43"/>
         </w:numPr>
         <w:rPr>
           <w:lang w:val="de-AT"/>
@@ -11479,7 +12304,7 @@
         <w:rPr>
           <w:lang w:val="de-AT"/>
         </w:rPr>
-        <w:t>Zunächst wird die Distanz des Objekts zur Kamera über das Tiefenbild ermittelt.</w:t>
+        <w:t>Länge: 114 mm</w:t>
       </w:r>
     </w:p>
     <w:p>
@@ -11487,7 +12312,7 @@
         <w:pStyle w:val="Text"/>
         <w:numPr>
           <w:ilvl w:val="0"/>
-          <w:numId w:val="34"/>
+          <w:numId w:val="43"/>
         </w:numPr>
         <w:rPr>
           <w:lang w:val="de-AT"/>
@@ -11497,7 +12322,7 @@
         <w:rPr>
           <w:lang w:val="de-AT"/>
         </w:rPr>
-        <w:t>Abhängig von dieser Distanz wird ein zuvor manuell kalibrierter Umrechnungsfaktor (Pixel pro Millimeter) verwendet.</w:t>
+        <w:t>Breite: 265 mm</w:t>
       </w:r>
     </w:p>
     <w:p>
@@ -11505,7 +12330,7 @@
         <w:pStyle w:val="Text"/>
         <w:numPr>
           <w:ilvl w:val="0"/>
-          <w:numId w:val="34"/>
+          <w:numId w:val="43"/>
         </w:numPr>
         <w:rPr>
           <w:lang w:val="de-AT"/>
@@ -11515,90 +12340,91 @@
         <w:rPr>
           <w:lang w:val="de-AT"/>
         </w:rPr>
-        <w:t>Die in Pixel gemessene Objektlänge wird mit diesem Faktor multipliziert, um die reale Länge in Millimetern zu bestimmen.</w:t>
-      </w:r>
-    </w:p>
-    <w:p>
-      <w:pPr>
-        <w:pStyle w:val="Text"/>
-        <w:rPr>
-          <w:lang w:val="de-AT"/>
-        </w:rPr>
-      </w:pPr>
-    </w:p>
-    <w:p>
-      <w:pPr>
-        <w:pStyle w:val="Text"/>
-        <w:rPr>
-          <w:lang w:val="de-AT"/>
-        </w:rPr>
-      </w:pPr>
-    </w:p>
-    <w:p>
-      <w:pPr>
-        <w:pStyle w:val="Text"/>
-        <w:rPr>
-          <w:lang w:val="de-AT"/>
-        </w:rPr>
-      </w:pPr>
-      <w:r>
-        <w:rPr>
-          <w:lang w:val="de-AT"/>
-        </w:rPr>
-        <w:t>Da sich die perspektivische Verzerrung mit zunehmender Entfernung verändert, wurden mehrere Kalibrierpunkte definiert. Für unterschiedliche Referenzdistanzen wurden entsprechende Umrechnungsfaktoren experimentell bestimmt. Dadurch kann die Messung an die jeweilige Objektposition angepasst werden.</w:t>
-      </w:r>
-    </w:p>
-    <w:p>
-      <w:pPr>
-        <w:pStyle w:val="Text"/>
-        <w:rPr>
-          <w:lang w:val="de-AT"/>
-        </w:rPr>
-      </w:pPr>
-      <w:r>
-        <w:rPr>
-          <w:lang w:val="de-AT"/>
-        </w:rPr>
-        <w:t xml:space="preserve">Die Pixellängenbestimmung selbst erfolgt automatisiert über das </w:t>
+        <w:t>Höhe: 98 mm</w:t>
+      </w:r>
+      <w:r>
+        <w:rPr>
+          <w:lang w:val="de-AT"/>
+        </w:rPr>
+        <w:t xml:space="preserve"> </w:t>
+      </w:r>
+    </w:p>
+    <w:p>
+      <w:pPr>
+        <w:pStyle w:val="Text"/>
+        <w:jc w:val="center"/>
+        <w:rPr>
+          <w:lang w:val="de-AT"/>
+        </w:rPr>
+      </w:pPr>
+      <w:r>
+        <w:rPr>
+          <w:lang w:val="de-AT"/>
+        </w:rPr>
+        <w:drawing>
+          <wp:inline distT="0" distB="0" distL="0" distR="0" wp14:anchorId="11492A5D" wp14:editId="55445E36">
+            <wp:extent cx="4385226" cy="1074420"/>
+            <wp:effectExtent l="0" t="0" r="0" b="0"/>
+            <wp:docPr id="1607923285" name="Grafik 1" descr="Ein Bild, das Text, Screenshot, Schrift enthält.&#10;&#10;KI-generierte Inhalte können fehlerhaft sein."/>
+            <wp:cNvGraphicFramePr>
+              <a:graphicFrameLocks xmlns:a="http://schemas.openxmlformats.org/drawingml/2006/main" noChangeAspect="1"/>
+            </wp:cNvGraphicFramePr>
+            <a:graphic xmlns:a="http://schemas.openxmlformats.org/drawingml/2006/main">
+              <a:graphicData uri="http://schemas.openxmlformats.org/drawingml/2006/picture">
+                <pic:pic xmlns:pic="http://schemas.openxmlformats.org/drawingml/2006/picture">
+                  <pic:nvPicPr>
+                    <pic:cNvPr id="1607923285" name="Grafik 1" descr="Ein Bild, das Text, Screenshot, Schrift enthält.&#10;&#10;KI-generierte Inhalte können fehlerhaft sein."/>
+                    <pic:cNvPicPr/>
+                  </pic:nvPicPr>
+                  <pic:blipFill>
+                    <a:blip r:embed="rId55"/>
+                    <a:stretch>
+                      <a:fillRect/>
+                    </a:stretch>
+                  </pic:blipFill>
+                  <pic:spPr>
+                    <a:xfrm>
+                      <a:off x="0" y="0"/>
+                      <a:ext cx="4411859" cy="1080945"/>
+                    </a:xfrm>
+                    <a:prstGeom prst="rect">
+                      <a:avLst/>
+                    </a:prstGeom>
+                  </pic:spPr>
+                </pic:pic>
+              </a:graphicData>
+            </a:graphic>
+          </wp:inline>
+        </w:drawing>
+      </w:r>
+    </w:p>
+    <w:p>
+      <w:pPr>
+        <w:pStyle w:val="Text"/>
+        <w:rPr>
+          <w:lang w:val="de-AT"/>
+        </w:rPr>
+      </w:pPr>
+      <w:r>
+        <w:rPr>
+          <w:lang w:val="de-AT"/>
+        </w:rPr>
+        <w:t xml:space="preserve">Die Messungen wurden unter nicht optimalen Lichtverhältnissen durchgeführt, wodurch geringfügige Abweichungen zum </w:t>
       </w:r>
       <w:proofErr w:type="spellStart"/>
       <w:r>
         <w:rPr>
           <w:lang w:val="de-AT"/>
         </w:rPr>
-        <w:t>Tiefenmapping</w:t>
+        <w:t>Realmaß</w:t>
       </w:r>
       <w:proofErr w:type="spellEnd"/>
       <w:r>
         <w:rPr>
           <w:lang w:val="de-AT"/>
         </w:rPr>
-        <w:t xml:space="preserve"> der Kamera, wodurch eine reproduzierbare und stabile Messung gewährleistet wird.</w:t>
-      </w:r>
-    </w:p>
-    <w:p>
-      <w:pPr>
-        <w:pStyle w:val="Text"/>
-        <w:rPr>
-          <w:lang w:val="de-AT"/>
-        </w:rPr>
-      </w:pPr>
-    </w:p>
-    <w:p>
-      <w:pPr>
-        <w:pStyle w:val="Text"/>
-        <w:rPr>
-          <w:lang w:val="de-AT"/>
-        </w:rPr>
-      </w:pPr>
-    </w:p>
-    <w:p>
-      <w:pPr>
-        <w:jc w:val="left"/>
-        <w:rPr>
-          <w:lang w:val="de-AT"/>
-        </w:rPr>
-      </w:pPr>
+        <w:t xml:space="preserve"> entstanden. Insgesamt zeigt das Verfahren jedoch eine stabile und für die Anwendung ausreichende Genauigkeit.</w:t>
+      </w:r>
       <w:r>
         <w:rPr>
           <w:lang w:val="de-AT"/>
@@ -11840,7 +12666,7 @@
                     <pic:cNvPicPr/>
                   </pic:nvPicPr>
                   <pic:blipFill>
-                    <a:blip r:embed="rId52"/>
+                    <a:blip r:embed="rId56"/>
                     <a:stretch>
                       <a:fillRect/>
                     </a:stretch>
@@ -12066,7 +12892,21 @@
         <w:rPr>
           <w:lang w:val="de-AT"/>
         </w:rPr>
-        <w:t xml:space="preserve">Die Fotos die zur </w:t>
+        <w:t xml:space="preserve">Die </w:t>
+      </w:r>
+      <w:proofErr w:type="gramStart"/>
+      <w:r>
+        <w:rPr>
+          <w:lang w:val="de-AT"/>
+        </w:rPr>
+        <w:t>Fotos</w:t>
+      </w:r>
+      <w:proofErr w:type="gramEnd"/>
+      <w:r>
+        <w:rPr>
+          <w:lang w:val="de-AT"/>
+        </w:rPr>
+        <w:t xml:space="preserve"> die zur </w:t>
       </w:r>
       <w:r>
         <w:rPr>
@@ -12078,7 +12918,21 @@
         <w:rPr>
           <w:lang w:val="de-AT"/>
         </w:rPr>
-        <w:t xml:space="preserve"> genommen wurden </w:t>
+        <w:t xml:space="preserve"> genommen </w:t>
+      </w:r>
+      <w:proofErr w:type="gramStart"/>
+      <w:r>
+        <w:rPr>
+          <w:lang w:val="de-AT"/>
+        </w:rPr>
+        <w:t>wurden</w:t>
+      </w:r>
+      <w:proofErr w:type="gramEnd"/>
+      <w:r>
+        <w:rPr>
+          <w:lang w:val="de-AT"/>
+        </w:rPr>
+        <w:t xml:space="preserve"> </w:t>
       </w:r>
       <w:r>
         <w:rPr>
@@ -12210,7 +13064,7 @@
                     </pic:cNvPicPr>
                   </pic:nvPicPr>
                   <pic:blipFill>
-                    <a:blip r:embed="rId53" cstate="print">
+                    <a:blip r:embed="rId57" cstate="print">
                       <a:extLst>
                         <a:ext uri="{28A0092B-C50C-407E-A947-70E740481C1C}">
                           <a14:useLocalDpi xmlns:a14="http://schemas.microsoft.com/office/drawing/2010/main" val="0"/>
@@ -12786,8 +13640,16 @@
         <w:rPr>
           <w:lang w:val="de-AT"/>
         </w:rPr>
-        <w:t>Initialisierung der ADCs über den Multiplexer</w:t>
-      </w:r>
+        <w:t xml:space="preserve">Initialisierung der ADCs </w:t>
+      </w:r>
+      <w:proofErr w:type="gramStart"/>
+      <w:r>
+        <w:rPr>
+          <w:lang w:val="de-AT"/>
+        </w:rPr>
+        <w:t>über den Multiplexer</w:t>
+      </w:r>
+      <w:proofErr w:type="gramEnd"/>
     </w:p>
     <w:p>
       <w:pPr>
@@ -13043,14 +13905,28 @@
         <w:rPr>
           <w:color w:val="0066FF"/>
         </w:rPr>
-        <w:t xml:space="preserve">(FV = Text) Diese Abschnitte sind individuell mit Ihren </w:t>
+        <w:t xml:space="preserve">(FV = Text) Diese Abschnitte sind individuell </w:t>
+      </w:r>
+      <w:proofErr w:type="gramStart"/>
+      <w:r>
+        <w:rPr>
+          <w:color w:val="0066FF"/>
+        </w:rPr>
+        <w:t xml:space="preserve">mit Ihren </w:t>
       </w:r>
       <w:proofErr w:type="spellStart"/>
       <w:r>
         <w:rPr>
           <w:color w:val="0066FF"/>
         </w:rPr>
-        <w:t>Betreuer:innen</w:t>
+        <w:t>Betreuer</w:t>
+      </w:r>
+      <w:proofErr w:type="gramEnd"/>
+      <w:r>
+        <w:rPr>
+          <w:color w:val="0066FF"/>
+        </w:rPr>
+        <w:t>:innen</w:t>
       </w:r>
       <w:proofErr w:type="spellEnd"/>
       <w:r>
@@ -13142,7 +14018,21 @@
         <w:rPr>
           <w:color w:val="0066FF"/>
         </w:rPr>
-        <w:t>(FV = Text) Hier werden die wichtigsten Fakten der individuellen Aufgabe des Schülers / der Schülerin kurz zusammengefasst werden.</w:t>
+        <w:t xml:space="preserve">(FV = Text) </w:t>
+      </w:r>
+      <w:proofErr w:type="gramStart"/>
+      <w:r>
+        <w:rPr>
+          <w:color w:val="0066FF"/>
+        </w:rPr>
+        <w:t>Hier</w:t>
+      </w:r>
+      <w:proofErr w:type="gramEnd"/>
+      <w:r>
+        <w:rPr>
+          <w:color w:val="0066FF"/>
+        </w:rPr>
+        <w:t xml:space="preserve"> werden die wichtigsten Fakten der individuellen Aufgabe des Schülers / der Schülerin kurz zusammengefasst werden.</w:t>
       </w:r>
     </w:p>
     <w:p>
@@ -13246,7 +14136,7 @@
       <w:pPr>
         <w:pStyle w:val="Text"/>
         <w:sectPr>
-          <w:headerReference w:type="default" r:id="rId54"/>
+          <w:headerReference w:type="default" r:id="rId58"/>
           <w:pgSz w:w="11906" w:h="16838"/>
           <w:pgMar w:top="1417" w:right="1440" w:bottom="1134" w:left="1440" w:header="708" w:footer="708" w:gutter="0"/>
           <w:cols w:space="720"/>
@@ -13322,7 +14212,7 @@
                     <pic:cNvPicPr/>
                   </pic:nvPicPr>
                   <pic:blipFill>
-                    <a:blip r:embed="rId55"/>
+                    <a:blip r:embed="rId59"/>
                     <a:stretch>
                       <a:fillRect/>
                     </a:stretch>
@@ -13372,7 +14262,7 @@
                     <pic:cNvPicPr/>
                   </pic:nvPicPr>
                   <pic:blipFill>
-                    <a:blip r:embed="rId56"/>
+                    <a:blip r:embed="rId60"/>
                     <a:stretch>
                       <a:fillRect/>
                     </a:stretch>
@@ -13403,6 +14293,7 @@
       </w:pPr>
       <w:r>
         <w:rPr>
+          <w:noProof/>
           <w:color w:val="0066FF"/>
           <w:lang w:val="de-AT"/>
         </w:rPr>
@@ -13424,7 +14315,7 @@
                     </pic:cNvPicPr>
                   </pic:nvPicPr>
                   <pic:blipFill>
-                    <a:blip r:embed="rId57" cstate="print">
+                    <a:blip r:embed="rId61" cstate="print">
                       <a:extLst>
                         <a:ext uri="{28A0092B-C50C-407E-A947-70E740481C1C}">
                           <a14:useLocalDpi xmlns:a14="http://schemas.microsoft.com/office/drawing/2010/main" val="0"/>
@@ -13493,7 +14384,7 @@
                     <pic:cNvPicPr/>
                   </pic:nvPicPr>
                   <pic:blipFill>
-                    <a:blip r:embed="rId58"/>
+                    <a:blip r:embed="rId62"/>
                     <a:stretch>
                       <a:fillRect/>
                     </a:stretch>
@@ -13524,6 +14415,7 @@
       </w:pPr>
       <w:r>
         <w:rPr>
+          <w:noProof/>
           <w:color w:val="0066FF"/>
           <w:lang w:val="de-AT"/>
         </w:rPr>
@@ -13545,7 +14437,7 @@
                     </pic:cNvPicPr>
                   </pic:nvPicPr>
                   <pic:blipFill>
-                    <a:blip r:embed="rId59" cstate="print">
+                    <a:blip r:embed="rId63" cstate="print">
                       <a:extLst>
                         <a:ext uri="{28A0092B-C50C-407E-A947-70E740481C1C}">
                           <a14:useLocalDpi xmlns:a14="http://schemas.microsoft.com/office/drawing/2010/main" val="0"/>
@@ -13628,7 +14520,7 @@
                     <pic:cNvPicPr/>
                   </pic:nvPicPr>
                   <pic:blipFill>
-                    <a:blip r:embed="rId60"/>
+                    <a:blip r:embed="rId64"/>
                     <a:stretch>
                       <a:fillRect/>
                     </a:stretch>
@@ -13791,17 +14683,25 @@
         <w:rPr>
           <w:color w:val="0066FF"/>
         </w:rPr>
-        <w:t>Erweiterung der Funktionalität des vorliegendes Projekts</w:t>
-      </w:r>
+        <w:t xml:space="preserve">Erweiterung der Funktionalität </w:t>
+      </w:r>
+      <w:proofErr w:type="gramStart"/>
+      <w:r>
+        <w:rPr>
+          <w:color w:val="0066FF"/>
+        </w:rPr>
+        <w:t>des vorliegendes Projekts</w:t>
+      </w:r>
+      <w:proofErr w:type="gramEnd"/>
     </w:p>
     <w:p>
       <w:pPr>
         <w:pStyle w:val="Text"/>
         <w:sectPr>
-          <w:headerReference w:type="default" r:id="rId61"/>
-          <w:footerReference w:type="default" r:id="rId62"/>
-          <w:headerReference w:type="first" r:id="rId63"/>
-          <w:footerReference w:type="first" r:id="rId64"/>
+          <w:headerReference w:type="default" r:id="rId65"/>
+          <w:footerReference w:type="default" r:id="rId66"/>
+          <w:headerReference w:type="first" r:id="rId67"/>
+          <w:footerReference w:type="first" r:id="rId68"/>
           <w:pgSz w:w="11906" w:h="16838"/>
           <w:pgMar w:top="1417" w:right="1440" w:bottom="1134" w:left="1440" w:header="708" w:footer="708" w:gutter="0"/>
           <w:cols w:space="720"/>
@@ -13957,10 +14857,10 @@
       <w:pPr>
         <w:pStyle w:val="Text"/>
         <w:sectPr>
-          <w:headerReference w:type="default" r:id="rId65"/>
-          <w:footerReference w:type="default" r:id="rId66"/>
-          <w:headerReference w:type="first" r:id="rId67"/>
-          <w:footerReference w:type="first" r:id="rId68"/>
+          <w:headerReference w:type="default" r:id="rId69"/>
+          <w:footerReference w:type="default" r:id="rId70"/>
+          <w:headerReference w:type="first" r:id="rId71"/>
+          <w:footerReference w:type="first" r:id="rId72"/>
           <w:pgSz w:w="11906" w:h="16838"/>
           <w:pgMar w:top="1417" w:right="1440" w:bottom="1134" w:left="1440" w:header="708" w:footer="708" w:gutter="0"/>
           <w:cols w:space="720"/>
@@ -13973,10 +14873,10 @@
       <w:pPr>
         <w:pStyle w:val="berschrift1"/>
         <w:sectPr>
-          <w:headerReference w:type="default" r:id="rId69"/>
-          <w:footerReference w:type="default" r:id="rId70"/>
-          <w:headerReference w:type="first" r:id="rId71"/>
-          <w:footerReference w:type="first" r:id="rId72"/>
+          <w:headerReference w:type="default" r:id="rId73"/>
+          <w:footerReference w:type="default" r:id="rId74"/>
+          <w:headerReference w:type="first" r:id="rId75"/>
+          <w:footerReference w:type="first" r:id="rId76"/>
           <w:pgSz w:w="11906" w:h="16838"/>
           <w:pgMar w:top="1417" w:right="1440" w:bottom="1134" w:left="1440" w:header="708" w:footer="708" w:gutter="0"/>
           <w:cols w:space="720"/>
@@ -14119,7 +15019,21 @@
         <w:rPr>
           <w:color w:val="0066FF"/>
         </w:rPr>
-        <w:t>(FV Text)</w:t>
+        <w:t>(</w:t>
+      </w:r>
+      <w:proofErr w:type="gramStart"/>
+      <w:r>
+        <w:rPr>
+          <w:color w:val="0066FF"/>
+        </w:rPr>
+        <w:t>FV Text</w:t>
+      </w:r>
+      <w:proofErr w:type="gramEnd"/>
+      <w:r>
+        <w:rPr>
+          <w:color w:val="0066FF"/>
+        </w:rPr>
+        <w:t>)</w:t>
       </w:r>
       <w:bookmarkStart w:id="114" w:name="_Toc211138172"/>
       <w:bookmarkStart w:id="115" w:name="_Toc211137928"/>
@@ -14162,7 +15076,21 @@
         <w:rPr>
           <w:color w:val="0066FF"/>
         </w:rPr>
-        <w:t>(FV Text) Optionaler Abschnitt. Nur verwenden, wenn mehr als 10 verschiedene Tabellen im gesamten Dokument vorkommen.</w:t>
+        <w:t>(</w:t>
+      </w:r>
+      <w:proofErr w:type="gramStart"/>
+      <w:r>
+        <w:rPr>
+          <w:color w:val="0066FF"/>
+        </w:rPr>
+        <w:t>FV Text</w:t>
+      </w:r>
+      <w:proofErr w:type="gramEnd"/>
+      <w:r>
+        <w:rPr>
+          <w:color w:val="0066FF"/>
+        </w:rPr>
+        <w:t>) Optionaler Abschnitt. Nur verwenden, wenn mehr als 10 verschiedene Tabellen im gesamten Dokument vorkommen.</w:t>
       </w:r>
     </w:p>
     <w:p/>
@@ -14203,26 +15131,40 @@
         <w:rPr>
           <w:color w:val="0066FF"/>
         </w:rPr>
-        <w:t>(FV Text) Optionaler Abschnitt. Nur verwenden, wenn mehr als 10 verschiedene Bilder im gesamten Dokument vorkommen.</w:t>
-      </w:r>
-    </w:p>
-    <w:p>
-      <w:pPr>
+        <w:t>(</w:t>
+      </w:r>
+      <w:proofErr w:type="gramStart"/>
+      <w:r>
         <w:rPr>
           <w:color w:val="0066FF"/>
         </w:rPr>
-      </w:pPr>
-    </w:p>
-    <w:p>
-      <w:pPr>
+        <w:t>FV Text</w:t>
+      </w:r>
+      <w:proofErr w:type="gramEnd"/>
+      <w:r>
         <w:rPr>
           <w:color w:val="0066FF"/>
         </w:rPr>
+        <w:t>) Optionaler Abschnitt. Nur verwenden, wenn mehr als 10 verschiedene Bilder im gesamten Dokument vorkommen.</w:t>
+      </w:r>
+    </w:p>
+    <w:p>
+      <w:pPr>
+        <w:rPr>
+          <w:color w:val="0066FF"/>
+        </w:rPr>
+      </w:pPr>
+    </w:p>
+    <w:p>
+      <w:pPr>
+        <w:rPr>
+          <w:color w:val="0066FF"/>
+        </w:rPr>
         <w:sectPr>
-          <w:headerReference w:type="default" r:id="rId73"/>
-          <w:footerReference w:type="default" r:id="rId74"/>
-          <w:headerReference w:type="first" r:id="rId75"/>
-          <w:footerReference w:type="first" r:id="rId76"/>
+          <w:headerReference w:type="default" r:id="rId77"/>
+          <w:footerReference w:type="default" r:id="rId78"/>
+          <w:headerReference w:type="first" r:id="rId79"/>
+          <w:footerReference w:type="first" r:id="rId80"/>
           <w:pgSz w:w="11906" w:h="16838"/>
           <w:pgMar w:top="1417" w:right="1440" w:bottom="1134" w:left="1440" w:header="708" w:footer="708" w:gutter="0"/>
           <w:cols w:space="720"/>
@@ -14265,7 +15207,21 @@
         <w:rPr>
           <w:color w:val="0066FF"/>
         </w:rPr>
-        <w:t>(FV Text) Optionales Kapitel. Hier werden Datenblätter, große Zeichnungen, Skizzen, Bilder, etc. eingefügt, die im Fließtext der vorigen Kapitel nicht eingefügt werden, da sie dort die Übersichtlichkeit bzw. Struktur dieser Kapitel verschlechtern würden.</w:t>
+        <w:t>(</w:t>
+      </w:r>
+      <w:proofErr w:type="gramStart"/>
+      <w:r>
+        <w:rPr>
+          <w:color w:val="0066FF"/>
+        </w:rPr>
+        <w:t>FV Text</w:t>
+      </w:r>
+      <w:proofErr w:type="gramEnd"/>
+      <w:r>
+        <w:rPr>
+          <w:color w:val="0066FF"/>
+        </w:rPr>
+        <w:t>) Optionales Kapitel. Hier werden Datenblätter, große Zeichnungen, Skizzen, Bilder, etc. eingefügt, die im Fließtext der vorigen Kapitel nicht eingefügt werden, da sie dort die Übersichtlichkeit bzw. Struktur dieser Kapitel verschlechtern würden.</w:t>
       </w:r>
       <w:bookmarkEnd w:id="136"/>
       <w:bookmarkEnd w:id="137"/>
@@ -14295,10 +15251,10 @@
       </w:pPr>
     </w:p>
     <w:sectPr>
-      <w:headerReference w:type="default" r:id="rId77"/>
-      <w:footerReference w:type="default" r:id="rId78"/>
-      <w:headerReference w:type="first" r:id="rId79"/>
-      <w:footerReference w:type="first" r:id="rId80"/>
+      <w:headerReference w:type="default" r:id="rId81"/>
+      <w:footerReference w:type="default" r:id="rId82"/>
+      <w:headerReference w:type="first" r:id="rId83"/>
+      <w:footerReference w:type="first" r:id="rId84"/>
       <w:pgSz w:w="11906" w:h="16838"/>
       <w:pgMar w:top="1417" w:right="1440" w:bottom="1134" w:left="1440" w:header="708" w:footer="708" w:gutter="0"/>
       <w:cols w:space="720"/>
@@ -14976,8 +15932,13 @@
       </w:pBdr>
     </w:pPr>
     <w:r>
-      <w:t>Granegger Felix</w:t>
+      <w:t xml:space="preserve">Granegger </w:t>
     </w:r>
+    <w:proofErr w:type="gramStart"/>
+    <w:r>
+      <w:t>Felix</w:t>
+    </w:r>
+    <w:proofErr w:type="gramEnd"/>
     <w:r>
       <w:tab/>
       <w:t>Kapitel 2</w:t>
@@ -16508,6 +17469,155 @@
     </w:lvl>
   </w:abstractNum>
   <w:abstractNum w:abstractNumId="3" w15:restartNumberingAfterBreak="0">
+    <w:nsid w:val="0DF404C1"/>
+    <w:multiLevelType w:val="multilevel"/>
+    <w:tmpl w:val="22F8E1A0"/>
+    <w:lvl w:ilvl="0">
+      <w:start w:val="1"/>
+      <w:numFmt w:val="bullet"/>
+      <w:lvlText w:val=""/>
+      <w:lvlJc w:val="left"/>
+      <w:pPr>
+        <w:tabs>
+          <w:tab w:val="num" w:pos="720"/>
+        </w:tabs>
+        <w:ind w:left="720" w:hanging="360"/>
+      </w:pPr>
+      <w:rPr>
+        <w:rFonts w:ascii="Symbol" w:hAnsi="Symbol" w:hint="default"/>
+        <w:sz w:val="20"/>
+      </w:rPr>
+    </w:lvl>
+    <w:lvl w:ilvl="1" w:tentative="1">
+      <w:start w:val="1"/>
+      <w:numFmt w:val="bullet"/>
+      <w:lvlText w:val="o"/>
+      <w:lvlJc w:val="left"/>
+      <w:pPr>
+        <w:tabs>
+          <w:tab w:val="num" w:pos="1440"/>
+        </w:tabs>
+        <w:ind w:left="1440" w:hanging="360"/>
+      </w:pPr>
+      <w:rPr>
+        <w:rFonts w:ascii="Courier New" w:hAnsi="Courier New" w:hint="default"/>
+        <w:sz w:val="20"/>
+      </w:rPr>
+    </w:lvl>
+    <w:lvl w:ilvl="2" w:tentative="1">
+      <w:start w:val="1"/>
+      <w:numFmt w:val="bullet"/>
+      <w:lvlText w:val=""/>
+      <w:lvlJc w:val="left"/>
+      <w:pPr>
+        <w:tabs>
+          <w:tab w:val="num" w:pos="2160"/>
+        </w:tabs>
+        <w:ind w:left="2160" w:hanging="360"/>
+      </w:pPr>
+      <w:rPr>
+        <w:rFonts w:ascii="Wingdings" w:hAnsi="Wingdings" w:hint="default"/>
+        <w:sz w:val="20"/>
+      </w:rPr>
+    </w:lvl>
+    <w:lvl w:ilvl="3" w:tentative="1">
+      <w:start w:val="1"/>
+      <w:numFmt w:val="bullet"/>
+      <w:lvlText w:val=""/>
+      <w:lvlJc w:val="left"/>
+      <w:pPr>
+        <w:tabs>
+          <w:tab w:val="num" w:pos="2880"/>
+        </w:tabs>
+        <w:ind w:left="2880" w:hanging="360"/>
+      </w:pPr>
+      <w:rPr>
+        <w:rFonts w:ascii="Wingdings" w:hAnsi="Wingdings" w:hint="default"/>
+        <w:sz w:val="20"/>
+      </w:rPr>
+    </w:lvl>
+    <w:lvl w:ilvl="4" w:tentative="1">
+      <w:start w:val="1"/>
+      <w:numFmt w:val="bullet"/>
+      <w:lvlText w:val=""/>
+      <w:lvlJc w:val="left"/>
+      <w:pPr>
+        <w:tabs>
+          <w:tab w:val="num" w:pos="3600"/>
+        </w:tabs>
+        <w:ind w:left="3600" w:hanging="360"/>
+      </w:pPr>
+      <w:rPr>
+        <w:rFonts w:ascii="Wingdings" w:hAnsi="Wingdings" w:hint="default"/>
+        <w:sz w:val="20"/>
+      </w:rPr>
+    </w:lvl>
+    <w:lvl w:ilvl="5" w:tentative="1">
+      <w:start w:val="1"/>
+      <w:numFmt w:val="bullet"/>
+      <w:lvlText w:val=""/>
+      <w:lvlJc w:val="left"/>
+      <w:pPr>
+        <w:tabs>
+          <w:tab w:val="num" w:pos="4320"/>
+        </w:tabs>
+        <w:ind w:left="4320" w:hanging="360"/>
+      </w:pPr>
+      <w:rPr>
+        <w:rFonts w:ascii="Wingdings" w:hAnsi="Wingdings" w:hint="default"/>
+        <w:sz w:val="20"/>
+      </w:rPr>
+    </w:lvl>
+    <w:lvl w:ilvl="6" w:tentative="1">
+      <w:start w:val="1"/>
+      <w:numFmt w:val="bullet"/>
+      <w:lvlText w:val=""/>
+      <w:lvlJc w:val="left"/>
+      <w:pPr>
+        <w:tabs>
+          <w:tab w:val="num" w:pos="5040"/>
+        </w:tabs>
+        <w:ind w:left="5040" w:hanging="360"/>
+      </w:pPr>
+      <w:rPr>
+        <w:rFonts w:ascii="Wingdings" w:hAnsi="Wingdings" w:hint="default"/>
+        <w:sz w:val="20"/>
+      </w:rPr>
+    </w:lvl>
+    <w:lvl w:ilvl="7" w:tentative="1">
+      <w:start w:val="1"/>
+      <w:numFmt w:val="bullet"/>
+      <w:lvlText w:val=""/>
+      <w:lvlJc w:val="left"/>
+      <w:pPr>
+        <w:tabs>
+          <w:tab w:val="num" w:pos="5760"/>
+        </w:tabs>
+        <w:ind w:left="5760" w:hanging="360"/>
+      </w:pPr>
+      <w:rPr>
+        <w:rFonts w:ascii="Wingdings" w:hAnsi="Wingdings" w:hint="default"/>
+        <w:sz w:val="20"/>
+      </w:rPr>
+    </w:lvl>
+    <w:lvl w:ilvl="8" w:tentative="1">
+      <w:start w:val="1"/>
+      <w:numFmt w:val="bullet"/>
+      <w:lvlText w:val=""/>
+      <w:lvlJc w:val="left"/>
+      <w:pPr>
+        <w:tabs>
+          <w:tab w:val="num" w:pos="6480"/>
+        </w:tabs>
+        <w:ind w:left="6480" w:hanging="360"/>
+      </w:pPr>
+      <w:rPr>
+        <w:rFonts w:ascii="Wingdings" w:hAnsi="Wingdings" w:hint="default"/>
+        <w:sz w:val="20"/>
+      </w:rPr>
+    </w:lvl>
+  </w:abstractNum>
+  <w:abstractNum w:abstractNumId="4" w15:restartNumberingAfterBreak="0">
     <w:nsid w:val="115B7327"/>
     <w:multiLevelType w:val="multilevel"/>
     <w:tmpl w:val="F648ED86"/>
@@ -16621,7 +17731,7 @@
       </w:pPr>
     </w:lvl>
   </w:abstractNum>
-  <w:abstractNum w:abstractNumId="4" w15:restartNumberingAfterBreak="0">
+  <w:abstractNum w:abstractNumId="5" w15:restartNumberingAfterBreak="0">
     <w:nsid w:val="14F656A7"/>
     <w:multiLevelType w:val="hybridMultilevel"/>
     <w:tmpl w:val="3570737A"/>
@@ -16734,7 +17844,7 @@
       </w:rPr>
     </w:lvl>
   </w:abstractNum>
-  <w:abstractNum w:abstractNumId="5" w15:restartNumberingAfterBreak="0">
+  <w:abstractNum w:abstractNumId="6" w15:restartNumberingAfterBreak="0">
     <w:nsid w:val="1E251737"/>
     <w:multiLevelType w:val="multilevel"/>
     <w:tmpl w:val="A26A3AF4"/>
@@ -16874,7 +17984,7 @@
       </w:rPr>
     </w:lvl>
   </w:abstractNum>
-  <w:abstractNum w:abstractNumId="6" w15:restartNumberingAfterBreak="0">
+  <w:abstractNum w:abstractNumId="7" w15:restartNumberingAfterBreak="0">
     <w:nsid w:val="1F5B0C4D"/>
     <w:multiLevelType w:val="multilevel"/>
     <w:tmpl w:val="46406A3E"/>
@@ -16990,7 +18100,7 @@
       </w:pPr>
     </w:lvl>
   </w:abstractNum>
-  <w:abstractNum w:abstractNumId="7" w15:restartNumberingAfterBreak="0">
+  <w:abstractNum w:abstractNumId="8" w15:restartNumberingAfterBreak="0">
     <w:nsid w:val="1FB92E25"/>
     <w:multiLevelType w:val="multilevel"/>
     <w:tmpl w:val="EF925F62"/>
@@ -17104,7 +18214,7 @@
       </w:pPr>
     </w:lvl>
   </w:abstractNum>
-  <w:abstractNum w:abstractNumId="8" w15:restartNumberingAfterBreak="0">
+  <w:abstractNum w:abstractNumId="9" w15:restartNumberingAfterBreak="0">
     <w:nsid w:val="211F54D0"/>
     <w:multiLevelType w:val="multilevel"/>
     <w:tmpl w:val="FC50420A"/>
@@ -17244,7 +18354,7 @@
       </w:rPr>
     </w:lvl>
   </w:abstractNum>
-  <w:abstractNum w:abstractNumId="9" w15:restartNumberingAfterBreak="0">
+  <w:abstractNum w:abstractNumId="10" w15:restartNumberingAfterBreak="0">
     <w:nsid w:val="24C56478"/>
     <w:multiLevelType w:val="multilevel"/>
     <w:tmpl w:val="30327A96"/>
@@ -17358,7 +18468,7 @@
       </w:pPr>
     </w:lvl>
   </w:abstractNum>
-  <w:abstractNum w:abstractNumId="10" w15:restartNumberingAfterBreak="0">
+  <w:abstractNum w:abstractNumId="11" w15:restartNumberingAfterBreak="0">
     <w:nsid w:val="25E87F22"/>
     <w:multiLevelType w:val="hybridMultilevel"/>
     <w:tmpl w:val="FE4AF340"/>
@@ -17471,7 +18581,7 @@
       </w:rPr>
     </w:lvl>
   </w:abstractNum>
-  <w:abstractNum w:abstractNumId="11" w15:restartNumberingAfterBreak="0">
+  <w:abstractNum w:abstractNumId="12" w15:restartNumberingAfterBreak="0">
     <w:nsid w:val="26D02D09"/>
     <w:multiLevelType w:val="hybridMultilevel"/>
     <w:tmpl w:val="B5C4B2BC"/>
@@ -17584,7 +18694,7 @@
       </w:rPr>
     </w:lvl>
   </w:abstractNum>
-  <w:abstractNum w:abstractNumId="12" w15:restartNumberingAfterBreak="0">
+  <w:abstractNum w:abstractNumId="13" w15:restartNumberingAfterBreak="0">
     <w:nsid w:val="29F5684E"/>
     <w:multiLevelType w:val="multilevel"/>
     <w:tmpl w:val="ADBEDCB6"/>
@@ -17733,7 +18843,7 @@
       </w:rPr>
     </w:lvl>
   </w:abstractNum>
-  <w:abstractNum w:abstractNumId="13" w15:restartNumberingAfterBreak="0">
+  <w:abstractNum w:abstractNumId="14" w15:restartNumberingAfterBreak="0">
     <w:nsid w:val="29FF513E"/>
     <w:multiLevelType w:val="hybridMultilevel"/>
     <w:tmpl w:val="005AEBF2"/>
@@ -17846,7 +18956,7 @@
       </w:rPr>
     </w:lvl>
   </w:abstractNum>
-  <w:abstractNum w:abstractNumId="14" w15:restartNumberingAfterBreak="0">
+  <w:abstractNum w:abstractNumId="15" w15:restartNumberingAfterBreak="0">
     <w:nsid w:val="2E1B6EF7"/>
     <w:multiLevelType w:val="hybridMultilevel"/>
     <w:tmpl w:val="9C3AE9FC"/>
@@ -17959,7 +19069,7 @@
       </w:rPr>
     </w:lvl>
   </w:abstractNum>
-  <w:abstractNum w:abstractNumId="15" w15:restartNumberingAfterBreak="0">
+  <w:abstractNum w:abstractNumId="16" w15:restartNumberingAfterBreak="0">
     <w:nsid w:val="30C22CBE"/>
     <w:multiLevelType w:val="multilevel"/>
     <w:tmpl w:val="4094D450"/>
@@ -18108,7 +19218,7 @@
       </w:rPr>
     </w:lvl>
   </w:abstractNum>
-  <w:abstractNum w:abstractNumId="16" w15:restartNumberingAfterBreak="0">
+  <w:abstractNum w:abstractNumId="17" w15:restartNumberingAfterBreak="0">
     <w:nsid w:val="30EA4759"/>
     <w:multiLevelType w:val="multilevel"/>
     <w:tmpl w:val="D31E9D38"/>
@@ -18257,7 +19367,7 @@
       </w:rPr>
     </w:lvl>
   </w:abstractNum>
-  <w:abstractNum w:abstractNumId="17" w15:restartNumberingAfterBreak="0">
+  <w:abstractNum w:abstractNumId="18" w15:restartNumberingAfterBreak="0">
     <w:nsid w:val="313914E0"/>
     <w:multiLevelType w:val="multilevel"/>
     <w:tmpl w:val="33CEEAD8"/>
@@ -18406,7 +19516,7 @@
       </w:rPr>
     </w:lvl>
   </w:abstractNum>
-  <w:abstractNum w:abstractNumId="18" w15:restartNumberingAfterBreak="0">
+  <w:abstractNum w:abstractNumId="19" w15:restartNumberingAfterBreak="0">
     <w:nsid w:val="323964BC"/>
     <w:multiLevelType w:val="multilevel"/>
     <w:tmpl w:val="75E682C0"/>
@@ -18520,7 +19630,7 @@
       </w:pPr>
     </w:lvl>
   </w:abstractNum>
-  <w:abstractNum w:abstractNumId="19" w15:restartNumberingAfterBreak="0">
+  <w:abstractNum w:abstractNumId="20" w15:restartNumberingAfterBreak="0">
     <w:nsid w:val="39025347"/>
     <w:multiLevelType w:val="multilevel"/>
     <w:tmpl w:val="31F83E7A"/>
@@ -18669,7 +19779,7 @@
       </w:rPr>
     </w:lvl>
   </w:abstractNum>
-  <w:abstractNum w:abstractNumId="20" w15:restartNumberingAfterBreak="0">
+  <w:abstractNum w:abstractNumId="21" w15:restartNumberingAfterBreak="0">
     <w:nsid w:val="3AA758A0"/>
     <w:multiLevelType w:val="hybridMultilevel"/>
     <w:tmpl w:val="70085ABA"/>
@@ -18782,7 +19892,7 @@
       </w:rPr>
     </w:lvl>
   </w:abstractNum>
-  <w:abstractNum w:abstractNumId="21" w15:restartNumberingAfterBreak="0">
+  <w:abstractNum w:abstractNumId="22" w15:restartNumberingAfterBreak="0">
     <w:nsid w:val="3E963E16"/>
     <w:multiLevelType w:val="multilevel"/>
     <w:tmpl w:val="3B685D2C"/>
@@ -18931,7 +20041,7 @@
       </w:rPr>
     </w:lvl>
   </w:abstractNum>
-  <w:abstractNum w:abstractNumId="22" w15:restartNumberingAfterBreak="0">
+  <w:abstractNum w:abstractNumId="23" w15:restartNumberingAfterBreak="0">
     <w:nsid w:val="3FE02D2E"/>
     <w:multiLevelType w:val="multilevel"/>
     <w:tmpl w:val="D618E11A"/>
@@ -19080,7 +20190,7 @@
       </w:rPr>
     </w:lvl>
   </w:abstractNum>
-  <w:abstractNum w:abstractNumId="23" w15:restartNumberingAfterBreak="0">
+  <w:abstractNum w:abstractNumId="24" w15:restartNumberingAfterBreak="0">
     <w:nsid w:val="436E0DC6"/>
     <w:multiLevelType w:val="multilevel"/>
     <w:tmpl w:val="461873D8"/>
@@ -19229,7 +20339,7 @@
       </w:rPr>
     </w:lvl>
   </w:abstractNum>
-  <w:abstractNum w:abstractNumId="24" w15:restartNumberingAfterBreak="0">
+  <w:abstractNum w:abstractNumId="25" w15:restartNumberingAfterBreak="0">
     <w:nsid w:val="4F424F7C"/>
     <w:multiLevelType w:val="multilevel"/>
     <w:tmpl w:val="192E5758"/>
@@ -19378,7 +20488,7 @@
       </w:rPr>
     </w:lvl>
   </w:abstractNum>
-  <w:abstractNum w:abstractNumId="25" w15:restartNumberingAfterBreak="0">
+  <w:abstractNum w:abstractNumId="26" w15:restartNumberingAfterBreak="0">
     <w:nsid w:val="509E0DC7"/>
     <w:multiLevelType w:val="hybridMultilevel"/>
     <w:tmpl w:val="5E0EC66E"/>
@@ -19491,7 +20601,7 @@
       </w:rPr>
     </w:lvl>
   </w:abstractNum>
-  <w:abstractNum w:abstractNumId="26" w15:restartNumberingAfterBreak="0">
+  <w:abstractNum w:abstractNumId="27" w15:restartNumberingAfterBreak="0">
     <w:nsid w:val="55A0278F"/>
     <w:multiLevelType w:val="multilevel"/>
     <w:tmpl w:val="AB9C1A34"/>
@@ -19605,7 +20715,7 @@
       </w:pPr>
     </w:lvl>
   </w:abstractNum>
-  <w:abstractNum w:abstractNumId="27" w15:restartNumberingAfterBreak="0">
+  <w:abstractNum w:abstractNumId="28" w15:restartNumberingAfterBreak="0">
     <w:nsid w:val="5D903A8D"/>
     <w:multiLevelType w:val="multilevel"/>
     <w:tmpl w:val="CC102D3C"/>
@@ -19719,7 +20829,7 @@
       </w:pPr>
     </w:lvl>
   </w:abstractNum>
-  <w:abstractNum w:abstractNumId="28" w15:restartNumberingAfterBreak="0">
+  <w:abstractNum w:abstractNumId="29" w15:restartNumberingAfterBreak="0">
     <w:nsid w:val="5EA1005D"/>
     <w:multiLevelType w:val="multilevel"/>
     <w:tmpl w:val="3F6C75F2"/>
@@ -19832,7 +20942,7 @@
       </w:pPr>
     </w:lvl>
   </w:abstractNum>
-  <w:abstractNum w:abstractNumId="29" w15:restartNumberingAfterBreak="0">
+  <w:abstractNum w:abstractNumId="30" w15:restartNumberingAfterBreak="0">
     <w:nsid w:val="5EC5797E"/>
     <w:multiLevelType w:val="multilevel"/>
     <w:tmpl w:val="49023F0A"/>
@@ -19958,7 +21068,7 @@
       </w:pPr>
     </w:lvl>
   </w:abstractNum>
-  <w:abstractNum w:abstractNumId="30" w15:restartNumberingAfterBreak="0">
+  <w:abstractNum w:abstractNumId="31" w15:restartNumberingAfterBreak="0">
     <w:nsid w:val="5F1D23A4"/>
     <w:multiLevelType w:val="multilevel"/>
     <w:tmpl w:val="1CA43AE2"/>
@@ -20107,7 +21217,7 @@
       </w:rPr>
     </w:lvl>
   </w:abstractNum>
-  <w:abstractNum w:abstractNumId="31" w15:restartNumberingAfterBreak="0">
+  <w:abstractNum w:abstractNumId="32" w15:restartNumberingAfterBreak="0">
     <w:nsid w:val="5F69081C"/>
     <w:multiLevelType w:val="multilevel"/>
     <w:tmpl w:val="7DF49EFA"/>
@@ -20256,7 +21366,7 @@
       </w:rPr>
     </w:lvl>
   </w:abstractNum>
-  <w:abstractNum w:abstractNumId="32" w15:restartNumberingAfterBreak="0">
+  <w:abstractNum w:abstractNumId="33" w15:restartNumberingAfterBreak="0">
     <w:nsid w:val="665D4CBB"/>
     <w:multiLevelType w:val="multilevel"/>
     <w:tmpl w:val="E60CE398"/>
@@ -20373,7 +21483,7 @@
       </w:pPr>
     </w:lvl>
   </w:abstractNum>
-  <w:abstractNum w:abstractNumId="33" w15:restartNumberingAfterBreak="0">
+  <w:abstractNum w:abstractNumId="34" w15:restartNumberingAfterBreak="0">
     <w:nsid w:val="69DA26B3"/>
     <w:multiLevelType w:val="hybridMultilevel"/>
     <w:tmpl w:val="C6FA130E"/>
@@ -20486,7 +21596,7 @@
       </w:rPr>
     </w:lvl>
   </w:abstractNum>
-  <w:abstractNum w:abstractNumId="34" w15:restartNumberingAfterBreak="0">
+  <w:abstractNum w:abstractNumId="35" w15:restartNumberingAfterBreak="0">
     <w:nsid w:val="6EBC7844"/>
     <w:multiLevelType w:val="multilevel"/>
     <w:tmpl w:val="36EC8B8C"/>
@@ -20635,7 +21745,7 @@
       </w:rPr>
     </w:lvl>
   </w:abstractNum>
-  <w:abstractNum w:abstractNumId="35" w15:restartNumberingAfterBreak="0">
+  <w:abstractNum w:abstractNumId="36" w15:restartNumberingAfterBreak="0">
     <w:nsid w:val="719B250E"/>
     <w:multiLevelType w:val="multilevel"/>
     <w:tmpl w:val="8334D66A"/>
@@ -20775,7 +21885,7 @@
       </w:rPr>
     </w:lvl>
   </w:abstractNum>
-  <w:abstractNum w:abstractNumId="36" w15:restartNumberingAfterBreak="0">
+  <w:abstractNum w:abstractNumId="37" w15:restartNumberingAfterBreak="0">
     <w:nsid w:val="73DA38DA"/>
     <w:multiLevelType w:val="multilevel"/>
     <w:tmpl w:val="5F56F602"/>
@@ -20888,7 +21998,7 @@
       </w:pPr>
     </w:lvl>
   </w:abstractNum>
-  <w:abstractNum w:abstractNumId="37" w15:restartNumberingAfterBreak="0">
+  <w:abstractNum w:abstractNumId="38" w15:restartNumberingAfterBreak="0">
     <w:nsid w:val="75A17E70"/>
     <w:multiLevelType w:val="multilevel"/>
     <w:tmpl w:val="C534194C"/>
@@ -21037,7 +22147,7 @@
       </w:rPr>
     </w:lvl>
   </w:abstractNum>
-  <w:abstractNum w:abstractNumId="38" w15:restartNumberingAfterBreak="0">
+  <w:abstractNum w:abstractNumId="39" w15:restartNumberingAfterBreak="0">
     <w:nsid w:val="78117A9A"/>
     <w:multiLevelType w:val="multilevel"/>
     <w:tmpl w:val="5B706B8C"/>
@@ -21186,7 +22296,7 @@
       </w:rPr>
     </w:lvl>
   </w:abstractNum>
-  <w:abstractNum w:abstractNumId="39" w15:restartNumberingAfterBreak="0">
+  <w:abstractNum w:abstractNumId="40" w15:restartNumberingAfterBreak="0">
     <w:nsid w:val="7BD31CC0"/>
     <w:multiLevelType w:val="multilevel"/>
     <w:tmpl w:val="67BC28FC"/>
@@ -21326,7 +22436,7 @@
       </w:rPr>
     </w:lvl>
   </w:abstractNum>
-  <w:abstractNum w:abstractNumId="40" w15:restartNumberingAfterBreak="0">
+  <w:abstractNum w:abstractNumId="41" w15:restartNumberingAfterBreak="0">
     <w:nsid w:val="7DAB64FA"/>
     <w:multiLevelType w:val="multilevel"/>
     <w:tmpl w:val="90AEDF7E"/>
@@ -21442,7 +22552,7 @@
       </w:pPr>
     </w:lvl>
   </w:abstractNum>
-  <w:abstractNum w:abstractNumId="41" w15:restartNumberingAfterBreak="0">
+  <w:abstractNum w:abstractNumId="42" w15:restartNumberingAfterBreak="0">
     <w:nsid w:val="7E18221F"/>
     <w:multiLevelType w:val="hybridMultilevel"/>
     <w:tmpl w:val="94EA5AF2"/>
@@ -21556,130 +22666,133 @@
     </w:lvl>
   </w:abstractNum>
   <w:num w:numId="1" w16cid:durableId="982929152">
-    <w:abstractNumId w:val="3"/>
+    <w:abstractNumId w:val="4"/>
   </w:num>
   <w:num w:numId="2" w16cid:durableId="151064096">
+    <w:abstractNumId w:val="28"/>
+  </w:num>
+  <w:num w:numId="3" w16cid:durableId="696661172">
+    <w:abstractNumId w:val="16"/>
+  </w:num>
+  <w:num w:numId="4" w16cid:durableId="1915779622">
+    <w:abstractNumId w:val="30"/>
+  </w:num>
+  <w:num w:numId="5" w16cid:durableId="1858688818">
+    <w:abstractNumId w:val="10"/>
+  </w:num>
+  <w:num w:numId="6" w16cid:durableId="807819139">
     <w:abstractNumId w:val="27"/>
   </w:num>
-  <w:num w:numId="3" w16cid:durableId="696661172">
-    <w:abstractNumId w:val="15"/>
-  </w:num>
-  <w:num w:numId="4" w16cid:durableId="1915779622">
-    <w:abstractNumId w:val="29"/>
-  </w:num>
-  <w:num w:numId="5" w16cid:durableId="1858688818">
-    <w:abstractNumId w:val="9"/>
-  </w:num>
-  <w:num w:numId="6" w16cid:durableId="807819139">
-    <w:abstractNumId w:val="26"/>
-  </w:num>
   <w:num w:numId="7" w16cid:durableId="1496384867">
-    <w:abstractNumId w:val="18"/>
+    <w:abstractNumId w:val="19"/>
   </w:num>
   <w:num w:numId="8" w16cid:durableId="911082857">
-    <w:abstractNumId w:val="7"/>
+    <w:abstractNumId w:val="8"/>
   </w:num>
   <w:num w:numId="9" w16cid:durableId="1090587333">
     <w:abstractNumId w:val="2"/>
   </w:num>
   <w:num w:numId="10" w16cid:durableId="260797068">
+    <w:abstractNumId w:val="40"/>
+  </w:num>
+  <w:num w:numId="11" w16cid:durableId="1712150709">
+    <w:abstractNumId w:val="36"/>
+  </w:num>
+  <w:num w:numId="12" w16cid:durableId="801771444">
+    <w:abstractNumId w:val="9"/>
+  </w:num>
+  <w:num w:numId="13" w16cid:durableId="739180959">
+    <w:abstractNumId w:val="6"/>
+  </w:num>
+  <w:num w:numId="14" w16cid:durableId="164512757">
+    <w:abstractNumId w:val="33"/>
+  </w:num>
+  <w:num w:numId="15" w16cid:durableId="1745376944">
+    <w:abstractNumId w:val="22"/>
+  </w:num>
+  <w:num w:numId="16" w16cid:durableId="2112626617">
+    <w:abstractNumId w:val="38"/>
+  </w:num>
+  <w:num w:numId="17" w16cid:durableId="2069179764">
+    <w:abstractNumId w:val="42"/>
+  </w:num>
+  <w:num w:numId="18" w16cid:durableId="756824728">
+    <w:abstractNumId w:val="20"/>
+  </w:num>
+  <w:num w:numId="19" w16cid:durableId="1680959368">
+    <w:abstractNumId w:val="14"/>
+  </w:num>
+  <w:num w:numId="20" w16cid:durableId="1083529391">
+    <w:abstractNumId w:val="24"/>
+  </w:num>
+  <w:num w:numId="21" w16cid:durableId="670303952">
     <w:abstractNumId w:val="39"/>
   </w:num>
-  <w:num w:numId="11" w16cid:durableId="1712150709">
-    <w:abstractNumId w:val="35"/>
-  </w:num>
-  <w:num w:numId="12" w16cid:durableId="801771444">
-    <w:abstractNumId w:val="8"/>
-  </w:num>
-  <w:num w:numId="13" w16cid:durableId="739180959">
-    <w:abstractNumId w:val="5"/>
-  </w:num>
-  <w:num w:numId="14" w16cid:durableId="164512757">
-    <w:abstractNumId w:val="32"/>
-  </w:num>
-  <w:num w:numId="15" w16cid:durableId="1745376944">
-    <w:abstractNumId w:val="21"/>
-  </w:num>
-  <w:num w:numId="16" w16cid:durableId="2112626617">
-    <w:abstractNumId w:val="37"/>
-  </w:num>
-  <w:num w:numId="17" w16cid:durableId="2069179764">
-    <w:abstractNumId w:val="41"/>
-  </w:num>
-  <w:num w:numId="18" w16cid:durableId="756824728">
-    <w:abstractNumId w:val="19"/>
-  </w:num>
-  <w:num w:numId="19" w16cid:durableId="1680959368">
-    <w:abstractNumId w:val="13"/>
-  </w:num>
-  <w:num w:numId="20" w16cid:durableId="1083529391">
-    <w:abstractNumId w:val="23"/>
-  </w:num>
-  <w:num w:numId="21" w16cid:durableId="670303952">
-    <w:abstractNumId w:val="38"/>
-  </w:num>
   <w:num w:numId="22" w16cid:durableId="401293004">
-    <w:abstractNumId w:val="33"/>
+    <w:abstractNumId w:val="34"/>
   </w:num>
   <w:num w:numId="23" w16cid:durableId="114830308">
-    <w:abstractNumId w:val="16"/>
+    <w:abstractNumId w:val="17"/>
   </w:num>
   <w:num w:numId="24" w16cid:durableId="2038774065">
-    <w:abstractNumId w:val="25"/>
+    <w:abstractNumId w:val="26"/>
   </w:num>
   <w:num w:numId="25" w16cid:durableId="1202596245">
     <w:abstractNumId w:val="0"/>
   </w:num>
   <w:num w:numId="26" w16cid:durableId="1466119662">
-    <w:abstractNumId w:val="20"/>
+    <w:abstractNumId w:val="21"/>
   </w:num>
   <w:num w:numId="27" w16cid:durableId="834607322">
-    <w:abstractNumId w:val="31"/>
+    <w:abstractNumId w:val="32"/>
   </w:num>
   <w:num w:numId="28" w16cid:durableId="1784765877">
+    <w:abstractNumId w:val="13"/>
+  </w:num>
+  <w:num w:numId="29" w16cid:durableId="1156458065">
     <w:abstractNumId w:val="12"/>
   </w:num>
-  <w:num w:numId="29" w16cid:durableId="1156458065">
+  <w:num w:numId="30" w16cid:durableId="1027759014">
     <w:abstractNumId w:val="11"/>
   </w:num>
-  <w:num w:numId="30" w16cid:durableId="1027759014">
-    <w:abstractNumId w:val="10"/>
-  </w:num>
   <w:num w:numId="31" w16cid:durableId="1931963899">
-    <w:abstractNumId w:val="40"/>
+    <w:abstractNumId w:val="41"/>
   </w:num>
   <w:num w:numId="32" w16cid:durableId="1638340900">
-    <w:abstractNumId w:val="6"/>
+    <w:abstractNumId w:val="7"/>
   </w:num>
   <w:num w:numId="33" w16cid:durableId="758018614">
-    <w:abstractNumId w:val="28"/>
+    <w:abstractNumId w:val="29"/>
   </w:num>
   <w:num w:numId="34" w16cid:durableId="580800734">
-    <w:abstractNumId w:val="4"/>
+    <w:abstractNumId w:val="5"/>
   </w:num>
   <w:num w:numId="35" w16cid:durableId="795296458">
-    <w:abstractNumId w:val="30"/>
+    <w:abstractNumId w:val="31"/>
   </w:num>
   <w:num w:numId="36" w16cid:durableId="832791633">
     <w:abstractNumId w:val="1"/>
   </w:num>
   <w:num w:numId="37" w16cid:durableId="61294599">
-    <w:abstractNumId w:val="17"/>
+    <w:abstractNumId w:val="18"/>
   </w:num>
   <w:num w:numId="38" w16cid:durableId="2071807276">
-    <w:abstractNumId w:val="34"/>
+    <w:abstractNumId w:val="35"/>
   </w:num>
   <w:num w:numId="39" w16cid:durableId="446313431">
-    <w:abstractNumId w:val="22"/>
+    <w:abstractNumId w:val="23"/>
   </w:num>
   <w:num w:numId="40" w16cid:durableId="862478243">
-    <w:abstractNumId w:val="24"/>
+    <w:abstractNumId w:val="25"/>
   </w:num>
   <w:num w:numId="41" w16cid:durableId="1112742714">
-    <w:abstractNumId w:val="14"/>
+    <w:abstractNumId w:val="15"/>
   </w:num>
   <w:num w:numId="42" w16cid:durableId="482890402">
-    <w:abstractNumId w:val="36"/>
+    <w:abstractNumId w:val="37"/>
+  </w:num>
+  <w:num w:numId="43" w16cid:durableId="736126958">
+    <w:abstractNumId w:val="3"/>
   </w:num>
 </w:numbering>
 </file>
@@ -24279,21 +25392,40 @@
 </file>
 
 <file path=customXml/item1.xml><?xml version="1.0" encoding="utf-8"?>
-<p:properties xmlns:p="http://schemas.microsoft.com/office/2006/metadata/properties" xmlns:xsi="http://www.w3.org/2001/XMLSchema-instance" xmlns:pc="http://schemas.microsoft.com/office/infopath/2007/PartnerControls">
-  <documentManagement/>
-</p:properties>
+<inkml:ink xmlns:inkml="http://www.w3.org/2003/InkML">
+  <inkml:definitions>
+    <inkml:context xml:id="ctx0">
+      <inkml:inkSource xml:id="inkSrc0">
+        <inkml:traceFormat>
+          <inkml:channel name="X" type="integer" min="-2.14748E9" max="2.14748E9" units="cm"/>
+          <inkml:channel name="Y" type="integer" min="-2.14748E9" max="2.14748E9" units="cm"/>
+          <inkml:channel name="F" type="integer" max="32767" units="dev"/>
+          <inkml:channel name="OA" type="integer" max="360" units="deg"/>
+          <inkml:channel name="OE" type="integer" max="90" units="deg"/>
+        </inkml:traceFormat>
+        <inkml:channelProperties>
+          <inkml:channelProperty channel="X" name="resolution" value="1000" units="1/cm"/>
+          <inkml:channelProperty channel="Y" name="resolution" value="1000" units="1/cm"/>
+          <inkml:channelProperty channel="F" name="resolution" value="0" units="1/dev"/>
+          <inkml:channelProperty channel="OA" name="resolution" value="1000" units="1/deg"/>
+          <inkml:channelProperty channel="OE" name="resolution" value="1000" units="1/deg"/>
+        </inkml:channelProperties>
+      </inkml:inkSource>
+      <inkml:timestamp xml:id="ts0" timeString="2025-06-10T16:09:06.362"/>
+    </inkml:context>
+    <inkml:brush xml:id="br0">
+      <inkml:brushProperty name="width" value="0.05" units="cm"/>
+      <inkml:brushProperty name="height" value="0.05" units="cm"/>
+      <inkml:brushProperty name="color" value="#E71224"/>
+    </inkml:brush>
+  </inkml:definitions>
+  <inkml:trace contextRef="#ctx0" brushRef="#br0">3153 356 7202 0 0,'-44'-7'350'0'0,"0"-2"0"0"0,1-2 0 0 0,0-2 0 0 0,-57-25 1 0 0,-168-76 1481 0 0,190 86-1679 0 0,-122-28 1 0 0,156 47-169 0 0,-67-16 302 0 0,-1 5 0 0 0,-122-5-1 0 0,88 25-117 0 0,1 6-1 0 0,-1 6 0 0 0,-208 45 1 0 0,298-44-170 0 0,0 3 1 0 0,1 1 0 0 0,1 4 0 0 0,0 1 0 0 0,-95 56-1 0 0,75-31-102 0 0,-120 97-1 0 0,165-119 91 0 0,2 1 0 0 0,1 2 0 0 0,1 0 0 0 0,2 2 1 0 0,1 0-1 0 0,-32 58 0 0 0,30-39-7 0 0,1 2 0 0 0,3 0 1 0 0,2 1-1 0 0,3 1 0 0 0,-17 102 0 0 0,25-76 38 0 0,3-1 0 0 0,4 1 0 0 0,4-1 0 0 0,20 120 0 0 0,-13-124-5 0 0,-3-11 48 0 0,4-1 0 0 0,23 76-1 0 0,-28-119-47 0 0,0-1 0 0 0,1 0 0 0 0,0 0 0 0 0,2-1 0 0 0,0 0 0 0 0,1-1 0 0 0,0 0 0 0 0,2-1 0 0 0,-1 0 0 0 0,2-1-1 0 0,25 20 1 0 0,-15-17 28 0 0,0-1 0 0 0,1-2-1 0 0,1 0 1 0 0,0-2 0 0 0,1-1-1 0 0,0-1 1 0 0,0-1 0 0 0,1-2-1 0 0,1 0 1 0 0,-1-2-1 0 0,1-1 1 0 0,31-1 0 0 0,36-3 35 0 0,1-4 1 0 0,122-22 0 0 0,-40 5 38 0 0,-35 9-33 0 0,182-24 276 0 0,51-43 591 0 0,-309 60-804 0 0,-1-3-1 0 0,0-3 1 0 0,89-47 0 0 0,59-55 5 0 0,-176 101-72 0 0,-1-3 0 0 0,-1-1 1 0 0,41-43-1 0 0,-52 43-35 0 0,-2 0 1 0 0,-1-2-1 0 0,-1-1 0 0 0,23-47 1 0 0,-19 26 62 0 0,-3-2 1 0 0,19-65-1 0 0,-30 75 16 0 0,-2 1 0 0 0,5-70 0 0 0,-4-95-93 0 0,-11 199-21 0 0,1-9 55 0 0,-1 1 0 0 0,-1-1 0 0 0,-1 1 0 0 0,0-1 0 0 0,-1 1 0 0 0,-2 0 0 0 0,0 0 0 0 0,-1 0 0 0 0,0 1 0 0 0,-2-1 0 0 0,-12-21 0 0 0,-32-62 287 0 0,32 60-30 0 0,-28-42 0 0 0,39 70-276 0 0,0 2 1 0 0,-1-1-1 0 0,0 1 1 0 0,-1 1-1 0 0,-1 0 1 0 0,0 0-1 0 0,-14-9 1 0 0,-10-3-215 0 0,0 3 0 0 0,-1 0-1 0 0,-1 3 1 0 0,0 1 0 0 0,-1 2 0 0 0,-1 1 0 0 0,-1 2 0 0 0,1 2 0 0 0,-1 2 0 0 0,-1 2 0 0 0,1 1 0 0 0,-76 4 0 0 0,88 3-696 0 0,0 2-1 0 0,0 1 1 0 0,0 2 0 0 0,-39 15 0 0 0,23-4 15 0 0</inkml:trace>
+  <inkml:trace contextRef="#ctx0" brushRef="#br0" timeOffset="2304.57">3473 308 408 0 0,'25'-34'-131'0'0,"-12"9"9868"0"0,-14 35-9206 0 0,-2 1-494 0 0,2 1 1 0 0,-1-1 0 0 0,1 0-1 0 0,1 1 1 0 0,0-1-1 0 0,3 17 1 0 0,16 78-22 0 0,-1-5-4 0 0,-6 136 38 0 0,0-15 29 0 0,-4-164-14 0 0,-4-36 88 0 0,2 43 1333 0 0,-8-70-1392 0 0,0 1 0 0 0,0-1 0 0 0,0 0 0 0 0,0 0 0 0 0,1 0 0 0 0,-2-8 0 0 0,2 11-63 0 0,-50-289 287 0 0,50 262-342 0 0,1 0 0 0 0,1 0-1 0 0,2 1 1 0 0,1-1-1 0 0,10-38 1 0 0,6-41-152 0 0,-20 107 169 0 0,0 1 1 0 0,0 0-1 0 0,0-1 1 0 0,0 1-1 0 0,0 0 1 0 0,0-1 0 0 0,0 1-1 0 0,0 0 1 0 0,0-1-1 0 0,0 1 1 0 0,0-1 0 0 0,0 1-1 0 0,0 0 1 0 0,0-1-1 0 0,0 1 1 0 0,0 0-1 0 0,-1-1 1 0 0,1 1 0 0 0,0 0-1 0 0,0-1 1 0 0,0 1-1 0 0,-1 0 1 0 0,1 0 0 0 0,0-1-1 0 0,0 1 1 0 0,-1 0-1 0 0,1 0 1 0 0,0-1-1 0 0,0 1 1 0 0,-1 0 0 0 0,1 0-1 0 0,0 0 1 0 0,-1-1-1 0 0,1 1 1 0 0,0 0 0 0 0,-1 0-1 0 0,1 0 1 0 0,-1 0-1 0 0,1 0 1 0 0,0 0-1 0 0,-1 0 1 0 0,1 0 0 0 0,0 0-1 0 0,-1 0 1 0 0,1 0-1 0 0,-1 0 1 0 0,1 0 0 0 0,0 0-1 0 0,-1 0 1 0 0,1 0-1 0 0,0 0 1 0 0,-1 0-1 0 0,1 1 1 0 0,0-1 0 0 0,-1 0-1 0 0,1 0 1 0 0,0 0-1 0 0,-1 1 1 0 0,1-1 0 0 0,0 0-1 0 0,-1 1 1 0 0,-1 0 2 0 0,-1 1 0 0 0,1-1 1 0 0,-1 1-1 0 0,1-1 0 0 0,0 1 1 0 0,0 0-1 0 0,0 0 0 0 0,-3 3 1 0 0,-4 11-2 0 0,0 1 0 0 0,1 0 0 0 0,1 1 0 0 0,0-1 0 0 0,1 1 0 0 0,1 1 0 0 0,1-1 0 0 0,-2 21 1 0 0,0 19-138 0 0,2 75 1 0 0,4-118-445 0 0,1 1 0 0 0,0-1 0 0 0,2 1 0 0 0,-1-1 0 0 0,2 0 0 0 0,0 0 0 0 0,1-1 0 0 0,0 1 0 0 0,9 14 0 0 0,-8-17-549 0 0</inkml:trace>
+  <inkml:trace contextRef="#ctx0" brushRef="#br0" timeOffset="2956.45">3554 1583 3409 0 0,'0'0'4221'0'0,"-1"0"-4145"0"0,0 0 0 0 0,1 1 0 0 0,-1-1 1 0 0,0 0-1 0 0,1 0 0 0 0,-1 0 0 0 0,0 1 1 0 0,0-1-1 0 0,1 0 0 0 0,-1 1 0 0 0,0-1 1 0 0,1 0-1 0 0,-1 1 0 0 0,1-1 0 0 0,-1 1 1 0 0,1-1-1 0 0,-1 1 0 0 0,1-1 0 0 0,-1 1 1 0 0,1-1-1 0 0,-1 1 0 0 0,0 1 0 0 0,-2 5-46 0 0,1 1-1 0 0,-1 0 1 0 0,1-1-1 0 0,1 1 0 0 0,-1 0 1 0 0,1 0-1 0 0,1 0 1 0 0,0 12-1 0 0,0-4-34 0 0,1 0 0 0 0,1 0 1 0 0,7 26-1 0 0,-10-41 2 0 0,1-1 0 0 0,1 1 0 0 0,-1-1 0 0 0,0 1 0 0 0,0-1 0 0 0,0 1 0 0 0,0-1 0 0 0,0 1 0 0 0,0-1 0 0 0,0 1 0 0 0,1-1 0 0 0,-1 1 0 0 0,0-1 0 0 0,0 0 0 0 0,1 1 0 0 0,-1-1 0 0 0,0 1 0 0 0,1-1 0 0 0,-1 0 0 0 0,0 1 0 0 0,1-1 0 0 0,-1 0 0 0 0,0 1 0 0 0,1-1 0 0 0,-1 0 0 0 0,1 0 0 0 0,-1 0 0 0 0,1 1 0 0 0,-1-1 0 0 0,0 0 0 0 0,1 0 0 0 0,-1 0 0 0 0,1 0 0 0 0,-1 0 0 0 0,2 0 0 0 0,12-13-54 0 0,7-26 91 0 0,-19 31 14 0 0,0-1 0 0 0,-1 0 0 0 0,1 0 1 0 0,-2-1-1 0 0,1 1 0 0 0,-2 0 0 0 0,1 0 0 0 0,-2-10 0 0 0,1 14 3 0 0,0 1 0 0 0,0-1 0 0 0,-1 1 0 0 0,1-1 0 0 0,-1 1 0 0 0,0-1-1 0 0,-5-7 1 0 0,6 11-13 0 0,0-1 0 0 0,-1 0 0 0 0,1 1-1 0 0,-1-1 1 0 0,1 1 0 0 0,-1-1 0 0 0,1 1 0 0 0,-1 0-1 0 0,0-1 1 0 0,0 1 0 0 0,0 0 0 0 0,0 0-1 0 0,0 1 1 0 0,0-1 0 0 0,0 0 0 0 0,0 1 0 0 0,-4-2-1 0 0,4 3-23 0 0,1-1 0 0 0,-1 0 0 0 0,0 1 0 0 0,0 0 0 0 0,0-1 0 0 0,1 1-1 0 0,-1 0 1 0 0,0 0 0 0 0,1 0 0 0 0,-1 0 0 0 0,0 0 0 0 0,1 0 0 0 0,-1 0-1 0 0,1 0 1 0 0,0 1 0 0 0,-1-1 0 0 0,1 1 0 0 0,0-1 0 0 0,0 1 0 0 0,0-1-1 0 0,0 1 1 0 0,0 0 0 0 0,0-1 0 0 0,1 1 0 0 0,-1 0 0 0 0,0 0 0 0 0,1-1 0 0 0,0 1-1 0 0,-1 3 1 0 0,0-1-44 0 0,0-1-1 0 0,0 0 1 0 0,0 1-1 0 0,1-1 0 0 0,-1 1 1 0 0,1-1-1 0 0,0 1 1 0 0,0-1-1 0 0,0 1 0 0 0,1-1 1 0 0,-1 1-1 0 0,1-1 1 0 0,0 0-1 0 0,0 1 1 0 0,2 4-1 0 0,-3-7 18 0 0,1-1 0 0 0,-1 1 0 0 0,0-1 0 0 0,1 1 0 0 0,-1-1 0 0 0,0 0 0 0 0,1 1 0 0 0,-1-1 0 0 0,1 0 0 0 0,-1 1 0 0 0,0-1 0 0 0,1 0 0 0 0,-1 0 0 0 0,1 1 0 0 0,-1-1 0 0 0,1 0 0 0 0,-1 0 0 0 0,1 0 1 0 0,-1 0-1 0 0,1 1 0 0 0,-1-1 0 0 0,1 0 0 0 0,-1 0 0 0 0,1 0 0 0 0,-1 0 0 0 0,1 0 0 0 0,-1 0 0 0 0,1-1 0 0 0,0 1 0 0 0,-1 0 0 0 0,1 0 0 0 0,-1 0 0 0 0,1 0 0 0 0,0-1 0 0 0,15-16-99 0 0,-12 10 125 0 0,0 1 0 0 0,-1-1 0 0 0,0 1 0 0 0,4-13 0 0 0,-5-5 173 0 0,-3 24-177 0 0,1 0 0 0 0,0-1-1 0 0,0 1 1 0 0,0 0-1 0 0,0 0 1 0 0,0 0 0 0 0,0 0-1 0 0,0 0 1 0 0,0-1 0 0 0,0 1-1 0 0,-1 0 1 0 0,1 0-1 0 0,0 0 1 0 0,0 0 0 0 0,0 0-1 0 0,0 0 1 0 0,0 0-1 0 0,-1 0 1 0 0,1-1 0 0 0,0 1-1 0 0,0 0 1 0 0,0 0-1 0 0,0 0 1 0 0,-1 0 0 0 0,1 0-1 0 0,0 0 1 0 0,0 0 0 0 0,0 0-1 0 0,0 0 1 0 0,-1 0-1 0 0,1 0 1 0 0,0 0 0 0 0,0 0-1 0 0,0 0 1 0 0,0 0-1 0 0,0 1 1 0 0,-1-1 0 0 0,1 0-1 0 0,0 0 1 0 0,0 0-1 0 0,0 0 1 0 0,0 0 0 0 0,0 0-1 0 0,-1 0 1 0 0,1 0 0 0 0,0 0-1 0 0,0 1 1 0 0,0-1-1 0 0,0 0 1 0 0,0 0 0 0 0,0 0-1 0 0,0 0 1 0 0,-1 0-1 0 0,1 1 1 0 0,-2 2 12 0 0,0 0-1 0 0,0 0 1 0 0,0 0-1 0 0,0 0 1 0 0,1 0 0 0 0,-1 1-1 0 0,1-1 1 0 0,0 1-1 0 0,0-1 1 0 0,-1 5-1 0 0,0 5-669 0 0,0 1 1 0 0,0 0-1 0 0,2 0 0 0 0,1 24 0 0 0,0-28 77 0 0</inkml:trace>
+</inkml:ink>
 </file>
 
 <file path=customXml/item2.xml><?xml version="1.0" encoding="utf-8"?>
-<?mso-contentType ?>
-<FormTemplates xmlns="http://schemas.microsoft.com/sharepoint/v3/contenttype/forms">
-  <Display>DocumentLibraryForm</Display>
-  <Edit>DocumentLibraryForm</Edit>
-  <New>DocumentLibraryForm</New>
-</FormTemplates>
-</file>
-
-<file path=customXml/item3.xml><?xml version="1.0" encoding="utf-8"?>
 <inkml:ink xmlns:inkml="http://www.w3.org/2003/InkML">
   <inkml:definitions>
     <inkml:context xml:id="ctx0">
@@ -24337,45 +25469,13 @@
 </inkml:ink>
 </file>
 
-<file path=customXml/item4.xml><?xml version="1.0" encoding="utf-8"?>
-<b:Sources xmlns:b="http://schemas.openxmlformats.org/officeDocument/2006/bibliography" xmlns="http://schemas.openxmlformats.org/officeDocument/2006/bibliography" SelectedStyle="\APASixthEditionOfficeOnline.xsl" StyleName="APA" Version="6"/>
+<file path=customXml/item3.xml><?xml version="1.0" encoding="utf-8"?>
+<p:properties xmlns:p="http://schemas.microsoft.com/office/2006/metadata/properties" xmlns:xsi="http://www.w3.org/2001/XMLSchema-instance" xmlns:pc="http://schemas.microsoft.com/office/infopath/2007/PartnerControls">
+  <documentManagement/>
+</p:properties>
 </file>
 
-<file path=customXml/item5.xml><?xml version="1.0" encoding="utf-8"?>
-<inkml:ink xmlns:inkml="http://www.w3.org/2003/InkML">
-  <inkml:definitions>
-    <inkml:context xml:id="ctx0">
-      <inkml:inkSource xml:id="inkSrc0">
-        <inkml:traceFormat>
-          <inkml:channel name="X" type="integer" min="-2.14748E9" max="2.14748E9" units="cm"/>
-          <inkml:channel name="Y" type="integer" min="-2.14748E9" max="2.14748E9" units="cm"/>
-          <inkml:channel name="F" type="integer" max="32767" units="dev"/>
-          <inkml:channel name="OA" type="integer" max="360" units="deg"/>
-          <inkml:channel name="OE" type="integer" max="90" units="deg"/>
-        </inkml:traceFormat>
-        <inkml:channelProperties>
-          <inkml:channelProperty channel="X" name="resolution" value="1000" units="1/cm"/>
-          <inkml:channelProperty channel="Y" name="resolution" value="1000" units="1/cm"/>
-          <inkml:channelProperty channel="F" name="resolution" value="0" units="1/dev"/>
-          <inkml:channelProperty channel="OA" name="resolution" value="1000" units="1/deg"/>
-          <inkml:channelProperty channel="OE" name="resolution" value="1000" units="1/deg"/>
-        </inkml:channelProperties>
-      </inkml:inkSource>
-      <inkml:timestamp xml:id="ts0" timeString="2025-06-10T16:09:06.362"/>
-    </inkml:context>
-    <inkml:brush xml:id="br0">
-      <inkml:brushProperty name="width" value="0.05" units="cm"/>
-      <inkml:brushProperty name="height" value="0.05" units="cm"/>
-      <inkml:brushProperty name="color" value="#E71224"/>
-    </inkml:brush>
-  </inkml:definitions>
-  <inkml:trace contextRef="#ctx0" brushRef="#br0">3153 356 7202 0 0,'-44'-7'350'0'0,"0"-2"0"0"0,1-2 0 0 0,0-2 0 0 0,-57-25 1 0 0,-168-76 1481 0 0,190 86-1679 0 0,-122-28 1 0 0,156 47-169 0 0,-67-16 302 0 0,-1 5 0 0 0,-122-5-1 0 0,88 25-117 0 0,1 6-1 0 0,-1 6 0 0 0,-208 45 1 0 0,298-44-170 0 0,0 3 1 0 0,1 1 0 0 0,1 4 0 0 0,0 1 0 0 0,-95 56-1 0 0,75-31-102 0 0,-120 97-1 0 0,165-119 91 0 0,2 1 0 0 0,1 2 0 0 0,1 0 0 0 0,2 2 1 0 0,1 0-1 0 0,-32 58 0 0 0,30-39-7 0 0,1 2 0 0 0,3 0 1 0 0,2 1-1 0 0,3 1 0 0 0,-17 102 0 0 0,25-76 38 0 0,3-1 0 0 0,4 1 0 0 0,4-1 0 0 0,20 120 0 0 0,-13-124-5 0 0,-3-11 48 0 0,4-1 0 0 0,23 76-1 0 0,-28-119-47 0 0,0-1 0 0 0,1 0 0 0 0,0 0 0 0 0,2-1 0 0 0,0 0 0 0 0,1-1 0 0 0,0 0 0 0 0,2-1 0 0 0,-1 0 0 0 0,2-1-1 0 0,25 20 1 0 0,-15-17 28 0 0,0-1 0 0 0,1-2-1 0 0,1 0 1 0 0,0-2 0 0 0,1-1-1 0 0,0-1 1 0 0,0-1 0 0 0,1-2-1 0 0,1 0 1 0 0,-1-2-1 0 0,1-1 1 0 0,31-1 0 0 0,36-3 35 0 0,1-4 1 0 0,122-22 0 0 0,-40 5 38 0 0,-35 9-33 0 0,182-24 276 0 0,51-43 591 0 0,-309 60-804 0 0,-1-3-1 0 0,0-3 1 0 0,89-47 0 0 0,59-55 5 0 0,-176 101-72 0 0,-1-3 0 0 0,-1-1 1 0 0,41-43-1 0 0,-52 43-35 0 0,-2 0 1 0 0,-1-2-1 0 0,-1-1 0 0 0,23-47 1 0 0,-19 26 62 0 0,-3-2 1 0 0,19-65-1 0 0,-30 75 16 0 0,-2 1 0 0 0,5-70 0 0 0,-4-95-93 0 0,-11 199-21 0 0,1-9 55 0 0,-1 1 0 0 0,-1-1 0 0 0,-1 1 0 0 0,0-1 0 0 0,-1 1 0 0 0,-2 0 0 0 0,0 0 0 0 0,-1 0 0 0 0,0 1 0 0 0,-2-1 0 0 0,-12-21 0 0 0,-32-62 287 0 0,32 60-30 0 0,-28-42 0 0 0,39 70-276 0 0,0 2 1 0 0,-1-1-1 0 0,0 1 1 0 0,-1 1-1 0 0,-1 0 1 0 0,0 0-1 0 0,-14-9 1 0 0,-10-3-215 0 0,0 3 0 0 0,-1 0-1 0 0,-1 3 1 0 0,0 1 0 0 0,-1 2 0 0 0,-1 1 0 0 0,-1 2 0 0 0,1 2 0 0 0,-1 2 0 0 0,-1 2 0 0 0,1 1 0 0 0,-76 4 0 0 0,88 3-696 0 0,0 2-1 0 0,0 1 1 0 0,0 2 0 0 0,-39 15 0 0 0,23-4 15 0 0</inkml:trace>
-  <inkml:trace contextRef="#ctx0" brushRef="#br0" timeOffset="2304.57">3473 308 408 0 0,'25'-34'-131'0'0,"-12"9"9868"0"0,-14 35-9206 0 0,-2 1-494 0 0,2 1 1 0 0,-1-1 0 0 0,1 0-1 0 0,1 1 1 0 0,0-1-1 0 0,3 17 1 0 0,16 78-22 0 0,-1-5-4 0 0,-6 136 38 0 0,0-15 29 0 0,-4-164-14 0 0,-4-36 88 0 0,2 43 1333 0 0,-8-70-1392 0 0,0 1 0 0 0,0-1 0 0 0,0 0 0 0 0,0 0 0 0 0,1 0 0 0 0,-2-8 0 0 0,2 11-63 0 0,-50-289 287 0 0,50 262-342 0 0,1 0 0 0 0,1 0-1 0 0,2 1 1 0 0,1-1-1 0 0,10-38 1 0 0,6-41-152 0 0,-20 107 169 0 0,0 1 1 0 0,0 0-1 0 0,0-1 1 0 0,0 1-1 0 0,0 0 1 0 0,0-1 0 0 0,0 1-1 0 0,0 0 1 0 0,0-1-1 0 0,0 1 1 0 0,0-1 0 0 0,0 1-1 0 0,0 0 1 0 0,0-1-1 0 0,0 1 1 0 0,0 0-1 0 0,-1-1 1 0 0,1 1 0 0 0,0 0-1 0 0,0-1 1 0 0,0 1-1 0 0,-1 0 1 0 0,1 0 0 0 0,0-1-1 0 0,0 1 1 0 0,-1 0-1 0 0,1 0 1 0 0,0-1-1 0 0,0 1 1 0 0,-1 0 0 0 0,1 0-1 0 0,0 0 1 0 0,-1-1-1 0 0,1 1 1 0 0,0 0 0 0 0,-1 0-1 0 0,1 0 1 0 0,-1 0-1 0 0,1 0 1 0 0,0 0-1 0 0,-1 0 1 0 0,1 0 0 0 0,0 0-1 0 0,-1 0 1 0 0,1 0-1 0 0,-1 0 1 0 0,1 0 0 0 0,0 0-1 0 0,-1 0 1 0 0,1 0-1 0 0,0 0 1 0 0,-1 0-1 0 0,1 1 1 0 0,0-1 0 0 0,-1 0-1 0 0,1 0 1 0 0,0 0-1 0 0,-1 1 1 0 0,1-1 0 0 0,0 0-1 0 0,-1 1 1 0 0,-1 0 2 0 0,-1 1 0 0 0,1-1 1 0 0,-1 1-1 0 0,1-1 0 0 0,0 1 1 0 0,0 0-1 0 0,0 0 0 0 0,-3 3 1 0 0,-4 11-2 0 0,0 1 0 0 0,1 0 0 0 0,1 1 0 0 0,0-1 0 0 0,1 1 0 0 0,1 1 0 0 0,1-1 0 0 0,-2 21 1 0 0,0 19-138 0 0,2 75 1 0 0,4-118-445 0 0,1 1 0 0 0,0-1 0 0 0,2 1 0 0 0,-1-1 0 0 0,2 0 0 0 0,0 0 0 0 0,1-1 0 0 0,0 1 0 0 0,9 14 0 0 0,-8-17-549 0 0</inkml:trace>
-  <inkml:trace contextRef="#ctx0" brushRef="#br0" timeOffset="2956.45">3554 1583 3409 0 0,'0'0'4221'0'0,"-1"0"-4145"0"0,0 0 0 0 0,1 1 0 0 0,-1-1 1 0 0,0 0-1 0 0,1 0 0 0 0,-1 0 0 0 0,0 1 1 0 0,0-1-1 0 0,1 0 0 0 0,-1 1 0 0 0,0-1 1 0 0,1 0-1 0 0,-1 1 0 0 0,1-1 0 0 0,-1 1 1 0 0,1-1-1 0 0,-1 1 0 0 0,1-1 0 0 0,-1 1 1 0 0,1-1-1 0 0,-1 1 0 0 0,0 1 0 0 0,-2 5-46 0 0,1 1-1 0 0,-1 0 1 0 0,1-1-1 0 0,1 1 0 0 0,-1 0 1 0 0,1 0-1 0 0,1 0 1 0 0,0 12-1 0 0,0-4-34 0 0,1 0 0 0 0,1 0 1 0 0,7 26-1 0 0,-10-41 2 0 0,1-1 0 0 0,1 1 0 0 0,-1-1 0 0 0,0 1 0 0 0,0-1 0 0 0,0 1 0 0 0,0-1 0 0 0,0 1 0 0 0,0-1 0 0 0,0 1 0 0 0,1-1 0 0 0,-1 1 0 0 0,0-1 0 0 0,0 0 0 0 0,1 1 0 0 0,-1-1 0 0 0,0 1 0 0 0,1-1 0 0 0,-1 0 0 0 0,0 1 0 0 0,1-1 0 0 0,-1 0 0 0 0,0 1 0 0 0,1-1 0 0 0,-1 0 0 0 0,1 0 0 0 0,-1 0 0 0 0,1 1 0 0 0,-1-1 0 0 0,0 0 0 0 0,1 0 0 0 0,-1 0 0 0 0,1 0 0 0 0,-1 0 0 0 0,2 0 0 0 0,12-13-54 0 0,7-26 91 0 0,-19 31 14 0 0,0-1 0 0 0,-1 0 0 0 0,1 0 1 0 0,-2-1-1 0 0,1 1 0 0 0,-2 0 0 0 0,1 0 0 0 0,-2-10 0 0 0,1 14 3 0 0,0 1 0 0 0,0-1 0 0 0,-1 1 0 0 0,1-1 0 0 0,-1 1 0 0 0,0-1-1 0 0,-5-7 1 0 0,6 11-13 0 0,0-1 0 0 0,-1 0 0 0 0,1 1-1 0 0,-1-1 1 0 0,1 1 0 0 0,-1-1 0 0 0,1 1 0 0 0,-1 0-1 0 0,0-1 1 0 0,0 1 0 0 0,0 0 0 0 0,0 0-1 0 0,0 1 1 0 0,0-1 0 0 0,0 0 0 0 0,0 1 0 0 0,-4-2-1 0 0,4 3-23 0 0,1-1 0 0 0,-1 0 0 0 0,0 1 0 0 0,0 0 0 0 0,0-1 0 0 0,1 1-1 0 0,-1 0 1 0 0,0 0 0 0 0,1 0 0 0 0,-1 0 0 0 0,0 0 0 0 0,1 0 0 0 0,-1 0-1 0 0,1 0 1 0 0,0 1 0 0 0,-1-1 0 0 0,1 1 0 0 0,0-1 0 0 0,0 1 0 0 0,0-1-1 0 0,0 1 1 0 0,0 0 0 0 0,0-1 0 0 0,1 1 0 0 0,-1 0 0 0 0,0 0 0 0 0,1-1 0 0 0,0 1-1 0 0,-1 3 1 0 0,0-1-44 0 0,0-1-1 0 0,0 0 1 0 0,0 1-1 0 0,1-1 0 0 0,-1 1 1 0 0,1-1-1 0 0,0 1 1 0 0,0-1-1 0 0,0 1 0 0 0,1-1 1 0 0,-1 1-1 0 0,1-1 1 0 0,0 0-1 0 0,0 1 1 0 0,2 4-1 0 0,-3-7 18 0 0,1-1 0 0 0,-1 1 0 0 0,0-1 0 0 0,1 1 0 0 0,-1-1 0 0 0,0 0 0 0 0,1 1 0 0 0,-1-1 0 0 0,1 0 0 0 0,-1 1 0 0 0,0-1 0 0 0,1 0 0 0 0,-1 0 0 0 0,1 1 0 0 0,-1-1 0 0 0,1 0 0 0 0,-1 0 0 0 0,1 0 1 0 0,-1 0-1 0 0,1 1 0 0 0,-1-1 0 0 0,1 0 0 0 0,-1 0 0 0 0,1 0 0 0 0,-1 0 0 0 0,1 0 0 0 0,-1 0 0 0 0,1-1 0 0 0,0 1 0 0 0,-1 0 0 0 0,1 0 0 0 0,-1 0 0 0 0,1 0 0 0 0,0-1 0 0 0,15-16-99 0 0,-12 10 125 0 0,0 1 0 0 0,-1-1 0 0 0,0 1 0 0 0,4-13 0 0 0,-5-5 173 0 0,-3 24-177 0 0,1 0 0 0 0,0-1-1 0 0,0 1 1 0 0,0 0-1 0 0,0 0 1 0 0,0 0 0 0 0,0 0-1 0 0,0 0 1 0 0,0-1 0 0 0,0 1-1 0 0,-1 0 1 0 0,1 0-1 0 0,0 0 1 0 0,0 0 0 0 0,0 0-1 0 0,0 0 1 0 0,0 0-1 0 0,-1 0 1 0 0,1-1 0 0 0,0 1-1 0 0,0 0 1 0 0,0 0-1 0 0,0 0 1 0 0,-1 0 0 0 0,1 0-1 0 0,0 0 1 0 0,0 0 0 0 0,0 0-1 0 0,0 0 1 0 0,-1 0-1 0 0,1 0 1 0 0,0 0 0 0 0,0 0-1 0 0,0 0 1 0 0,0 0-1 0 0,0 1 1 0 0,-1-1 0 0 0,1 0-1 0 0,0 0 1 0 0,0 0-1 0 0,0 0 1 0 0,0 0 0 0 0,0 0-1 0 0,-1 0 1 0 0,1 0 0 0 0,0 0-1 0 0,0 1 1 0 0,0-1-1 0 0,0 0 1 0 0,0 0 0 0 0,0 0-1 0 0,0 0 1 0 0,-1 0-1 0 0,1 1 1 0 0,-2 2 12 0 0,0 0-1 0 0,0 0 1 0 0,0 0-1 0 0,0 0 1 0 0,1 0 0 0 0,-1 1-1 0 0,1-1 1 0 0,0 1-1 0 0,0-1 1 0 0,-1 5-1 0 0,0 5-669 0 0,0 1 1 0 0,0 0-1 0 0,2 0 0 0 0,1 24 0 0 0,0-28 77 0 0</inkml:trace>
-</inkml:ink>
-</file>
-
-<file path=customXml/item6.xml><?xml version="1.0" encoding="utf-8"?>
+<file path=customXml/item4.xml><?xml version="1.0" encoding="utf-8"?>
 <inkml:ink xmlns:inkml="http://www.w3.org/2003/InkML">
   <inkml:definitions>
     <inkml:context xml:id="ctx0">
@@ -24407,7 +25507,11 @@
 </inkml:ink>
 </file>
 
-<file path=customXml/item7.xml><?xml version="1.0" encoding="utf-8"?>
+<file path=customXml/item5.xml><?xml version="1.0" encoding="utf-8"?>
+<b:Sources xmlns:b="http://schemas.openxmlformats.org/officeDocument/2006/bibliography" xmlns="http://schemas.openxmlformats.org/officeDocument/2006/bibliography" SelectedStyle="\APASixthEditionOfficeOnline.xsl" StyleName="APA" Version="6"/>
+</file>
+
+<file path=customXml/item6.xml><?xml version="1.0" encoding="utf-8"?>
 <ct:contentTypeSchema xmlns:ct="http://schemas.microsoft.com/office/2006/metadata/contentType" xmlns:ma="http://schemas.microsoft.com/office/2006/metadata/properties/metaAttributes" ct:_="" ma:_="" ma:contentTypeName="Dokument" ma:contentTypeID="0x01010025C71E9534E21E4A9F2CF33BA7DCE92D" ma:contentTypeVersion="3" ma:contentTypeDescription="Ein neues Dokument erstellen." ma:contentTypeScope="" ma:versionID="32b9bbdf2bbf4e0fb27a426421665337">
   <xsd:schema xmlns:xsd="http://www.w3.org/2001/XMLSchema" xmlns:xs="http://www.w3.org/2001/XMLSchema" xmlns:p="http://schemas.microsoft.com/office/2006/metadata/properties" xmlns:ns2="5a9e9855-01b6-487f-b294-67c59083cc31" targetNamespace="http://schemas.microsoft.com/office/2006/metadata/properties" ma:root="true" ma:fieldsID="ec87b9b32475f90c9dbf7ae918480825" ns2:_="">
     <xsd:import namespace="5a9e9855-01b6-487f-b294-67c59083cc31"/>
@@ -24545,7 +25649,32 @@
 </ct:contentTypeSchema>
 </file>
 
+<file path=customXml/item7.xml><?xml version="1.0" encoding="utf-8"?>
+<?mso-contentType ?>
+<FormTemplates xmlns="http://schemas.microsoft.com/sharepoint/v3/contenttype/forms">
+  <Display>DocumentLibraryForm</Display>
+  <Edit>DocumentLibraryForm</Edit>
+  <New>DocumentLibraryForm</New>
+</FormTemplates>
+</file>
+
 <file path=customXml/itemProps1.xml><?xml version="1.0" encoding="utf-8"?>
+<ds:datastoreItem xmlns:ds="http://schemas.openxmlformats.org/officeDocument/2006/customXml" ds:itemID="{01D51A4F-7BE7-46DF-A7D0-BDB91C1C49A3}">
+  <ds:schemaRefs>
+    <ds:schemaRef ds:uri="http://www.w3.org/2003/InkML"/>
+  </ds:schemaRefs>
+</ds:datastoreItem>
+</file>
+
+<file path=customXml/itemProps2.xml><?xml version="1.0" encoding="utf-8"?>
+<ds:datastoreItem xmlns:ds="http://schemas.openxmlformats.org/officeDocument/2006/customXml" ds:itemID="{4B023D59-82BC-4D0F-A651-C98E01C1F15C}">
+  <ds:schemaRefs>
+    <ds:schemaRef ds:uri="http://www.w3.org/2003/InkML"/>
+  </ds:schemaRefs>
+</ds:datastoreItem>
+</file>
+
+<file path=customXml/itemProps3.xml><?xml version="1.0" encoding="utf-8"?>
 <ds:datastoreItem xmlns:ds="http://schemas.openxmlformats.org/officeDocument/2006/customXml" ds:itemID="{CE199482-6225-420D-8982-84EA3B0C446C}">
   <ds:schemaRefs>
     <ds:schemaRef ds:uri="http://schemas.microsoft.com/office/2006/metadata/properties"/>
@@ -24554,15 +25683,7 @@
 </ds:datastoreItem>
 </file>
 
-<file path=customXml/itemProps2.xml><?xml version="1.0" encoding="utf-8"?>
-<ds:datastoreItem xmlns:ds="http://schemas.openxmlformats.org/officeDocument/2006/customXml" ds:itemID="{6A655C0C-F4A3-4931-9F7F-84CBD61DCE8F}">
-  <ds:schemaRefs>
-    <ds:schemaRef ds:uri="http://schemas.microsoft.com/sharepoint/v3/contenttype/forms"/>
-  </ds:schemaRefs>
-</ds:datastoreItem>
-</file>
-
-<file path=customXml/itemProps3.xml><?xml version="1.0" encoding="utf-8"?>
+<file path=customXml/itemProps4.xml><?xml version="1.0" encoding="utf-8"?>
 <ds:datastoreItem xmlns:ds="http://schemas.openxmlformats.org/officeDocument/2006/customXml" ds:itemID="{4B023D59-82BC-4D0F-A651-C98E01C1F15C}">
   <ds:schemaRefs>
     <ds:schemaRef ds:uri="http://www.w3.org/2003/InkML"/>
@@ -24570,7 +25691,7 @@
 </ds:datastoreItem>
 </file>
 
-<file path=customXml/itemProps4.xml><?xml version="1.0" encoding="utf-8"?>
+<file path=customXml/itemProps5.xml><?xml version="1.0" encoding="utf-8"?>
 <ds:datastoreItem xmlns:ds="http://schemas.openxmlformats.org/officeDocument/2006/customXml" ds:itemID="{01D51A4F-7BE7-46DF-A7D0-BDB91C1C49A3}">
   <ds:schemaRefs>
     <ds:schemaRef ds:uri="http://schemas.openxmlformats.org/officeDocument/2006/bibliography"/>
@@ -24578,23 +25699,7 @@
 </ds:datastoreItem>
 </file>
 
-<file path=customXml/itemProps5.xml><?xml version="1.0" encoding="utf-8"?>
-<ds:datastoreItem xmlns:ds="http://schemas.openxmlformats.org/officeDocument/2006/customXml" ds:itemID="{01D51A4F-7BE7-46DF-A7D0-BDB91C1C49A3}">
-  <ds:schemaRefs>
-    <ds:schemaRef ds:uri="http://www.w3.org/2003/InkML"/>
-  </ds:schemaRefs>
-</ds:datastoreItem>
-</file>
-
 <file path=customXml/itemProps6.xml><?xml version="1.0" encoding="utf-8"?>
-<ds:datastoreItem xmlns:ds="http://schemas.openxmlformats.org/officeDocument/2006/customXml" ds:itemID="{4B023D59-82BC-4D0F-A651-C98E01C1F15C}">
-  <ds:schemaRefs>
-    <ds:schemaRef ds:uri="http://www.w3.org/2003/InkML"/>
-  </ds:schemaRefs>
-</ds:datastoreItem>
-</file>
-
-<file path=customXml/itemProps7.xml><?xml version="1.0" encoding="utf-8"?>
 <ds:datastoreItem xmlns:ds="http://schemas.openxmlformats.org/officeDocument/2006/customXml" ds:itemID="{4B023D59-82BC-4D0F-A651-C98E01C1F15C}">
   <ds:schemaRefs>
     <ds:schemaRef ds:uri="http://schemas.microsoft.com/office/2006/metadata/contentType"/>
@@ -24610,4 +25715,12 @@
     <ds:schemaRef ds:uri="http://schemas.microsoft.com/internal/obd"/>
   </ds:schemaRefs>
 </ds:datastoreItem>
+</file>
+
+<file path=customXml/itemProps7.xml><?xml version="1.0" encoding="utf-8"?>
+<ds:datastoreItem xmlns:ds="http://schemas.openxmlformats.org/officeDocument/2006/customXml" ds:itemID="{6A655C0C-F4A3-4931-9F7F-84CBD61DCE8F}">
+  <ds:schemaRefs>
+    <ds:schemaRef ds:uri="http://schemas.microsoft.com/sharepoint/v3/contenttype/forms"/>
+  </ds:schemaRefs>
+</ds:datastoreItem>
 </file>
</xml_diff>

<commit_message>
Fehler bei der volume Fehlermeldung
</commit_message>
<xml_diff>
--- a/D_Documentation/Doku-Felix.docx
+++ b/D_Documentation/Doku-Felix.docx
@@ -1082,7 +1082,7 @@
             </w:rPr>
             <w:fldChar w:fldCharType="separate"/>
           </w:r>
-          <w:hyperlink w:anchor="_Toc223029749" w:history="1">
+          <w:hyperlink w:anchor="_Toc223637561" w:history="1">
             <w:r>
               <w:rPr>
                 <w:rStyle w:val="Hyperlink"/>
@@ -1128,7 +1128,7 @@
                 <w:noProof/>
                 <w:webHidden/>
               </w:rPr>
-              <w:instrText xml:space="preserve"> PAGEREF _Toc223029749 \h </w:instrText>
+              <w:instrText xml:space="preserve"> PAGEREF _Toc223637561 \h </w:instrText>
             </w:r>
             <w:r>
               <w:rPr>
@@ -1176,7 +1176,7 @@
               <w14:ligatures w14:val="standardContextual"/>
             </w:rPr>
           </w:pPr>
-          <w:hyperlink w:anchor="_Toc223029750" w:history="1">
+          <w:hyperlink w:anchor="_Toc223637562" w:history="1">
             <w:r>
               <w:rPr>
                 <w:rStyle w:val="Hyperlink"/>
@@ -1222,7 +1222,7 @@
                 <w:noProof/>
                 <w:webHidden/>
               </w:rPr>
-              <w:instrText xml:space="preserve"> PAGEREF _Toc223029750 \h </w:instrText>
+              <w:instrText xml:space="preserve"> PAGEREF _Toc223637562 \h </w:instrText>
             </w:r>
             <w:r>
               <w:rPr>
@@ -1270,7 +1270,7 @@
               <w14:ligatures w14:val="standardContextual"/>
             </w:rPr>
           </w:pPr>
-          <w:hyperlink w:anchor="_Toc223029751" w:history="1">
+          <w:hyperlink w:anchor="_Toc223637563" w:history="1">
             <w:r>
               <w:rPr>
                 <w:rStyle w:val="Hyperlink"/>
@@ -1316,7 +1316,7 @@
                 <w:noProof/>
                 <w:webHidden/>
               </w:rPr>
-              <w:instrText xml:space="preserve"> PAGEREF _Toc223029751 \h </w:instrText>
+              <w:instrText xml:space="preserve"> PAGEREF _Toc223637563 \h </w:instrText>
             </w:r>
             <w:r>
               <w:rPr>
@@ -1360,7 +1360,7 @@
               <w14:ligatures w14:val="standardContextual"/>
             </w:rPr>
           </w:pPr>
-          <w:hyperlink w:anchor="_Toc223029752" w:history="1">
+          <w:hyperlink w:anchor="_Toc223637564" w:history="1">
             <w:r>
               <w:rPr>
                 <w:rStyle w:val="Hyperlink"/>
@@ -1406,7 +1406,7 @@
                 <w:noProof/>
                 <w:webHidden/>
               </w:rPr>
-              <w:instrText xml:space="preserve"> PAGEREF _Toc223029752 \h </w:instrText>
+              <w:instrText xml:space="preserve"> PAGEREF _Toc223637564 \h </w:instrText>
             </w:r>
             <w:r>
               <w:rPr>
@@ -1454,7 +1454,7 @@
               <w14:ligatures w14:val="standardContextual"/>
             </w:rPr>
           </w:pPr>
-          <w:hyperlink w:anchor="_Toc223029753" w:history="1">
+          <w:hyperlink w:anchor="_Toc223637565" w:history="1">
             <w:r>
               <w:rPr>
                 <w:rStyle w:val="Hyperlink"/>
@@ -1500,7 +1500,7 @@
                 <w:noProof/>
                 <w:webHidden/>
               </w:rPr>
-              <w:instrText xml:space="preserve"> PAGEREF _Toc223029753 \h </w:instrText>
+              <w:instrText xml:space="preserve"> PAGEREF _Toc223637565 \h </w:instrText>
             </w:r>
             <w:r>
               <w:rPr>
@@ -1548,7 +1548,7 @@
               <w14:ligatures w14:val="standardContextual"/>
             </w:rPr>
           </w:pPr>
-          <w:hyperlink w:anchor="_Toc223029754" w:history="1">
+          <w:hyperlink w:anchor="_Toc223637566" w:history="1">
             <w:r>
               <w:rPr>
                 <w:rStyle w:val="Hyperlink"/>
@@ -1594,7 +1594,7 @@
                 <w:noProof/>
                 <w:webHidden/>
               </w:rPr>
-              <w:instrText xml:space="preserve"> PAGEREF _Toc223029754 \h </w:instrText>
+              <w:instrText xml:space="preserve"> PAGEREF _Toc223637566 \h </w:instrText>
             </w:r>
             <w:r>
               <w:rPr>
@@ -1642,7 +1642,7 @@
               <w14:ligatures w14:val="standardContextual"/>
             </w:rPr>
           </w:pPr>
-          <w:hyperlink w:anchor="_Toc223029755" w:history="1">
+          <w:hyperlink w:anchor="_Toc223637567" w:history="1">
             <w:r>
               <w:rPr>
                 <w:rStyle w:val="Hyperlink"/>
@@ -1696,7 +1696,7 @@
                 <w:noProof/>
                 <w:webHidden/>
               </w:rPr>
-              <w:instrText xml:space="preserve"> PAGEREF _Toc223029755 \h </w:instrText>
+              <w:instrText xml:space="preserve"> PAGEREF _Toc223637567 \h </w:instrText>
             </w:r>
             <w:r>
               <w:rPr>
@@ -1744,7 +1744,7 @@
               <w14:ligatures w14:val="standardContextual"/>
             </w:rPr>
           </w:pPr>
-          <w:hyperlink w:anchor="_Toc223029756" w:history="1">
+          <w:hyperlink w:anchor="_Toc223637568" w:history="1">
             <w:r>
               <w:rPr>
                 <w:rStyle w:val="Hyperlink"/>
@@ -1790,7 +1790,7 @@
                 <w:noProof/>
                 <w:webHidden/>
               </w:rPr>
-              <w:instrText xml:space="preserve"> PAGEREF _Toc223029756 \h </w:instrText>
+              <w:instrText xml:space="preserve"> PAGEREF _Toc223637568 \h </w:instrText>
             </w:r>
             <w:r>
               <w:rPr>
@@ -1838,7 +1838,7 @@
               <w14:ligatures w14:val="standardContextual"/>
             </w:rPr>
           </w:pPr>
-          <w:hyperlink w:anchor="_Toc223029757" w:history="1">
+          <w:hyperlink w:anchor="_Toc223637569" w:history="1">
             <w:r>
               <w:rPr>
                 <w:rStyle w:val="Hyperlink"/>
@@ -1884,7 +1884,7 @@
                 <w:noProof/>
                 <w:webHidden/>
               </w:rPr>
-              <w:instrText xml:space="preserve"> PAGEREF _Toc223029757 \h </w:instrText>
+              <w:instrText xml:space="preserve"> PAGEREF _Toc223637569 \h </w:instrText>
             </w:r>
             <w:r>
               <w:rPr>
@@ -1932,7 +1932,7 @@
               <w14:ligatures w14:val="standardContextual"/>
             </w:rPr>
           </w:pPr>
-          <w:hyperlink w:anchor="_Toc223029758" w:history="1">
+          <w:hyperlink w:anchor="_Toc223637570" w:history="1">
             <w:r>
               <w:rPr>
                 <w:rStyle w:val="Hyperlink"/>
@@ -1978,7 +1978,7 @@
                 <w:noProof/>
                 <w:webHidden/>
               </w:rPr>
-              <w:instrText xml:space="preserve"> PAGEREF _Toc223029758 \h </w:instrText>
+              <w:instrText xml:space="preserve"> PAGEREF _Toc223637570 \h </w:instrText>
             </w:r>
             <w:r>
               <w:rPr>
@@ -2026,7 +2026,7 @@
               <w14:ligatures w14:val="standardContextual"/>
             </w:rPr>
           </w:pPr>
-          <w:hyperlink w:anchor="_Toc223029759" w:history="1">
+          <w:hyperlink w:anchor="_Toc223637571" w:history="1">
             <w:r>
               <w:rPr>
                 <w:rStyle w:val="Hyperlink"/>
@@ -2072,7 +2072,7 @@
                 <w:noProof/>
                 <w:webHidden/>
               </w:rPr>
-              <w:instrText xml:space="preserve"> PAGEREF _Toc223029759 \h </w:instrText>
+              <w:instrText xml:space="preserve"> PAGEREF _Toc223637571 \h </w:instrText>
             </w:r>
             <w:r>
               <w:rPr>
@@ -2120,7 +2120,7 @@
               <w14:ligatures w14:val="standardContextual"/>
             </w:rPr>
           </w:pPr>
-          <w:hyperlink w:anchor="_Toc223029760" w:history="1">
+          <w:hyperlink w:anchor="_Toc223637572" w:history="1">
             <w:r>
               <w:rPr>
                 <w:rStyle w:val="Hyperlink"/>
@@ -2166,7 +2166,7 @@
                 <w:noProof/>
                 <w:webHidden/>
               </w:rPr>
-              <w:instrText xml:space="preserve"> PAGEREF _Toc223029760 \h </w:instrText>
+              <w:instrText xml:space="preserve"> PAGEREF _Toc223637572 \h </w:instrText>
             </w:r>
             <w:r>
               <w:rPr>
@@ -2210,7 +2210,7 @@
               <w14:ligatures w14:val="standardContextual"/>
             </w:rPr>
           </w:pPr>
-          <w:hyperlink w:anchor="_Toc223029761" w:history="1">
+          <w:hyperlink w:anchor="_Toc223637573" w:history="1">
             <w:r>
               <w:rPr>
                 <w:rStyle w:val="Hyperlink"/>
@@ -2256,7 +2256,7 @@
                 <w:noProof/>
                 <w:webHidden/>
               </w:rPr>
-              <w:instrText xml:space="preserve"> PAGEREF _Toc223029761 \h </w:instrText>
+              <w:instrText xml:space="preserve"> PAGEREF _Toc223637573 \h </w:instrText>
             </w:r>
             <w:r>
               <w:rPr>
@@ -2304,7 +2304,7 @@
               <w14:ligatures w14:val="standardContextual"/>
             </w:rPr>
           </w:pPr>
-          <w:hyperlink w:anchor="_Toc223029762" w:history="1">
+          <w:hyperlink w:anchor="_Toc223637574" w:history="1">
             <w:r>
               <w:rPr>
                 <w:rStyle w:val="Hyperlink"/>
@@ -2350,7 +2350,7 @@
                 <w:noProof/>
                 <w:webHidden/>
               </w:rPr>
-              <w:instrText xml:space="preserve"> PAGEREF _Toc223029762 \h </w:instrText>
+              <w:instrText xml:space="preserve"> PAGEREF _Toc223637574 \h </w:instrText>
             </w:r>
             <w:r>
               <w:rPr>
@@ -2398,7 +2398,7 @@
               <w14:ligatures w14:val="standardContextual"/>
             </w:rPr>
           </w:pPr>
-          <w:hyperlink w:anchor="_Toc223029763" w:history="1">
+          <w:hyperlink w:anchor="_Toc223637575" w:history="1">
             <w:r>
               <w:rPr>
                 <w:rStyle w:val="Hyperlink"/>
@@ -2444,7 +2444,7 @@
                 <w:noProof/>
                 <w:webHidden/>
               </w:rPr>
-              <w:instrText xml:space="preserve"> PAGEREF _Toc223029763 \h </w:instrText>
+              <w:instrText xml:space="preserve"> PAGEREF _Toc223637575 \h </w:instrText>
             </w:r>
             <w:r>
               <w:rPr>
@@ -2492,7 +2492,7 @@
               <w14:ligatures w14:val="standardContextual"/>
             </w:rPr>
           </w:pPr>
-          <w:hyperlink w:anchor="_Toc223029764" w:history="1">
+          <w:hyperlink w:anchor="_Toc223637576" w:history="1">
             <w:r>
               <w:rPr>
                 <w:rStyle w:val="Hyperlink"/>
@@ -2546,7 +2546,7 @@
                 <w:noProof/>
                 <w:webHidden/>
               </w:rPr>
-              <w:instrText xml:space="preserve"> PAGEREF _Toc223029764 \h </w:instrText>
+              <w:instrText xml:space="preserve"> PAGEREF _Toc223637576 \h </w:instrText>
             </w:r>
             <w:r>
               <w:rPr>
@@ -2594,7 +2594,7 @@
               <w14:ligatures w14:val="standardContextual"/>
             </w:rPr>
           </w:pPr>
-          <w:hyperlink w:anchor="_Toc223029765" w:history="1">
+          <w:hyperlink w:anchor="_Toc223637577" w:history="1">
             <w:r>
               <w:rPr>
                 <w:rStyle w:val="Hyperlink"/>
@@ -2651,7 +2651,7 @@
                 <w:noProof/>
                 <w:webHidden/>
               </w:rPr>
-              <w:instrText xml:space="preserve"> PAGEREF _Toc223029765 \h </w:instrText>
+              <w:instrText xml:space="preserve"> PAGEREF _Toc223637577 \h </w:instrText>
             </w:r>
             <w:r>
               <w:rPr>
@@ -2699,7 +2699,7 @@
               <w14:ligatures w14:val="standardContextual"/>
             </w:rPr>
           </w:pPr>
-          <w:hyperlink w:anchor="_Toc223029766" w:history="1">
+          <w:hyperlink w:anchor="_Toc223637578" w:history="1">
             <w:r>
               <w:rPr>
                 <w:rStyle w:val="Hyperlink"/>
@@ -2747,7 +2747,7 @@
                 <w:noProof/>
                 <w:webHidden/>
               </w:rPr>
-              <w:instrText xml:space="preserve"> PAGEREF _Toc223029766 \h </w:instrText>
+              <w:instrText xml:space="preserve"> PAGEREF _Toc223637578 \h </w:instrText>
             </w:r>
             <w:r>
               <w:rPr>
@@ -2795,7 +2795,7 @@
               <w14:ligatures w14:val="standardContextual"/>
             </w:rPr>
           </w:pPr>
-          <w:hyperlink w:anchor="_Toc223029767" w:history="1">
+          <w:hyperlink w:anchor="_Toc223637579" w:history="1">
             <w:r>
               <w:rPr>
                 <w:rStyle w:val="Hyperlink"/>
@@ -2841,7 +2841,7 @@
                 <w:noProof/>
                 <w:webHidden/>
               </w:rPr>
-              <w:instrText xml:space="preserve"> PAGEREF _Toc223029767 \h </w:instrText>
+              <w:instrText xml:space="preserve"> PAGEREF _Toc223637579 \h </w:instrText>
             </w:r>
             <w:r>
               <w:rPr>
@@ -2889,7 +2889,7 @@
               <w14:ligatures w14:val="standardContextual"/>
             </w:rPr>
           </w:pPr>
-          <w:hyperlink w:anchor="_Toc223029768" w:history="1">
+          <w:hyperlink w:anchor="_Toc223637580" w:history="1">
             <w:r>
               <w:rPr>
                 <w:rStyle w:val="Hyperlink"/>
@@ -2937,7 +2937,7 @@
                 <w:noProof/>
                 <w:webHidden/>
               </w:rPr>
-              <w:instrText xml:space="preserve"> PAGEREF _Toc223029768 \h </w:instrText>
+              <w:instrText xml:space="preserve"> PAGEREF _Toc223637580 \h </w:instrText>
             </w:r>
             <w:r>
               <w:rPr>
@@ -2985,7 +2985,7 @@
               <w14:ligatures w14:val="standardContextual"/>
             </w:rPr>
           </w:pPr>
-          <w:hyperlink w:anchor="_Toc223029769" w:history="1">
+          <w:hyperlink w:anchor="_Toc223637581" w:history="1">
             <w:r>
               <w:rPr>
                 <w:rStyle w:val="Hyperlink"/>
@@ -3031,7 +3031,7 @@
                 <w:noProof/>
                 <w:webHidden/>
               </w:rPr>
-              <w:instrText xml:space="preserve"> PAGEREF _Toc223029769 \h </w:instrText>
+              <w:instrText xml:space="preserve"> PAGEREF _Toc223637581 \h </w:instrText>
             </w:r>
             <w:r>
               <w:rPr>
@@ -3079,7 +3079,7 @@
               <w14:ligatures w14:val="standardContextual"/>
             </w:rPr>
           </w:pPr>
-          <w:hyperlink w:anchor="_Toc223029770" w:history="1">
+          <w:hyperlink w:anchor="_Toc223637582" w:history="1">
             <w:r>
               <w:rPr>
                 <w:rStyle w:val="Hyperlink"/>
@@ -3125,7 +3125,7 @@
                 <w:noProof/>
                 <w:webHidden/>
               </w:rPr>
-              <w:instrText xml:space="preserve"> PAGEREF _Toc223029770 \h </w:instrText>
+              <w:instrText xml:space="preserve"> PAGEREF _Toc223637582 \h </w:instrText>
             </w:r>
             <w:r>
               <w:rPr>
@@ -3173,7 +3173,7 @@
               <w14:ligatures w14:val="standardContextual"/>
             </w:rPr>
           </w:pPr>
-          <w:hyperlink w:anchor="_Toc223029771" w:history="1">
+          <w:hyperlink w:anchor="_Toc223637583" w:history="1">
             <w:r>
               <w:rPr>
                 <w:rStyle w:val="Hyperlink"/>
@@ -3219,7 +3219,7 @@
                 <w:noProof/>
                 <w:webHidden/>
               </w:rPr>
-              <w:instrText xml:space="preserve"> PAGEREF _Toc223029771 \h </w:instrText>
+              <w:instrText xml:space="preserve"> PAGEREF _Toc223637583 \h </w:instrText>
             </w:r>
             <w:r>
               <w:rPr>
@@ -3267,7 +3267,7 @@
               <w14:ligatures w14:val="standardContextual"/>
             </w:rPr>
           </w:pPr>
-          <w:hyperlink w:anchor="_Toc223029772" w:history="1">
+          <w:hyperlink w:anchor="_Toc223637584" w:history="1">
             <w:r>
               <w:rPr>
                 <w:rStyle w:val="Hyperlink"/>
@@ -3313,7 +3313,7 @@
                 <w:noProof/>
                 <w:webHidden/>
               </w:rPr>
-              <w:instrText xml:space="preserve"> PAGEREF _Toc223029772 \h </w:instrText>
+              <w:instrText xml:space="preserve"> PAGEREF _Toc223637584 \h </w:instrText>
             </w:r>
             <w:r>
               <w:rPr>
@@ -3333,7 +3333,7 @@
                 <w:noProof/>
                 <w:webHidden/>
               </w:rPr>
-              <w:t>23</w:t>
+              <w:t>26</w:t>
             </w:r>
             <w:r>
               <w:rPr>
@@ -3361,7 +3361,7 @@
               <w14:ligatures w14:val="standardContextual"/>
             </w:rPr>
           </w:pPr>
-          <w:hyperlink w:anchor="_Toc223029773" w:history="1">
+          <w:hyperlink w:anchor="_Toc223637585" w:history="1">
             <w:r>
               <w:rPr>
                 <w:rStyle w:val="Hyperlink"/>
@@ -3407,7 +3407,7 @@
                 <w:noProof/>
                 <w:webHidden/>
               </w:rPr>
-              <w:instrText xml:space="preserve"> PAGEREF _Toc223029773 \h </w:instrText>
+              <w:instrText xml:space="preserve"> PAGEREF _Toc223637585 \h </w:instrText>
             </w:r>
             <w:r>
               <w:rPr>
@@ -3427,7 +3427,7 @@
                 <w:noProof/>
                 <w:webHidden/>
               </w:rPr>
-              <w:t>23</w:t>
+              <w:t>28</w:t>
             </w:r>
             <w:r>
               <w:rPr>
@@ -3455,7 +3455,7 @@
               <w14:ligatures w14:val="standardContextual"/>
             </w:rPr>
           </w:pPr>
-          <w:hyperlink w:anchor="_Toc223029774" w:history="1">
+          <w:hyperlink w:anchor="_Toc223637586" w:history="1">
             <w:r>
               <w:rPr>
                 <w:rStyle w:val="Hyperlink"/>
@@ -3501,7 +3501,7 @@
                 <w:noProof/>
                 <w:webHidden/>
               </w:rPr>
-              <w:instrText xml:space="preserve"> PAGEREF _Toc223029774 \h </w:instrText>
+              <w:instrText xml:space="preserve"> PAGEREF _Toc223637586 \h </w:instrText>
             </w:r>
             <w:r>
               <w:rPr>
@@ -3521,7 +3521,7 @@
                 <w:noProof/>
                 <w:webHidden/>
               </w:rPr>
-              <w:t>23</w:t>
+              <w:t>30</w:t>
             </w:r>
             <w:r>
               <w:rPr>
@@ -3549,7 +3549,7 @@
               <w14:ligatures w14:val="standardContextual"/>
             </w:rPr>
           </w:pPr>
-          <w:hyperlink w:anchor="_Toc223029775" w:history="1">
+          <w:hyperlink w:anchor="_Toc223637587" w:history="1">
             <w:r>
               <w:rPr>
                 <w:rStyle w:val="Hyperlink"/>
@@ -3595,7 +3595,7 @@
                 <w:noProof/>
                 <w:webHidden/>
               </w:rPr>
-              <w:instrText xml:space="preserve"> PAGEREF _Toc223029775 \h </w:instrText>
+              <w:instrText xml:space="preserve"> PAGEREF _Toc223637587 \h </w:instrText>
             </w:r>
             <w:r>
               <w:rPr>
@@ -3615,7 +3615,7 @@
                 <w:noProof/>
                 <w:webHidden/>
               </w:rPr>
-              <w:t>23</w:t>
+              <w:t>32</w:t>
             </w:r>
             <w:r>
               <w:rPr>
@@ -3643,7 +3643,7 @@
               <w14:ligatures w14:val="standardContextual"/>
             </w:rPr>
           </w:pPr>
-          <w:hyperlink w:anchor="_Toc223029776" w:history="1">
+          <w:hyperlink w:anchor="_Toc223637588" w:history="1">
             <w:r>
               <w:rPr>
                 <w:rStyle w:val="Hyperlink"/>
@@ -3689,7 +3689,7 @@
                 <w:noProof/>
                 <w:webHidden/>
               </w:rPr>
-              <w:instrText xml:space="preserve"> PAGEREF _Toc223029776 \h </w:instrText>
+              <w:instrText xml:space="preserve"> PAGEREF _Toc223637588 \h </w:instrText>
             </w:r>
             <w:r>
               <w:rPr>
@@ -3709,7 +3709,7 @@
                 <w:noProof/>
                 <w:webHidden/>
               </w:rPr>
-              <w:t>24</w:t>
+              <w:t>33</w:t>
             </w:r>
             <w:r>
               <w:rPr>
@@ -3737,7 +3737,7 @@
               <w14:ligatures w14:val="standardContextual"/>
             </w:rPr>
           </w:pPr>
-          <w:hyperlink w:anchor="_Toc223029777" w:history="1">
+          <w:hyperlink w:anchor="_Toc223637589" w:history="1">
             <w:r>
               <w:rPr>
                 <w:rStyle w:val="Hyperlink"/>
@@ -3783,7 +3783,7 @@
                 <w:noProof/>
                 <w:webHidden/>
               </w:rPr>
-              <w:instrText xml:space="preserve"> PAGEREF _Toc223029777 \h </w:instrText>
+              <w:instrText xml:space="preserve"> PAGEREF _Toc223637589 \h </w:instrText>
             </w:r>
             <w:r>
               <w:rPr>
@@ -3803,7 +3803,7 @@
                 <w:noProof/>
                 <w:webHidden/>
               </w:rPr>
-              <w:t>25</w:t>
+              <w:t>34</w:t>
             </w:r>
             <w:r>
               <w:rPr>
@@ -3831,7 +3831,7 @@
               <w14:ligatures w14:val="standardContextual"/>
             </w:rPr>
           </w:pPr>
-          <w:hyperlink w:anchor="_Toc223029778" w:history="1">
+          <w:hyperlink w:anchor="_Toc223637590" w:history="1">
             <w:r>
               <w:rPr>
                 <w:rStyle w:val="Hyperlink"/>
@@ -3877,7 +3877,7 @@
                 <w:noProof/>
                 <w:webHidden/>
               </w:rPr>
-              <w:instrText xml:space="preserve"> PAGEREF _Toc223029778 \h </w:instrText>
+              <w:instrText xml:space="preserve"> PAGEREF _Toc223637590 \h </w:instrText>
             </w:r>
             <w:r>
               <w:rPr>
@@ -3897,7 +3897,7 @@
                 <w:noProof/>
                 <w:webHidden/>
               </w:rPr>
-              <w:t>26</w:t>
+              <w:t>35</w:t>
             </w:r>
             <w:r>
               <w:rPr>
@@ -3921,7 +3921,7 @@
               <w14:ligatures w14:val="standardContextual"/>
             </w:rPr>
           </w:pPr>
-          <w:hyperlink w:anchor="_Toc223029779" w:history="1">
+          <w:hyperlink w:anchor="_Toc223637591" w:history="1">
             <w:r>
               <w:rPr>
                 <w:rStyle w:val="Hyperlink"/>
@@ -3967,7 +3967,7 @@
                 <w:noProof/>
                 <w:webHidden/>
               </w:rPr>
-              <w:instrText xml:space="preserve"> PAGEREF _Toc223029779 \h </w:instrText>
+              <w:instrText xml:space="preserve"> PAGEREF _Toc223637591 \h </w:instrText>
             </w:r>
             <w:r>
               <w:rPr>
@@ -3987,7 +3987,7 @@
                 <w:noProof/>
                 <w:webHidden/>
               </w:rPr>
-              <w:t>27</w:t>
+              <w:t>36</w:t>
             </w:r>
             <w:r>
               <w:rPr>
@@ -4015,7 +4015,7 @@
               <w14:ligatures w14:val="standardContextual"/>
             </w:rPr>
           </w:pPr>
-          <w:hyperlink w:anchor="_Toc223029780" w:history="1">
+          <w:hyperlink w:anchor="_Toc223637592" w:history="1">
             <w:r>
               <w:rPr>
                 <w:rStyle w:val="Hyperlink"/>
@@ -4061,7 +4061,7 @@
                 <w:noProof/>
                 <w:webHidden/>
               </w:rPr>
-              <w:instrText xml:space="preserve"> PAGEREF _Toc223029780 \h </w:instrText>
+              <w:instrText xml:space="preserve"> PAGEREF _Toc223637592 \h </w:instrText>
             </w:r>
             <w:r>
               <w:rPr>
@@ -4081,7 +4081,7 @@
                 <w:noProof/>
                 <w:webHidden/>
               </w:rPr>
-              <w:t>27</w:t>
+              <w:t>36</w:t>
             </w:r>
             <w:r>
               <w:rPr>
@@ -4109,7 +4109,7 @@
               <w14:ligatures w14:val="standardContextual"/>
             </w:rPr>
           </w:pPr>
-          <w:hyperlink w:anchor="_Toc223029781" w:history="1">
+          <w:hyperlink w:anchor="_Toc223637593" w:history="1">
             <w:r>
               <w:rPr>
                 <w:rStyle w:val="Hyperlink"/>
@@ -4155,7 +4155,7 @@
                 <w:noProof/>
                 <w:webHidden/>
               </w:rPr>
-              <w:instrText xml:space="preserve"> PAGEREF _Toc223029781 \h </w:instrText>
+              <w:instrText xml:space="preserve"> PAGEREF _Toc223637593 \h </w:instrText>
             </w:r>
             <w:r>
               <w:rPr>
@@ -4175,7 +4175,7 @@
                 <w:noProof/>
                 <w:webHidden/>
               </w:rPr>
-              <w:t>29</w:t>
+              <w:t>39</w:t>
             </w:r>
             <w:r>
               <w:rPr>
@@ -4199,7 +4199,7 @@
               <w14:ligatures w14:val="standardContextual"/>
             </w:rPr>
           </w:pPr>
-          <w:hyperlink w:anchor="_Toc223029782" w:history="1">
+          <w:hyperlink w:anchor="_Toc223637594" w:history="1">
             <w:r>
               <w:rPr>
                 <w:rStyle w:val="Hyperlink"/>
@@ -4245,7 +4245,7 @@
                 <w:noProof/>
                 <w:webHidden/>
               </w:rPr>
-              <w:instrText xml:space="preserve"> PAGEREF _Toc223029782 \h </w:instrText>
+              <w:instrText xml:space="preserve"> PAGEREF _Toc223637594 \h </w:instrText>
             </w:r>
             <w:r>
               <w:rPr>
@@ -4265,7 +4265,7 @@
                 <w:noProof/>
                 <w:webHidden/>
               </w:rPr>
-              <w:t>30</w:t>
+              <w:t>40</w:t>
             </w:r>
             <w:r>
               <w:rPr>
@@ -4289,7 +4289,7 @@
               <w14:ligatures w14:val="standardContextual"/>
             </w:rPr>
           </w:pPr>
-          <w:hyperlink w:anchor="_Toc223029783" w:history="1">
+          <w:hyperlink w:anchor="_Toc223637595" w:history="1">
             <w:r>
               <w:rPr>
                 <w:rStyle w:val="Hyperlink"/>
@@ -4335,7 +4335,7 @@
                 <w:noProof/>
                 <w:webHidden/>
               </w:rPr>
-              <w:instrText xml:space="preserve"> PAGEREF _Toc223029783 \h </w:instrText>
+              <w:instrText xml:space="preserve"> PAGEREF _Toc223637595 \h </w:instrText>
             </w:r>
             <w:r>
               <w:rPr>
@@ -4355,7 +4355,7 @@
                 <w:noProof/>
                 <w:webHidden/>
               </w:rPr>
-              <w:t>31</w:t>
+              <w:t>41</w:t>
             </w:r>
             <w:r>
               <w:rPr>
@@ -4379,7 +4379,7 @@
               <w14:ligatures w14:val="standardContextual"/>
             </w:rPr>
           </w:pPr>
-          <w:hyperlink w:anchor="_Toc223029784" w:history="1">
+          <w:hyperlink w:anchor="_Toc223637596" w:history="1">
             <w:r>
               <w:rPr>
                 <w:rStyle w:val="Hyperlink"/>
@@ -4425,7 +4425,7 @@
                 <w:noProof/>
                 <w:webHidden/>
               </w:rPr>
-              <w:instrText xml:space="preserve"> PAGEREF _Toc223029784 \h </w:instrText>
+              <w:instrText xml:space="preserve"> PAGEREF _Toc223637596 \h </w:instrText>
             </w:r>
             <w:r>
               <w:rPr>
@@ -4445,7 +4445,7 @@
                 <w:noProof/>
                 <w:webHidden/>
               </w:rPr>
-              <w:t>32</w:t>
+              <w:t>42</w:t>
             </w:r>
             <w:r>
               <w:rPr>
@@ -4473,7 +4473,7 @@
               <w14:ligatures w14:val="standardContextual"/>
             </w:rPr>
           </w:pPr>
-          <w:hyperlink w:anchor="_Toc223029785" w:history="1">
+          <w:hyperlink w:anchor="_Toc223637597" w:history="1">
             <w:r>
               <w:rPr>
                 <w:rStyle w:val="Hyperlink"/>
@@ -4519,7 +4519,7 @@
                 <w:noProof/>
                 <w:webHidden/>
               </w:rPr>
-              <w:instrText xml:space="preserve"> PAGEREF _Toc223029785 \h </w:instrText>
+              <w:instrText xml:space="preserve"> PAGEREF _Toc223637597 \h </w:instrText>
             </w:r>
             <w:r>
               <w:rPr>
@@ -4539,7 +4539,7 @@
                 <w:noProof/>
                 <w:webHidden/>
               </w:rPr>
-              <w:t>32</w:t>
+              <w:t>42</w:t>
             </w:r>
             <w:r>
               <w:rPr>
@@ -4567,7 +4567,7 @@
               <w14:ligatures w14:val="standardContextual"/>
             </w:rPr>
           </w:pPr>
-          <w:hyperlink w:anchor="_Toc223029786" w:history="1">
+          <w:hyperlink w:anchor="_Toc223637598" w:history="1">
             <w:r>
               <w:rPr>
                 <w:rStyle w:val="Hyperlink"/>
@@ -4613,7 +4613,7 @@
                 <w:noProof/>
                 <w:webHidden/>
               </w:rPr>
-              <w:instrText xml:space="preserve"> PAGEREF _Toc223029786 \h </w:instrText>
+              <w:instrText xml:space="preserve"> PAGEREF _Toc223637598 \h </w:instrText>
             </w:r>
             <w:r>
               <w:rPr>
@@ -4633,7 +4633,7 @@
                 <w:noProof/>
                 <w:webHidden/>
               </w:rPr>
-              <w:t>32</w:t>
+              <w:t>42</w:t>
             </w:r>
             <w:r>
               <w:rPr>
@@ -4661,7 +4661,7 @@
               <w14:ligatures w14:val="standardContextual"/>
             </w:rPr>
           </w:pPr>
-          <w:hyperlink w:anchor="_Toc223029787" w:history="1">
+          <w:hyperlink w:anchor="_Toc223637599" w:history="1">
             <w:r>
               <w:rPr>
                 <w:rStyle w:val="Hyperlink"/>
@@ -4707,7 +4707,7 @@
                 <w:noProof/>
                 <w:webHidden/>
               </w:rPr>
-              <w:instrText xml:space="preserve"> PAGEREF _Toc223029787 \h </w:instrText>
+              <w:instrText xml:space="preserve"> PAGEREF _Toc223637599 \h </w:instrText>
             </w:r>
             <w:r>
               <w:rPr>
@@ -4727,7 +4727,7 @@
                 <w:noProof/>
                 <w:webHidden/>
               </w:rPr>
-              <w:t>32</w:t>
+              <w:t>42</w:t>
             </w:r>
             <w:r>
               <w:rPr>
@@ -4755,7 +4755,7 @@
               <w14:ligatures w14:val="standardContextual"/>
             </w:rPr>
           </w:pPr>
-          <w:hyperlink w:anchor="_Toc223029788" w:history="1">
+          <w:hyperlink w:anchor="_Toc223637600" w:history="1">
             <w:r>
               <w:rPr>
                 <w:rStyle w:val="Hyperlink"/>
@@ -4801,7 +4801,7 @@
                 <w:noProof/>
                 <w:webHidden/>
               </w:rPr>
-              <w:instrText xml:space="preserve"> PAGEREF _Toc223029788 \h </w:instrText>
+              <w:instrText xml:space="preserve"> PAGEREF _Toc223637600 \h </w:instrText>
             </w:r>
             <w:r>
               <w:rPr>
@@ -4821,7 +4821,7 @@
                 <w:noProof/>
                 <w:webHidden/>
               </w:rPr>
-              <w:t>32</w:t>
+              <w:t>42</w:t>
             </w:r>
             <w:r>
               <w:rPr>
@@ -4845,7 +4845,7 @@
               <w14:ligatures w14:val="standardContextual"/>
             </w:rPr>
           </w:pPr>
-          <w:hyperlink w:anchor="_Toc223029789" w:history="1">
+          <w:hyperlink w:anchor="_Toc223637601" w:history="1">
             <w:r>
               <w:rPr>
                 <w:rStyle w:val="Hyperlink"/>
@@ -4891,7 +4891,7 @@
                 <w:noProof/>
                 <w:webHidden/>
               </w:rPr>
-              <w:instrText xml:space="preserve"> PAGEREF _Toc223029789 \h </w:instrText>
+              <w:instrText xml:space="preserve"> PAGEREF _Toc223637601 \h </w:instrText>
             </w:r>
             <w:r>
               <w:rPr>
@@ -4911,7 +4911,7 @@
                 <w:noProof/>
                 <w:webHidden/>
               </w:rPr>
-              <w:t>33</w:t>
+              <w:t>43</w:t>
             </w:r>
             <w:r>
               <w:rPr>
@@ -4977,7 +4977,7 @@
       <w:bookmarkStart w:id="12" w:name="_Ref211230122"/>
       <w:bookmarkStart w:id="13" w:name="_Ref211230230"/>
       <w:bookmarkStart w:id="14" w:name="_Ref200464507"/>
-      <w:bookmarkStart w:id="15" w:name="_Toc223029749"/>
+      <w:bookmarkStart w:id="15" w:name="_Toc223637561"/>
       <w:r>
         <w:lastRenderedPageBreak/>
         <w:t>Einleitung</w:t>
@@ -5119,7 +5119,7 @@
       <w:bookmarkStart w:id="20" w:name="_Toc210560241"/>
       <w:bookmarkStart w:id="21" w:name="_Toc84751232"/>
       <w:bookmarkStart w:id="22" w:name="_Toc211138145"/>
-      <w:bookmarkStart w:id="23" w:name="_Toc223029750"/>
+      <w:bookmarkStart w:id="23" w:name="_Toc223637562"/>
       <w:r>
         <w:t>Vertiefende Aufgabenstellung</w:t>
       </w:r>
@@ -5155,6 +5155,31 @@
           <w:szCs w:val="28"/>
         </w:rPr>
         <w:t>Text (Formatvorlage = Text): ….</w:t>
+      </w:r>
+    </w:p>
+    <w:p>
+      <w:pPr>
+        <w:pStyle w:val="Text"/>
+        <w:rPr>
+          <w:color w:val="0066FF"/>
+          <w:szCs w:val="28"/>
+        </w:rPr>
+      </w:pPr>
+    </w:p>
+    <w:p>
+      <w:pPr>
+        <w:jc w:val="left"/>
+        <w:rPr>
+          <w:color w:val="0066FF"/>
+          <w:szCs w:val="28"/>
+        </w:rPr>
+      </w:pPr>
+      <w:r>
+        <w:rPr>
+          <w:color w:val="0066FF"/>
+          <w:szCs w:val="28"/>
+        </w:rPr>
+        <w:br w:type="page"/>
       </w:r>
     </w:p>
     <w:p>
@@ -5169,7 +5194,7 @@
       <w:bookmarkStart w:id="29" w:name="_Toc210560295"/>
       <w:bookmarkStart w:id="30" w:name="_Toc84751233"/>
       <w:bookmarkStart w:id="31" w:name="_Toc211137894"/>
-      <w:bookmarkStart w:id="32" w:name="_Toc223029751"/>
+      <w:bookmarkStart w:id="32" w:name="_Toc223637563"/>
       <w:bookmarkEnd w:id="24"/>
       <w:bookmarkEnd w:id="25"/>
       <w:bookmarkEnd w:id="26"/>
@@ -5179,6 +5204,7 @@
       <w:bookmarkEnd w:id="30"/>
       <w:bookmarkEnd w:id="31"/>
       <w:r>
+        <w:lastRenderedPageBreak/>
         <w:t>Vertiefende Aufgabenstellung Schüler:in2</w:t>
       </w:r>
       <w:bookmarkEnd w:id="32"/>
@@ -5224,8 +5250,8 @@
       <w:pPr>
         <w:pStyle w:val="berschrift1"/>
       </w:pPr>
-      <w:bookmarkStart w:id="33" w:name="_Toc223029752"/>
-      <w:bookmarkStart w:id="34" w:name="_Ref200464718"/>
+      <w:bookmarkStart w:id="33" w:name="_Ref200464718"/>
+      <w:bookmarkStart w:id="34" w:name="_Toc223637564"/>
       <w:r>
         <w:lastRenderedPageBreak/>
         <w:t xml:space="preserve">Dokumentation </w:t>
@@ -5238,17 +5264,17 @@
       <w:r>
         <w:t xml:space="preserve"> Alexander</w:t>
       </w:r>
+      <w:bookmarkEnd w:id="34"/>
+      <w:r>
+        <w:t xml:space="preserve"> </w:t>
+      </w:r>
       <w:bookmarkEnd w:id="33"/>
-      <w:r>
-        <w:t xml:space="preserve"> </w:t>
-      </w:r>
-      <w:bookmarkEnd w:id="34"/>
     </w:p>
     <w:p>
       <w:pPr>
         <w:pStyle w:val="berschrift2"/>
       </w:pPr>
-      <w:bookmarkStart w:id="35" w:name="_Toc223029753"/>
+      <w:bookmarkStart w:id="35" w:name="_Toc223637565"/>
       <w:r>
         <w:t>Einleitung</w:t>
       </w:r>
@@ -5349,7 +5375,7 @@
       <w:pPr>
         <w:pStyle w:val="berschrift2"/>
       </w:pPr>
-      <w:bookmarkStart w:id="36" w:name="_Toc223029754"/>
+      <w:bookmarkStart w:id="36" w:name="_Toc223637566"/>
       <w:r>
         <w:t>Theoretische Grundlagen</w:t>
       </w:r>
@@ -5397,7 +5423,7 @@
       <w:pPr>
         <w:pStyle w:val="berschrift3"/>
       </w:pPr>
-      <w:bookmarkStart w:id="37" w:name="_Toc223029755"/>
+      <w:bookmarkStart w:id="37" w:name="_Toc223637567"/>
       <w:r>
         <w:rPr>
           <w:i/>
@@ -5436,7 +5462,7 @@
       <w:pPr>
         <w:pStyle w:val="berschrift3"/>
       </w:pPr>
-      <w:bookmarkStart w:id="38" w:name="_Toc223029756"/>
+      <w:bookmarkStart w:id="38" w:name="_Toc223637568"/>
       <w:r>
         <w:rPr>
           <w:color w:val="0066FF"/>
@@ -5914,6 +5940,9 @@
         <w:fldChar w:fldCharType="separate"/>
       </w:r>
       <w:r>
+        <w:rPr>
+          <w:noProof/>
+        </w:rPr>
         <w:t>1</w:t>
       </w:r>
       <w:r>
@@ -6270,6 +6299,9 @@
         <w:fldChar w:fldCharType="separate"/>
       </w:r>
       <w:r>
+        <w:rPr>
+          <w:noProof/>
+        </w:rPr>
         <w:t>1</w:t>
       </w:r>
       <w:r>
@@ -6332,7 +6364,7 @@
       <w:pPr>
         <w:pStyle w:val="berschrift2"/>
       </w:pPr>
-      <w:bookmarkStart w:id="39" w:name="_Toc223029757"/>
+      <w:bookmarkStart w:id="39" w:name="_Toc223637569"/>
       <w:r>
         <w:t>Praktische Umsetzung</w:t>
       </w:r>
@@ -6350,7 +6382,7 @@
       <w:pPr>
         <w:pStyle w:val="berschrift2"/>
       </w:pPr>
-      <w:bookmarkStart w:id="40" w:name="_Toc223029758"/>
+      <w:bookmarkStart w:id="40" w:name="_Toc223637570"/>
       <w:r>
         <w:t>Weitere individuelle Abschnitte</w:t>
       </w:r>
@@ -6405,7 +6437,7 @@
       <w:pPr>
         <w:pStyle w:val="berschrift2"/>
       </w:pPr>
-      <w:bookmarkStart w:id="41" w:name="_Toc223029759"/>
+      <w:bookmarkStart w:id="41" w:name="_Toc223637571"/>
       <w:r>
         <w:lastRenderedPageBreak/>
         <w:t>Ergebnisse und Diskussion</w:t>
@@ -6430,7 +6462,7 @@
       <w:pPr>
         <w:pStyle w:val="berschrift2"/>
       </w:pPr>
-      <w:bookmarkStart w:id="42" w:name="_Toc223029760"/>
+      <w:bookmarkStart w:id="42" w:name="_Toc223637572"/>
       <w:r>
         <w:t>Zusammenfassung individueller Teil</w:t>
       </w:r>
@@ -6586,7 +6618,7 @@
         <w:pStyle w:val="berschrift1"/>
       </w:pPr>
       <w:bookmarkStart w:id="43" w:name="_Ref200465902"/>
-      <w:bookmarkStart w:id="44" w:name="_Toc223029761"/>
+      <w:bookmarkStart w:id="44" w:name="_Toc223637573"/>
       <w:r>
         <w:lastRenderedPageBreak/>
         <w:t xml:space="preserve">Dokumentation </w:t>
@@ -6604,7 +6636,7 @@
       <w:pPr>
         <w:pStyle w:val="berschrift2"/>
       </w:pPr>
-      <w:bookmarkStart w:id="45" w:name="_Toc223029762"/>
+      <w:bookmarkStart w:id="45" w:name="_Toc223637574"/>
       <w:r>
         <w:t>Einleitung</w:t>
       </w:r>
@@ -6766,7 +6798,7 @@
       <w:pPr>
         <w:pStyle w:val="berschrift2"/>
       </w:pPr>
-      <w:bookmarkStart w:id="46" w:name="_Toc223029763"/>
+      <w:bookmarkStart w:id="46" w:name="_Toc223637575"/>
       <w:r>
         <w:lastRenderedPageBreak/>
         <w:t>Theoretische Grundlagen</w:t>
@@ -6993,7 +7025,7 @@
       <w:pPr>
         <w:pStyle w:val="berschrift3"/>
       </w:pPr>
-      <w:bookmarkStart w:id="47" w:name="_Toc223029764"/>
+      <w:bookmarkStart w:id="47" w:name="_Toc223637576"/>
       <w:commentRangeStart w:id="48"/>
       <w:r>
         <w:lastRenderedPageBreak/>
@@ -8015,7 +8047,10 @@
         <w:fldChar w:fldCharType="separate"/>
       </w:r>
       <w:r>
-        <w:t>1</w:t>
+        <w:rPr>
+          <w:noProof/>
+        </w:rPr>
+        <w:t>2</w:t>
       </w:r>
       <w:r>
         <w:fldChar w:fldCharType="end"/>
@@ -8366,7 +8401,10 @@
         <w:fldChar w:fldCharType="separate"/>
       </w:r>
       <w:r>
-        <w:t>1</w:t>
+        <w:rPr>
+          <w:noProof/>
+        </w:rPr>
+        <w:t>2</w:t>
       </w:r>
       <w:r>
         <w:fldChar w:fldCharType="end"/>
@@ -8850,7 +8888,7 @@
           <w:lang w:val="de-AT"/>
         </w:rPr>
       </w:pPr>
-      <w:bookmarkStart w:id="52" w:name="_Toc223029765"/>
+      <w:bookmarkStart w:id="52" w:name="_Toc223637577"/>
       <w:r>
         <w:rPr>
           <w:lang w:val="de-AT"/>
@@ -9816,7 +9854,7 @@
           <w:lang w:val="de-AT"/>
         </w:rPr>
       </w:pPr>
-      <w:bookmarkStart w:id="56" w:name="_Toc223029766"/>
+      <w:bookmarkStart w:id="56" w:name="_Toc223637578"/>
       <w:commentRangeStart w:id="57"/>
       <w:r>
         <w:rPr>
@@ -9935,7 +9973,7 @@
       <w:pPr>
         <w:pStyle w:val="berschrift3"/>
       </w:pPr>
-      <w:bookmarkStart w:id="58" w:name="_Toc223029767"/>
+      <w:bookmarkStart w:id="58" w:name="_Toc223637579"/>
       <w:r>
         <w:lastRenderedPageBreak/>
         <w:t>Interface</w:t>
@@ -10805,7 +10843,7 @@
           <w:lang w:val="de-AT"/>
         </w:rPr>
       </w:pPr>
-      <w:bookmarkStart w:id="59" w:name="_Toc223029768"/>
+      <w:bookmarkStart w:id="59" w:name="_Toc223637580"/>
       <w:commentRangeStart w:id="60"/>
       <w:r>
         <w:rPr>
@@ -11176,7 +11214,10 @@
         <w:fldChar w:fldCharType="separate"/>
       </w:r>
       <w:r>
-        <w:t>1</w:t>
+        <w:rPr>
+          <w:noProof/>
+        </w:rPr>
+        <w:t>3</w:t>
       </w:r>
       <w:r>
         <w:fldChar w:fldCharType="end"/>
@@ -11203,7 +11244,7 @@
       <w:pPr>
         <w:pStyle w:val="berschrift3"/>
       </w:pPr>
-      <w:bookmarkStart w:id="61" w:name="_Toc223029769"/>
+      <w:bookmarkStart w:id="61" w:name="_Toc223637581"/>
       <w:r>
         <w:lastRenderedPageBreak/>
         <w:t>Verwendung von Literatur, Internetquellen und KI</w:t>
@@ -11281,7 +11322,7 @@
       <w:pPr>
         <w:pStyle w:val="berschrift2"/>
       </w:pPr>
-      <w:bookmarkStart w:id="62" w:name="_Toc223029770"/>
+      <w:bookmarkStart w:id="62" w:name="_Toc223637582"/>
       <w:r>
         <w:lastRenderedPageBreak/>
         <w:t>Praktische Umsetzung</w:t>
@@ -11292,12 +11333,11 @@
       <w:pPr>
         <w:pStyle w:val="berschrift3"/>
       </w:pPr>
-      <w:bookmarkStart w:id="63" w:name="_Toc223029771"/>
+      <w:bookmarkStart w:id="63" w:name="_Toc223637583"/>
       <w:commentRangeStart w:id="64"/>
       <w:r>
         <w:t>Tiefenmessung mit Stereo-Vision</w:t>
       </w:r>
-      <w:bookmarkEnd w:id="63"/>
       <w:commentRangeEnd w:id="64"/>
       <w:r>
         <w:rPr>
@@ -11307,6 +11347,7 @@
         </w:rPr>
         <w:commentReference w:id="64"/>
       </w:r>
+      <w:bookmarkEnd w:id="63"/>
     </w:p>
     <w:p>
       <w:pPr>
@@ -11844,6 +11885,7 @@
       </w:pPr>
       <w:r>
         <w:rPr>
+          <w:noProof/>
           <w:lang w:val="de-AT"/>
         </w:rPr>
         <w:drawing>
@@ -11903,16 +11945,16 @@
         <w:fldChar w:fldCharType="separate"/>
       </w:r>
       <w:r>
-        <w:t>1</w:t>
+        <w:rPr>
+          <w:noProof/>
+        </w:rPr>
+        <w:t>3</w:t>
       </w:r>
       <w:r>
         <w:fldChar w:fldCharType="end"/>
       </w:r>
       <w:r>
-        <w:t xml:space="preserve">: </w:t>
-      </w:r>
-      <w:r>
-        <w:t xml:space="preserve">JET – Farbskala mit </w:t>
+        <w:t xml:space="preserve">: JET – Farbskala mit </w:t>
       </w:r>
       <w:r>
         <w:t>minimal</w:t>
@@ -11974,6 +12016,7 @@
       </w:pPr>
       <w:r>
         <w:rPr>
+          <w:noProof/>
           <w:lang w:val="de-AT"/>
         </w:rPr>
         <w:drawing>
@@ -12033,16 +12076,16 @@
         <w:fldChar w:fldCharType="separate"/>
       </w:r>
       <w:r>
-        <w:t>1</w:t>
+        <w:rPr>
+          <w:noProof/>
+        </w:rPr>
+        <w:t>4</w:t>
       </w:r>
       <w:r>
         <w:fldChar w:fldCharType="end"/>
       </w:r>
       <w:r>
-        <w:t xml:space="preserve">: </w:t>
-      </w:r>
-      <w:r>
-        <w:t>JET – Farbskala mit unbekannten Punkten im ROI</w:t>
+        <w:t>: JET – Farbskala mit unbekannten Punkten im ROI</w:t>
       </w:r>
     </w:p>
     <w:p>
@@ -12091,13 +12134,12 @@
     <w:p>
       <w:pPr>
         <w:pStyle w:val="Text"/>
+        <w:keepNext/>
         <w:jc w:val="center"/>
-        <w:rPr>
-          <w:lang w:val="de-AT"/>
-        </w:rPr>
-      </w:pPr>
-      <w:r>
-        <w:rPr>
+      </w:pPr>
+      <w:r>
+        <w:rPr>
+          <w:noProof/>
           <w:lang w:val="de-AT"/>
         </w:rPr>
         <w:drawing>
@@ -12149,9 +12191,6 @@
     <w:p>
       <w:pPr>
         <w:pStyle w:val="Beschriftung"/>
-        <w:rPr>
-          <w:color w:val="0066FF"/>
-        </w:rPr>
       </w:pPr>
       <w:r>
         <w:t xml:space="preserve">Abbildung </w:t>
@@ -12166,16 +12205,16 @@
         <w:fldChar w:fldCharType="separate"/>
       </w:r>
       <w:r>
-        <w:t>1</w:t>
+        <w:rPr>
+          <w:noProof/>
+        </w:rPr>
+        <w:t>5</w:t>
       </w:r>
       <w:r>
         <w:fldChar w:fldCharType="end"/>
       </w:r>
       <w:r>
-        <w:t xml:space="preserve">: </w:t>
-      </w:r>
-      <w:r>
-        <w:t>Tiefenwerten nach Objekt Filterung</w:t>
+        <w:t>: Tiefenwerte nach Objekt Filterung</w:t>
       </w:r>
     </w:p>
     <w:p>
@@ -12340,25 +12379,18 @@
         <w:rPr>
           <w:lang w:val="de-AT"/>
         </w:rPr>
-        <w:t>Höhe: 98 mm</w:t>
-      </w:r>
-      <w:r>
-        <w:rPr>
-          <w:lang w:val="de-AT"/>
-        </w:rPr>
-        <w:t xml:space="preserve"> </w:t>
-      </w:r>
-    </w:p>
-    <w:p>
-      <w:pPr>
-        <w:pStyle w:val="Text"/>
+        <w:t xml:space="preserve">Höhe: 98 mm </w:t>
+      </w:r>
+    </w:p>
+    <w:p>
+      <w:pPr>
+        <w:pStyle w:val="Text"/>
+        <w:keepNext/>
         <w:jc w:val="center"/>
-        <w:rPr>
-          <w:lang w:val="de-AT"/>
-        </w:rPr>
-      </w:pPr>
-      <w:r>
-        <w:rPr>
+      </w:pPr>
+      <w:r>
+        <w:rPr>
+          <w:noProof/>
           <w:lang w:val="de-AT"/>
         </w:rPr>
         <w:drawing>
@@ -12400,6 +12432,44 @@
     </w:p>
     <w:p>
       <w:pPr>
+        <w:pStyle w:val="Beschriftung"/>
+      </w:pPr>
+      <w:r>
+        <w:t xml:space="preserve">Abbildung </w:t>
+      </w:r>
+      <w:r>
+        <w:fldChar w:fldCharType="begin"/>
+      </w:r>
+      <w:r>
+        <w:instrText xml:space="preserve"> SEQ Abbildung \* ARABIC </w:instrText>
+      </w:r>
+      <w:r>
+        <w:fldChar w:fldCharType="separate"/>
+      </w:r>
+      <w:r>
+        <w:rPr>
+          <w:noProof/>
+        </w:rPr>
+        <w:t>7</w:t>
+      </w:r>
+      <w:r>
+        <w:fldChar w:fldCharType="end"/>
+      </w:r>
+      <w:r>
+        <w:t>: Ergebnis der Abmessungen</w:t>
+      </w:r>
+    </w:p>
+    <w:p>
+      <w:pPr>
+        <w:pStyle w:val="Text"/>
+        <w:jc w:val="center"/>
+        <w:rPr>
+          <w:lang w:val="de-AT"/>
+        </w:rPr>
+      </w:pPr>
+    </w:p>
+    <w:p>
+      <w:pPr>
         <w:pStyle w:val="Text"/>
         <w:rPr>
           <w:lang w:val="de-AT"/>
@@ -12436,14 +12506,13 @@
       <w:pPr>
         <w:pStyle w:val="berschrift3"/>
       </w:pPr>
-      <w:bookmarkStart w:id="65" w:name="_Toc223029772"/>
+      <w:bookmarkStart w:id="65" w:name="_Toc223637584"/>
       <w:commentRangeStart w:id="66"/>
       <w:commentRangeStart w:id="67"/>
       <w:r>
         <w:lastRenderedPageBreak/>
         <w:t>Bildverarbeitung mit Barcode Erkennung</w:t>
       </w:r>
-      <w:bookmarkEnd w:id="65"/>
       <w:commentRangeEnd w:id="66"/>
       <w:r>
         <w:rPr>
@@ -12462,6 +12531,7 @@
         </w:rPr>
         <w:commentReference w:id="67"/>
       </w:r>
+      <w:bookmarkEnd w:id="65"/>
     </w:p>
     <w:p>
       <w:pPr>
@@ -12640,10 +12710,8 @@
     <w:p>
       <w:pPr>
         <w:pStyle w:val="Text"/>
+        <w:keepNext/>
         <w:jc w:val="center"/>
-        <w:rPr>
-          <w:lang w:val="de-AT"/>
-        </w:rPr>
       </w:pPr>
       <w:r>
         <w:rPr>
@@ -12690,106 +12758,282 @@
     <w:p>
       <w:pPr>
         <w:pStyle w:val="Beschriftung"/>
-        <w:rPr>
-          <w:color w:val="0066FF"/>
-        </w:rPr>
       </w:pPr>
       <w:r>
         <w:t xml:space="preserve">Abbildung </w:t>
       </w:r>
       <w:r>
-        <w:t>2</w:t>
-      </w:r>
-      <w:r>
-        <w:t xml:space="preserve">: Ergebnis von der Yolo </w:t>
-      </w:r>
-      <w:r>
-        <w:t>E</w:t>
-      </w:r>
-      <w:r>
-        <w:t>rkennung</w:t>
-      </w:r>
-      <w:r>
+        <w:fldChar w:fldCharType="begin"/>
+      </w:r>
+      <w:r>
+        <w:instrText xml:space="preserve"> SEQ Abbildung \* ARABIC </w:instrText>
+      </w:r>
+      <w:r>
+        <w:fldChar w:fldCharType="separate"/>
+      </w:r>
+      <w:r>
+        <w:rPr>
+          <w:noProof/>
+        </w:rPr>
+        <w:t>8</w:t>
+      </w:r>
+      <w:r>
+        <w:fldChar w:fldCharType="end"/>
+      </w:r>
+      <w:r>
+        <w:t>: Ergebnis von der Yolo Erkennung</w:t>
+      </w:r>
+    </w:p>
+    <w:p>
+      <w:pPr>
+        <w:rPr>
+          <w:lang w:val="de-AT" w:eastAsia="de-DE"/>
+        </w:rPr>
+      </w:pPr>
+    </w:p>
+    <w:p>
+      <w:pPr>
+        <w:pStyle w:val="Text"/>
+        <w:rPr>
+          <w:lang w:val="de-AT"/>
+        </w:rPr>
+      </w:pPr>
+      <w:r>
+        <w:rPr>
+          <w:lang w:val="de-AT"/>
+        </w:rPr>
+        <w:t xml:space="preserve">In diesem Beispiel ging es nur die Funktionalität zu testen des Yolo </w:t>
+      </w:r>
+      <w:r>
+        <w:rPr>
+          <w:lang w:val="de-AT"/>
+        </w:rPr>
+        <w:t>Modells</w:t>
+      </w:r>
+      <w:r>
+        <w:rPr>
+          <w:lang w:val="de-AT"/>
+        </w:rPr>
+        <w:t xml:space="preserve"> nicht um die </w:t>
+      </w:r>
+      <w:r>
+        <w:rPr>
+          <w:lang w:val="de-AT"/>
+        </w:rPr>
+        <w:t>Decodierung</w:t>
+      </w:r>
+      <w:r>
+        <w:rPr>
+          <w:lang w:val="de-AT"/>
+        </w:rPr>
+        <w:t xml:space="preserve">. Weil bei der </w:t>
+      </w:r>
+      <w:r>
+        <w:rPr>
+          <w:lang w:val="de-AT"/>
+        </w:rPr>
+        <w:t>Decodierung</w:t>
+      </w:r>
+      <w:r>
+        <w:rPr>
+          <w:lang w:val="de-AT"/>
+        </w:rPr>
+        <w:t xml:space="preserve"> wurde auch einmal die </w:t>
+      </w:r>
+      <w:proofErr w:type="spellStart"/>
+      <w:r>
+        <w:rPr>
+          <w:lang w:val="de-AT"/>
+        </w:rPr>
+        <w:t>libary</w:t>
+      </w:r>
+      <w:proofErr w:type="spellEnd"/>
+      <w:r>
+        <w:rPr>
+          <w:lang w:val="de-AT"/>
+        </w:rPr>
+        <w:t xml:space="preserve"> von </w:t>
+      </w:r>
+      <w:proofErr w:type="spellStart"/>
+      <w:r>
+        <w:rPr>
+          <w:lang w:val="de-AT"/>
+        </w:rPr>
+        <w:t>zxing</w:t>
+      </w:r>
+      <w:proofErr w:type="spellEnd"/>
+      <w:r>
+        <w:rPr>
+          <w:lang w:val="de-AT"/>
+        </w:rPr>
         <w:t xml:space="preserve"> </w:t>
       </w:r>
-    </w:p>
-    <w:p>
-      <w:pPr>
-        <w:pStyle w:val="Text"/>
-        <w:rPr>
-          <w:lang w:val="de-AT"/>
-        </w:rPr>
-      </w:pPr>
-    </w:p>
-    <w:p>
-      <w:pPr>
-        <w:pStyle w:val="Text"/>
-        <w:rPr>
-          <w:lang w:val="de-AT"/>
-        </w:rPr>
-      </w:pPr>
-      <w:r>
-        <w:rPr>
-          <w:lang w:val="de-AT"/>
-        </w:rPr>
-        <w:t xml:space="preserve">In diesem Beispiel ging es nur die Funktionalität zu testen des Yolo </w:t>
-      </w:r>
-      <w:r>
-        <w:rPr>
-          <w:lang w:val="de-AT"/>
-        </w:rPr>
-        <w:t>Modells</w:t>
-      </w:r>
-      <w:r>
-        <w:rPr>
-          <w:lang w:val="de-AT"/>
-        </w:rPr>
-        <w:t xml:space="preserve"> nicht um die </w:t>
-      </w:r>
-      <w:r>
-        <w:rPr>
-          <w:lang w:val="de-AT"/>
-        </w:rPr>
-        <w:t>Decodierung</w:t>
-      </w:r>
-      <w:r>
-        <w:rPr>
-          <w:lang w:val="de-AT"/>
-        </w:rPr>
-        <w:t xml:space="preserve">. Weil bei der </w:t>
-      </w:r>
-      <w:r>
-        <w:rPr>
-          <w:lang w:val="de-AT"/>
-        </w:rPr>
-        <w:t>Decodierung</w:t>
-      </w:r>
-      <w:r>
-        <w:rPr>
-          <w:lang w:val="de-AT"/>
-        </w:rPr>
-        <w:t xml:space="preserve"> wurde auch einmal die </w:t>
+      <w:r>
+        <w:rPr>
+          <w:lang w:val="de-AT"/>
+        </w:rPr>
+        <w:t>probiert,</w:t>
+      </w:r>
+      <w:r>
+        <w:rPr>
+          <w:lang w:val="de-AT"/>
+        </w:rPr>
+        <w:t xml:space="preserve"> aber dabei kam es zu wenigen </w:t>
+      </w:r>
+      <w:r>
+        <w:rPr>
+          <w:lang w:val="de-AT"/>
+        </w:rPr>
+        <w:t>Ergebnissen,</w:t>
+      </w:r>
+      <w:r>
+        <w:rPr>
+          <w:lang w:val="de-AT"/>
+        </w:rPr>
+        <w:t xml:space="preserve"> daher wurde die </w:t>
       </w:r>
       <w:proofErr w:type="spellStart"/>
       <w:r>
         <w:rPr>
           <w:lang w:val="de-AT"/>
         </w:rPr>
-        <w:t>libary</w:t>
+        <w:t>pyzbar</w:t>
       </w:r>
       <w:proofErr w:type="spellEnd"/>
       <w:r>
         <w:rPr>
           <w:lang w:val="de-AT"/>
         </w:rPr>
-        <w:t xml:space="preserve"> von </w:t>
+        <w:t xml:space="preserve"> verwendet und ein </w:t>
+      </w:r>
+      <w:r>
+        <w:rPr>
+          <w:lang w:val="de-AT"/>
+        </w:rPr>
+        <w:t>Ergebnis</w:t>
+      </w:r>
+      <w:r>
+        <w:rPr>
+          <w:lang w:val="de-AT"/>
+        </w:rPr>
+        <w:t xml:space="preserve"> von erzielt.</w:t>
+      </w:r>
+    </w:p>
+    <w:p>
+      <w:pPr>
+        <w:pStyle w:val="Text"/>
+        <w:rPr>
+          <w:lang w:val="de-AT"/>
+        </w:rPr>
+      </w:pPr>
+    </w:p>
+    <w:p>
+      <w:pPr>
+        <w:pStyle w:val="Text"/>
+        <w:rPr>
+          <w:lang w:val="de-AT"/>
+        </w:rPr>
+      </w:pPr>
+    </w:p>
+    <w:p>
+      <w:pPr>
+        <w:pStyle w:val="Text"/>
+        <w:rPr>
+          <w:lang w:val="de-AT"/>
+        </w:rPr>
+      </w:pPr>
+    </w:p>
+    <w:p>
+      <w:pPr>
+        <w:pStyle w:val="Text"/>
+        <w:rPr>
+          <w:lang w:val="de-AT"/>
+        </w:rPr>
+      </w:pPr>
+    </w:p>
+    <w:p>
+      <w:pPr>
+        <w:pStyle w:val="Text"/>
+        <w:rPr>
+          <w:lang w:val="de-AT"/>
+        </w:rPr>
+      </w:pPr>
+      <w:r>
+        <w:rPr>
+          <w:lang w:val="de-AT"/>
+        </w:rPr>
+        <w:t xml:space="preserve">Die </w:t>
+      </w:r>
+      <w:proofErr w:type="gramStart"/>
+      <w:r>
+        <w:rPr>
+          <w:lang w:val="de-AT"/>
+        </w:rPr>
+        <w:t>Fotos</w:t>
+      </w:r>
+      <w:proofErr w:type="gramEnd"/>
+      <w:r>
+        <w:rPr>
+          <w:lang w:val="de-AT"/>
+        </w:rPr>
+        <w:t xml:space="preserve"> die zur </w:t>
+      </w:r>
+      <w:r>
+        <w:rPr>
+          <w:lang w:val="de-AT"/>
+        </w:rPr>
+        <w:t>Verwendung</w:t>
+      </w:r>
+      <w:r>
+        <w:rPr>
+          <w:lang w:val="de-AT"/>
+        </w:rPr>
+        <w:t xml:space="preserve"> genommen </w:t>
+      </w:r>
+      <w:proofErr w:type="gramStart"/>
+      <w:r>
+        <w:rPr>
+          <w:lang w:val="de-AT"/>
+        </w:rPr>
+        <w:t>wurden</w:t>
+      </w:r>
+      <w:proofErr w:type="gramEnd"/>
+      <w:r>
+        <w:rPr>
+          <w:lang w:val="de-AT"/>
+        </w:rPr>
+        <w:t xml:space="preserve"> </w:t>
+      </w:r>
+      <w:r>
+        <w:rPr>
+          <w:lang w:val="de-AT"/>
+        </w:rPr>
+        <w:t>kamen</w:t>
+      </w:r>
+      <w:r>
+        <w:rPr>
+          <w:lang w:val="de-AT"/>
+        </w:rPr>
+        <w:t xml:space="preserve"> auch aus dem link vo</w:t>
+      </w:r>
+      <w:r>
+        <w:rPr>
+          <w:lang w:val="de-AT"/>
+        </w:rPr>
+        <w:t>n der</w:t>
+      </w:r>
+      <w:r>
+        <w:rPr>
+          <w:lang w:val="de-AT"/>
+        </w:rPr>
+        <w:t xml:space="preserve"> </w:t>
       </w:r>
       <w:proofErr w:type="spellStart"/>
       <w:r>
         <w:rPr>
           <w:lang w:val="de-AT"/>
         </w:rPr>
-        <w:t>zxing</w:t>
+        <w:t>barcode</w:t>
       </w:r>
       <w:proofErr w:type="spellEnd"/>
       <w:r>
@@ -12798,192 +13042,18 @@
         </w:rPr>
         <w:t xml:space="preserve"> </w:t>
       </w:r>
-      <w:r>
-        <w:rPr>
-          <w:lang w:val="de-AT"/>
-        </w:rPr>
-        <w:t>probiert,</w:t>
-      </w:r>
-      <w:r>
-        <w:rPr>
-          <w:lang w:val="de-AT"/>
-        </w:rPr>
-        <w:t xml:space="preserve"> aber dabei kam es zu wenigen </w:t>
-      </w:r>
-      <w:r>
-        <w:rPr>
-          <w:lang w:val="de-AT"/>
-        </w:rPr>
-        <w:t>Ergebnissen,</w:t>
-      </w:r>
-      <w:r>
-        <w:rPr>
-          <w:lang w:val="de-AT"/>
-        </w:rPr>
-        <w:t xml:space="preserve"> daher wurde die </w:t>
-      </w:r>
       <w:proofErr w:type="spellStart"/>
       <w:r>
         <w:rPr>
           <w:lang w:val="de-AT"/>
         </w:rPr>
-        <w:t>pyzbar</w:t>
+        <w:t>detection</w:t>
       </w:r>
       <w:proofErr w:type="spellEnd"/>
       <w:r>
         <w:rPr>
           <w:lang w:val="de-AT"/>
         </w:rPr>
-        <w:t xml:space="preserve"> verwendet und ein </w:t>
-      </w:r>
-      <w:r>
-        <w:rPr>
-          <w:lang w:val="de-AT"/>
-        </w:rPr>
-        <w:t>Ergebnis</w:t>
-      </w:r>
-      <w:r>
-        <w:rPr>
-          <w:lang w:val="de-AT"/>
-        </w:rPr>
-        <w:t xml:space="preserve"> von erzielt.</w:t>
-      </w:r>
-    </w:p>
-    <w:p>
-      <w:pPr>
-        <w:pStyle w:val="Text"/>
-        <w:rPr>
-          <w:lang w:val="de-AT"/>
-        </w:rPr>
-      </w:pPr>
-    </w:p>
-    <w:p>
-      <w:pPr>
-        <w:pStyle w:val="Text"/>
-        <w:rPr>
-          <w:lang w:val="de-AT"/>
-        </w:rPr>
-      </w:pPr>
-    </w:p>
-    <w:p>
-      <w:pPr>
-        <w:pStyle w:val="Text"/>
-        <w:rPr>
-          <w:lang w:val="de-AT"/>
-        </w:rPr>
-      </w:pPr>
-    </w:p>
-    <w:p>
-      <w:pPr>
-        <w:pStyle w:val="Text"/>
-        <w:rPr>
-          <w:lang w:val="de-AT"/>
-        </w:rPr>
-      </w:pPr>
-    </w:p>
-    <w:p>
-      <w:pPr>
-        <w:pStyle w:val="Text"/>
-        <w:rPr>
-          <w:lang w:val="de-AT"/>
-        </w:rPr>
-      </w:pPr>
-      <w:r>
-        <w:rPr>
-          <w:lang w:val="de-AT"/>
-        </w:rPr>
-        <w:t xml:space="preserve">Die </w:t>
-      </w:r>
-      <w:proofErr w:type="gramStart"/>
-      <w:r>
-        <w:rPr>
-          <w:lang w:val="de-AT"/>
-        </w:rPr>
-        <w:t>Fotos</w:t>
-      </w:r>
-      <w:proofErr w:type="gramEnd"/>
-      <w:r>
-        <w:rPr>
-          <w:lang w:val="de-AT"/>
-        </w:rPr>
-        <w:t xml:space="preserve"> die zur </w:t>
-      </w:r>
-      <w:r>
-        <w:rPr>
-          <w:lang w:val="de-AT"/>
-        </w:rPr>
-        <w:t>Verwendung</w:t>
-      </w:r>
-      <w:r>
-        <w:rPr>
-          <w:lang w:val="de-AT"/>
-        </w:rPr>
-        <w:t xml:space="preserve"> genommen </w:t>
-      </w:r>
-      <w:proofErr w:type="gramStart"/>
-      <w:r>
-        <w:rPr>
-          <w:lang w:val="de-AT"/>
-        </w:rPr>
-        <w:t>wurden</w:t>
-      </w:r>
-      <w:proofErr w:type="gramEnd"/>
-      <w:r>
-        <w:rPr>
-          <w:lang w:val="de-AT"/>
-        </w:rPr>
-        <w:t xml:space="preserve"> </w:t>
-      </w:r>
-      <w:r>
-        <w:rPr>
-          <w:lang w:val="de-AT"/>
-        </w:rPr>
-        <w:t>kamen</w:t>
-      </w:r>
-      <w:r>
-        <w:rPr>
-          <w:lang w:val="de-AT"/>
-        </w:rPr>
-        <w:t xml:space="preserve"> auch aus dem link vo</w:t>
-      </w:r>
-      <w:r>
-        <w:rPr>
-          <w:lang w:val="de-AT"/>
-        </w:rPr>
-        <w:t>n der</w:t>
-      </w:r>
-      <w:r>
-        <w:rPr>
-          <w:lang w:val="de-AT"/>
-        </w:rPr>
-        <w:t xml:space="preserve"> </w:t>
-      </w:r>
-      <w:proofErr w:type="spellStart"/>
-      <w:r>
-        <w:rPr>
-          <w:lang w:val="de-AT"/>
-        </w:rPr>
-        <w:t>barcode</w:t>
-      </w:r>
-      <w:proofErr w:type="spellEnd"/>
-      <w:r>
-        <w:rPr>
-          <w:lang w:val="de-AT"/>
-        </w:rPr>
-        <w:t xml:space="preserve"> </w:t>
-      </w:r>
-      <w:proofErr w:type="spellStart"/>
-      <w:r>
-        <w:rPr>
-          <w:lang w:val="de-AT"/>
-        </w:rPr>
-        <w:t>detection</w:t>
-      </w:r>
-      <w:proofErr w:type="spellEnd"/>
-      <w:r>
-        <w:rPr>
-          <w:lang w:val="de-AT"/>
-        </w:rPr>
         <w:t>.</w:t>
       </w:r>
     </w:p>
@@ -13036,10 +13106,8 @@
     <w:p>
       <w:pPr>
         <w:pStyle w:val="Text"/>
+        <w:keepNext/>
         <w:jc w:val="center"/>
-        <w:rPr>
-          <w:lang w:val="de-AT"/>
-        </w:rPr>
       </w:pPr>
       <w:r>
         <w:rPr>
@@ -13099,12 +13167,30 @@
     <w:p>
       <w:pPr>
         <w:pStyle w:val="Beschriftung"/>
-        <w:rPr>
-          <w:color w:val="0066FF"/>
-        </w:rPr>
-      </w:pPr>
-      <w:r>
-        <w:t xml:space="preserve">Abbildung 3: Fotos mit Barcodes für die Yolo Erkennung </w:t>
+      </w:pPr>
+      <w:r>
+        <w:t xml:space="preserve">Abbildung </w:t>
+      </w:r>
+      <w:r>
+        <w:fldChar w:fldCharType="begin"/>
+      </w:r>
+      <w:r>
+        <w:instrText xml:space="preserve"> SEQ Abbildung \* ARABIC </w:instrText>
+      </w:r>
+      <w:r>
+        <w:fldChar w:fldCharType="separate"/>
+      </w:r>
+      <w:r>
+        <w:rPr>
+          <w:noProof/>
+        </w:rPr>
+        <w:t>9</w:t>
+      </w:r>
+      <w:r>
+        <w:fldChar w:fldCharType="end"/>
+      </w:r>
+      <w:r>
+        <w:t>: Fotos mit Barcodes für die Yolo Erkennung</w:t>
       </w:r>
     </w:p>
     <w:p>
@@ -13146,12 +13232,11 @@
       <w:pPr>
         <w:pStyle w:val="berschrift3"/>
       </w:pPr>
-      <w:bookmarkStart w:id="68" w:name="_Toc223029773"/>
+      <w:bookmarkStart w:id="68" w:name="_Toc223637585"/>
       <w:commentRangeStart w:id="69"/>
       <w:r>
         <w:t>Gewichtserfassung</w:t>
       </w:r>
-      <w:bookmarkEnd w:id="68"/>
       <w:commentRangeEnd w:id="69"/>
       <w:r>
         <w:rPr>
@@ -13161,6 +13246,7 @@
         </w:rPr>
         <w:commentReference w:id="69"/>
       </w:r>
+      <w:bookmarkEnd w:id="68"/>
     </w:p>
     <w:p>
       <w:pPr>
@@ -13797,7 +13883,7 @@
       <w:pPr>
         <w:pStyle w:val="berschrift3"/>
       </w:pPr>
-      <w:bookmarkStart w:id="73" w:name="_Toc223029774"/>
+      <w:bookmarkStart w:id="73" w:name="_Toc223637586"/>
       <w:r>
         <w:t>Datenverarbeitung</w:t>
       </w:r>
@@ -13806,77 +13892,675 @@
     <w:p>
       <w:pPr>
         <w:pStyle w:val="Text"/>
-      </w:pPr>
-    </w:p>
-    <w:p>
-      <w:pPr>
-        <w:pStyle w:val="Text"/>
-      </w:pPr>
-    </w:p>
-    <w:p>
-      <w:pPr>
-        <w:pStyle w:val="Text"/>
-      </w:pPr>
-    </w:p>
-    <w:p>
-      <w:pPr>
-        <w:pStyle w:val="Text"/>
-      </w:pPr>
-    </w:p>
-    <w:p>
-      <w:pPr>
-        <w:pStyle w:val="Text"/>
-      </w:pPr>
+        <w:rPr>
+          <w:lang w:val="de-AT" w:eastAsia="de-AT"/>
+        </w:rPr>
+      </w:pPr>
+      <w:r>
+        <w:rPr>
+          <w:lang w:val="de-AT" w:eastAsia="de-AT"/>
+        </w:rPr>
+        <w:t xml:space="preserve">Für die Verarbeitung der erfassten Daten wurde eine </w:t>
+      </w:r>
+      <w:r>
+        <w:rPr>
+          <w:bCs/>
+          <w:lang w:val="de-AT" w:eastAsia="de-AT"/>
+        </w:rPr>
+        <w:t>CSV-Datei</w:t>
+      </w:r>
+      <w:r>
+        <w:rPr>
+          <w:lang w:val="de-AT" w:eastAsia="de-AT"/>
+        </w:rPr>
+        <w:t xml:space="preserve"> implementiert, die mit dem </w:t>
+      </w:r>
+      <w:r>
+        <w:rPr>
+          <w:bCs/>
+          <w:lang w:val="de-AT" w:eastAsia="de-AT"/>
+        </w:rPr>
+        <w:t>SAP-System der Firma Leitner</w:t>
+      </w:r>
+      <w:r>
+        <w:rPr>
+          <w:lang w:val="de-AT" w:eastAsia="de-AT"/>
+        </w:rPr>
+        <w:t xml:space="preserve"> kompatibel ist. Dadurch können die aufgenommenen Daten ohne zusätzliche Anpassungen in das System importiert werden. Der Export erfolgt in einem Format, das den Anforderungen des SAP-Imports entspricht und somit eine einfache sowie schnelle Weiterverarbeitung der Messdaten ermöglicht.</w:t>
+      </w:r>
+    </w:p>
+    <w:p>
+      <w:pPr>
+        <w:pStyle w:val="Text"/>
+        <w:rPr>
+          <w:lang w:val="de-AT" w:eastAsia="de-AT"/>
+        </w:rPr>
+      </w:pPr>
+    </w:p>
+    <w:p>
+      <w:pPr>
+        <w:pStyle w:val="Text"/>
+        <w:rPr>
+          <w:lang w:val="de-AT" w:eastAsia="de-AT"/>
+        </w:rPr>
+      </w:pPr>
+      <w:r>
+        <w:rPr>
+          <w:lang w:val="de-AT" w:eastAsia="de-AT"/>
+        </w:rPr>
+        <w:t xml:space="preserve">Ursprünglich wurde geprüft, ob eine </w:t>
+      </w:r>
+      <w:r>
+        <w:rPr>
+          <w:bCs/>
+          <w:lang w:val="de-AT" w:eastAsia="de-AT"/>
+        </w:rPr>
+        <w:t>direkte automatisierte Anbindung an das SAP-System</w:t>
+      </w:r>
+      <w:r>
+        <w:rPr>
+          <w:lang w:val="de-AT" w:eastAsia="de-AT"/>
+        </w:rPr>
+        <w:t xml:space="preserve"> umgesetzt werden kann. Eine solche Integration war jedoch nicht möglich, da von Seiten der </w:t>
+      </w:r>
+      <w:r>
+        <w:rPr>
+          <w:bCs/>
+          <w:lang w:val="de-AT" w:eastAsia="de-AT"/>
+        </w:rPr>
+        <w:t>IT-Abteilung der Firma Leitner keine Freigabe für eine direkte Schnittstelle</w:t>
+      </w:r>
+      <w:r>
+        <w:rPr>
+          <w:lang w:val="de-AT" w:eastAsia="de-AT"/>
+        </w:rPr>
+        <w:t xml:space="preserve"> erteilt wurde. Aus diesem Grund erfolgt die Datenübertragung über eine CSV-Datei, die anschließend manuell in das SAP-System importiert werden kann.</w:t>
+      </w:r>
+    </w:p>
+    <w:p>
+      <w:pPr>
+        <w:pStyle w:val="Text"/>
+        <w:rPr>
+          <w:lang w:val="de-AT"/>
+        </w:rPr>
+      </w:pPr>
+      <w:r>
+        <w:rPr>
+          <w:lang w:val="de-AT"/>
+        </w:rPr>
+        <w:t xml:space="preserve">Die Speicherung der Daten erfolgt in einer klar strukturierten Ordnerhierarchie. Auf dem Desktop des Raspberry Pi befindet sich der Hauptordner </w:t>
+      </w:r>
+      <w:r>
+        <w:rPr>
+          <w:bCs/>
+          <w:lang w:val="de-AT"/>
+        </w:rPr>
+        <w:t>„Scans“</w:t>
+      </w:r>
+      <w:r>
+        <w:rPr>
+          <w:lang w:val="de-AT"/>
+        </w:rPr>
+        <w:t xml:space="preserve">, in dem alle vom Benutzer gespeicherten Daten abgelegt werden. Innerhalb dieses Ordners wird für jeden Kalendertag automatisch ein eigener Unterordner erstellt, der nach dem </w:t>
+      </w:r>
+      <w:r>
+        <w:rPr>
+          <w:lang w:val="de-AT"/>
+        </w:rPr>
+        <w:lastRenderedPageBreak/>
+        <w:t>jeweiligen Datum benannt ist. In diesem Tagesordner werden sämtliche Scans gespeichert, die an diesem Tag durchgeführt wurden. Beginnt ein neuer Tag, wird automatisch ein neuer Ordner angelegt, wodurch eine chronologische und übersichtliche Struktur entsteht.</w:t>
+      </w:r>
+    </w:p>
+    <w:p>
+      <w:pPr>
+        <w:pStyle w:val="Text"/>
+      </w:pPr>
+      <w:r>
+        <w:rPr>
+          <w:lang w:val="de-AT"/>
+        </w:rPr>
+        <w:t xml:space="preserve">Im jeweiligen Tagesordner befindet sich die </w:t>
+      </w:r>
+      <w:r>
+        <w:rPr>
+          <w:bCs/>
+          <w:lang w:val="de-AT"/>
+        </w:rPr>
+        <w:t>CSV-Datei</w:t>
+      </w:r>
+      <w:r>
+        <w:rPr>
+          <w:lang w:val="de-AT"/>
+        </w:rPr>
+        <w:t xml:space="preserve">, welche alle erfolgreichen Scans des Tages enthält. Dadurch werden sämtliche Messdaten eines Tages zentral in einer einzigen Datei gesammelt. Die aufgenommenen Bilder werden hingegen separat gespeichert. Hierfür existiert innerhalb des Tagesordners ein weiterer Unterordner, in dem für jeden einzelnen Scan ein eigener Ordner erstellt wird. Diese Scan-Ordner sind mit einem Zeitstempel versehen, sodass jede Bildaufnahme </w:t>
+      </w:r>
+      <w:r>
+        <w:t>eindeutig zugeordnet werden kann.</w:t>
+      </w:r>
+    </w:p>
+    <w:p>
+      <w:pPr>
+        <w:pStyle w:val="Text"/>
+      </w:pPr>
+      <w:r>
+        <w:t>Diese Struktur wurde bewusst einfach gehalten, um auch bei einer großen Anzahl an Scans eine übersichtliche Organisation und schnelle Auffindbarkeit der Daten zu gewährleisten. Gleichzeitig unterstützt diese Vorgehensweise das grundlegende Ziel des Projekts: eine effiziente und benutzerfreundliche Erfassung sowie Verwaltung von Scan- und Messdaten.</w:t>
+      </w:r>
+    </w:p>
+    <w:p>
+      <w:pPr>
+        <w:pStyle w:val="Text"/>
+        <w:rPr>
+          <w:b/>
+        </w:rPr>
+      </w:pPr>
+      <w:r>
+        <w:rPr>
+          <w:b/>
+        </w:rPr>
+        <w:t>Ordnerstruktur</w:t>
+      </w:r>
+      <w:r>
+        <w:rPr>
+          <w:b/>
+        </w:rPr>
+        <w:t xml:space="preserve"> </w:t>
+      </w:r>
+      <w:r>
+        <w:rPr>
+          <w:b/>
+        </w:rPr>
+        <w:t xml:space="preserve">am Desktop </w:t>
+      </w:r>
+      <w:r>
+        <w:rPr>
+          <w:b/>
+        </w:rPr>
+        <w:t>- Beispiel</w:t>
+      </w:r>
+      <w:r>
+        <w:rPr>
+          <w:b/>
+        </w:rPr>
+        <w:t>:</w:t>
+      </w:r>
+    </w:p>
+    <w:p>
+      <w:pPr>
+        <w:pStyle w:val="Text"/>
+        <w:keepNext/>
+        <w:jc w:val="center"/>
+      </w:pPr>
+      <w:r>
+        <w:rPr>
+          <w:lang w:val="de-AT"/>
+        </w:rPr>
+        <w:drawing>
+          <wp:inline distT="0" distB="0" distL="0" distR="0" wp14:anchorId="7C7168C8" wp14:editId="063DB61B">
+            <wp:extent cx="3281463" cy="2263140"/>
+            <wp:effectExtent l="0" t="0" r="0" b="0"/>
+            <wp:docPr id="1628160198" name="Grafik 2" descr="Ein Bild, das Text, Screenshot, Schrift, Design enthält.&#10;&#10;KI-generierte Inhalte können fehlerhaft sein."/>
+            <wp:cNvGraphicFramePr>
+              <a:graphicFrameLocks xmlns:a="http://schemas.openxmlformats.org/drawingml/2006/main" noChangeAspect="1"/>
+            </wp:cNvGraphicFramePr>
+            <a:graphic xmlns:a="http://schemas.openxmlformats.org/drawingml/2006/main">
+              <a:graphicData uri="http://schemas.openxmlformats.org/drawingml/2006/picture">
+                <pic:pic xmlns:pic="http://schemas.openxmlformats.org/drawingml/2006/picture">
+                  <pic:nvPicPr>
+                    <pic:cNvPr id="1628160198" name="Grafik 2" descr="Ein Bild, das Text, Screenshot, Schrift, Design enthält.&#10;&#10;KI-generierte Inhalte können fehlerhaft sein."/>
+                    <pic:cNvPicPr>
+                      <a:picLocks noChangeAspect="1" noChangeArrowheads="1"/>
+                    </pic:cNvPicPr>
+                  </pic:nvPicPr>
+                  <pic:blipFill>
+                    <a:blip r:embed="rId58" cstate="print">
+                      <a:extLst>
+                        <a:ext uri="{28A0092B-C50C-407E-A947-70E740481C1C}">
+                          <a14:useLocalDpi xmlns:a14="http://schemas.microsoft.com/office/drawing/2010/main" val="0"/>
+                        </a:ext>
+                      </a:extLst>
+                    </a:blip>
+                    <a:srcRect/>
+                    <a:stretch>
+                      <a:fillRect/>
+                    </a:stretch>
+                  </pic:blipFill>
+                  <pic:spPr bwMode="auto">
+                    <a:xfrm>
+                      <a:off x="0" y="0"/>
+                      <a:ext cx="3288255" cy="2267824"/>
+                    </a:xfrm>
+                    <a:prstGeom prst="rect">
+                      <a:avLst/>
+                    </a:prstGeom>
+                    <a:noFill/>
+                    <a:ln>
+                      <a:noFill/>
+                    </a:ln>
+                  </pic:spPr>
+                </pic:pic>
+              </a:graphicData>
+            </a:graphic>
+          </wp:inline>
+        </w:drawing>
+      </w:r>
+    </w:p>
+    <w:p>
+      <w:pPr>
+        <w:pStyle w:val="Beschriftung"/>
+      </w:pPr>
+      <w:r>
+        <w:t xml:space="preserve">Abbildung </w:t>
+      </w:r>
+      <w:r>
+        <w:fldChar w:fldCharType="begin"/>
+      </w:r>
+      <w:r>
+        <w:instrText xml:space="preserve"> SEQ Abbildung \* ARABIC </w:instrText>
+      </w:r>
+      <w:r>
+        <w:fldChar w:fldCharType="separate"/>
+      </w:r>
+      <w:r>
+        <w:rPr>
+          <w:noProof/>
+        </w:rPr>
+        <w:t>10</w:t>
+      </w:r>
+      <w:r>
+        <w:fldChar w:fldCharType="end"/>
+      </w:r>
+      <w:r>
+        <w:t>: Ordnerstruktur</w:t>
+      </w:r>
+    </w:p>
+    <w:p>
+      <w:pPr>
+        <w:jc w:val="left"/>
+        <w:rPr>
+          <w:bCs/>
+          <w:sz w:val="20"/>
+          <w:szCs w:val="20"/>
+          <w:lang w:val="de-AT" w:eastAsia="de-DE"/>
+        </w:rPr>
+      </w:pPr>
+      <w:r>
+        <w:br w:type="page"/>
+      </w:r>
     </w:p>
     <w:p>
       <w:pPr>
         <w:pStyle w:val="berschrift3"/>
       </w:pPr>
-      <w:bookmarkStart w:id="74" w:name="_Toc223029775"/>
-      <w:r>
+      <w:bookmarkStart w:id="74" w:name="_Toc223637587"/>
+      <w:commentRangeStart w:id="75"/>
+      <w:r>
+        <w:lastRenderedPageBreak/>
         <w:t>User Interface für die Datenverarbeitung</w:t>
       </w:r>
       <w:bookmarkEnd w:id="74"/>
-    </w:p>
-    <w:p>
-      <w:pPr>
-        <w:rPr>
-          <w:color w:val="0066FF"/>
-        </w:rPr>
-      </w:pPr>
-    </w:p>
-    <w:p>
-      <w:pPr>
-        <w:rPr>
-          <w:color w:val="0066FF"/>
-        </w:rPr>
-      </w:pPr>
-    </w:p>
-    <w:p>
-      <w:pPr>
-        <w:rPr>
-          <w:color w:val="0066FF"/>
-        </w:rPr>
-      </w:pPr>
-    </w:p>
-    <w:p>
-      <w:pPr>
-        <w:rPr>
-          <w:color w:val="0066FF"/>
-        </w:rPr>
-      </w:pPr>
-    </w:p>
-    <w:p>
-      <w:pPr>
-        <w:jc w:val="left"/>
-        <w:rPr>
-          <w:color w:val="0066FF"/>
-        </w:rPr>
-      </w:pPr>
-      <w:r>
-        <w:rPr>
-          <w:color w:val="0066FF"/>
-        </w:rPr>
+      <w:commentRangeEnd w:id="75"/>
+      <w:r>
+        <w:rPr>
+          <w:rStyle w:val="Kommentarzeichen"/>
+          <w:b w:val="0"/>
+          <w:bCs w:val="0"/>
+        </w:rPr>
+        <w:commentReference w:id="75"/>
+      </w:r>
+    </w:p>
+    <w:p>
+      <w:pPr>
+        <w:pStyle w:val="Text"/>
+        <w:rPr>
+          <w:lang w:val="de-AT" w:eastAsia="de-AT"/>
+        </w:rPr>
+      </w:pPr>
+      <w:r>
+        <w:rPr>
+          <w:lang w:val="de-AT" w:eastAsia="de-AT"/>
+        </w:rPr>
+        <w:t xml:space="preserve">Die Benutzeroberfläche zeigt dem Anwender übersichtlich an, </w:t>
+      </w:r>
+      <w:r>
+        <w:rPr>
+          <w:bCs/>
+          <w:lang w:val="de-AT" w:eastAsia="de-AT"/>
+        </w:rPr>
+        <w:t>welche Verarbeitungsschritte aktuell ausgeführt werden und welche Ergebnisse dabei entstehen</w:t>
+      </w:r>
+      <w:r>
+        <w:rPr>
+          <w:lang w:val="de-AT" w:eastAsia="de-AT"/>
+        </w:rPr>
+        <w:t xml:space="preserve">. Falls es während der automatischen Verarbeitung zu einem Fehler kommt, besteht zudem die Möglichkeit, die entsprechenden Werte </w:t>
+      </w:r>
+      <w:r>
+        <w:rPr>
+          <w:bCs/>
+          <w:lang w:val="de-AT" w:eastAsia="de-AT"/>
+        </w:rPr>
+        <w:t>manuell einzutragen oder zu korrigieren</w:t>
+      </w:r>
+      <w:r>
+        <w:rPr>
+          <w:lang w:val="de-AT" w:eastAsia="de-AT"/>
+        </w:rPr>
+        <w:t>.</w:t>
+      </w:r>
+    </w:p>
+    <w:p>
+      <w:pPr>
+        <w:pStyle w:val="Text"/>
+        <w:rPr>
+          <w:lang w:val="de-AT" w:eastAsia="de-AT"/>
+        </w:rPr>
+      </w:pPr>
+      <w:r>
+        <w:rPr>
+          <w:lang w:val="de-AT" w:eastAsia="de-AT"/>
+        </w:rPr>
+        <w:t xml:space="preserve">Die </w:t>
+      </w:r>
+      <w:r>
+        <w:rPr>
+          <w:bCs/>
+          <w:lang w:val="de-AT" w:eastAsia="de-AT"/>
+        </w:rPr>
+        <w:t>Kalibrierung der einzelnen Komponenten</w:t>
+      </w:r>
+      <w:r>
+        <w:rPr>
+          <w:lang w:val="de-AT" w:eastAsia="de-AT"/>
+        </w:rPr>
+        <w:t xml:space="preserve"> kann nicht direkt über die grafische Benutzeroberfläche durchgeführt werden, da dieser Prozess einen höheren technischen Aufwand und genauere Einstellungen erfordert. Stattdessen erfolgt die Kalibrierung über </w:t>
+      </w:r>
+      <w:r>
+        <w:rPr>
+          <w:bCs/>
+          <w:lang w:val="de-AT" w:eastAsia="de-AT"/>
+        </w:rPr>
+        <w:t>separate Programme der jeweiligen Komponenten</w:t>
+      </w:r>
+      <w:r>
+        <w:rPr>
+          <w:lang w:val="de-AT" w:eastAsia="de-AT"/>
+        </w:rPr>
+        <w:t>.</w:t>
+      </w:r>
+    </w:p>
+    <w:p>
+      <w:pPr>
+        <w:pStyle w:val="Text"/>
+        <w:rPr>
+          <w:lang w:val="de-AT" w:eastAsia="de-AT"/>
+        </w:rPr>
+      </w:pPr>
+      <w:r>
+        <w:rPr>
+          <w:lang w:val="de-AT" w:eastAsia="de-AT"/>
+        </w:rPr>
+        <w:t xml:space="preserve">Die sogenannten </w:t>
+      </w:r>
+      <w:r>
+        <w:rPr>
+          <w:bCs/>
+          <w:lang w:val="de-AT" w:eastAsia="de-AT"/>
+        </w:rPr>
+        <w:t>Worker</w:t>
+      </w:r>
+      <w:r>
+        <w:rPr>
+          <w:lang w:val="de-AT" w:eastAsia="de-AT"/>
+        </w:rPr>
+        <w:t xml:space="preserve"> sind eigenständige Python-Skripte, die die Verarbeitung der einzelnen Systemkomponenten übernehmen. Dazu zählen unter anderem die </w:t>
+      </w:r>
+      <w:r>
+        <w:rPr>
+          <w:bCs/>
+          <w:lang w:val="de-AT" w:eastAsia="de-AT"/>
+        </w:rPr>
+        <w:t>Barcode-Erkennung</w:t>
+      </w:r>
+      <w:r>
+        <w:rPr>
+          <w:lang w:val="de-AT" w:eastAsia="de-AT"/>
+        </w:rPr>
+        <w:t xml:space="preserve">, die </w:t>
+      </w:r>
+      <w:r>
+        <w:rPr>
+          <w:bCs/>
+          <w:lang w:val="de-AT" w:eastAsia="de-AT"/>
+        </w:rPr>
+        <w:t>Abmessungserkennung</w:t>
+      </w:r>
+      <w:r>
+        <w:rPr>
+          <w:lang w:val="de-AT" w:eastAsia="de-AT"/>
+        </w:rPr>
+        <w:t xml:space="preserve"> sowie die </w:t>
+      </w:r>
+      <w:r>
+        <w:rPr>
+          <w:bCs/>
+          <w:lang w:val="de-AT" w:eastAsia="de-AT"/>
+        </w:rPr>
+        <w:t>Gewichtserfassung</w:t>
+      </w:r>
+      <w:r>
+        <w:rPr>
+          <w:lang w:val="de-AT" w:eastAsia="de-AT"/>
+        </w:rPr>
+        <w:t xml:space="preserve">. Diese Skripte werden beim Start des Systems </w:t>
+      </w:r>
+      <w:r>
+        <w:rPr>
+          <w:bCs/>
+          <w:lang w:val="de-AT" w:eastAsia="de-AT"/>
+        </w:rPr>
+        <w:t>parallel ausgeführt</w:t>
+      </w:r>
+      <w:r>
+        <w:rPr>
+          <w:lang w:val="de-AT" w:eastAsia="de-AT"/>
+        </w:rPr>
+        <w:t>, um eine möglichst schnelle Datenverarbeitung zu gewährleisten.</w:t>
+      </w:r>
+    </w:p>
+    <w:p>
+      <w:pPr>
+        <w:pStyle w:val="Text"/>
+        <w:rPr>
+          <w:lang w:val="de-AT" w:eastAsia="de-AT"/>
+        </w:rPr>
+      </w:pPr>
+      <w:r>
+        <w:rPr>
+          <w:lang w:val="de-AT" w:eastAsia="de-AT"/>
+        </w:rPr>
+        <w:t xml:space="preserve">Zusätzlich verfügt das System über ein </w:t>
+      </w:r>
+      <w:proofErr w:type="spellStart"/>
+      <w:r>
+        <w:rPr>
+          <w:bCs/>
+          <w:lang w:val="de-AT" w:eastAsia="de-AT"/>
+        </w:rPr>
+        <w:t>Logging</w:t>
+      </w:r>
+      <w:proofErr w:type="spellEnd"/>
+      <w:r>
+        <w:rPr>
+          <w:bCs/>
+          <w:lang w:val="de-AT" w:eastAsia="de-AT"/>
+        </w:rPr>
+        <w:t>-System</w:t>
+      </w:r>
+      <w:r>
+        <w:rPr>
+          <w:lang w:val="de-AT" w:eastAsia="de-AT"/>
+        </w:rPr>
+        <w:t>, das sämtliche relevanten Ereignisse und Prozessschritte protokolliert. Dadurch können auftretende Fehler oder unerwartete Programmabbrüche im Nachhinein analysiert werden, indem die entsprechenden Log-Dateien eingesehen werden.</w:t>
+      </w:r>
+    </w:p>
+    <w:p>
+      <w:pPr>
+        <w:pStyle w:val="Text"/>
+        <w:rPr>
+          <w:lang w:val="de-AT" w:eastAsia="de-AT"/>
+        </w:rPr>
+      </w:pPr>
+      <w:r>
+        <w:rPr>
+          <w:lang w:val="de-AT" w:eastAsia="de-AT"/>
+        </w:rPr>
+        <w:t xml:space="preserve">Da in der Firma Leitner in Sterzing Mitarbeiter mit unterschiedlichen Sprachhintergründen arbeiten, wurde die Benutzeroberfläche </w:t>
+      </w:r>
+      <w:r>
+        <w:rPr>
+          <w:bCs/>
+          <w:lang w:val="de-AT" w:eastAsia="de-AT"/>
+        </w:rPr>
+        <w:t>mehrsprachig gestaltet</w:t>
+      </w:r>
+      <w:r>
+        <w:rPr>
+          <w:lang w:val="de-AT" w:eastAsia="de-AT"/>
+        </w:rPr>
+        <w:t xml:space="preserve">. Neben Deutsch wurden daher auch </w:t>
+      </w:r>
+      <w:r>
+        <w:rPr>
+          <w:bCs/>
+          <w:lang w:val="de-AT" w:eastAsia="de-AT"/>
+        </w:rPr>
+        <w:t>Italienisch und Englisch</w:t>
+      </w:r>
+      <w:r>
+        <w:rPr>
+          <w:lang w:val="de-AT" w:eastAsia="de-AT"/>
+        </w:rPr>
+        <w:t xml:space="preserve"> integriert. Die Übersetzungen werden in einer eigenen Klasse namens </w:t>
+      </w:r>
+      <w:r>
+        <w:rPr>
+          <w:bCs/>
+          <w:lang w:val="de-AT" w:eastAsia="de-AT"/>
+        </w:rPr>
+        <w:t>Translator</w:t>
+      </w:r>
+      <w:r>
+        <w:rPr>
+          <w:lang w:val="de-AT" w:eastAsia="de-AT"/>
+        </w:rPr>
+        <w:t xml:space="preserve"> gespeichert, in der die jeweiligen Texte als Dictionary hinterlegt sind. Die grafische Oberfläche greift auf diese Einträge zu und zeigt die Inhalte entsprechend der ausgewählten Sprache </w:t>
+      </w:r>
+      <w:r>
+        <w:rPr>
+          <w:lang w:val="de-AT" w:eastAsia="de-AT"/>
+        </w:rPr>
+        <w:lastRenderedPageBreak/>
+        <w:t xml:space="preserve">an. Der </w:t>
+      </w:r>
+      <w:r>
+        <w:rPr>
+          <w:bCs/>
+          <w:lang w:val="de-AT" w:eastAsia="de-AT"/>
+        </w:rPr>
+        <w:t>Sprachwechsel erfolgt über das Anklicken der jeweiligen Landesflagge</w:t>
+      </w:r>
+      <w:r>
+        <w:rPr>
+          <w:lang w:val="de-AT" w:eastAsia="de-AT"/>
+        </w:rPr>
+        <w:t>, wodurch die Oberfläche unmittelbar in die gewünschte Sprache umgestellt wird.</w:t>
+      </w:r>
+    </w:p>
+    <w:p>
+      <w:pPr>
+        <w:pStyle w:val="Text"/>
+        <w:rPr>
+          <w:lang w:val="de-AT"/>
+        </w:rPr>
+      </w:pPr>
+    </w:p>
+    <w:p>
+      <w:pPr>
+        <w:pStyle w:val="Text"/>
+        <w:rPr>
+          <w:lang w:val="de-AT"/>
+        </w:rPr>
+      </w:pPr>
+      <w:r>
+        <w:rPr>
+          <w:lang w:val="de-AT"/>
+        </w:rPr>
+        <w:t xml:space="preserve">Zusätzlich bietet </w:t>
+      </w:r>
+    </w:p>
+    <w:p>
+      <w:pPr>
+        <w:pStyle w:val="Text"/>
+        <w:rPr>
+          <w:lang w:val="de-AT"/>
+        </w:rPr>
+      </w:pPr>
+    </w:p>
+    <w:p>
+      <w:pPr>
+        <w:pStyle w:val="Text"/>
+        <w:rPr>
+          <w:lang w:val="de-AT"/>
+        </w:rPr>
+      </w:pPr>
+      <w:commentRangeStart w:id="76"/>
+      <w:r>
+        <w:rPr>
+          <w:lang w:val="de-AT"/>
+        </w:rPr>
+        <w:t>…</w:t>
+      </w:r>
+      <w:commentRangeEnd w:id="76"/>
+      <w:r>
+        <w:rPr>
+          <w:rStyle w:val="Kommentarzeichen"/>
+        </w:rPr>
+        <w:commentReference w:id="76"/>
+      </w:r>
+    </w:p>
+    <w:p>
+      <w:pPr>
+        <w:pStyle w:val="Text"/>
+        <w:rPr>
+          <w:lang w:val="de-AT"/>
+        </w:rPr>
+      </w:pPr>
+    </w:p>
+    <w:p>
+      <w:pPr>
+        <w:pStyle w:val="Text"/>
+      </w:pPr>
+    </w:p>
+    <w:p>
+      <w:pPr>
+        <w:pStyle w:val="Text"/>
+      </w:pPr>
+    </w:p>
+    <w:p>
+      <w:pPr>
+        <w:pStyle w:val="Text"/>
+      </w:pPr>
+    </w:p>
+    <w:p>
+      <w:pPr>
+        <w:pStyle w:val="Text"/>
+      </w:pPr>
+    </w:p>
+    <w:p>
+      <w:pPr>
+        <w:pStyle w:val="Text"/>
+      </w:pPr>
+      <w:r>
         <w:br w:type="page"/>
       </w:r>
     </w:p>
@@ -13884,12 +14568,12 @@
       <w:pPr>
         <w:pStyle w:val="berschrift2"/>
       </w:pPr>
-      <w:bookmarkStart w:id="75" w:name="_Toc223029776"/>
+      <w:bookmarkStart w:id="77" w:name="_Toc223637588"/>
       <w:r>
         <w:lastRenderedPageBreak/>
         <w:t>Weitere individuelle Abschnitte</w:t>
       </w:r>
-      <w:bookmarkEnd w:id="75"/>
+      <w:bookmarkEnd w:id="77"/>
       <w:r>
         <w:t xml:space="preserve"> </w:t>
       </w:r>
@@ -13954,12 +14638,12 @@
       <w:pPr>
         <w:pStyle w:val="berschrift2"/>
       </w:pPr>
-      <w:bookmarkStart w:id="76" w:name="_Toc223029777"/>
+      <w:bookmarkStart w:id="78" w:name="_Toc223637589"/>
       <w:r>
         <w:lastRenderedPageBreak/>
         <w:t>Ergebnisse und Diskussion</w:t>
       </w:r>
-      <w:bookmarkEnd w:id="76"/>
+      <w:bookmarkEnd w:id="78"/>
     </w:p>
     <w:p>
       <w:pPr>
@@ -14001,12 +14685,12 @@
       <w:pPr>
         <w:pStyle w:val="berschrift2"/>
       </w:pPr>
-      <w:bookmarkStart w:id="77" w:name="_Toc223029778"/>
+      <w:bookmarkStart w:id="79" w:name="_Toc223637590"/>
       <w:r>
         <w:lastRenderedPageBreak/>
         <w:t>Zusammenfassung individueller Teil</w:t>
       </w:r>
-      <w:bookmarkEnd w:id="77"/>
+      <w:bookmarkEnd w:id="79"/>
     </w:p>
     <w:p>
       <w:pPr>
@@ -14136,7 +14820,7 @@
       <w:pPr>
         <w:pStyle w:val="Text"/>
         <w:sectPr>
-          <w:headerReference w:type="default" r:id="rId58"/>
+          <w:headerReference w:type="default" r:id="rId59"/>
           <w:pgSz w:w="11906" w:h="16838"/>
           <w:pgMar w:top="1417" w:right="1440" w:bottom="1134" w:left="1440" w:header="708" w:footer="708" w:gutter="0"/>
           <w:cols w:space="720"/>
@@ -14149,26 +14833,26 @@
       <w:pPr>
         <w:pStyle w:val="berschrift1"/>
       </w:pPr>
-      <w:bookmarkStart w:id="78" w:name="_Ref200468988"/>
-      <w:bookmarkStart w:id="79" w:name="_Ref200469530"/>
-      <w:bookmarkStart w:id="80" w:name="_Toc223029779"/>
+      <w:bookmarkStart w:id="80" w:name="_Ref200468988"/>
+      <w:bookmarkStart w:id="81" w:name="_Ref200469530"/>
+      <w:bookmarkStart w:id="82" w:name="_Toc223637591"/>
       <w:r>
         <w:lastRenderedPageBreak/>
         <w:t>Zusammenfassung und Ausblick</w:t>
       </w:r>
-      <w:bookmarkEnd w:id="78"/>
-      <w:bookmarkEnd w:id="79"/>
       <w:bookmarkEnd w:id="80"/>
+      <w:bookmarkEnd w:id="81"/>
+      <w:bookmarkEnd w:id="82"/>
     </w:p>
     <w:p>
       <w:pPr>
         <w:pStyle w:val="berschrift2"/>
       </w:pPr>
-      <w:bookmarkStart w:id="81" w:name="_Toc223029780"/>
+      <w:bookmarkStart w:id="83" w:name="_Toc223637592"/>
       <w:r>
         <w:t>Zusammenfassung der gesamten Arbeit</w:t>
       </w:r>
-      <w:bookmarkEnd w:id="81"/>
+      <w:bookmarkEnd w:id="83"/>
     </w:p>
     <w:p>
       <w:pPr>
@@ -14212,7 +14896,7 @@
                     <pic:cNvPicPr/>
                   </pic:nvPicPr>
                   <pic:blipFill>
-                    <a:blip r:embed="rId59"/>
+                    <a:blip r:embed="rId60"/>
                     <a:stretch>
                       <a:fillRect/>
                     </a:stretch>
@@ -14262,7 +14946,7 @@
                     <pic:cNvPicPr/>
                   </pic:nvPicPr>
                   <pic:blipFill>
-                    <a:blip r:embed="rId60"/>
+                    <a:blip r:embed="rId61"/>
                     <a:stretch>
                       <a:fillRect/>
                     </a:stretch>
@@ -14315,7 +14999,7 @@
                     </pic:cNvPicPr>
                   </pic:nvPicPr>
                   <pic:blipFill>
-                    <a:blip r:embed="rId61" cstate="print">
+                    <a:blip r:embed="rId62" cstate="print">
                       <a:extLst>
                         <a:ext uri="{28A0092B-C50C-407E-A947-70E740481C1C}">
                           <a14:useLocalDpi xmlns:a14="http://schemas.microsoft.com/office/drawing/2010/main" val="0"/>
@@ -14384,7 +15068,7 @@
                     <pic:cNvPicPr/>
                   </pic:nvPicPr>
                   <pic:blipFill>
-                    <a:blip r:embed="rId62"/>
+                    <a:blip r:embed="rId63"/>
                     <a:stretch>
                       <a:fillRect/>
                     </a:stretch>
@@ -14437,7 +15121,7 @@
                     </pic:cNvPicPr>
                   </pic:nvPicPr>
                   <pic:blipFill>
-                    <a:blip r:embed="rId63" cstate="print">
+                    <a:blip r:embed="rId64" cstate="print">
                       <a:extLst>
                         <a:ext uri="{28A0092B-C50C-407E-A947-70E740481C1C}">
                           <a14:useLocalDpi xmlns:a14="http://schemas.microsoft.com/office/drawing/2010/main" val="0"/>
@@ -14520,7 +15204,7 @@
                     <pic:cNvPicPr/>
                   </pic:nvPicPr>
                   <pic:blipFill>
-                    <a:blip r:embed="rId64"/>
+                    <a:blip r:embed="rId65"/>
                     <a:stretch>
                       <a:fillRect/>
                     </a:stretch>
@@ -14559,11 +15243,11 @@
       <w:pPr>
         <w:pStyle w:val="berschrift2"/>
       </w:pPr>
-      <w:bookmarkStart w:id="82" w:name="_Toc223029781"/>
+      <w:bookmarkStart w:id="84" w:name="_Toc223637593"/>
       <w:r>
         <w:t>Ausblick</w:t>
       </w:r>
-      <w:bookmarkEnd w:id="82"/>
+      <w:bookmarkEnd w:id="84"/>
     </w:p>
     <w:p>
       <w:pPr>
@@ -14698,10 +15382,10 @@
       <w:pPr>
         <w:pStyle w:val="Text"/>
         <w:sectPr>
-          <w:headerReference w:type="default" r:id="rId65"/>
-          <w:footerReference w:type="default" r:id="rId66"/>
-          <w:headerReference w:type="first" r:id="rId67"/>
-          <w:footerReference w:type="first" r:id="rId68"/>
+          <w:headerReference w:type="default" r:id="rId66"/>
+          <w:footerReference w:type="default" r:id="rId67"/>
+          <w:headerReference w:type="first" r:id="rId68"/>
+          <w:footerReference w:type="first" r:id="rId69"/>
           <w:pgSz w:w="11906" w:h="16838"/>
           <w:pgMar w:top="1417" w:right="1440" w:bottom="1134" w:left="1440" w:header="708" w:footer="708" w:gutter="0"/>
           <w:cols w:space="720"/>
@@ -14714,14 +15398,14 @@
       <w:pPr>
         <w:pStyle w:val="berschrift1"/>
       </w:pPr>
-      <w:bookmarkStart w:id="83" w:name="_Ref200468159"/>
-      <w:bookmarkStart w:id="84" w:name="_Toc223029782"/>
+      <w:bookmarkStart w:id="85" w:name="_Ref200468159"/>
+      <w:bookmarkStart w:id="86" w:name="_Toc223637594"/>
       <w:r>
         <w:lastRenderedPageBreak/>
         <w:t>Erklärung der Eigenständigkeit</w:t>
       </w:r>
-      <w:bookmarkEnd w:id="83"/>
-      <w:bookmarkEnd w:id="84"/>
+      <w:bookmarkEnd w:id="85"/>
+      <w:bookmarkEnd w:id="86"/>
     </w:p>
     <w:p>
       <w:pPr>
@@ -14857,10 +15541,10 @@
       <w:pPr>
         <w:pStyle w:val="Text"/>
         <w:sectPr>
-          <w:headerReference w:type="default" r:id="rId69"/>
-          <w:footerReference w:type="default" r:id="rId70"/>
-          <w:headerReference w:type="first" r:id="rId71"/>
-          <w:footerReference w:type="first" r:id="rId72"/>
+          <w:headerReference w:type="default" r:id="rId70"/>
+          <w:footerReference w:type="default" r:id="rId71"/>
+          <w:headerReference w:type="first" r:id="rId72"/>
+          <w:footerReference w:type="first" r:id="rId73"/>
           <w:pgSz w:w="11906" w:h="16838"/>
           <w:pgMar w:top="1417" w:right="1440" w:bottom="1134" w:left="1440" w:header="708" w:footer="708" w:gutter="0"/>
           <w:cols w:space="720"/>
@@ -14873,10 +15557,10 @@
       <w:pPr>
         <w:pStyle w:val="berschrift1"/>
         <w:sectPr>
-          <w:headerReference w:type="default" r:id="rId73"/>
-          <w:footerReference w:type="default" r:id="rId74"/>
-          <w:headerReference w:type="first" r:id="rId75"/>
-          <w:footerReference w:type="first" r:id="rId76"/>
+          <w:headerReference w:type="default" r:id="rId74"/>
+          <w:footerReference w:type="default" r:id="rId75"/>
+          <w:headerReference w:type="first" r:id="rId76"/>
+          <w:footerReference w:type="first" r:id="rId77"/>
           <w:pgSz w:w="11906" w:h="16838"/>
           <w:pgMar w:top="1417" w:right="1440" w:bottom="1134" w:left="1440" w:header="708" w:footer="708" w:gutter="0"/>
           <w:cols w:space="720"/>
@@ -14884,36 +15568,34 @@
           <w:docGrid w:type="lines" w:linePitch="360"/>
         </w:sectPr>
       </w:pPr>
-      <w:bookmarkStart w:id="85" w:name="_Ref200469499"/>
-      <w:bookmarkStart w:id="86" w:name="_Toc223029783"/>
+      <w:bookmarkStart w:id="87" w:name="_Ref200469499"/>
+      <w:bookmarkStart w:id="88" w:name="_Toc223637595"/>
       <w:r>
         <w:lastRenderedPageBreak/>
         <w:t>Arbeitsnachweise</w:t>
       </w:r>
-      <w:bookmarkEnd w:id="85"/>
-      <w:bookmarkEnd w:id="86"/>
+      <w:bookmarkEnd w:id="87"/>
+      <w:bookmarkEnd w:id="88"/>
     </w:p>
     <w:p>
       <w:pPr>
         <w:pStyle w:val="berschrift1"/>
       </w:pPr>
-      <w:bookmarkStart w:id="87" w:name="_Toc84751256"/>
-      <w:bookmarkStart w:id="88" w:name="_Toc211138167"/>
-      <w:bookmarkStart w:id="89" w:name="_Toc211137922"/>
-      <w:bookmarkStart w:id="90" w:name="_Toc84757221"/>
-      <w:bookmarkStart w:id="91" w:name="_Toc210560305"/>
-      <w:bookmarkStart w:id="92" w:name="_Toc210560252"/>
-      <w:bookmarkStart w:id="93" w:name="_Ref210560064"/>
-      <w:bookmarkStart w:id="94" w:name="_Toc84751368"/>
-      <w:bookmarkStart w:id="95" w:name="_Ref200467937"/>
-      <w:bookmarkStart w:id="96" w:name="_Ref200469033"/>
-      <w:bookmarkStart w:id="97" w:name="_Toc223029784"/>
+      <w:bookmarkStart w:id="89" w:name="_Toc84751256"/>
+      <w:bookmarkStart w:id="90" w:name="_Toc211138167"/>
+      <w:bookmarkStart w:id="91" w:name="_Toc211137922"/>
+      <w:bookmarkStart w:id="92" w:name="_Toc84757221"/>
+      <w:bookmarkStart w:id="93" w:name="_Toc210560305"/>
+      <w:bookmarkStart w:id="94" w:name="_Toc210560252"/>
+      <w:bookmarkStart w:id="95" w:name="_Ref210560064"/>
+      <w:bookmarkStart w:id="96" w:name="_Toc84751368"/>
+      <w:bookmarkStart w:id="97" w:name="_Ref200467937"/>
+      <w:bookmarkStart w:id="98" w:name="_Ref200469033"/>
+      <w:bookmarkStart w:id="99" w:name="_Toc223637596"/>
       <w:r>
         <w:lastRenderedPageBreak/>
         <w:t>Verzeichnisse</w:t>
       </w:r>
-      <w:bookmarkEnd w:id="87"/>
-      <w:bookmarkEnd w:id="88"/>
       <w:bookmarkEnd w:id="89"/>
       <w:bookmarkEnd w:id="90"/>
       <w:bookmarkEnd w:id="91"/>
@@ -14923,36 +15605,38 @@
       <w:bookmarkEnd w:id="95"/>
       <w:bookmarkEnd w:id="96"/>
       <w:bookmarkEnd w:id="97"/>
-      <w:r>
-        <w:t xml:space="preserve"> </w:t>
-      </w:r>
-    </w:p>
-    <w:p>
-      <w:pPr>
-        <w:pStyle w:val="berschrift2"/>
-      </w:pPr>
-      <w:bookmarkStart w:id="98" w:name="_Toc210560306"/>
-      <w:bookmarkStart w:id="99" w:name="_Toc211138168"/>
-      <w:bookmarkStart w:id="100" w:name="_Toc84757222"/>
-      <w:bookmarkStart w:id="101" w:name="_Toc84751369"/>
-      <w:bookmarkStart w:id="102" w:name="_Toc84751257"/>
-      <w:bookmarkStart w:id="103" w:name="_Toc210560253"/>
-      <w:bookmarkStart w:id="104" w:name="_Toc211137923"/>
-      <w:bookmarkStart w:id="105" w:name="_Toc223029785"/>
-      <w:r>
-        <w:t>Literatur</w:t>
-      </w:r>
       <w:bookmarkEnd w:id="98"/>
       <w:bookmarkEnd w:id="99"/>
+      <w:r>
+        <w:t xml:space="preserve"> </w:t>
+      </w:r>
+    </w:p>
+    <w:p>
+      <w:pPr>
+        <w:pStyle w:val="berschrift2"/>
+      </w:pPr>
+      <w:bookmarkStart w:id="100" w:name="_Toc210560306"/>
+      <w:bookmarkStart w:id="101" w:name="_Toc211138168"/>
+      <w:bookmarkStart w:id="102" w:name="_Toc84757222"/>
+      <w:bookmarkStart w:id="103" w:name="_Toc84751369"/>
+      <w:bookmarkStart w:id="104" w:name="_Toc84751257"/>
+      <w:bookmarkStart w:id="105" w:name="_Toc210560253"/>
+      <w:bookmarkStart w:id="106" w:name="_Toc211137923"/>
+      <w:bookmarkStart w:id="107" w:name="_Toc223637597"/>
+      <w:r>
+        <w:t>Literatur</w:t>
+      </w:r>
       <w:bookmarkEnd w:id="100"/>
       <w:bookmarkEnd w:id="101"/>
       <w:bookmarkEnd w:id="102"/>
       <w:bookmarkEnd w:id="103"/>
       <w:bookmarkEnd w:id="104"/>
+      <w:bookmarkEnd w:id="105"/>
+      <w:bookmarkEnd w:id="106"/>
       <w:r>
         <w:t>verzeichnis</w:t>
       </w:r>
-      <w:bookmarkEnd w:id="105"/>
+      <w:bookmarkEnd w:id="107"/>
       <w:r>
         <w:t xml:space="preserve"> </w:t>
       </w:r>
@@ -14988,138 +15672,138 @@
       <w:pPr>
         <w:pStyle w:val="berschrift2"/>
       </w:pPr>
-      <w:bookmarkStart w:id="106" w:name="_Toc84757225"/>
-      <w:bookmarkStart w:id="107" w:name="_Toc211138171"/>
-      <w:bookmarkStart w:id="108" w:name="_Toc211137927"/>
-      <w:bookmarkStart w:id="109" w:name="_Toc84751260"/>
-      <w:bookmarkStart w:id="110" w:name="_Toc210560307"/>
-      <w:bookmarkStart w:id="111" w:name="_Toc210560254"/>
-      <w:bookmarkStart w:id="112" w:name="_Toc84751372"/>
-      <w:bookmarkStart w:id="113" w:name="_Toc223029786"/>
+      <w:bookmarkStart w:id="108" w:name="_Toc84757225"/>
+      <w:bookmarkStart w:id="109" w:name="_Toc211138171"/>
+      <w:bookmarkStart w:id="110" w:name="_Toc211137927"/>
+      <w:bookmarkStart w:id="111" w:name="_Toc84751260"/>
+      <w:bookmarkStart w:id="112" w:name="_Toc210560307"/>
+      <w:bookmarkStart w:id="113" w:name="_Toc210560254"/>
+      <w:bookmarkStart w:id="114" w:name="_Toc84751372"/>
+      <w:bookmarkStart w:id="115" w:name="_Toc223637598"/>
       <w:r>
         <w:t>Abkürzungsverzeichnis</w:t>
       </w:r>
-      <w:bookmarkEnd w:id="106"/>
-      <w:bookmarkEnd w:id="107"/>
       <w:bookmarkEnd w:id="108"/>
       <w:bookmarkEnd w:id="109"/>
       <w:bookmarkEnd w:id="110"/>
       <w:bookmarkEnd w:id="111"/>
       <w:bookmarkEnd w:id="112"/>
       <w:bookmarkEnd w:id="113"/>
-    </w:p>
-    <w:p>
-      <w:pPr>
-        <w:pStyle w:val="Text"/>
-        <w:rPr>
-          <w:color w:val="0066FF"/>
-        </w:rPr>
-      </w:pPr>
-      <w:r>
-        <w:rPr>
-          <w:color w:val="0066FF"/>
-        </w:rPr>
-        <w:t>(</w:t>
-      </w:r>
-      <w:proofErr w:type="gramStart"/>
-      <w:r>
-        <w:rPr>
-          <w:color w:val="0066FF"/>
-        </w:rPr>
-        <w:t>FV Text</w:t>
-      </w:r>
-      <w:proofErr w:type="gramEnd"/>
-      <w:r>
-        <w:rPr>
-          <w:color w:val="0066FF"/>
-        </w:rPr>
-        <w:t>)</w:t>
-      </w:r>
-      <w:bookmarkStart w:id="114" w:name="_Toc211138172"/>
-      <w:bookmarkStart w:id="115" w:name="_Toc211137928"/>
-      <w:bookmarkStart w:id="116" w:name="_Toc84757226"/>
-      <w:bookmarkStart w:id="117" w:name="_Toc84751373"/>
-      <w:bookmarkStart w:id="118" w:name="_Toc84751261"/>
-      <w:bookmarkStart w:id="119" w:name="_Toc210560308"/>
-      <w:bookmarkStart w:id="120" w:name="_Toc210560255"/>
-      <w:r>
-        <w:rPr>
-          <w:color w:val="0066FF"/>
-        </w:rPr>
-        <w:t xml:space="preserve"> Optionaler Abschnitt. Nur verwenden, wenn mehr als 10 verschiedene Abkürzungen im gesamten Dokument vorkommen.</w:t>
-      </w:r>
-    </w:p>
-    <w:p>
-      <w:pPr>
-        <w:pStyle w:val="berschrift2"/>
-      </w:pPr>
-      <w:bookmarkStart w:id="121" w:name="_Toc223029787"/>
-      <w:r>
-        <w:t>Tabellen</w:t>
-      </w:r>
       <w:bookmarkEnd w:id="114"/>
       <w:bookmarkEnd w:id="115"/>
+    </w:p>
+    <w:p>
+      <w:pPr>
+        <w:pStyle w:val="Text"/>
+        <w:rPr>
+          <w:color w:val="0066FF"/>
+        </w:rPr>
+      </w:pPr>
+      <w:r>
+        <w:rPr>
+          <w:color w:val="0066FF"/>
+        </w:rPr>
+        <w:t>(</w:t>
+      </w:r>
+      <w:proofErr w:type="gramStart"/>
+      <w:r>
+        <w:rPr>
+          <w:color w:val="0066FF"/>
+        </w:rPr>
+        <w:t>FV Text</w:t>
+      </w:r>
+      <w:proofErr w:type="gramEnd"/>
+      <w:r>
+        <w:rPr>
+          <w:color w:val="0066FF"/>
+        </w:rPr>
+        <w:t>)</w:t>
+      </w:r>
+      <w:bookmarkStart w:id="116" w:name="_Toc211138172"/>
+      <w:bookmarkStart w:id="117" w:name="_Toc211137928"/>
+      <w:bookmarkStart w:id="118" w:name="_Toc84757226"/>
+      <w:bookmarkStart w:id="119" w:name="_Toc84751373"/>
+      <w:bookmarkStart w:id="120" w:name="_Toc84751261"/>
+      <w:bookmarkStart w:id="121" w:name="_Toc210560308"/>
+      <w:bookmarkStart w:id="122" w:name="_Toc210560255"/>
+      <w:r>
+        <w:rPr>
+          <w:color w:val="0066FF"/>
+        </w:rPr>
+        <w:t xml:space="preserve"> Optionaler Abschnitt. Nur verwenden, wenn mehr als 10 verschiedene Abkürzungen im gesamten Dokument vorkommen.</w:t>
+      </w:r>
+    </w:p>
+    <w:p>
+      <w:pPr>
+        <w:pStyle w:val="berschrift2"/>
+      </w:pPr>
+      <w:bookmarkStart w:id="123" w:name="_Toc223637599"/>
+      <w:r>
+        <w:t>Tabellen</w:t>
+      </w:r>
       <w:bookmarkEnd w:id="116"/>
       <w:bookmarkEnd w:id="117"/>
       <w:bookmarkEnd w:id="118"/>
       <w:bookmarkEnd w:id="119"/>
       <w:bookmarkEnd w:id="120"/>
       <w:bookmarkEnd w:id="121"/>
-    </w:p>
-    <w:p>
-      <w:pPr>
-        <w:rPr>
-          <w:color w:val="0066FF"/>
-        </w:rPr>
-      </w:pPr>
-      <w:r>
-        <w:rPr>
-          <w:color w:val="0066FF"/>
-        </w:rPr>
-        <w:t>(</w:t>
-      </w:r>
-      <w:proofErr w:type="gramStart"/>
-      <w:r>
-        <w:rPr>
-          <w:color w:val="0066FF"/>
-        </w:rPr>
-        <w:t>FV Text</w:t>
-      </w:r>
-      <w:proofErr w:type="gramEnd"/>
-      <w:r>
-        <w:rPr>
-          <w:color w:val="0066FF"/>
-        </w:rPr>
-        <w:t>) Optionaler Abschnitt. Nur verwenden, wenn mehr als 10 verschiedene Tabellen im gesamten Dokument vorkommen.</w:t>
-      </w:r>
-    </w:p>
-    <w:p/>
-    <w:p>
-      <w:pPr>
-        <w:pStyle w:val="berschrift2"/>
-      </w:pPr>
-      <w:bookmarkStart w:id="122" w:name="_Toc210560256"/>
-      <w:bookmarkStart w:id="123" w:name="_Toc210560309"/>
-      <w:bookmarkStart w:id="124" w:name="_Toc211137929"/>
-      <w:bookmarkStart w:id="125" w:name="_Toc84757227"/>
-      <w:bookmarkStart w:id="126" w:name="_Toc84751374"/>
-      <w:bookmarkStart w:id="127" w:name="_Toc84751262"/>
-      <w:bookmarkStart w:id="128" w:name="_Toc211138173"/>
-      <w:bookmarkStart w:id="129" w:name="_Toc223029788"/>
-      <w:r>
-        <w:t>Abbildunge</w:t>
-      </w:r>
       <w:bookmarkEnd w:id="122"/>
       <w:bookmarkEnd w:id="123"/>
-      <w:r>
-        <w:t>n</w:t>
+    </w:p>
+    <w:p>
+      <w:pPr>
+        <w:rPr>
+          <w:color w:val="0066FF"/>
+        </w:rPr>
+      </w:pPr>
+      <w:r>
+        <w:rPr>
+          <w:color w:val="0066FF"/>
+        </w:rPr>
+        <w:t>(</w:t>
+      </w:r>
+      <w:proofErr w:type="gramStart"/>
+      <w:r>
+        <w:rPr>
+          <w:color w:val="0066FF"/>
+        </w:rPr>
+        <w:t>FV Text</w:t>
+      </w:r>
+      <w:proofErr w:type="gramEnd"/>
+      <w:r>
+        <w:rPr>
+          <w:color w:val="0066FF"/>
+        </w:rPr>
+        <w:t>) Optionaler Abschnitt. Nur verwenden, wenn mehr als 10 verschiedene Tabellen im gesamten Dokument vorkommen.</w:t>
+      </w:r>
+    </w:p>
+    <w:p/>
+    <w:p>
+      <w:pPr>
+        <w:pStyle w:val="berschrift2"/>
+      </w:pPr>
+      <w:bookmarkStart w:id="124" w:name="_Toc210560256"/>
+      <w:bookmarkStart w:id="125" w:name="_Toc210560309"/>
+      <w:bookmarkStart w:id="126" w:name="_Toc211137929"/>
+      <w:bookmarkStart w:id="127" w:name="_Toc84757227"/>
+      <w:bookmarkStart w:id="128" w:name="_Toc84751374"/>
+      <w:bookmarkStart w:id="129" w:name="_Toc84751262"/>
+      <w:bookmarkStart w:id="130" w:name="_Toc211138173"/>
+      <w:bookmarkStart w:id="131" w:name="_Toc223637600"/>
+      <w:r>
+        <w:t>Abbildunge</w:t>
       </w:r>
       <w:bookmarkEnd w:id="124"/>
       <w:bookmarkEnd w:id="125"/>
+      <w:r>
+        <w:t>n</w:t>
+      </w:r>
       <w:bookmarkEnd w:id="126"/>
       <w:bookmarkEnd w:id="127"/>
       <w:bookmarkEnd w:id="128"/>
       <w:bookmarkEnd w:id="129"/>
+      <w:bookmarkEnd w:id="130"/>
+      <w:bookmarkEnd w:id="131"/>
     </w:p>
     <w:p>
       <w:pPr>
@@ -15160,11 +15844,25 @@
         <w:rPr>
           <w:color w:val="0066FF"/>
         </w:rPr>
+      </w:pPr>
+    </w:p>
+    <w:p>
+      <w:pPr>
+        <w:rPr>
+          <w:color w:val="0066FF"/>
+        </w:rPr>
+      </w:pPr>
+    </w:p>
+    <w:p>
+      <w:pPr>
+        <w:rPr>
+          <w:color w:val="0066FF"/>
+        </w:rPr>
         <w:sectPr>
-          <w:headerReference w:type="default" r:id="rId77"/>
-          <w:footerReference w:type="default" r:id="rId78"/>
-          <w:headerReference w:type="first" r:id="rId79"/>
-          <w:footerReference w:type="first" r:id="rId80"/>
+          <w:headerReference w:type="default" r:id="rId78"/>
+          <w:footerReference w:type="default" r:id="rId79"/>
+          <w:headerReference w:type="first" r:id="rId80"/>
+          <w:footerReference w:type="first" r:id="rId81"/>
           <w:pgSz w:w="11906" w:h="16838"/>
           <w:pgMar w:top="1417" w:right="1440" w:bottom="1134" w:left="1440" w:header="708" w:footer="708" w:gutter="0"/>
           <w:cols w:space="720"/>
@@ -15177,52 +15875,20 @@
       <w:pPr>
         <w:pStyle w:val="berschrift1"/>
       </w:pPr>
-      <w:bookmarkStart w:id="130" w:name="_Toc211138174"/>
-      <w:bookmarkStart w:id="131" w:name="_Toc211137930"/>
-      <w:bookmarkStart w:id="132" w:name="_Toc84751375"/>
-      <w:bookmarkStart w:id="133" w:name="_Toc84751263"/>
-      <w:bookmarkStart w:id="134" w:name="_Ref84675439"/>
-      <w:bookmarkStart w:id="135" w:name="_Toc223029789"/>
+      <w:bookmarkStart w:id="132" w:name="_Toc211138174"/>
+      <w:bookmarkStart w:id="133" w:name="_Toc211137930"/>
+      <w:bookmarkStart w:id="134" w:name="_Toc84751375"/>
+      <w:bookmarkStart w:id="135" w:name="_Toc84751263"/>
+      <w:bookmarkStart w:id="136" w:name="_Ref84675439"/>
+      <w:bookmarkStart w:id="137" w:name="_Toc223637601"/>
       <w:r>
         <w:lastRenderedPageBreak/>
         <w:t>Anhang</w:t>
       </w:r>
-      <w:bookmarkEnd w:id="130"/>
-      <w:bookmarkEnd w:id="131"/>
       <w:bookmarkEnd w:id="132"/>
       <w:bookmarkEnd w:id="133"/>
       <w:bookmarkEnd w:id="134"/>
       <w:bookmarkEnd w:id="135"/>
-    </w:p>
-    <w:p>
-      <w:pPr>
-        <w:pStyle w:val="Text"/>
-        <w:rPr>
-          <w:color w:val="0066FF"/>
-        </w:rPr>
-      </w:pPr>
-      <w:bookmarkStart w:id="136" w:name="_Ref210468443"/>
-      <w:bookmarkStart w:id="137" w:name="_Ref210464602"/>
-      <w:r>
-        <w:rPr>
-          <w:color w:val="0066FF"/>
-        </w:rPr>
-        <w:t>(</w:t>
-      </w:r>
-      <w:proofErr w:type="gramStart"/>
-      <w:r>
-        <w:rPr>
-          <w:color w:val="0066FF"/>
-        </w:rPr>
-        <w:t>FV Text</w:t>
-      </w:r>
-      <w:proofErr w:type="gramEnd"/>
-      <w:r>
-        <w:rPr>
-          <w:color w:val="0066FF"/>
-        </w:rPr>
-        <w:t>) Optionales Kapitel. Hier werden Datenblätter, große Zeichnungen, Skizzen, Bilder, etc. eingefügt, die im Fließtext der vorigen Kapitel nicht eingefügt werden, da sie dort die Übersichtlichkeit bzw. Struktur dieser Kapitel verschlechtern würden.</w:t>
-      </w:r>
       <w:bookmarkEnd w:id="136"/>
       <w:bookmarkEnd w:id="137"/>
     </w:p>
@@ -15233,28 +15899,60 @@
           <w:color w:val="0066FF"/>
         </w:rPr>
       </w:pPr>
-    </w:p>
-    <w:p>
-      <w:pPr>
-        <w:pStyle w:val="Text"/>
+      <w:bookmarkStart w:id="138" w:name="_Ref210468443"/>
+      <w:bookmarkStart w:id="139" w:name="_Ref210464602"/>
+      <w:r>
         <w:rPr>
           <w:color w:val="0066FF"/>
         </w:rPr>
-      </w:pPr>
-    </w:p>
-    <w:p>
-      <w:pPr>
-        <w:pStyle w:val="Text"/>
-        <w:rPr>
-          <w:lang w:val="de-AT"/>
+        <w:t>(</w:t>
+      </w:r>
+      <w:proofErr w:type="gramStart"/>
+      <w:r>
+        <w:rPr>
+          <w:color w:val="0066FF"/>
+        </w:rPr>
+        <w:t>FV Text</w:t>
+      </w:r>
+      <w:proofErr w:type="gramEnd"/>
+      <w:r>
+        <w:rPr>
+          <w:color w:val="0066FF"/>
+        </w:rPr>
+        <w:t>) Optionales Kapitel. Hier werden Datenblätter, große Zeichnungen, Skizzen, Bilder, etc. eingefügt, die im Fließtext der vorigen Kapitel nicht eingefügt werden, da sie dort die Übersichtlichkeit bzw. Struktur dieser Kapitel verschlechtern würden.</w:t>
+      </w:r>
+      <w:bookmarkEnd w:id="138"/>
+      <w:bookmarkEnd w:id="139"/>
+    </w:p>
+    <w:p>
+      <w:pPr>
+        <w:pStyle w:val="Text"/>
+        <w:rPr>
+          <w:color w:val="0066FF"/>
+        </w:rPr>
+      </w:pPr>
+    </w:p>
+    <w:p>
+      <w:pPr>
+        <w:pStyle w:val="Text"/>
+        <w:rPr>
+          <w:color w:val="0066FF"/>
+        </w:rPr>
+      </w:pPr>
+    </w:p>
+    <w:p>
+      <w:pPr>
+        <w:pStyle w:val="Text"/>
+        <w:rPr>
+          <w:lang w:val="en-GB"/>
         </w:rPr>
       </w:pPr>
     </w:p>
     <w:sectPr>
-      <w:headerReference w:type="default" r:id="rId81"/>
-      <w:footerReference w:type="default" r:id="rId82"/>
-      <w:headerReference w:type="first" r:id="rId83"/>
-      <w:footerReference w:type="first" r:id="rId84"/>
+      <w:headerReference w:type="default" r:id="rId82"/>
+      <w:footerReference w:type="default" r:id="rId83"/>
+      <w:headerReference w:type="first" r:id="rId84"/>
+      <w:footerReference w:type="first" r:id="rId85"/>
       <w:pgSz w:w="11906" w:h="16838"/>
       <w:pgMar w:top="1417" w:right="1440" w:bottom="1134" w:left="1440" w:header="708" w:footer="708" w:gutter="0"/>
       <w:cols w:space="720"/>
@@ -15685,6 +16383,106 @@
           <w:lang w:val="de-AT"/>
         </w:rPr>
         <w:t>überprüfen</w:t>
+      </w:r>
+    </w:p>
+  </w:comment>
+  <w:comment w:id="75" w:author="GRANEGGER Felix, SchülerIn" w:date="2026-03-05T21:30:00Z" w:initials="FG">
+    <w:p>
+      <w:pPr>
+        <w:pStyle w:val="Kommentartext"/>
+        <w:jc w:val="left"/>
+      </w:pPr>
+      <w:r>
+        <w:rPr>
+          <w:rStyle w:val="Kommentarzeichen"/>
+        </w:rPr>
+        <w:annotationRef/>
+      </w:r>
+      <w:r>
+        <w:rPr>
+          <w:lang w:val="de-AT"/>
+        </w:rPr>
+        <w:t>KI- änder</w:t>
+      </w:r>
+    </w:p>
+  </w:comment>
+  <w:comment w:id="76" w:author="GRANEGGER Felix, SchülerIn" w:date="2026-03-05T21:34:00Z" w:initials="FG">
+    <w:p>
+      <w:pPr>
+        <w:pStyle w:val="Kommentartext"/>
+        <w:jc w:val="left"/>
+      </w:pPr>
+      <w:r>
+        <w:rPr>
+          <w:rStyle w:val="Kommentarzeichen"/>
+        </w:rPr>
+        <w:annotationRef/>
+      </w:r>
+      <w:r>
+        <w:rPr>
+          <w:lang w:val="de-AT"/>
+        </w:rPr>
+        <w:t>Fehlt:</w:t>
+      </w:r>
+    </w:p>
+    <w:p>
+      <w:pPr>
+        <w:pStyle w:val="Kommentartext"/>
+        <w:jc w:val="left"/>
+      </w:pPr>
+      <w:r>
+        <w:rPr>
+          <w:lang w:val="de-AT"/>
+        </w:rPr>
+        <w:t>Warum Python</w:t>
+      </w:r>
+    </w:p>
+    <w:p>
+      <w:pPr>
+        <w:pStyle w:val="Kommentartext"/>
+        <w:jc w:val="left"/>
+      </w:pPr>
+      <w:r>
+        <w:rPr>
+          <w:lang w:val="de-AT"/>
+        </w:rPr>
+        <w:t>Welche GUI (PyQt6)</w:t>
+      </w:r>
+    </w:p>
+    <w:p>
+      <w:pPr>
+        <w:pStyle w:val="Kommentartext"/>
+        <w:jc w:val="left"/>
+      </w:pPr>
+      <w:r>
+        <w:rPr>
+          <w:lang w:val="de-AT"/>
+        </w:rPr>
+        <w:t>Welche Bibliotheken</w:t>
+      </w:r>
+    </w:p>
+    <w:p>
+      <w:pPr>
+        <w:pStyle w:val="Kommentartext"/>
+        <w:jc w:val="left"/>
+      </w:pPr>
+      <w:r>
+        <w:rPr>
+          <w:lang w:val="de-AT"/>
+        </w:rPr>
+        <w:t>Zusatz funktionen (erneute Aufnahme von Bildern)</w:t>
+      </w:r>
+    </w:p>
+    <w:p>
+      <w:pPr>
+        <w:pStyle w:val="Kommentartext"/>
+        <w:jc w:val="left"/>
+      </w:pPr>
+      <w:r>
+        <w:rPr>
+          <w:lang w:val="de-AT"/>
+        </w:rPr>
+        <w:t>Einfach zu bedienen auch mit Pfeiltasten</w:t>
       </w:r>
     </w:p>
   </w:comment>
@@ -15709,6 +16507,8 @@
   <w15:commentEx w15:paraId="436ED5F5" w15:done="0"/>
   <w15:commentEx w15:paraId="57AA0711" w15:done="0"/>
   <w15:commentEx w15:paraId="4DC4BF4E" w15:done="0"/>
+  <w15:commentEx w15:paraId="126FE310" w15:done="0"/>
+  <w15:commentEx w15:paraId="413869BA" w15:done="0"/>
 </w15:commentsEx>
 </file>
 
@@ -15730,6 +16530,8 @@
   <w16cex:commentExtensible w16cex:durableId="7EE46E6B" w16cex:dateUtc="2026-03-03T13:37:00Z"/>
   <w16cex:commentExtensible w16cex:durableId="31621F3E" w16cex:dateUtc="2026-03-03T13:37:00Z"/>
   <w16cex:commentExtensible w16cex:durableId="46D6F6B3" w16cex:dateUtc="2026-03-03T13:40:00Z"/>
+  <w16cex:commentExtensible w16cex:durableId="4DD3F4B5" w16cex:dateUtc="2026-03-05T20:30:00Z"/>
+  <w16cex:commentExtensible w16cex:durableId="0C284E3A" w16cex:dateUtc="2026-03-05T20:34:00Z"/>
 </w16cex:commentsExtensible>
 </file>
 
@@ -15751,6 +16553,8 @@
   <w16cid:commentId w16cid:paraId="436ED5F5" w16cid:durableId="7EE46E6B"/>
   <w16cid:commentId w16cid:paraId="57AA0711" w16cid:durableId="31621F3E"/>
   <w16cid:commentId w16cid:paraId="4DC4BF4E" w16cid:durableId="46D6F6B3"/>
+  <w16cid:commentId w16cid:paraId="126FE310" w16cid:durableId="4DD3F4B5"/>
+  <w16cid:commentId w16cid:paraId="413869BA" w16cid:durableId="0C284E3A"/>
 </w16cid:commentsIds>
 </file>
 
@@ -25392,6 +26196,16 @@
 </file>
 
 <file path=customXml/item1.xml><?xml version="1.0" encoding="utf-8"?>
+<b:Sources xmlns:b="http://schemas.openxmlformats.org/officeDocument/2006/bibliography" xmlns="http://schemas.openxmlformats.org/officeDocument/2006/bibliography" SelectedStyle="\APASixthEditionOfficeOnline.xsl" StyleName="APA" Version="6"/>
+</file>
+
+<file path=customXml/item2.xml><?xml version="1.0" encoding="utf-8"?>
+<p:properties xmlns:p="http://schemas.microsoft.com/office/2006/metadata/properties" xmlns:xsi="http://www.w3.org/2001/XMLSchema-instance" xmlns:pc="http://schemas.microsoft.com/office/infopath/2007/PartnerControls">
+  <documentManagement/>
+</p:properties>
+</file>
+
+<file path=customXml/item3.xml><?xml version="1.0" encoding="utf-8"?>
 <inkml:ink xmlns:inkml="http://www.w3.org/2003/InkML">
   <inkml:definitions>
     <inkml:context xml:id="ctx0">
@@ -25425,93 +26239,7 @@
 </inkml:ink>
 </file>
 
-<file path=customXml/item2.xml><?xml version="1.0" encoding="utf-8"?>
-<inkml:ink xmlns:inkml="http://www.w3.org/2003/InkML">
-  <inkml:definitions>
-    <inkml:context xml:id="ctx0">
-      <inkml:inkSource xml:id="inkSrc0">
-        <inkml:traceFormat>
-          <inkml:channel name="X" type="integer" min="-2.14748E9" max="2.14748E9" units="cm"/>
-          <inkml:channel name="Y" type="integer" min="-2.14748E9" max="2.14748E9" units="cm"/>
-          <inkml:channel name="F" type="integer" max="32767" units="dev"/>
-          <inkml:channel name="OA" type="integer" max="360" units="deg"/>
-          <inkml:channel name="OE" type="integer" max="90" units="deg"/>
-        </inkml:traceFormat>
-        <inkml:channelProperties>
-          <inkml:channelProperty channel="X" name="resolution" value="1000" units="1/cm"/>
-          <inkml:channelProperty channel="Y" name="resolution" value="1000" units="1/cm"/>
-          <inkml:channelProperty channel="F" name="resolution" value="0" units="1/dev"/>
-          <inkml:channelProperty channel="OA" name="resolution" value="1000" units="1/deg"/>
-          <inkml:channelProperty channel="OE" name="resolution" value="1000" units="1/deg"/>
-        </inkml:channelProperties>
-      </inkml:inkSource>
-      <inkml:timestamp xml:id="ts0" timeString="2025-06-10T16:08:54.030"/>
-    </inkml:context>
-    <inkml:brush xml:id="br0">
-      <inkml:brushProperty name="width" value="0.05" units="cm"/>
-      <inkml:brushProperty name="height" value="0.05" units="cm"/>
-      <inkml:brushProperty name="color" value="#E71224"/>
-    </inkml:brush>
-  </inkml:definitions>
-  <inkml:trace contextRef="#ctx0" brushRef="#br0">5 208 2425 0 0,'0'0'5878'0'0,"24"0"-3468"0"0,-17 1-2405 0 0,0 0 1 0 0,0 0-1 0 0,0 0 0 0 0,0 1 1 0 0,0 0-1 0 0,11 5 0 0 0,-9-5 40 0 0,0 0-1 0 0,0 0 0 0 0,0-1 0 0 0,1 0 1 0 0,-1 0-1 0 0,0-1 0 0 0,17-3 1 0 0,4 2 74 0 0,-22 1-105 0 0,1-1 1 0 0,0 2-1 0 0,-1-1 0 0 0,1 1 1 0 0,-1 0-1 0 0,1 1 1 0 0,-1 0-1 0 0,1 0 1 0 0,-1 1-1 0 0,14 7 0 0 0,-22-10-10 0 0,1 0 1 0 0,0 1-1 0 0,-1-1 0 0 0,1 1 0 0 0,0-1 0 0 0,-1 1 0 0 0,1-1 0 0 0,0 1 0 0 0,-1 0 0 0 0,1-1 0 0 0,-1 1 0 0 0,1 0 0 0 0,-1-1 0 0 0,0 1 0 0 0,1 0 0 0 0,-1 0 0 0 0,0-1 0 0 0,1 1 0 0 0,-1 0 0 0 0,0 0 0 0 0,0 0 0 0 0,0-1 0 0 0,0 1 0 0 0,0 0 1 0 0,0 0-1 0 0,0 0 0 0 0,0 0 0 0 0,0-1 0 0 0,0 1 0 0 0,0 0 0 0 0,0 0 0 0 0,-1 0 0 0 0,1-1 0 0 0,0 1 0 0 0,-1 0 0 0 0,1 0 0 0 0,0-1 0 0 0,-1 1 0 0 0,1 0 0 0 0,-2 0 0 0 0,-2 4 13 0 0,0-1 0 0 0,-1 1 0 0 0,0-1 0 0 0,-10 6 0 0 0,-6 7-17 0 0,-52 46-71 0 0,46-41 27 0 0,-30 31 0 0 0,55-51 44 0 0,1 0 0 0 0,-1 0 0 0 0,0 0 0 0 0,1 0-1 0 0,-1 0 1 0 0,1 0 0 0 0,0 0 0 0 0,0 0 0 0 0,-1 1-1 0 0,1-1 1 0 0,1 0 0 0 0,-1 1 0 0 0,0-1 0 0 0,1 1-1 0 0,-1-1 1 0 0,1 1 0 0 0,0-1 0 0 0,0 5-1 0 0,0-6 1 0 0,1 1 0 0 0,0-1 0 0 0,-1 1 0 0 0,1-1 0 0 0,0 1 0 0 0,0-1 0 0 0,0 0-1 0 0,0 1 1 0 0,0-1 0 0 0,0 0 0 0 0,0 0 0 0 0,0 0 0 0 0,1 0 0 0 0,-1 0-1 0 0,0 0 1 0 0,1 0 0 0 0,-1 0 0 0 0,1 0 0 0 0,-1-1 0 0 0,1 1 0 0 0,-1-1 0 0 0,1 1-1 0 0,-1-1 1 0 0,1 1 0 0 0,0-1 0 0 0,-1 0 0 0 0,1 0 0 0 0,-1 0 0 0 0,3 0-1 0 0,29 4-18 0 0,-11-1-40 0 0,-1-1 0 0 0,25-2 0 0 0,-39 0 42 0 0,1-1-1 0 0,0 0 1 0 0,0 0-1 0 0,-1-1 1 0 0,1 0-1 0 0,-1-1 1 0 0,0 0 0 0 0,0 0-1 0 0,12-7 1 0 0,29-13-1642 0 0,-12 16-3216 0 0,-30 7 3490 0 0</inkml:trace>
-  <inkml:trace contextRef="#ctx0" brushRef="#br0" timeOffset="537.36">1 353 3761 0 0,'14'-4'313'0'0,"1"1"1"0"0,0 1 0 0 0,0 0-1 0 0,0 1 1 0 0,1 1 0 0 0,-1 0-1 0 0,0 1 1 0 0,0 0 0 0 0,0 2-1 0 0,0-1 1 0 0,-1 2 0 0 0,1 0-1 0 0,-1 1 1 0 0,1 0 0 0 0,13 8-1 0 0,-21-9-404 0 0,1-2 0 0 0,0 1 0 0 0,0-1 0 0 0,0 0-1 0 0,0-1 1 0 0,0 0 0 0 0,0 0 0 0 0,1 0 0 0 0,-1-1 0 0 0,0-1-1 0 0,0 1 1 0 0,1-2 0 0 0,-1 1 0 0 0,0-1 0 0 0,0 0 0 0 0,9-4 0 0 0,-11 5-498 0 0</inkml:trace>
-  <inkml:trace contextRef="#ctx0" brushRef="#br0" timeOffset="1907.49">580 318 4417 0 0,'0'0'535'0'0,"25"18"674"0"0,-15-14-1066 0 0,1 0-1 0 0,0-1 0 0 0,-1 0 0 0 0,1-1 1 0 0,17 2-1 0 0,-15-3-53 0 0,0-1 1 0 0,0 0-1 0 0,19-4 1 0 0,-28 4-78 0 0,0-1 0 0 0,-1 1 0 0 0,1-1 1 0 0,-1 0-1 0 0,1-1 0 0 0,-1 1 0 0 0,1 0 1 0 0,-1-1-1 0 0,0 0 0 0 0,0 0 1 0 0,0 0-1 0 0,0 0 0 0 0,0 0 0 0 0,0-1 1 0 0,-1 1-1 0 0,1-1 0 0 0,2-4 1 0 0,-4 5-7 0 0,0 0 0 0 0,0 0 0 0 0,-1 0 0 0 0,1 0 0 0 0,-1 0 1 0 0,0 0-1 0 0,1 0 0 0 0,-1 0 0 0 0,0 0 0 0 0,0 0 1 0 0,0 0-1 0 0,-1 0 0 0 0,1 0 0 0 0,0 0 0 0 0,-1 0 0 0 0,1 0 1 0 0,-1 0-1 0 0,0 0 0 0 0,-1-3 0 0 0,2 4-6 0 0,-1 0-1 0 0,0-1 1 0 0,0 1-1 0 0,0 0 1 0 0,1 0 0 0 0,-1 0-1 0 0,0 0 1 0 0,-1 0-1 0 0,1 0 1 0 0,0 0 0 0 0,0 0-1 0 0,0 0 1 0 0,0 1-1 0 0,-1-1 1 0 0,1 0-1 0 0,0 1 1 0 0,-1-1 0 0 0,1 1-1 0 0,0-1 1 0 0,-1 1-1 0 0,1 0 1 0 0,-1 0 0 0 0,1-1-1 0 0,0 1 1 0 0,-1 0-1 0 0,1 0 1 0 0,-1 0-1 0 0,1 1 1 0 0,-1-1 0 0 0,1 0-1 0 0,-1 0 1 0 0,1 1-1 0 0,-2 0 1 0 0,-13 4-18 0 0,0 1 0 0 0,0 1 1 0 0,0 0-1 0 0,1 1 0 0 0,-16 12 0 0 0,26-16 81 0 0,-1 0 0 0 0,2 0 0 0 0,-1 0 0 0 0,0 1 0 0 0,1 0 1 0 0,0 0-1 0 0,0 0 0 0 0,1 0 0 0 0,-1 0 0 0 0,1 1 0 0 0,0 0 0 0 0,1 0 0 0 0,-1 0 0 0 0,1 0 0 0 0,0 0 0 0 0,1 0 0 0 0,-2 9 0 0 0,3-10-43 0 0,-1-1 0 0 0,2 1 0 0 0,-1-1 0 0 0,0 1 0 0 0,1-1 0 0 0,0 1-1 0 0,0-1 1 0 0,0 0 0 0 0,1 1 0 0 0,-1-1 0 0 0,1 0 0 0 0,0 0 0 0 0,0 0 0 0 0,4 5 0 0 0,-1-3-13 0 0,0 1-1 0 0,0-1 1 0 0,1 0 0 0 0,0 0 0 0 0,0-1 0 0 0,1 0 0 0 0,11 8 0 0 0,-10-9 30 0 0,-1 1 0 0 0,0-1 0 0 0,1-1 0 0 0,0 0 0 0 0,-1 0 1 0 0,1 0-1 0 0,1-1 0 0 0,-1 0 0 0 0,0-1 0 0 0,0 1 0 0 0,1-2 0 0 0,-1 1 0 0 0,1-1 0 0 0,-1-1 0 0 0,0 1 0 0 0,14-4 0 0 0,-13 1 19 0 0,0 0 0 0 0,0 0-1 0 0,-1-1 1 0 0,1-1 0 0 0,-1 1-1 0 0,0-1 1 0 0,0-1 0 0 0,0 0-1 0 0,-1 0 1 0 0,0 0 0 0 0,0-1-1 0 0,-1 0 1 0 0,1 0-1 0 0,-1-1 1 0 0,-1 1 0 0 0,0-1-1 0 0,0-1 1 0 0,0 1 0 0 0,-1-1-1 0 0,-1 1 1 0 0,6-18 0 0 0,3-2 566 0 0,-23 48-322 0 0,9-18-301 0 0,1 1 0 0 0,0 0 1 0 0,-1 0-1 0 0,1-1 0 0 0,0 1 0 0 0,0 0 1 0 0,1 0-1 0 0,-1 0 0 0 0,1 0 0 0 0,-1 0 1 0 0,1 0-1 0 0,0 0 0 0 0,0 0 0 0 0,1 5 1 0 0,-1-8 0 0 0,0-1 0 0 0,0 1 0 0 0,0 0 0 0 0,0 0 0 0 0,0 0 0 0 0,0 0 0 0 0,-1 0 0 0 0,1 0 0 0 0,0 0 0 0 0,0 0 0 0 0,0 0-1 0 0,0 0 1 0 0,0 0 0 0 0,0 0 0 0 0,0 0 0 0 0,0 0 0 0 0,0 0 0 0 0,0 0 0 0 0,0 0 0 0 0,0 0 0 0 0,0 0 0 0 0,0 0 0 0 0,0 0 0 0 0,0 0 0 0 0,0 0 0 0 0,0 0 0 0 0,-1 0 0 0 0,1 0 0 0 0,0 0 0 0 0,0 0 0 0 0,0 0 0 0 0,0 0 0 0 0,0 0 0 0 0,0 0 0 0 0,9 36 2 0 0,-9-36 0 0 0,0 1 0 0 0,0 0 0 0 0,0-1-1 0 0,0 1 1 0 0,0-1 0 0 0,1 1 0 0 0,-1 0 0 0 0,0-1 0 0 0,0 1 0 0 0,0-1 0 0 0,1 1-1 0 0,-1-1 1 0 0,0 1 0 0 0,0-1 0 0 0,1 1 0 0 0,-1-1 0 0 0,0 1 0 0 0,1-1 0 0 0,-1 1-1 0 0,1-1 1 0 0,-1 1 0 0 0,1-1 0 0 0,-1 0 0 0 0,1 1 0 0 0,-1-1 0 0 0,1 0 0 0 0,-1 0-1 0 0,1 1 1 0 0,-1-1 0 0 0,1 0 0 0 0,-1 0 0 0 0,2 1 0 0 0,5 1 24 0 0,-1 1-15 0 0,-4-1-3 0 0,0-1 0 0 0,0 0-1 0 0,0 0 1 0 0,0 0-1 0 0,0 0 1 0 0,0-1 0 0 0,0 1-1 0 0,0 0 1 0 0,0-1-1 0 0,0 0 1 0 0,4 1 0 0 0,-2-1 6 0 0,-1-1 1 0 0,1 0 0 0 0,-1 1 0 0 0,1-1 0 0 0,-1-1-1 0 0,0 1 1 0 0,1 0 0 0 0,-1-1 0 0 0,0 0 0 0 0,0 0 0 0 0,0 1-1 0 0,0-2 1 0 0,0 1 0 0 0,0 0 0 0 0,-1-1 0 0 0,1 1-1 0 0,3-6 1 0 0,2-3 48 0 0,0 0 0 0 0,-1 0-1 0 0,9-18 1 0 0,-15 28-59 0 0,-1 1 0 0 0,0 0 0 0 0,1 0 0 0 0,-1 0 0 0 0,0-1 0 0 0,1 1 0 0 0,-1 0-1 0 0,0 0 1 0 0,1 0 0 0 0,-1 0 0 0 0,1 0 0 0 0,-1 0 0 0 0,0 0 0 0 0,1 0 0 0 0,-1 0 0 0 0,1 0 0 0 0,-1 0 0 0 0,0 0 0 0 0,1 0 0 0 0,-1 0 0 0 0,0 0 0 0 0,1 0-1 0 0,-1 0 1 0 0,1 0 0 0 0,-1 1 0 0 0,0-1 0 0 0,1 0 0 0 0,-1 0 0 0 0,0 0 0 0 0,1 1 0 0 0,-1-1 0 0 0,1 1 0 0 0,15 10 220 0 0,-11-8-150 0 0,16 12 108 0 0,-20-14-176 0 0,1 0 0 0 0,-1 0 0 0 0,1 1 0 0 0,0-1 0 0 0,-1 0 0 0 0,1 0 0 0 0,0-1 0 0 0,0 1 1 0 0,-1 0-1 0 0,1 0 0 0 0,3 0 0 0 0,14 9 241 0 0,-16-8-777 0 0,0 1 0 0 0,0-1 1 0 0,0 0-1 0 0,1-1 1 0 0,-1 1-1 0 0,0-1 0 0 0,7 3 1 0 0,16 2-598 0 0,-20-4-110 0 0</inkml:trace>
-  <inkml:trace contextRef="#ctx0" brushRef="#br0" timeOffset="2280.99">1565 26 4089 0 0,'0'0'1209'0'0,"0"0"-1132"0"0,0 0-1 0 0,0 0 1 0 0,0-1-1 0 0,0 1 1 0 0,0 0 0 0 0,0 0-1 0 0,0 0 1 0 0,0 0-1 0 0,0-1 1 0 0,0 1-1 0 0,0 0 1 0 0,0 0-1 0 0,0 0 1 0 0,0 0-1 0 0,0 0 1 0 0,0-1-1 0 0,0 1 1 0 0,-1 0-1 0 0,1 0 1 0 0,0 0-1 0 0,0 0 1 0 0,0 0-1 0 0,0 0 1 0 0,0 0-1 0 0,0-1 1 0 0,0 1-1 0 0,0 0 1 0 0,-1 0-1 0 0,1 0 1 0 0,0 0-1 0 0,0 0 1 0 0,0 0-1 0 0,0 0 1 0 0,0 0-1 0 0,-1 0 1 0 0,1 0-1 0 0,0 0 1 0 0,0 0-1 0 0,0 0 1 0 0,0 0-1 0 0,0 0 1 0 0,-1 0-1 0 0,1 0 1 0 0,0 0-1 0 0,0 0 1 0 0,0 0-1 0 0,0 0 1 0 0,0 0-1 0 0,-1 0 1 0 0,1 0-1 0 0,0 0 1 0 0,0 0-1 0 0,0 0 1 0 0,0 0-1 0 0,0 0 1 0 0,-1 0-1 0 0,-1 5-10 0 0,-1 0-1 0 0,1 1 0 0 0,0-1 1 0 0,1 0-1 0 0,-1 0 1 0 0,1 1-1 0 0,0-1 0 0 0,1 1 1 0 0,-1-1-1 0 0,1 7 0 0 0,3 67 129 0 0,-2-49-157 0 0,4 73-83 0 0,21 127 0 0 0,-23-221-74 0 0,0 3-3773 0 0</inkml:trace>
-  <inkml:trace contextRef="#ctx0" brushRef="#br0" timeOffset="2798.33">1444 424 2192 0 0,'0'0'112'0'0,"-1"0"0"0"0,1 0 0 0 0,0-1-1 0 0,-1 1 1 0 0,1 0 0 0 0,0 0 0 0 0,0-1-1 0 0,-1 1 1 0 0,1 0 0 0 0,0-1 0 0 0,0 1-1 0 0,-1 0 1 0 0,1-1 0 0 0,0 1-1 0 0,0 0 1 0 0,0-1 0 0 0,0 1 0 0 0,-1-1-1 0 0,1 1 1 0 0,0 0 0 0 0,0-1 0 0 0,0 1-1 0 0,0-1 1 0 0,0 1 0 0 0,0-1 0 0 0,0 1-1 0 0,0 0 1 0 0,0-1 0 0 0,0 1-1 0 0,0-1 1 0 0,1 1 0 0 0,-1 0 0 0 0,0-1-1 0 0,0 1 1 0 0,0-1 0 0 0,0 1 0 0 0,1 0-1 0 0,-1-1 1 0 0,0 1 0 0 0,0 0 0 0 0,1-1-1 0 0,-1 1 1 0 0,0 0 0 0 0,1 0-1 0 0,-1-1 1 0 0,12-18 1969 0 0,25-6-1791 0 0,-37 24-276 0 0,0 1-1 0 0,0 0 0 0 0,1-1 0 0 0,-1 1 0 0 0,0 0 0 0 0,1-1 0 0 0,-1 1 0 0 0,0 0 1 0 0,1-1-1 0 0,-1 1 0 0 0,1 0 0 0 0,-1 0 0 0 0,1-1 0 0 0,-1 1 0 0 0,0 0 0 0 0,1 0 1 0 0,-1 0-1 0 0,1 0 0 0 0,-1 0 0 0 0,1-1 0 0 0,-1 1 0 0 0,1 0 0 0 0,-1 0 0 0 0,1 0 1 0 0,-1 0-1 0 0,1 0 0 0 0,-1 1 0 0 0,1-1 0 0 0,-1 0 0 0 0,1 0 0 0 0,-1 0 0 0 0,1 0 1 0 0,-1 0-1 0 0,0 1 0 0 0,1-1 0 0 0,-1 0 0 0 0,1 0 0 0 0,-1 1 0 0 0,0-1 0 0 0,1 0 1 0 0,-1 1-1 0 0,0-1 0 0 0,1 1 0 0 0,6 5 43 0 0,3 2-14 0 0,1-1 0 0 0,-1 0 1 0 0,1-1-1 0 0,19 8 0 0 0,-26-13-198 0 0,0 0 1 0 0,0 1-1 0 0,0-2 1 0 0,0 1-1 0 0,0 0 0 0 0,0-1 1 0 0,0 0-1 0 0,0 0 1 0 0,0 0-1 0 0,1 0 1 0 0,-1-1-1 0 0,0 1 0 0 0,0-1 1 0 0,0 0-1 0 0,0-1 1 0 0,0 1-1 0 0,0-1 0 0 0,-1 1 1 0 0,8-5-1 0 0,5-6-909 0 0,-7 6 943 0 0</inkml:trace>
-  <inkml:trace contextRef="#ctx0" brushRef="#br0" timeOffset="3356.09">1840 346 3401 0 0,'0'0'3806'0'0,"-2"3"-3743"0"0,-1 3-50 0 0,0 1 0 0 0,0-1 0 0 0,0 1 0 0 0,0 0 0 0 0,1 0 0 0 0,1 0 0 0 0,-1 0 0 0 0,1 0 0 0 0,-1 12 1 0 0,2-14-7 0 0,-1 0 0 0 0,1 0 0 0 0,0 0 0 0 0,0 1 0 0 0,1-1 0 0 0,-1 0 0 0 0,1 0 0 0 0,1 0 0 0 0,-1 0 0 0 0,1 0 0 0 0,-1 0 0 0 0,1 0 0 0 0,1-1 0 0 0,4 9 0 0 0,-6-11 12 0 0,1 0 0 0 0,0-1 0 0 0,-1 1 0 0 0,1-1 0 0 0,0 1 0 0 0,0-1 1 0 0,0 0-1 0 0,-1 0 0 0 0,1 0 0 0 0,0 0 0 0 0,1 0 0 0 0,-1 0 0 0 0,0 0 1 0 0,0-1-1 0 0,0 1 0 0 0,0-1 0 0 0,1 0 0 0 0,-1 0 0 0 0,5 0 642 0 0,-10-26 1203 0 0,4 24-1851 0 0,-1 0-1 0 0,0 0 0 0 0,-1 0 1 0 0,1 0-1 0 0,0 0 1 0 0,0 0-1 0 0,-1 0 1 0 0,1 0-1 0 0,-1 0 0 0 0,0 1 1 0 0,0-1-1 0 0,-1-3 1 0 0,-2 0 71 0 0,0 0 1 0 0,-1 0 0 0 0,1 0 0 0 0,-1 1 0 0 0,0 0 0 0 0,0 0 0 0 0,-7-5 0 0 0,6 6-43 0 0,0-3 62 0 0,7 2-115 0 0,1 1 0 0 0,0-1 0 0 0,0 1 0 0 0,0 0 0 0 0,0-1 0 0 0,0 1 0 0 0,1 0-1 0 0,0 1 1 0 0,-1-1 0 0 0,1 0 0 0 0,0 1 0 0 0,0-1 0 0 0,1 1 0 0 0,-1 0 0 0 0,4-2 0 0 0,7-2-23 0 0,0 0 1 0 0,0 1-1 0 0,1 0 1 0 0,-1 2 0 0 0,1-1-1 0 0,18 0 1 0 0,41-12-3622 0 0,-67 15 2699 0 0,-1 1-138 0 0</inkml:trace>
-  <inkml:trace contextRef="#ctx0" brushRef="#br0" timeOffset="3740.67">2229 335 4217 0 0,'0'0'95'0'0,"0"-1"-1"0"0,0 1 1 0 0,0 0 0 0 0,0-1 0 0 0,1 1-1 0 0,-1 0 1 0 0,0 0 0 0 0,0-1-1 0 0,0 1 1 0 0,0 0 0 0 0,1-1 0 0 0,-1 1-1 0 0,0 0 1 0 0,0 0 0 0 0,1-1 0 0 0,-1 1-1 0 0,0 0 1 0 0,0 0 0 0 0,1 0-1 0 0,-1 0 1 0 0,0-1 0 0 0,1 1 0 0 0,-1 0-1 0 0,0 0 1 0 0,1 0 0 0 0,-1 0 0 0 0,0 0-1 0 0,1 0 1 0 0,-1 0 0 0 0,0 0-1 0 0,1 0 1 0 0,-1 0 0 0 0,0 0 0 0 0,1 0-1 0 0,0 0 1 0 0,8 10 1419 0 0,2 19-612 0 0,-8 20-538 0 0,-3-42-416 0 0,0 0 0 0 0,0 0 0 0 0,0-1 0 0 0,1 1 0 0 0,0 0 0 0 0,0 0 0 0 0,1-1 0 0 0,0 1 0 0 0,0-1 0 0 0,0 0 0 0 0,1 1 0 0 0,0-1 0 0 0,0 0 0 0 0,5 7 0 0 0,-6-10-558 0 0,1 1-319 0 0</inkml:trace>
-  <inkml:trace contextRef="#ctx0" brushRef="#br0" timeOffset="3921.31">2292 212 3929 0 0,'-1'-2'370'0'0,"0"0"1"0"0,0 0-1 0 0,0 0 0 0 0,0 0 1 0 0,0 0-1 0 0,1 0 1 0 0,-1 0-1 0 0,1 0 1 0 0,0-1-1 0 0,-1 1 0 0 0,1-4 1 0 0,0 6-415 0 0</inkml:trace>
-  <inkml:trace contextRef="#ctx0" brushRef="#br0" timeOffset="5174.93">2503 367 1624 0 0,'0'0'4464'0'0,"2"2"-4200"0"0,1 0-1 0 0,-1 0 1 0 0,0 0-1 0 0,1 0 1 0 0,-1-1 0 0 0,1 1-1 0 0,0-1 1 0 0,5 2-1 0 0,-3-1-237 0 0,1-1-1 0 0,0 1 0 0 0,0-2 0 0 0,0 1 0 0 0,0-1 0 0 0,0 0 0 0 0,1 0 0 0 0,-1 0 0 0 0,0-1 0 0 0,0 0 0 0 0,0 0 0 0 0,9-4 0 0 0,-9 2-2 0 0,1 0-1 0 0,-1-1 1 0 0,0 0 0 0 0,0 0 0 0 0,9-9-1 0 0,-14 12-17 0 0,0-1 0 0 0,1 1-1 0 0,-1 0 1 0 0,0-1-1 0 0,0 1 1 0 0,0 0-1 0 0,-1-1 1 0 0,1 0-1 0 0,0 1 1 0 0,0-1 0 0 0,-1 1-1 0 0,1-1 1 0 0,-1 0-1 0 0,1 1 1 0 0,-1-1-1 0 0,0 0 1 0 0,0 1 0 0 0,0-1-1 0 0,0 0 1 0 0,0 0-1 0 0,0 1 1 0 0,0-1-1 0 0,-1 0 1 0 0,1 1-1 0 0,0-1 1 0 0,-1 0 0 0 0,1 1-1 0 0,-1-1 1 0 0,-1-2-1 0 0,1 2-3 0 0,-1 1 0 0 0,1-1 0 0 0,0 1 0 0 0,0 0 0 0 0,-1 0 0 0 0,1-1 0 0 0,-1 1 0 0 0,1 0 0 0 0,-1 0 0 0 0,0 0 0 0 0,1 1 0 0 0,-1-1 0 0 0,0 0 0 0 0,1 1-1 0 0,-1-1 1 0 0,0 1 0 0 0,0-1 0 0 0,0 1 0 0 0,1 0 0 0 0,-1 0 0 0 0,0 0 0 0 0,0 0 0 0 0,0 0 0 0 0,0 0 0 0 0,1 0 0 0 0,-1 1 0 0 0,0-1 0 0 0,0 1 0 0 0,0-1 0 0 0,1 1 0 0 0,-4 1 0 0 0,0 0 3 0 0,0 0 1 0 0,0 1 0 0 0,0 0-1 0 0,0-1 1 0 0,0 1 0 0 0,0 1-1 0 0,1-1 1 0 0,0 1 0 0 0,-5 5 0 0 0,-11 12 13 0 0,18-19 18 0 0,0 0-1 0 0,0 0 0 0 0,0-1 1 0 0,0 2-1 0 0,0-1 1 0 0,1 0-1 0 0,-1 0 1 0 0,1 1-1 0 0,-1-1 1 0 0,1 0-1 0 0,0 1 1 0 0,0-1-1 0 0,0 1 1 0 0,0 0-1 0 0,0-1 0 0 0,1 1 1 0 0,-1 0-1 0 0,1 0 1 0 0,0-1-1 0 0,0 1 1 0 0,0 0-1 0 0,0 0 1 0 0,1 4-1 0 0,-1-3-8 0 0,0 0-1 0 0,1 0 1 0 0,0 0 0 0 0,0 0-1 0 0,0 0 1 0 0,0 0-1 0 0,1 0 1 0 0,-1 0 0 0 0,1-1-1 0 0,0 1 1 0 0,0-1 0 0 0,1 1-1 0 0,-1-1 1 0 0,0 0-1 0 0,1 0 1 0 0,0 0 0 0 0,0 0-1 0 0,0 0 1 0 0,0-1 0 0 0,0 1-1 0 0,1-1 1 0 0,-1 0-1 0 0,1 0 1 0 0,0 0 0 0 0,4 1-1 0 0,1 2-24 0 0,0-1 1 0 0,0 0-1 0 0,1 0 0 0 0,-1-1 0 0 0,1 0 0 0 0,0-1 0 0 0,0 0 0 0 0,0-1 1 0 0,0 0-1 0 0,0 0 0 0 0,0-1 0 0 0,0-1 0 0 0,0 1 0 0 0,0-2 1 0 0,0 1-1 0 0,0-2 0 0 0,14-4 0 0 0,-22 7 6 0 0,-1-1 1 0 0,1 0-1 0 0,-1 1 1 0 0,1-1-1 0 0,-1 0 1 0 0,0 0-1 0 0,1 0 1 0 0,-1 0-1 0 0,0 0 0 0 0,1-1 1 0 0,-1 1-1 0 0,0 0 1 0 0,0-1-1 0 0,0 1 1 0 0,0 0-1 0 0,-1-1 1 0 0,1 1-1 0 0,0-1 0 0 0,0 0 1 0 0,-1 1-1 0 0,1-1 1 0 0,-1 1-1 0 0,0-1 1 0 0,1 0-1 0 0,-1 0 1 0 0,0 1-1 0 0,0-1 0 0 0,0 0 1 0 0,0 1-1 0 0,0-1 1 0 0,-1 0-1 0 0,1 1 1 0 0,0-1-1 0 0,-1 0 1 0 0,1 1-1 0 0,-1-1 0 0 0,0 1 1 0 0,1-1-1 0 0,-1 1 1 0 0,0-1-1 0 0,0 1 1 0 0,0-1-1 0 0,0 1 1 0 0,0 0-1 0 0,0-1 0 0 0,0 1 1 0 0,-1 0-1 0 0,1 0 1 0 0,0 0-1 0 0,-2-1 1 0 0,2 1 18 0 0,0 0 0 0 0,0 0 0 0 0,1 0 0 0 0,-1 0 0 0 0,0-1 0 0 0,1 1 0 0 0,-1 0-1 0 0,1 0 1 0 0,0 0 0 0 0,-1-1 0 0 0,1 1 0 0 0,0 0 0 0 0,0-1 0 0 0,0 1 0 0 0,0 0 0 0 0,0 0 0 0 0,0-1 0 0 0,0 1 0 0 0,0 0 0 0 0,1-1 0 0 0,-1 1 0 0 0,0 0 0 0 0,1 0 0 0 0,-1-1 0 0 0,1 1 0 0 0,-1 0 0 0 0,1 0 0 0 0,0 0 0 0 0,-1 0 0 0 0,1 0 0 0 0,0 0 0 0 0,0 0 0 0 0,0 0 0 0 0,0 0 0 0 0,2-1 0 0 0,-1 0-47 0 0,1 1 0 0 0,-1 1 0 0 0,1-1 1 0 0,-1 0-1 0 0,1 0 0 0 0,-1 1 1 0 0,1 0-1 0 0,0-1 0 0 0,-1 1 0 0 0,1 0 1 0 0,0 0-1 0 0,-1 1 0 0 0,1-1 1 0 0,-1 0-1 0 0,1 1 0 0 0,0-1 0 0 0,-1 1 1 0 0,1 0-1 0 0,-1 0 0 0 0,0 0 1 0 0,1 0-1 0 0,3 3 0 0 0,-2-2-109 0 0,1 0 0 0 0,0 0 0 0 0,-1-1 0 0 0,1 1 0 0 0,0-1-1 0 0,0 0 1 0 0,0-1 0 0 0,0 1 0 0 0,0-1 0 0 0,0 0 0 0 0,5-1 0 0 0,33-9-4310 0 0,-35 8 3159 0 0</inkml:trace>
-  <inkml:trace contextRef="#ctx0" brushRef="#br0" timeOffset="5981.97">3170 36 5377 0 0,'-8'-3'4857'0'0,"-2"11"-3287"0"0,1 14-1849 0 0,7 12 244 0 0,1 0 0 0 0,2-1 0 0 0,1 1 0 0 0,1 0 0 0 0,2-1 0 0 0,2 0 0 0 0,0 0 0 0 0,3 0-1 0 0,15 36 1 0 0,-23-57-192 0 0,-11-19-139 0 0,-8-7 219 0 0,-11-8 149 0 0,22 18 3 0 0,3 2-2 0 0,-4 2 7 0 0,-2-3 1 0 0,0 1 0 0 0,1 0 0 0 0,-1 1 0 0 0,0 0 0 0 0,0 0 0 0 0,0 1 0 0 0,0 0 0 0 0,0 1 0 0 0,-10 1 0 0 0,19-1 402 0 0,7-2 74 0 0,26 0-139 0 0,33-7 1 0 0,-56 6-838 0 0,-1 0 0 0 0,1 0 0 0 0,0-1 0 0 0,-1-1 0 0 0,1 0-1 0 0,-1 0 1 0 0,0 0 0 0 0,9-7 0 0 0,-11 6 249 0 0,0 0-326 0 0</inkml:trace>
-  <inkml:trace contextRef="#ctx0" brushRef="#br0" timeOffset="6556.61">3575 1 1816 0 0,'0'0'7770'0'0,"0"11"-6007"0"0,1 12-1488 0 0,0 0 0 0 0,-5 38 0 0 0,1-35-254 0 0,2 0-1 0 0,2 36 1 0 0,3 13-82 0 0,-5-56 3 0 0,2 0 0 0 0,0-1 1 0 0,1 1-1 0 0,1 0 0 0 0,1-1 1 0 0,0 1-1 0 0,9 19 0 0 0,-8-28-191 0 0,3 5-356 0 0,-6-8-3797 0 0</inkml:trace>
-  <inkml:trace contextRef="#ctx0" brushRef="#br0" timeOffset="7116.94">3726 736 1048 0 0,'0'0'150'0'0,"-18"-13"6504"0"0,-10 9-6188 0 0,21 2-374 0 0,0 0 173 0 0,-6 8 1065 0 0,3-1-1239 0 0,0 1 0 0 0,1 0 0 0 0,0 1 0 0 0,0 0 0 0 0,0 0 0 0 0,1 1-1 0 0,0 0 1 0 0,0 0 0 0 0,-10 16 0 0 0,18-23-89 0 0,-1-1 0 0 0,1 1 0 0 0,0-1 0 0 0,0 0 0 0 0,-1 1 0 0 0,1-1-1 0 0,0 1 1 0 0,0 0 0 0 0,0-1 0 0 0,-1 1 0 0 0,1-1 0 0 0,0 1 0 0 0,0-1 0 0 0,0 1 0 0 0,0-1-1 0 0,0 1 1 0 0,0-1 0 0 0,0 1 0 0 0,0 0 0 0 0,0-1 0 0 0,0 1 0 0 0,1-1 0 0 0,-1 1-1 0 0,0-1 1 0 0,0 1 0 0 0,0-1 0 0 0,1 1 0 0 0,-1-1 0 0 0,0 1 0 0 0,1 0 0 0 0,16 2 129 0 0,20-11 87 0 0,-36 8-216 0 0,5-3 27 0 0,0 1 1 0 0,0-1-1 0 0,0 0 1 0 0,-1-1-1 0 0,1 1 0 0 0,8-8 1 0 0,-12 9-11 0 0,0 1 1 0 0,0-1-1 0 0,0 0 1 0 0,-1 1-1 0 0,1-1 1 0 0,0 0 0 0 0,-1 0-1 0 0,0 0 1 0 0,1 0-1 0 0,-1 0 1 0 0,0-1-1 0 0,0 1 1 0 0,0 0-1 0 0,0-1 1 0 0,0 1-1 0 0,-1 0 1 0 0,1-1-1 0 0,-1 1 1 0 0,1-1-1 0 0,-1-3 1 0 0,0 6-11 0 0,0 0 0 0 0,0-1 0 0 0,-1 1 1 0 0,1 0-1 0 0,0-1 0 0 0,0 1 0 0 0,0 0 0 0 0,0-1 0 0 0,0 1 1 0 0,-1 0-1 0 0,1-1 0 0 0,0 1 0 0 0,0 0 0 0 0,-1 0 1 0 0,1-1-1 0 0,0 1 0 0 0,0 0 0 0 0,-1 0 0 0 0,1 0 0 0 0,0-1 1 0 0,-1 1-1 0 0,1 0 0 0 0,0 0 0 0 0,-1 0 0 0 0,1 0 0 0 0,0 0 1 0 0,-1 0-1 0 0,1 0 0 0 0,0 0 0 0 0,-1-1 0 0 0,1 1 1 0 0,0 0-1 0 0,-1 0 0 0 0,1 1 0 0 0,0-1 0 0 0,-1 0 0 0 0,1 0 1 0 0,0 0-1 0 0,-1 0 0 0 0,1 0 0 0 0,-23 9 22 0 0,-11 6-42 0 0,33-14 7 0 0,3-1-1 0 0,-4 4-43 0 0,1-4 48 0 0,1 1 0 0 0,0-1 1 0 0,-1 0-1 0 0,1 0 0 0 0,0 1 0 0 0,0-1 0 0 0,-1 0 1 0 0,1 1-1 0 0,0-1 0 0 0,0 0 0 0 0,-1 1 0 0 0,1-1 1 0 0,0 0-1 0 0,0 1 0 0 0,0-1 0 0 0,0 0 0 0 0,-1 1 0 0 0,1-1 1 0 0,0 1-1 0 0,0-1 0 0 0,0 0 0 0 0,0 1 0 0 0,0-1 1 0 0,0 1-1 0 0,0-1 0 0 0,0 1 0 0 0,0-1 0 0 0,0 0 0 0 0,0 1 1 0 0,0-1-1 0 0,1 1 0 0 0,-1-1 0 0 0,0 0 0 0 0,0 1 1 0 0,0-1-1 0 0,1 0 0 0 0,-1 1 0 0 0,0-1 0 0 0,0 0 1 0 0,1 1-1 0 0,-1-1 0 0 0,0 0 0 0 0,0 1 0 0 0,1-1 0 0 0,-1 0 1 0 0,0 0-1 0 0,1 1 0 0 0,-1-1 0 0 0,0 0 0 0 0,1 0 1 0 0,-1 0-1 0 0,1 0 0 0 0,-1 0 0 0 0,0 1 0 0 0,1-1 1 0 0,-1 0-1 0 0,1 0 0 0 0,-1 0 0 0 0,0 0 0 0 0,1 0 0 0 0,0 0 1 0 0,2 0 3 0 0,0 0 1 0 0,-1 0-1 0 0,1 0 1 0 0,0 0-1 0 0,0-1 1 0 0,-1 1-1 0 0,1-1 1 0 0,0 0-1 0 0,-1 1 1 0 0,1-1-1 0 0,-1-1 1 0 0,1 1-1 0 0,-1 0 1 0 0,1 0-1 0 0,-1-1 1 0 0,0 1-1 0 0,0-1 1 0 0,1 0-1 0 0,-1 0 1 0 0,0 0-1 0 0,-1 0 1 0 0,1 0-1 0 0,0 0 1 0 0,-1 0-1 0 0,1-1 1 0 0,-1 1-1 0 0,0-1 1 0 0,1 1-1 0 0,-1-1 1 0 0,0 1-1 0 0,-1-1 1 0 0,1 0-1 0 0,0-4 1 0 0,-1 7-16 0 0,0-1 0 0 0,0 1 1 0 0,0-1-1 0 0,0 1 0 0 0,0-1 0 0 0,0 1 0 0 0,0-1 1 0 0,0 1-1 0 0,0-1 0 0 0,0 1 0 0 0,0-1 0 0 0,0 1 1 0 0,-1-1-1 0 0,1 1 0 0 0,0-1 0 0 0,0 1 0 0 0,-1 0 1 0 0,1-1-1 0 0,0 1 0 0 0,-1-1 0 0 0,1 1 1 0 0,0 0-1 0 0,-1-1 0 0 0,1 1 0 0 0,-1 0 0 0 0,1-1 1 0 0,0 1-1 0 0,-1 0 0 0 0,1 0 0 0 0,-1-1 0 0 0,-17 3-1171 0 0,-17 17-3193 0 0,27-12 2680 0 0</inkml:trace>
-  <inkml:trace contextRef="#ctx0" brushRef="#br0" timeOffset="8040.3">3146 323 288 0 0,'0'0'1288'0'0,"-9"-7"3628"0"0,8 14-4679 0 0,-1-1 0 0 0,1 0 0 0 0,0 0 0 0 0,1 0 0 0 0,0 10 0 0 0,0-9-159 0 0,-2 3 18 0 0,0 5 19 0 0,0-1-1 0 0,1 0 0 0 0,1 20 0 0 0,1-29-91 0 0,-1 0 0 0 0,2 0 1 0 0,-1 0-1 0 0,0 0 0 0 0,1 0 0 0 0,0 0 0 0 0,0 0 1 0 0,1 0-1 0 0,-1-1 0 0 0,1 1 0 0 0,6 7 0 0 0,-4-6 0 0 0,-1 0 0 0 0,0 1 0 0 0,-1-1 0 0 0,0 1 0 0 0,0 0 0 0 0,0 0 0 0 0,2 10 0 0 0,-4-13-14 0 0,0 0 0 0 0,0 0 1 0 0,-1 0-1 0 0,1 0 0 0 0,-1 0 0 0 0,0 0 0 0 0,0 0 0 0 0,0 0 1 0 0,0 0-1 0 0,-1 0 0 0 0,0 0 0 0 0,0 0 0 0 0,0 0 1 0 0,0 0-1 0 0,-3 5 0 0 0,-9-6 270 0 0</inkml:trace>
-</inkml:ink>
-</file>
-
-<file path=customXml/item3.xml><?xml version="1.0" encoding="utf-8"?>
-<p:properties xmlns:p="http://schemas.microsoft.com/office/2006/metadata/properties" xmlns:xsi="http://www.w3.org/2001/XMLSchema-instance" xmlns:pc="http://schemas.microsoft.com/office/infopath/2007/PartnerControls">
-  <documentManagement/>
-</p:properties>
-</file>
-
 <file path=customXml/item4.xml><?xml version="1.0" encoding="utf-8"?>
-<inkml:ink xmlns:inkml="http://www.w3.org/2003/InkML">
-  <inkml:definitions>
-    <inkml:context xml:id="ctx0">
-      <inkml:inkSource xml:id="inkSrc0">
-        <inkml:traceFormat>
-          <inkml:channel name="X" type="integer" min="-2.14748E9" max="2.14748E9" units="cm"/>
-          <inkml:channel name="Y" type="integer" min="-2.14748E9" max="2.14748E9" units="cm"/>
-          <inkml:channel name="F" type="integer" max="32767" units="dev"/>
-          <inkml:channel name="OA" type="integer" max="360" units="deg"/>
-          <inkml:channel name="OE" type="integer" max="90" units="deg"/>
-        </inkml:traceFormat>
-        <inkml:channelProperties>
-          <inkml:channelProperty channel="X" name="resolution" value="1000" units="1/cm"/>
-          <inkml:channelProperty channel="Y" name="resolution" value="1000" units="1/cm"/>
-          <inkml:channelProperty channel="F" name="resolution" value="0" units="1/dev"/>
-          <inkml:channelProperty channel="OA" name="resolution" value="1000" units="1/deg"/>
-          <inkml:channelProperty channel="OE" name="resolution" value="1000" units="1/deg"/>
-        </inkml:channelProperties>
-      </inkml:inkSource>
-      <inkml:timestamp xml:id="ts0" timeString="2025-06-10T16:08:50.568"/>
-    </inkml:context>
-    <inkml:brush xml:id="br0">
-      <inkml:brushProperty name="width" value="0.05" units="cm"/>
-      <inkml:brushProperty name="height" value="0.05" units="cm"/>
-      <inkml:brushProperty name="color" value="#E71224"/>
-    </inkml:brush>
-  </inkml:definitions>
-  <inkml:trace contextRef="#ctx0" brushRef="#br0">1236 239 3217 0 0,'-18'-44'2449'0'0,"11"24"-2251"0"0,-2 1 0 0 0,-14-27 0 0 0,19 39-210 0 0,-1 0 0 0 0,0 1-1 0 0,0 0 1 0 0,-1-1 0 0 0,0 2 0 0 0,0-1-1 0 0,0 1 1 0 0,0 0 0 0 0,-14-8-1 0 0,8 6-57 0 0,-1 1 0 0 0,1 1 1 0 0,-1 0-1 0 0,0 0 0 0 0,0 1 0 0 0,0 1 0 0 0,0 0 0 0 0,-1 1 0 0 0,-22-1 0 0 0,19 4-190 0 0,0 0-1 0 0,0 1 1 0 0,0 1-1 0 0,1 0 1 0 0,-1 1-1 0 0,1 1 1 0 0,-21 9-1 0 0,-37 17-295 0 0,-131 76-1 0 0,173-87 985 0 0,0 2 0 0 0,2 1 0 0 0,1 2 0 0 0,1 0 0 0 0,1 2 0 0 0,-28 37 0 0 0,-16 22-328 0 0,-54 78 18 0 0,113-145-112 0 0,0 0 1 0 0,2 1-1 0 0,1 0 0 0 0,0 0 0 0 0,2 1 1 0 0,0 0-1 0 0,-5 27 0 0 0,4 3 6 0 0,3 0-1 0 0,1 0 0 0 0,3 0 1 0 0,2 1-1 0 0,2-1 1 0 0,13 62-1 0 0,-11-89 37 0 0,1-1 0 0 0,2 1 0 0 0,0-1 0 0 0,1-1 0 0 0,1 0 0 0 0,2 0-1 0 0,0-1 1 0 0,1-1 0 0 0,1 0 0 0 0,1 0 0 0 0,25 25 0 0 0,-31-38 8 0 0,1 0 0 0 0,0-1 0 0 0,0 0 0 0 0,1-1-1 0 0,0 0 1 0 0,0 0 0 0 0,0-1 0 0 0,0 0 0 0 0,1-1 0 0 0,-1-1 0 0 0,1 0 0 0 0,23 1 0 0 0,0-2-27 0 0,-1-1 0 0 0,0-2 0 0 0,43-8 0 0 0,15-10 179 0 0,-1-4 0 0 0,111-46 0 0 0,-162 55-168 0 0,0 1-21 0 0,5-1 26 0 0,-2-3-1 0 0,45-23 0 0 0,-67 26 22 0 0,-1 0 0 0 0,0-2-1 0 0,-2 0 1 0 0,0-1 0 0 0,-1-1 0 0 0,0-1 0 0 0,-2 0-1 0 0,22-37 1 0 0,-28 39-39 0 0,0 1 1 0 0,-1-1-1 0 0,-1-1 0 0 0,-1 0 1 0 0,-1 1-1 0 0,0-2 0 0 0,-2 1 0 0 0,0 0 1 0 0,0-25-1 0 0,-2-13 167 0 0,-14-108-1 0 0,10 143-149 0 0,-1 0-1 0 0,0 1 1 0 0,-2-1-1 0 0,-1 1 1 0 0,-1 0-1 0 0,0 1 1 0 0,-1 0-1 0 0,-23-35 0 0 0,22 41 15 0 0,-1 0 0 0 0,0 0-1 0 0,-1 1 1 0 0,-1 0 0 0 0,0 1-1 0 0,0 1 1 0 0,-1 0 0 0 0,-1 1-1 0 0,0 0 1 0 0,0 1 0 0 0,-25-10-1 0 0,15 9-505 0 0,-1 1-1 0 0,0 2 1 0 0,0 0 0 0 0,-49-5-1 0 0,41 10-389 0 0</inkml:trace>
-</inkml:ink>
-</file>
-
-<file path=customXml/item5.xml><?xml version="1.0" encoding="utf-8"?>
-<b:Sources xmlns:b="http://schemas.openxmlformats.org/officeDocument/2006/bibliography" xmlns="http://schemas.openxmlformats.org/officeDocument/2006/bibliography" SelectedStyle="\APASixthEditionOfficeOnline.xsl" StyleName="APA" Version="6"/>
-</file>
-
-<file path=customXml/item6.xml><?xml version="1.0" encoding="utf-8"?>
 <ct:contentTypeSchema xmlns:ct="http://schemas.microsoft.com/office/2006/metadata/contentType" xmlns:ma="http://schemas.microsoft.com/office/2006/metadata/properties/metaAttributes" ct:_="" ma:_="" ma:contentTypeName="Dokument" ma:contentTypeID="0x01010025C71E9534E21E4A9F2CF33BA7DCE92D" ma:contentTypeVersion="3" ma:contentTypeDescription="Ein neues Dokument erstellen." ma:contentTypeScope="" ma:versionID="32b9bbdf2bbf4e0fb27a426421665337">
   <xsd:schema xmlns:xsd="http://www.w3.org/2001/XMLSchema" xmlns:xs="http://www.w3.org/2001/XMLSchema" xmlns:p="http://schemas.microsoft.com/office/2006/metadata/properties" xmlns:ns2="5a9e9855-01b6-487f-b294-67c59083cc31" targetNamespace="http://schemas.microsoft.com/office/2006/metadata/properties" ma:root="true" ma:fieldsID="ec87b9b32475f90c9dbf7ae918480825" ns2:_="">
     <xsd:import namespace="5a9e9855-01b6-487f-b294-67c59083cc31"/>
@@ -25649,7 +26377,39 @@
 </ct:contentTypeSchema>
 </file>
 
-<file path=customXml/item7.xml><?xml version="1.0" encoding="utf-8"?>
+<file path=customXml/item5.xml><?xml version="1.0" encoding="utf-8"?>
+<inkml:ink xmlns:inkml="http://www.w3.org/2003/InkML">
+  <inkml:definitions>
+    <inkml:context xml:id="ctx0">
+      <inkml:inkSource xml:id="inkSrc0">
+        <inkml:traceFormat>
+          <inkml:channel name="X" type="integer" min="-2.14748E9" max="2.14748E9" units="cm"/>
+          <inkml:channel name="Y" type="integer" min="-2.14748E9" max="2.14748E9" units="cm"/>
+          <inkml:channel name="F" type="integer" max="32767" units="dev"/>
+          <inkml:channel name="OA" type="integer" max="360" units="deg"/>
+          <inkml:channel name="OE" type="integer" max="90" units="deg"/>
+        </inkml:traceFormat>
+        <inkml:channelProperties>
+          <inkml:channelProperty channel="X" name="resolution" value="1000" units="1/cm"/>
+          <inkml:channelProperty channel="Y" name="resolution" value="1000" units="1/cm"/>
+          <inkml:channelProperty channel="F" name="resolution" value="0" units="1/dev"/>
+          <inkml:channelProperty channel="OA" name="resolution" value="1000" units="1/deg"/>
+          <inkml:channelProperty channel="OE" name="resolution" value="1000" units="1/deg"/>
+        </inkml:channelProperties>
+      </inkml:inkSource>
+      <inkml:timestamp xml:id="ts0" timeString="2025-06-10T16:08:50.568"/>
+    </inkml:context>
+    <inkml:brush xml:id="br0">
+      <inkml:brushProperty name="width" value="0.05" units="cm"/>
+      <inkml:brushProperty name="height" value="0.05" units="cm"/>
+      <inkml:brushProperty name="color" value="#E71224"/>
+    </inkml:brush>
+  </inkml:definitions>
+  <inkml:trace contextRef="#ctx0" brushRef="#br0">1236 239 3217 0 0,'-18'-44'2449'0'0,"11"24"-2251"0"0,-2 1 0 0 0,-14-27 0 0 0,19 39-210 0 0,-1 0 0 0 0,0 1-1 0 0,0 0 1 0 0,-1-1 0 0 0,0 2 0 0 0,0-1-1 0 0,0 1 1 0 0,0 0 0 0 0,-14-8-1 0 0,8 6-57 0 0,-1 1 0 0 0,1 1 1 0 0,-1 0-1 0 0,0 0 0 0 0,0 1 0 0 0,0 1 0 0 0,0 0 0 0 0,-1 1 0 0 0,-22-1 0 0 0,19 4-190 0 0,0 0-1 0 0,0 1 1 0 0,0 1-1 0 0,1 0 1 0 0,-1 1-1 0 0,1 1 1 0 0,-21 9-1 0 0,-37 17-295 0 0,-131 76-1 0 0,173-87 985 0 0,0 2 0 0 0,2 1 0 0 0,1 2 0 0 0,1 0 0 0 0,1 2 0 0 0,-28 37 0 0 0,-16 22-328 0 0,-54 78 18 0 0,113-145-112 0 0,0 0 1 0 0,2 1-1 0 0,1 0 0 0 0,0 0 0 0 0,2 1 1 0 0,0 0-1 0 0,-5 27 0 0 0,4 3 6 0 0,3 0-1 0 0,1 0 0 0 0,3 0 1 0 0,2 1-1 0 0,2-1 1 0 0,13 62-1 0 0,-11-89 37 0 0,1-1 0 0 0,2 1 0 0 0,0-1 0 0 0,1-1 0 0 0,1 0 0 0 0,2 0-1 0 0,0-1 1 0 0,1-1 0 0 0,1 0 0 0 0,1 0 0 0 0,25 25 0 0 0,-31-38 8 0 0,1 0 0 0 0,0-1 0 0 0,0 0 0 0 0,1-1-1 0 0,0 0 1 0 0,0 0 0 0 0,0-1 0 0 0,0 0 0 0 0,1-1 0 0 0,-1-1 0 0 0,1 0 0 0 0,23 1 0 0 0,0-2-27 0 0,-1-1 0 0 0,0-2 0 0 0,43-8 0 0 0,15-10 179 0 0,-1-4 0 0 0,111-46 0 0 0,-162 55-168 0 0,0 1-21 0 0,5-1 26 0 0,-2-3-1 0 0,45-23 0 0 0,-67 26 22 0 0,-1 0 0 0 0,0-2-1 0 0,-2 0 1 0 0,0-1 0 0 0,-1-1 0 0 0,0-1 0 0 0,-2 0-1 0 0,22-37 1 0 0,-28 39-39 0 0,0 1 1 0 0,-1-1-1 0 0,-1-1 0 0 0,-1 0 1 0 0,-1 1-1 0 0,0-2 0 0 0,-2 1 0 0 0,0 0 1 0 0,0-25-1 0 0,-2-13 167 0 0,-14-108-1 0 0,10 143-149 0 0,-1 0-1 0 0,0 1 1 0 0,-2-1-1 0 0,-1 1 1 0 0,-1 0-1 0 0,0 1 1 0 0,-1 0-1 0 0,-23-35 0 0 0,22 41 15 0 0,-1 0 0 0 0,0 0-1 0 0,-1 1 1 0 0,-1 0 0 0 0,0 1-1 0 0,0 1 1 0 0,-1 0 0 0 0,-1 1-1 0 0,0 0 1 0 0,0 1 0 0 0,-25-10-1 0 0,15 9-505 0 0,-1 1-1 0 0,0 2 1 0 0,0 0 0 0 0,-49-5-1 0 0,41 10-389 0 0</inkml:trace>
+</inkml:ink>
+</file>
+
+<file path=customXml/item6.xml><?xml version="1.0" encoding="utf-8"?>
 <?mso-contentType ?>
 <FormTemplates xmlns="http://schemas.microsoft.com/sharepoint/v3/contenttype/forms">
   <Display>DocumentLibraryForm</Display>
@@ -25658,23 +26418,59 @@
 </FormTemplates>
 </file>
 
+<file path=customXml/item7.xml><?xml version="1.0" encoding="utf-8"?>
+<inkml:ink xmlns:inkml="http://www.w3.org/2003/InkML">
+  <inkml:definitions>
+    <inkml:context xml:id="ctx0">
+      <inkml:inkSource xml:id="inkSrc0">
+        <inkml:traceFormat>
+          <inkml:channel name="X" type="integer" min="-2.14748E9" max="2.14748E9" units="cm"/>
+          <inkml:channel name="Y" type="integer" min="-2.14748E9" max="2.14748E9" units="cm"/>
+          <inkml:channel name="F" type="integer" max="32767" units="dev"/>
+          <inkml:channel name="OA" type="integer" max="360" units="deg"/>
+          <inkml:channel name="OE" type="integer" max="90" units="deg"/>
+        </inkml:traceFormat>
+        <inkml:channelProperties>
+          <inkml:channelProperty channel="X" name="resolution" value="1000" units="1/cm"/>
+          <inkml:channelProperty channel="Y" name="resolution" value="1000" units="1/cm"/>
+          <inkml:channelProperty channel="F" name="resolution" value="0" units="1/dev"/>
+          <inkml:channelProperty channel="OA" name="resolution" value="1000" units="1/deg"/>
+          <inkml:channelProperty channel="OE" name="resolution" value="1000" units="1/deg"/>
+        </inkml:channelProperties>
+      </inkml:inkSource>
+      <inkml:timestamp xml:id="ts0" timeString="2025-06-10T16:08:54.030"/>
+    </inkml:context>
+    <inkml:brush xml:id="br0">
+      <inkml:brushProperty name="width" value="0.05" units="cm"/>
+      <inkml:brushProperty name="height" value="0.05" units="cm"/>
+      <inkml:brushProperty name="color" value="#E71224"/>
+    </inkml:brush>
+  </inkml:definitions>
+  <inkml:trace contextRef="#ctx0" brushRef="#br0">5 208 2425 0 0,'0'0'5878'0'0,"24"0"-3468"0"0,-17 1-2405 0 0,0 0 1 0 0,0 0-1 0 0,0 0 0 0 0,0 1 1 0 0,0 0-1 0 0,11 5 0 0 0,-9-5 40 0 0,0 0-1 0 0,0 0 0 0 0,0-1 0 0 0,1 0 1 0 0,-1 0-1 0 0,0-1 0 0 0,17-3 1 0 0,4 2 74 0 0,-22 1-105 0 0,1-1 1 0 0,0 2-1 0 0,-1-1 0 0 0,1 1 1 0 0,-1 0-1 0 0,1 1 1 0 0,-1 0-1 0 0,1 0 1 0 0,-1 1-1 0 0,14 7 0 0 0,-22-10-10 0 0,1 0 1 0 0,0 1-1 0 0,-1-1 0 0 0,1 1 0 0 0,0-1 0 0 0,-1 1 0 0 0,1-1 0 0 0,0 1 0 0 0,-1 0 0 0 0,1-1 0 0 0,-1 1 0 0 0,1 0 0 0 0,-1-1 0 0 0,0 1 0 0 0,1 0 0 0 0,-1 0 0 0 0,0-1 0 0 0,1 1 0 0 0,-1 0 0 0 0,0 0 0 0 0,0 0 0 0 0,0-1 0 0 0,0 1 0 0 0,0 0 1 0 0,0 0-1 0 0,0 0 0 0 0,0 0 0 0 0,0-1 0 0 0,0 1 0 0 0,0 0 0 0 0,0 0 0 0 0,-1 0 0 0 0,1-1 0 0 0,0 1 0 0 0,-1 0 0 0 0,1 0 0 0 0,0-1 0 0 0,-1 1 0 0 0,1 0 0 0 0,-2 0 0 0 0,-2 4 13 0 0,0-1 0 0 0,-1 1 0 0 0,0-1 0 0 0,-10 6 0 0 0,-6 7-17 0 0,-52 46-71 0 0,46-41 27 0 0,-30 31 0 0 0,55-51 44 0 0,1 0 0 0 0,-1 0 0 0 0,0 0 0 0 0,1 0-1 0 0,-1 0 1 0 0,1 0 0 0 0,0 0 0 0 0,0 0 0 0 0,-1 1-1 0 0,1-1 1 0 0,1 0 0 0 0,-1 1 0 0 0,0-1 0 0 0,1 1-1 0 0,-1-1 1 0 0,1 1 0 0 0,0-1 0 0 0,0 5-1 0 0,0-6 1 0 0,1 1 0 0 0,0-1 0 0 0,-1 1 0 0 0,1-1 0 0 0,0 1 0 0 0,0-1 0 0 0,0 0-1 0 0,0 1 1 0 0,0-1 0 0 0,0 0 0 0 0,0 0 0 0 0,0 0 0 0 0,1 0 0 0 0,-1 0-1 0 0,0 0 1 0 0,1 0 0 0 0,-1 0 0 0 0,1 0 0 0 0,-1-1 0 0 0,1 1 0 0 0,-1-1 0 0 0,1 1-1 0 0,-1-1 1 0 0,1 1 0 0 0,0-1 0 0 0,-1 0 0 0 0,1 0 0 0 0,-1 0 0 0 0,3 0-1 0 0,29 4-18 0 0,-11-1-40 0 0,-1-1 0 0 0,25-2 0 0 0,-39 0 42 0 0,1-1-1 0 0,0 0 1 0 0,0 0-1 0 0,-1-1 1 0 0,1 0-1 0 0,-1-1 1 0 0,0 0 0 0 0,0 0-1 0 0,12-7 1 0 0,29-13-1642 0 0,-12 16-3216 0 0,-30 7 3490 0 0</inkml:trace>
+  <inkml:trace contextRef="#ctx0" brushRef="#br0" timeOffset="537.36">1 353 3761 0 0,'14'-4'313'0'0,"1"1"1"0"0,0 1 0 0 0,0 0-1 0 0,0 1 1 0 0,1 1 0 0 0,-1 0-1 0 0,0 1 1 0 0,0 0 0 0 0,0 2-1 0 0,0-1 1 0 0,-1 2 0 0 0,1 0-1 0 0,-1 1 1 0 0,1 0 0 0 0,13 8-1 0 0,-21-9-404 0 0,1-2 0 0 0,0 1 0 0 0,0-1 0 0 0,0 0-1 0 0,0-1 1 0 0,0 0 0 0 0,0 0 0 0 0,1 0 0 0 0,-1-1 0 0 0,0-1-1 0 0,0 1 1 0 0,1-2 0 0 0,-1 1 0 0 0,0-1 0 0 0,0 0 0 0 0,9-4 0 0 0,-11 5-498 0 0</inkml:trace>
+  <inkml:trace contextRef="#ctx0" brushRef="#br0" timeOffset="1907.49">580 318 4417 0 0,'0'0'535'0'0,"25"18"674"0"0,-15-14-1066 0 0,1 0-1 0 0,0-1 0 0 0,-1 0 0 0 0,1-1 1 0 0,17 2-1 0 0,-15-3-53 0 0,0-1 1 0 0,0 0-1 0 0,19-4 1 0 0,-28 4-78 0 0,0-1 0 0 0,-1 1 0 0 0,1-1 1 0 0,-1 0-1 0 0,1-1 0 0 0,-1 1 0 0 0,1 0 1 0 0,-1-1-1 0 0,0 0 0 0 0,0 0 1 0 0,0 0-1 0 0,0 0 0 0 0,0 0 0 0 0,0-1 1 0 0,-1 1-1 0 0,1-1 0 0 0,2-4 1 0 0,-4 5-7 0 0,0 0 0 0 0,0 0 0 0 0,-1 0 0 0 0,1 0 0 0 0,-1 0 1 0 0,0 0-1 0 0,1 0 0 0 0,-1 0 0 0 0,0 0 0 0 0,0 0 1 0 0,0 0-1 0 0,-1 0 0 0 0,1 0 0 0 0,0 0 0 0 0,-1 0 0 0 0,1 0 1 0 0,-1 0-1 0 0,0 0 0 0 0,-1-3 0 0 0,2 4-6 0 0,-1 0-1 0 0,0-1 1 0 0,0 1-1 0 0,0 0 1 0 0,1 0 0 0 0,-1 0-1 0 0,0 0 1 0 0,-1 0-1 0 0,1 0 1 0 0,0 0 0 0 0,0 0-1 0 0,0 0 1 0 0,0 1-1 0 0,-1-1 1 0 0,1 0-1 0 0,0 1 1 0 0,-1-1 0 0 0,1 1-1 0 0,0-1 1 0 0,-1 1-1 0 0,1 0 1 0 0,-1 0 0 0 0,1-1-1 0 0,0 1 1 0 0,-1 0-1 0 0,1 0 1 0 0,-1 0-1 0 0,1 1 1 0 0,-1-1 0 0 0,1 0-1 0 0,-1 0 1 0 0,1 1-1 0 0,-2 0 1 0 0,-13 4-18 0 0,0 1 0 0 0,0 1 1 0 0,0 0-1 0 0,1 1 0 0 0,-16 12 0 0 0,26-16 81 0 0,-1 0 0 0 0,2 0 0 0 0,-1 0 0 0 0,0 1 0 0 0,1 0 1 0 0,0 0-1 0 0,0 0 0 0 0,1 0 0 0 0,-1 0 0 0 0,1 1 0 0 0,0 0 0 0 0,1 0 0 0 0,-1 0 0 0 0,1 0 0 0 0,0 0 0 0 0,1 0 0 0 0,-2 9 0 0 0,3-10-43 0 0,-1-1 0 0 0,2 1 0 0 0,-1-1 0 0 0,0 1 0 0 0,1-1 0 0 0,0 1-1 0 0,0-1 1 0 0,0 0 0 0 0,1 1 0 0 0,-1-1 0 0 0,1 0 0 0 0,0 0 0 0 0,0 0 0 0 0,4 5 0 0 0,-1-3-13 0 0,0 1-1 0 0,0-1 1 0 0,1 0 0 0 0,0 0 0 0 0,0-1 0 0 0,1 0 0 0 0,11 8 0 0 0,-10-9 30 0 0,-1 1 0 0 0,0-1 0 0 0,1-1 0 0 0,0 0 0 0 0,-1 0 1 0 0,1 0-1 0 0,1-1 0 0 0,-1 0 0 0 0,0-1 0 0 0,0 1 0 0 0,1-2 0 0 0,-1 1 0 0 0,1-1 0 0 0,-1-1 0 0 0,0 1 0 0 0,14-4 0 0 0,-13 1 19 0 0,0 0 0 0 0,0 0-1 0 0,-1-1 1 0 0,1-1 0 0 0,-1 1-1 0 0,0-1 1 0 0,0-1 0 0 0,0 0-1 0 0,-1 0 1 0 0,0 0 0 0 0,0-1-1 0 0,-1 0 1 0 0,1 0-1 0 0,-1-1 1 0 0,-1 1 0 0 0,0-1-1 0 0,0-1 1 0 0,0 1 0 0 0,-1-1-1 0 0,-1 1 1 0 0,6-18 0 0 0,3-2 566 0 0,-23 48-322 0 0,9-18-301 0 0,1 1 0 0 0,0 0 1 0 0,-1 0-1 0 0,1-1 0 0 0,0 1 0 0 0,0 0 1 0 0,1 0-1 0 0,-1 0 0 0 0,1 0 0 0 0,-1 0 1 0 0,1 0-1 0 0,0 0 0 0 0,0 0 0 0 0,1 5 1 0 0,-1-8 0 0 0,0-1 0 0 0,0 1 0 0 0,0 0 0 0 0,0 0 0 0 0,0 0 0 0 0,0 0 0 0 0,-1 0 0 0 0,1 0 0 0 0,0 0 0 0 0,0 0 0 0 0,0 0-1 0 0,0 0 1 0 0,0 0 0 0 0,0 0 0 0 0,0 0 0 0 0,0 0 0 0 0,0 0 0 0 0,0 0 0 0 0,0 0 0 0 0,0 0 0 0 0,0 0 0 0 0,0 0 0 0 0,0 0 0 0 0,0 0 0 0 0,0 0 0 0 0,0 0 0 0 0,-1 0 0 0 0,1 0 0 0 0,0 0 0 0 0,0 0 0 0 0,0 0 0 0 0,0 0 0 0 0,0 0 0 0 0,0 0 0 0 0,9 36 2 0 0,-9-36 0 0 0,0 1 0 0 0,0 0 0 0 0,0-1-1 0 0,0 1 1 0 0,0-1 0 0 0,1 1 0 0 0,-1 0 0 0 0,0-1 0 0 0,0 1 0 0 0,0-1 0 0 0,1 1-1 0 0,-1-1 1 0 0,0 1 0 0 0,0-1 0 0 0,1 1 0 0 0,-1-1 0 0 0,0 1 0 0 0,1-1 0 0 0,-1 1-1 0 0,1-1 1 0 0,-1 1 0 0 0,1-1 0 0 0,-1 0 0 0 0,1 1 0 0 0,-1-1 0 0 0,1 0 0 0 0,-1 0-1 0 0,1 1 1 0 0,-1-1 0 0 0,1 0 0 0 0,-1 0 0 0 0,2 1 0 0 0,5 1 24 0 0,-1 1-15 0 0,-4-1-3 0 0,0-1 0 0 0,0 0-1 0 0,0 0 1 0 0,0 0-1 0 0,0 0 1 0 0,0-1 0 0 0,0 1-1 0 0,0 0 1 0 0,0-1-1 0 0,0 0 1 0 0,4 1 0 0 0,-2-1 6 0 0,-1-1 1 0 0,1 0 0 0 0,-1 1 0 0 0,1-1 0 0 0,-1-1-1 0 0,0 1 1 0 0,1 0 0 0 0,-1-1 0 0 0,0 0 0 0 0,0 0 0 0 0,0 1-1 0 0,0-2 1 0 0,0 1 0 0 0,0 0 0 0 0,-1-1 0 0 0,1 1-1 0 0,3-6 1 0 0,2-3 48 0 0,0 0 0 0 0,-1 0-1 0 0,9-18 1 0 0,-15 28-59 0 0,-1 1 0 0 0,0 0 0 0 0,1 0 0 0 0,-1 0 0 0 0,0-1 0 0 0,1 1 0 0 0,-1 0-1 0 0,0 0 1 0 0,1 0 0 0 0,-1 0 0 0 0,1 0 0 0 0,-1 0 0 0 0,0 0 0 0 0,1 0 0 0 0,-1 0 0 0 0,1 0 0 0 0,-1 0 0 0 0,0 0 0 0 0,1 0 0 0 0,-1 0 0 0 0,0 0 0 0 0,1 0-1 0 0,-1 0 1 0 0,1 0 0 0 0,-1 1 0 0 0,0-1 0 0 0,1 0 0 0 0,-1 0 0 0 0,0 0 0 0 0,1 1 0 0 0,-1-1 0 0 0,1 1 0 0 0,15 10 220 0 0,-11-8-150 0 0,16 12 108 0 0,-20-14-176 0 0,1 0 0 0 0,-1 0 0 0 0,1 1 0 0 0,0-1 0 0 0,-1 0 0 0 0,1 0 0 0 0,0-1 0 0 0,0 1 1 0 0,-1 0-1 0 0,1 0 0 0 0,3 0 0 0 0,14 9 241 0 0,-16-8-777 0 0,0 1 0 0 0,0-1 1 0 0,0 0-1 0 0,1-1 1 0 0,-1 1-1 0 0,0-1 0 0 0,7 3 1 0 0,16 2-598 0 0,-20-4-110 0 0</inkml:trace>
+  <inkml:trace contextRef="#ctx0" brushRef="#br0" timeOffset="2280.99">1565 26 4089 0 0,'0'0'1209'0'0,"0"0"-1132"0"0,0 0-1 0 0,0 0 1 0 0,0-1-1 0 0,0 1 1 0 0,0 0 0 0 0,0 0-1 0 0,0 0 1 0 0,0 0-1 0 0,0-1 1 0 0,0 1-1 0 0,0 0 1 0 0,0 0-1 0 0,0 0 1 0 0,0 0-1 0 0,0 0 1 0 0,0-1-1 0 0,0 1 1 0 0,-1 0-1 0 0,1 0 1 0 0,0 0-1 0 0,0 0 1 0 0,0 0-1 0 0,0 0 1 0 0,0 0-1 0 0,0-1 1 0 0,0 1-1 0 0,0 0 1 0 0,-1 0-1 0 0,1 0 1 0 0,0 0-1 0 0,0 0 1 0 0,0 0-1 0 0,0 0 1 0 0,0 0-1 0 0,-1 0 1 0 0,1 0-1 0 0,0 0 1 0 0,0 0-1 0 0,0 0 1 0 0,0 0-1 0 0,0 0 1 0 0,-1 0-1 0 0,1 0 1 0 0,0 0-1 0 0,0 0 1 0 0,0 0-1 0 0,0 0 1 0 0,0 0-1 0 0,-1 0 1 0 0,1 0-1 0 0,0 0 1 0 0,0 0-1 0 0,0 0 1 0 0,0 0-1 0 0,0 0 1 0 0,-1 0-1 0 0,-1 5-10 0 0,-1 0-1 0 0,1 1 0 0 0,0-1 1 0 0,1 0-1 0 0,-1 0 1 0 0,1 1-1 0 0,0-1 0 0 0,1 1 1 0 0,-1-1-1 0 0,1 7 0 0 0,3 67 129 0 0,-2-49-157 0 0,4 73-83 0 0,21 127 0 0 0,-23-221-74 0 0,0 3-3773 0 0</inkml:trace>
+  <inkml:trace contextRef="#ctx0" brushRef="#br0" timeOffset="2798.33">1444 424 2192 0 0,'0'0'112'0'0,"-1"0"0"0"0,1 0 0 0 0,0-1-1 0 0,-1 1 1 0 0,1 0 0 0 0,0 0 0 0 0,0-1-1 0 0,-1 1 1 0 0,1 0 0 0 0,0-1 0 0 0,0 1-1 0 0,-1 0 1 0 0,1-1 0 0 0,0 1-1 0 0,0 0 1 0 0,0-1 0 0 0,0 1 0 0 0,-1-1-1 0 0,1 1 1 0 0,0 0 0 0 0,0-1 0 0 0,0 1-1 0 0,0-1 1 0 0,0 1 0 0 0,0-1 0 0 0,0 1-1 0 0,0 0 1 0 0,0-1 0 0 0,0 1-1 0 0,0-1 1 0 0,1 1 0 0 0,-1 0 0 0 0,0-1-1 0 0,0 1 1 0 0,0-1 0 0 0,0 1 0 0 0,1 0-1 0 0,-1-1 1 0 0,0 1 0 0 0,0 0 0 0 0,1-1-1 0 0,-1 1 1 0 0,0 0 0 0 0,1 0-1 0 0,-1-1 1 0 0,12-18 1969 0 0,25-6-1791 0 0,-37 24-276 0 0,0 1-1 0 0,0 0 0 0 0,1-1 0 0 0,-1 1 0 0 0,0 0 0 0 0,1-1 0 0 0,-1 1 0 0 0,0 0 1 0 0,1-1-1 0 0,-1 1 0 0 0,1 0 0 0 0,-1 0 0 0 0,1-1 0 0 0,-1 1 0 0 0,0 0 0 0 0,1 0 1 0 0,-1 0-1 0 0,1 0 0 0 0,-1 0 0 0 0,1-1 0 0 0,-1 1 0 0 0,1 0 0 0 0,-1 0 0 0 0,1 0 1 0 0,-1 0-1 0 0,1 0 0 0 0,-1 1 0 0 0,1-1 0 0 0,-1 0 0 0 0,1 0 0 0 0,-1 0 0 0 0,1 0 1 0 0,-1 0-1 0 0,0 1 0 0 0,1-1 0 0 0,-1 0 0 0 0,1 0 0 0 0,-1 1 0 0 0,0-1 0 0 0,1 0 1 0 0,-1 1-1 0 0,0-1 0 0 0,1 1 0 0 0,6 5 43 0 0,3 2-14 0 0,1-1 0 0 0,-1 0 1 0 0,1-1-1 0 0,19 8 0 0 0,-26-13-198 0 0,0 0 1 0 0,0 1-1 0 0,0-2 1 0 0,0 1-1 0 0,0 0 0 0 0,0-1 1 0 0,0 0-1 0 0,0 0 1 0 0,0 0-1 0 0,1 0 1 0 0,-1-1-1 0 0,0 1 0 0 0,0-1 1 0 0,0 0-1 0 0,0-1 1 0 0,0 1-1 0 0,0-1 0 0 0,-1 1 1 0 0,8-5-1 0 0,5-6-909 0 0,-7 6 943 0 0</inkml:trace>
+  <inkml:trace contextRef="#ctx0" brushRef="#br0" timeOffset="3356.09">1840 346 3401 0 0,'0'0'3806'0'0,"-2"3"-3743"0"0,-1 3-50 0 0,0 1 0 0 0,0-1 0 0 0,0 1 0 0 0,0 0 0 0 0,1 0 0 0 0,1 0 0 0 0,-1 0 0 0 0,1 0 0 0 0,-1 12 1 0 0,2-14-7 0 0,-1 0 0 0 0,1 0 0 0 0,0 0 0 0 0,0 1 0 0 0,1-1 0 0 0,-1 0 0 0 0,1 0 0 0 0,1 0 0 0 0,-1 0 0 0 0,1 0 0 0 0,-1 0 0 0 0,1 0 0 0 0,1-1 0 0 0,4 9 0 0 0,-6-11 12 0 0,1 0 0 0 0,0-1 0 0 0,-1 1 0 0 0,1-1 0 0 0,0 1 0 0 0,0-1 1 0 0,0 0-1 0 0,-1 0 0 0 0,1 0 0 0 0,0 0 0 0 0,1 0 0 0 0,-1 0 0 0 0,0 0 1 0 0,0-1-1 0 0,0 1 0 0 0,0-1 0 0 0,1 0 0 0 0,-1 0 0 0 0,5 0 642 0 0,-10-26 1203 0 0,4 24-1851 0 0,-1 0-1 0 0,0 0 0 0 0,-1 0 1 0 0,1 0-1 0 0,0 0 1 0 0,0 0-1 0 0,-1 0 1 0 0,1 0-1 0 0,-1 0 0 0 0,0 1 1 0 0,0-1-1 0 0,-1-3 1 0 0,-2 0 71 0 0,0 0 1 0 0,-1 0 0 0 0,1 0 0 0 0,-1 1 0 0 0,0 0 0 0 0,0 0 0 0 0,-7-5 0 0 0,6 6-43 0 0,0-3 62 0 0,7 2-115 0 0,1 1 0 0 0,0-1 0 0 0,0 1 0 0 0,0 0 0 0 0,0-1 0 0 0,0 1 0 0 0,1 0-1 0 0,0 1 1 0 0,-1-1 0 0 0,1 0 0 0 0,0 1 0 0 0,0-1 0 0 0,1 1 0 0 0,-1 0 0 0 0,4-2 0 0 0,7-2-23 0 0,0 0 1 0 0,0 1-1 0 0,1 0 1 0 0,-1 2 0 0 0,1-1-1 0 0,18 0 1 0 0,41-12-3622 0 0,-67 15 2699 0 0,-1 1-138 0 0</inkml:trace>
+  <inkml:trace contextRef="#ctx0" brushRef="#br0" timeOffset="3740.67">2229 335 4217 0 0,'0'0'95'0'0,"0"-1"-1"0"0,0 1 1 0 0,0 0 0 0 0,0-1 0 0 0,1 1-1 0 0,-1 0 1 0 0,0 0 0 0 0,0-1-1 0 0,0 1 1 0 0,0 0 0 0 0,1-1 0 0 0,-1 1-1 0 0,0 0 1 0 0,0 0 0 0 0,1-1 0 0 0,-1 1-1 0 0,0 0 1 0 0,0 0 0 0 0,1 0-1 0 0,-1 0 1 0 0,0-1 0 0 0,1 1 0 0 0,-1 0-1 0 0,0 0 1 0 0,1 0 0 0 0,-1 0 0 0 0,0 0-1 0 0,1 0 1 0 0,-1 0 0 0 0,0 0-1 0 0,1 0 1 0 0,-1 0 0 0 0,0 0 0 0 0,1 0-1 0 0,0 0 1 0 0,8 10 1419 0 0,2 19-612 0 0,-8 20-538 0 0,-3-42-416 0 0,0 0 0 0 0,0 0 0 0 0,0-1 0 0 0,1 1 0 0 0,0 0 0 0 0,0 0 0 0 0,1-1 0 0 0,0 1 0 0 0,0-1 0 0 0,0 0 0 0 0,1 1 0 0 0,0-1 0 0 0,0 0 0 0 0,5 7 0 0 0,-6-10-558 0 0,1 1-319 0 0</inkml:trace>
+  <inkml:trace contextRef="#ctx0" brushRef="#br0" timeOffset="3921.31">2292 212 3929 0 0,'-1'-2'370'0'0,"0"0"1"0"0,0 0-1 0 0,0 0 0 0 0,0 0 1 0 0,0 0-1 0 0,1 0 1 0 0,-1 0-1 0 0,1 0 1 0 0,0-1-1 0 0,-1 1 0 0 0,1-4 1 0 0,0 6-415 0 0</inkml:trace>
+  <inkml:trace contextRef="#ctx0" brushRef="#br0" timeOffset="5174.93">2503 367 1624 0 0,'0'0'4464'0'0,"2"2"-4200"0"0,1 0-1 0 0,-1 0 1 0 0,0 0-1 0 0,1 0 1 0 0,-1-1 0 0 0,1 1-1 0 0,0-1 1 0 0,5 2-1 0 0,-3-1-237 0 0,1-1-1 0 0,0 1 0 0 0,0-2 0 0 0,0 1 0 0 0,0-1 0 0 0,0 0 0 0 0,1 0 0 0 0,-1 0 0 0 0,0-1 0 0 0,0 0 0 0 0,0 0 0 0 0,9-4 0 0 0,-9 2-2 0 0,1 0-1 0 0,-1-1 1 0 0,0 0 0 0 0,0 0 0 0 0,9-9-1 0 0,-14 12-17 0 0,0-1 0 0 0,1 1-1 0 0,-1 0 1 0 0,0-1-1 0 0,0 1 1 0 0,0 0-1 0 0,-1-1 1 0 0,1 0-1 0 0,0 1 1 0 0,0-1 0 0 0,-1 1-1 0 0,1-1 1 0 0,-1 0-1 0 0,1 1 1 0 0,-1-1-1 0 0,0 0 1 0 0,0 1 0 0 0,0-1-1 0 0,0 0 1 0 0,0 0-1 0 0,0 1 1 0 0,0-1-1 0 0,-1 0 1 0 0,1 1-1 0 0,0-1 1 0 0,-1 0 0 0 0,1 1-1 0 0,-1-1 1 0 0,-1-2-1 0 0,1 2-3 0 0,-1 1 0 0 0,1-1 0 0 0,0 1 0 0 0,0 0 0 0 0,-1 0 0 0 0,1-1 0 0 0,-1 1 0 0 0,1 0 0 0 0,-1 0 0 0 0,0 0 0 0 0,1 1 0 0 0,-1-1 0 0 0,0 0 0 0 0,1 1-1 0 0,-1-1 1 0 0,0 1 0 0 0,0-1 0 0 0,0 1 0 0 0,1 0 0 0 0,-1 0 0 0 0,0 0 0 0 0,0 0 0 0 0,0 0 0 0 0,0 0 0 0 0,1 0 0 0 0,-1 1 0 0 0,0-1 0 0 0,0 1 0 0 0,0-1 0 0 0,1 1 0 0 0,-4 1 0 0 0,0 0 3 0 0,0 0 1 0 0,0 1 0 0 0,0 0-1 0 0,0-1 1 0 0,0 1 0 0 0,0 1-1 0 0,1-1 1 0 0,0 1 0 0 0,-5 5 0 0 0,-11 12 13 0 0,18-19 18 0 0,0 0-1 0 0,0 0 0 0 0,0-1 1 0 0,0 2-1 0 0,0-1 1 0 0,1 0-1 0 0,-1 0 1 0 0,1 1-1 0 0,-1-1 1 0 0,1 0-1 0 0,0 1 1 0 0,0-1-1 0 0,0 1 1 0 0,0 0-1 0 0,0-1 0 0 0,1 1 1 0 0,-1 0-1 0 0,1 0 1 0 0,0-1-1 0 0,0 1 1 0 0,0 0-1 0 0,0 0 1 0 0,1 4-1 0 0,-1-3-8 0 0,0 0-1 0 0,1 0 1 0 0,0 0 0 0 0,0 0-1 0 0,0 0 1 0 0,0 0-1 0 0,1 0 1 0 0,-1 0 0 0 0,1-1-1 0 0,0 1 1 0 0,0-1 0 0 0,1 1-1 0 0,-1-1 1 0 0,0 0-1 0 0,1 0 1 0 0,0 0 0 0 0,0 0-1 0 0,0 0 1 0 0,0-1 0 0 0,0 1-1 0 0,1-1 1 0 0,-1 0-1 0 0,1 0 1 0 0,0 0 0 0 0,4 1-1 0 0,1 2-24 0 0,0-1 1 0 0,0 0-1 0 0,1 0 0 0 0,-1-1 0 0 0,1 0 0 0 0,0-1 0 0 0,0 0 0 0 0,0-1 1 0 0,0 0-1 0 0,0 0 0 0 0,0-1 0 0 0,0-1 0 0 0,0 1 0 0 0,0-2 1 0 0,0 1-1 0 0,0-2 0 0 0,14-4 0 0 0,-22 7 6 0 0,-1-1 1 0 0,1 0-1 0 0,-1 1 1 0 0,1-1-1 0 0,-1 0 1 0 0,0 0-1 0 0,1 0 1 0 0,-1 0-1 0 0,0 0 0 0 0,1-1 1 0 0,-1 1-1 0 0,0 0 1 0 0,0-1-1 0 0,0 1 1 0 0,0 0-1 0 0,-1-1 1 0 0,1 1-1 0 0,0-1 0 0 0,0 0 1 0 0,-1 1-1 0 0,1-1 1 0 0,-1 1-1 0 0,0-1 1 0 0,1 0-1 0 0,-1 0 1 0 0,0 1-1 0 0,0-1 0 0 0,0 0 1 0 0,0 1-1 0 0,0-1 1 0 0,-1 0-1 0 0,1 1 1 0 0,0-1-1 0 0,-1 0 1 0 0,1 1-1 0 0,-1-1 0 0 0,0 1 1 0 0,1-1-1 0 0,-1 1 1 0 0,0-1-1 0 0,0 1 1 0 0,0-1-1 0 0,0 1 1 0 0,0 0-1 0 0,0-1 0 0 0,0 1 1 0 0,-1 0-1 0 0,1 0 1 0 0,0 0-1 0 0,-2-1 1 0 0,2 1 18 0 0,0 0 0 0 0,0 0 0 0 0,1 0 0 0 0,-1 0 0 0 0,0-1 0 0 0,1 1 0 0 0,-1 0-1 0 0,1 0 1 0 0,0 0 0 0 0,-1-1 0 0 0,1 1 0 0 0,0 0 0 0 0,0-1 0 0 0,0 1 0 0 0,0 0 0 0 0,0 0 0 0 0,0-1 0 0 0,0 1 0 0 0,0 0 0 0 0,1-1 0 0 0,-1 1 0 0 0,0 0 0 0 0,1 0 0 0 0,-1-1 0 0 0,1 1 0 0 0,-1 0 0 0 0,1 0 0 0 0,0 0 0 0 0,-1 0 0 0 0,1 0 0 0 0,0 0 0 0 0,0 0 0 0 0,0 0 0 0 0,0 0 0 0 0,2-1 0 0 0,-1 0-47 0 0,1 1 0 0 0,-1 1 0 0 0,1-1 1 0 0,-1 0-1 0 0,1 0 0 0 0,-1 1 1 0 0,1 0-1 0 0,0-1 0 0 0,-1 1 0 0 0,1 0 1 0 0,0 0-1 0 0,-1 1 0 0 0,1-1 1 0 0,-1 0-1 0 0,1 1 0 0 0,0-1 0 0 0,-1 1 1 0 0,1 0-1 0 0,-1 0 0 0 0,0 0 1 0 0,1 0-1 0 0,3 3 0 0 0,-2-2-109 0 0,1 0 0 0 0,0 0 0 0 0,-1-1 0 0 0,1 1 0 0 0,0-1-1 0 0,0 0 1 0 0,0-1 0 0 0,0 1 0 0 0,0-1 0 0 0,0 0 0 0 0,5-1 0 0 0,33-9-4310 0 0,-35 8 3159 0 0</inkml:trace>
+  <inkml:trace contextRef="#ctx0" brushRef="#br0" timeOffset="5981.97">3170 36 5377 0 0,'-8'-3'4857'0'0,"-2"11"-3287"0"0,1 14-1849 0 0,7 12 244 0 0,1 0 0 0 0,2-1 0 0 0,1 1 0 0 0,1 0 0 0 0,2-1 0 0 0,2 0 0 0 0,0 0 0 0 0,3 0-1 0 0,15 36 1 0 0,-23-57-192 0 0,-11-19-139 0 0,-8-7 219 0 0,-11-8 149 0 0,22 18 3 0 0,3 2-2 0 0,-4 2 7 0 0,-2-3 1 0 0,0 1 0 0 0,1 0 0 0 0,-1 1 0 0 0,0 0 0 0 0,0 0 0 0 0,0 1 0 0 0,0 0 0 0 0,0 1 0 0 0,-10 1 0 0 0,19-1 402 0 0,7-2 74 0 0,26 0-139 0 0,33-7 1 0 0,-56 6-838 0 0,-1 0 0 0 0,1 0 0 0 0,0-1 0 0 0,-1-1 0 0 0,1 0-1 0 0,-1 0 1 0 0,0 0 0 0 0,9-7 0 0 0,-11 6 249 0 0,0 0-326 0 0</inkml:trace>
+  <inkml:trace contextRef="#ctx0" brushRef="#br0" timeOffset="6556.61">3575 1 1816 0 0,'0'0'7770'0'0,"0"11"-6007"0"0,1 12-1488 0 0,0 0 0 0 0,-5 38 0 0 0,1-35-254 0 0,2 0-1 0 0,2 36 1 0 0,3 13-82 0 0,-5-56 3 0 0,2 0 0 0 0,0-1 1 0 0,1 1-1 0 0,1 0 0 0 0,1-1 1 0 0,0 1-1 0 0,9 19 0 0 0,-8-28-191 0 0,3 5-356 0 0,-6-8-3797 0 0</inkml:trace>
+  <inkml:trace contextRef="#ctx0" brushRef="#br0" timeOffset="7116.94">3726 736 1048 0 0,'0'0'150'0'0,"-18"-13"6504"0"0,-10 9-6188 0 0,21 2-374 0 0,0 0 173 0 0,-6 8 1065 0 0,3-1-1239 0 0,0 1 0 0 0,1 0 0 0 0,0 1 0 0 0,0 0 0 0 0,0 0 0 0 0,1 1-1 0 0,0 0 1 0 0,0 0 0 0 0,-10 16 0 0 0,18-23-89 0 0,-1-1 0 0 0,1 1 0 0 0,0-1 0 0 0,0 0 0 0 0,-1 1 0 0 0,1-1-1 0 0,0 1 1 0 0,0 0 0 0 0,0-1 0 0 0,-1 1 0 0 0,1-1 0 0 0,0 1 0 0 0,0-1 0 0 0,0 1 0 0 0,0-1-1 0 0,0 1 1 0 0,0-1 0 0 0,0 1 0 0 0,0 0 0 0 0,0-1 0 0 0,0 1 0 0 0,1-1 0 0 0,-1 1-1 0 0,0-1 1 0 0,0 1 0 0 0,0-1 0 0 0,1 1 0 0 0,-1-1 0 0 0,0 1 0 0 0,1 0 0 0 0,16 2 129 0 0,20-11 87 0 0,-36 8-216 0 0,5-3 27 0 0,0 1 1 0 0,0-1-1 0 0,0 0 1 0 0,-1-1-1 0 0,1 1 0 0 0,8-8 1 0 0,-12 9-11 0 0,0 1 1 0 0,0-1-1 0 0,0 0 1 0 0,-1 1-1 0 0,1-1 1 0 0,0 0 0 0 0,-1 0-1 0 0,0 0 1 0 0,1 0-1 0 0,-1 0 1 0 0,0-1-1 0 0,0 1 1 0 0,0 0-1 0 0,0-1 1 0 0,0 1-1 0 0,-1 0 1 0 0,1-1-1 0 0,-1 1 1 0 0,1-1-1 0 0,-1-3 1 0 0,0 6-11 0 0,0 0 0 0 0,0-1 0 0 0,-1 1 1 0 0,1 0-1 0 0,0-1 0 0 0,0 1 0 0 0,0 0 0 0 0,0-1 0 0 0,0 1 1 0 0,-1 0-1 0 0,1-1 0 0 0,0 1 0 0 0,0 0 0 0 0,-1 0 1 0 0,1-1-1 0 0,0 1 0 0 0,0 0 0 0 0,-1 0 0 0 0,1 0 0 0 0,0-1 1 0 0,-1 1-1 0 0,1 0 0 0 0,0 0 0 0 0,-1 0 0 0 0,1 0 0 0 0,0 0 1 0 0,-1 0-1 0 0,1 0 0 0 0,0 0 0 0 0,-1-1 0 0 0,1 1 1 0 0,0 0-1 0 0,-1 0 0 0 0,1 1 0 0 0,0-1 0 0 0,-1 0 0 0 0,1 0 1 0 0,0 0-1 0 0,-1 0 0 0 0,1 0 0 0 0,-23 9 22 0 0,-11 6-42 0 0,33-14 7 0 0,3-1-1 0 0,-4 4-43 0 0,1-4 48 0 0,1 1 0 0 0,0-1 1 0 0,-1 0-1 0 0,1 0 0 0 0,0 1 0 0 0,0-1 0 0 0,-1 0 1 0 0,1 1-1 0 0,0-1 0 0 0,0 0 0 0 0,-1 1 0 0 0,1-1 1 0 0,0 0-1 0 0,0 1 0 0 0,0-1 0 0 0,0 0 0 0 0,-1 1 0 0 0,1-1 1 0 0,0 1-1 0 0,0-1 0 0 0,0 0 0 0 0,0 1 0 0 0,0-1 1 0 0,0 1-1 0 0,0-1 0 0 0,0 1 0 0 0,0-1 0 0 0,0 0 0 0 0,0 1 1 0 0,0-1-1 0 0,1 1 0 0 0,-1-1 0 0 0,0 0 0 0 0,0 1 1 0 0,0-1-1 0 0,1 0 0 0 0,-1 1 0 0 0,0-1 0 0 0,0 0 1 0 0,1 1-1 0 0,-1-1 0 0 0,0 0 0 0 0,0 1 0 0 0,1-1 0 0 0,-1 0 1 0 0,0 0-1 0 0,1 1 0 0 0,-1-1 0 0 0,0 0 0 0 0,1 0 1 0 0,-1 0-1 0 0,1 0 0 0 0,-1 0 0 0 0,0 1 0 0 0,1-1 1 0 0,-1 0-1 0 0,1 0 0 0 0,-1 0 0 0 0,0 0 0 0 0,1 0 0 0 0,0 0 1 0 0,2 0 3 0 0,0 0 1 0 0,-1 0-1 0 0,1 0 1 0 0,0 0-1 0 0,0-1 1 0 0,-1 1-1 0 0,1-1 1 0 0,0 0-1 0 0,-1 1 1 0 0,1-1-1 0 0,-1-1 1 0 0,1 1-1 0 0,-1 0 1 0 0,1 0-1 0 0,-1-1 1 0 0,0 1-1 0 0,0-1 1 0 0,1 0-1 0 0,-1 0 1 0 0,0 0-1 0 0,-1 0 1 0 0,1 0-1 0 0,0 0 1 0 0,-1 0-1 0 0,1-1 1 0 0,-1 1-1 0 0,0-1 1 0 0,1 1-1 0 0,-1-1 1 0 0,0 1-1 0 0,-1-1 1 0 0,1 0-1 0 0,0-4 1 0 0,-1 7-16 0 0,0-1 0 0 0,0 1 1 0 0,0-1-1 0 0,0 1 0 0 0,0-1 0 0 0,0 1 0 0 0,0-1 1 0 0,0 1-1 0 0,0-1 0 0 0,0 1 0 0 0,0-1 0 0 0,0 1 1 0 0,-1-1-1 0 0,1 1 0 0 0,0-1 0 0 0,0 1 0 0 0,-1 0 1 0 0,1-1-1 0 0,0 1 0 0 0,-1-1 0 0 0,1 1 1 0 0,0 0-1 0 0,-1-1 0 0 0,1 1 0 0 0,-1 0 0 0 0,1-1 1 0 0,0 1-1 0 0,-1 0 0 0 0,1 0 0 0 0,-1-1 0 0 0,-17 3-1171 0 0,-17 17-3193 0 0,27-12 2680 0 0</inkml:trace>
+  <inkml:trace contextRef="#ctx0" brushRef="#br0" timeOffset="8040.3">3146 323 288 0 0,'0'0'1288'0'0,"-9"-7"3628"0"0,8 14-4679 0 0,-1-1 0 0 0,1 0 0 0 0,0 0 0 0 0,1 0 0 0 0,0 10 0 0 0,0-9-159 0 0,-2 3 18 0 0,0 5 19 0 0,0-1-1 0 0,1 0 0 0 0,1 20 0 0 0,1-29-91 0 0,-1 0 0 0 0,2 0 1 0 0,-1 0-1 0 0,0 0 0 0 0,1 0 0 0 0,0 0 0 0 0,0 0 1 0 0,1 0-1 0 0,-1-1 0 0 0,1 1 0 0 0,6 7 0 0 0,-4-6 0 0 0,-1 0 0 0 0,0 1 0 0 0,-1-1 0 0 0,0 1 0 0 0,0 0 0 0 0,0 0 0 0 0,2 10 0 0 0,-4-13-14 0 0,0 0 0 0 0,0 0 1 0 0,-1 0-1 0 0,1 0 0 0 0,-1 0 0 0 0,0 0 0 0 0,0 0 0 0 0,0 0 1 0 0,0 0-1 0 0,-1 0 0 0 0,0 0 0 0 0,0 0 0 0 0,0 0 1 0 0,0 0-1 0 0,-3 5 0 0 0,-9-6 270 0 0</inkml:trace>
+</inkml:ink>
+</file>
+
 <file path=customXml/itemProps1.xml><?xml version="1.0" encoding="utf-8"?>
 <ds:datastoreItem xmlns:ds="http://schemas.openxmlformats.org/officeDocument/2006/customXml" ds:itemID="{01D51A4F-7BE7-46DF-A7D0-BDB91C1C49A3}">
   <ds:schemaRefs>
-    <ds:schemaRef ds:uri="http://www.w3.org/2003/InkML"/>
+    <ds:schemaRef ds:uri="http://schemas.openxmlformats.org/officeDocument/2006/bibliography"/>
   </ds:schemaRefs>
 </ds:datastoreItem>
 </file>
 
 <file path=customXml/itemProps2.xml><?xml version="1.0" encoding="utf-8"?>
-<ds:datastoreItem xmlns:ds="http://schemas.openxmlformats.org/officeDocument/2006/customXml" ds:itemID="{4B023D59-82BC-4D0F-A651-C98E01C1F15C}">
-  <ds:schemaRefs>
-    <ds:schemaRef ds:uri="http://www.w3.org/2003/InkML"/>
-  </ds:schemaRefs>
-</ds:datastoreItem>
-</file>
-
-<file path=customXml/itemProps3.xml><?xml version="1.0" encoding="utf-8"?>
 <ds:datastoreItem xmlns:ds="http://schemas.openxmlformats.org/officeDocument/2006/customXml" ds:itemID="{CE199482-6225-420D-8982-84EA3B0C446C}">
   <ds:schemaRefs>
     <ds:schemaRef ds:uri="http://schemas.microsoft.com/office/2006/metadata/properties"/>
@@ -25683,23 +26479,15 @@
 </ds:datastoreItem>
 </file>
 
-<file path=customXml/itemProps4.xml><?xml version="1.0" encoding="utf-8"?>
-<ds:datastoreItem xmlns:ds="http://schemas.openxmlformats.org/officeDocument/2006/customXml" ds:itemID="{4B023D59-82BC-4D0F-A651-C98E01C1F15C}">
+<file path=customXml/itemProps3.xml><?xml version="1.0" encoding="utf-8"?>
+<ds:datastoreItem xmlns:ds="http://schemas.openxmlformats.org/officeDocument/2006/customXml" ds:itemID="{01D51A4F-7BE7-46DF-A7D0-BDB91C1C49A3}">
   <ds:schemaRefs>
     <ds:schemaRef ds:uri="http://www.w3.org/2003/InkML"/>
   </ds:schemaRefs>
 </ds:datastoreItem>
 </file>
 
-<file path=customXml/itemProps5.xml><?xml version="1.0" encoding="utf-8"?>
-<ds:datastoreItem xmlns:ds="http://schemas.openxmlformats.org/officeDocument/2006/customXml" ds:itemID="{01D51A4F-7BE7-46DF-A7D0-BDB91C1C49A3}">
-  <ds:schemaRefs>
-    <ds:schemaRef ds:uri="http://schemas.openxmlformats.org/officeDocument/2006/bibliography"/>
-  </ds:schemaRefs>
-</ds:datastoreItem>
-</file>
-
-<file path=customXml/itemProps6.xml><?xml version="1.0" encoding="utf-8"?>
+<file path=customXml/itemProps4.xml><?xml version="1.0" encoding="utf-8"?>
 <ds:datastoreItem xmlns:ds="http://schemas.openxmlformats.org/officeDocument/2006/customXml" ds:itemID="{4B023D59-82BC-4D0F-A651-C98E01C1F15C}">
   <ds:schemaRefs>
     <ds:schemaRef ds:uri="http://schemas.microsoft.com/office/2006/metadata/contentType"/>
@@ -25717,10 +26505,26 @@
 </ds:datastoreItem>
 </file>
 
-<file path=customXml/itemProps7.xml><?xml version="1.0" encoding="utf-8"?>
+<file path=customXml/itemProps5.xml><?xml version="1.0" encoding="utf-8"?>
+<ds:datastoreItem xmlns:ds="http://schemas.openxmlformats.org/officeDocument/2006/customXml" ds:itemID="{4B023D59-82BC-4D0F-A651-C98E01C1F15C}">
+  <ds:schemaRefs>
+    <ds:schemaRef ds:uri="http://www.w3.org/2003/InkML"/>
+  </ds:schemaRefs>
+</ds:datastoreItem>
+</file>
+
+<file path=customXml/itemProps6.xml><?xml version="1.0" encoding="utf-8"?>
 <ds:datastoreItem xmlns:ds="http://schemas.openxmlformats.org/officeDocument/2006/customXml" ds:itemID="{6A655C0C-F4A3-4931-9F7F-84CBD61DCE8F}">
   <ds:schemaRefs>
     <ds:schemaRef ds:uri="http://schemas.microsoft.com/sharepoint/v3/contenttype/forms"/>
   </ds:schemaRefs>
 </ds:datastoreItem>
+</file>
+
+<file path=customXml/itemProps7.xml><?xml version="1.0" encoding="utf-8"?>
+<ds:datastoreItem xmlns:ds="http://schemas.openxmlformats.org/officeDocument/2006/customXml" ds:itemID="{4B023D59-82BC-4D0F-A651-C98E01C1F15C}">
+  <ds:schemaRefs>
+    <ds:schemaRef ds:uri="http://www.w3.org/2003/InkML"/>
+  </ds:schemaRefs>
+</ds:datastoreItem>
 </file>
</xml_diff>

<commit_message>
Doku Update - Felix
</commit_message>
<xml_diff>
--- a/D_Documentation/Doku-Felix.docx
+++ b/D_Documentation/Doku-Felix.docx
@@ -7163,6 +7163,9 @@
       </w:pPr>
       <w:r>
         <w:t xml:space="preserve">Die beiden Kameras erfassen somit ein Objekt über zwei </w:t>
+      </w:r>
+      <w:r>
+        <w:t xml:space="preserve">verschobene </w:t>
       </w:r>
       <w:r>
         <w:t xml:space="preserve">Bilder. </w:t>
@@ -7383,7 +7386,13 @@
         <w:t xml:space="preserve">sollte </w:t>
       </w:r>
       <w:r>
-        <w:t>auf mehrere Faktoren achten</w:t>
+        <w:t xml:space="preserve">auf mehrere Faktoren </w:t>
+      </w:r>
+      <w:r>
+        <w:t>ge</w:t>
+      </w:r>
+      <w:r>
+        <w:t>achtet</w:t>
       </w:r>
       <w:r>
         <w:t xml:space="preserve"> werden</w:t>
@@ -7407,19 +7416,10 @@
         <w:t>Kameraabstand</w:t>
       </w:r>
       <w:r>
-        <w:t>: Ein größerer Abstand liefert genauere Tiefenwerte</w:t>
-      </w:r>
-      <w:r>
-        <w:t>(je nach Modell)</w:t>
-      </w:r>
-      <w:r>
-        <w:t xml:space="preserve">, aber die Kameras sehen dann weniger vom </w:t>
-      </w:r>
-      <w:r>
-        <w:t>Objekt</w:t>
-      </w:r>
-      <w:r>
-        <w:t>.</w:t>
+        <w:t xml:space="preserve">: </w:t>
+      </w:r>
+      <w:r>
+        <w:t>Durch die Disparität wird der Abstand von der Kamera zum Objekt wichtig zu beachten.</w:t>
       </w:r>
     </w:p>
     <w:p>
@@ -7936,37 +7936,13 @@
         <w:t>Oberfläche des Objekts</w:t>
       </w:r>
       <w:r>
-        <w:t xml:space="preserve">: Wenn die Oberfläche einfarbig oder </w:t>
-      </w:r>
-      <w:r>
-        <w:t>durchsichtig</w:t>
-      </w:r>
-      <w:r>
-        <w:t xml:space="preserve"> ist, fällt es </w:t>
-      </w:r>
-      <w:r>
-        <w:t>der Kamera schwere</w:t>
-      </w:r>
-      <w:r>
-        <w:t xml:space="preserve">, </w:t>
-      </w:r>
-      <w:r>
-        <w:t xml:space="preserve">die Punkte schon </w:t>
-      </w:r>
-      <w:r>
-        <w:t>darzustrecken</w:t>
-      </w:r>
-      <w:r>
-        <w:t xml:space="preserve"> und dadurch </w:t>
-      </w:r>
-      <w:r>
-        <w:t>Punkt in beiden Bildern wiederzufinden</w:t>
-      </w:r>
-      <w:r>
-        <w:t xml:space="preserve"> erschwert wird</w:t>
-      </w:r>
-      <w:r>
-        <w:t>.</w:t>
+        <w:t>:</w:t>
+      </w:r>
+      <w:r>
+        <w:t xml:space="preserve"> </w:t>
+      </w:r>
+      <w:r>
+        <w:t>Eine einfarbige oder transparente Oberfläche erschwert der Kamera die zuverlässige Darstellung der Punkte, da Strukturen fehlen und Lichtreflexionen auftreten können.</w:t>
       </w:r>
     </w:p>
     <w:p>
@@ -7981,27 +7957,22 @@
         <w:rPr>
           <w:bCs/>
         </w:rPr>
+        <w:t xml:space="preserve">Ungünstige </w:t>
+      </w:r>
+      <w:r>
+        <w:rPr>
+          <w:bCs/>
+        </w:rPr>
         <w:t>Lichtverhältnisse</w:t>
       </w:r>
       <w:r>
-        <w:t xml:space="preserve">: Zu wenig Licht oder </w:t>
-      </w:r>
-      <w:r>
-        <w:t>einfallende</w:t>
-      </w:r>
-      <w:r>
-        <w:t xml:space="preserve"> Schatten verschlechtern die </w:t>
-      </w:r>
-      <w:r>
-        <w:t xml:space="preserve">die Aufnahme durch den Kontrast </w:t>
-      </w:r>
-      <w:proofErr w:type="spellStart"/>
-      <w:r>
-        <w:t>verlust</w:t>
-      </w:r>
-      <w:proofErr w:type="spellEnd"/>
-      <w:r>
-        <w:t>.</w:t>
+        <w:t xml:space="preserve">: </w:t>
+      </w:r>
+      <w:r>
+        <w:t>Z</w:t>
+      </w:r>
+      <w:r>
+        <w:t>u wenig Licht oder Schatten, verschlechtern die Aufnahme durch einen geringeren Kontrast.</w:t>
       </w:r>
     </w:p>
     <w:p>
@@ -8045,22 +8016,22 @@
         <w:t>Kamera</w:t>
       </w:r>
       <w:r>
-        <w:t xml:space="preserve"> (siehe Abbildung 1). Sie hat zwei Kameras eingebaut und einen speziellen </w:t>
+        <w:t xml:space="preserve"> (siehe Abbildung 1). Sie hat </w:t>
+      </w:r>
+      <w:r>
+        <w:t>drei</w:t>
+      </w:r>
+      <w:r>
+        <w:t xml:space="preserve"> Kameras eingebaut und einen speziellen </w:t>
       </w:r>
       <w:r>
         <w:t xml:space="preserve">internen </w:t>
       </w:r>
       <w:r>
-        <w:t xml:space="preserve">Chip, der die Tiefenberechnung direkt erledigt – das entlastet den </w:t>
-      </w:r>
-      <w:r>
-        <w:t>Raspberry</w:t>
-      </w:r>
-      <w:r>
-        <w:t xml:space="preserve"> </w:t>
-      </w:r>
-      <w:r>
-        <w:t>Pi</w:t>
+        <w:t>Chip, der die Tiefenberechnung direkt erledig</w:t>
+      </w:r>
+      <w:r>
+        <w:t>en kann</w:t>
       </w:r>
       <w:r>
         <w:t xml:space="preserve">. </w:t>
@@ -8423,55 +8394,41 @@
         <w:pStyle w:val="Text"/>
       </w:pPr>
       <w:r>
-        <w:t xml:space="preserve">Für die Bestimmung der Höhe wird eine Referenzebene definiert, die der Auflagefläche entspricht. Aus dem Tiefenbild wird ein charakteristischer Tiefenwert dieser Grundfläche als Bezugspunkt festgelegt. </w:t>
-      </w:r>
-      <w:r>
-        <w:t>D</w:t>
-      </w:r>
-      <w:r>
-        <w:t>as</w:t>
+        <w:t xml:space="preserve">Für die </w:t>
+      </w:r>
+      <w:r>
+        <w:t>Höhenberechnung</w:t>
+      </w:r>
+      <w:r>
+        <w:t xml:space="preserve"> wird eine Referenzebene definiert, die der Auflagefläche entspricht. </w:t>
+      </w:r>
+      <w:r>
+        <w:t>Aus dem Tiefenbild wird dafür ein charakteristischer Tiefenwert dieser Grundfläche als Referenz bestimmt. Anschließend werden die Tiefenwerte der zum Objekt gehörenden Pixel mit diesem Referenzwert verglichen. Die Höhe des Objekts ergibt sich aus der Differenz zwischen dem Tiefenwert der Grundfläche und dem Tiefenwert der obersten Objektpunkte. Dadurch kann die vertikale Ausdehnung des Objekts relativ zur Auflagefläche berechnet werden.</w:t>
       </w:r>
       <w:r>
         <w:t xml:space="preserve"> </w:t>
       </w:r>
-      <w:r>
-        <w:t>Stereo-Vision System</w:t>
-      </w:r>
-      <w:r>
-        <w:t xml:space="preserve"> erkennt ein Objekt, indem </w:t>
-      </w:r>
-      <w:r>
-        <w:t>es</w:t>
-      </w:r>
-      <w:r>
-        <w:t xml:space="preserve"> überprüft, ob sich zwischen der definierten Grundfläche und der Kamera ein Bereich mit abweichender Tiefe befindet. Weichen die Tiefenwerte einzelner Pixel ausreichend von der </w:t>
-      </w:r>
-      <w:r>
-        <w:t>Grundfläche</w:t>
-      </w:r>
-      <w:r>
-        <w:t xml:space="preserve"> ab, werden diese dem Objekt zugeordnet. Dadurch entsteht eine klar abgegrenzte Objektfläche im Bild.</w:t>
-      </w:r>
-    </w:p>
-    <w:p>
-      <w:pPr>
-        <w:pStyle w:val="Text"/>
-      </w:pPr>
-    </w:p>
-    <w:p>
-      <w:pPr>
-        <w:pStyle w:val="Text"/>
-      </w:pPr>
-      <w:r>
-        <w:t>Aus dieser Objektfläche werden zunächst die Abmessungen in Pixeln bestimmt. Anschließend erfolgt die Umrechnung dieser Pixelwerte in reale Längen unter Verwendung der Tiefeninformation und der bekannten Kameraparameter.</w:t>
-      </w:r>
-    </w:p>
-    <w:p>
-      <w:pPr>
-        <w:pStyle w:val="Text"/>
-      </w:pPr>
-      <w:r>
-        <w:t>Die Höhe des Objekts ergibt sich aus der Differenz zwischen dem gemessenen Objektabstand und der Referenzebene der Grundfläche. Auf diese Weise können Länge, Breite und Höhe dreidimensional erfasst werden.</w:t>
+    </w:p>
+    <w:p>
+      <w:pPr>
+        <w:pStyle w:val="Text"/>
+      </w:pPr>
+    </w:p>
+    <w:p>
+      <w:pPr>
+        <w:pStyle w:val="Text"/>
+      </w:pPr>
+      <w:r>
+        <w:t>Aus</w:t>
+      </w:r>
+      <w:r>
+        <w:t xml:space="preserve"> dieser abgegrenzten Fläche werden die Ausdehnungen des Objekts in Bildrichtung ermittelt und in Pixeln gemessen.</w:t>
+      </w:r>
+      <w:r>
+        <w:t xml:space="preserve"> </w:t>
+      </w:r>
+      <w:r>
+        <w:t>Anschließend erfolgt die Umrechnung dieser Pixelwerte in reale Längen. Dafür werden die zugehörigen Tiefeninformationen der Pixel sowie die bekannten Kameraparameter, wie Brennweite und Auflösung, verwendet. Dadurch lassen sich die tatsächlichen Abmessungen des Objekts im Raum bestimmen.</w:t>
       </w:r>
     </w:p>
     <w:p>
@@ -8487,12 +8444,9 @@
         <w:pStyle w:val="berschrift3"/>
       </w:pPr>
       <w:bookmarkStart w:id="52" w:name="_Toc223637577"/>
+      <w:commentRangeStart w:id="53"/>
       <w:r>
         <w:lastRenderedPageBreak/>
-        <w:t xml:space="preserve">Grundlagen der </w:t>
-      </w:r>
-      <w:commentRangeStart w:id="53"/>
-      <w:r>
         <w:t xml:space="preserve">Bildverarbeitung </w:t>
       </w:r>
       <w:commentRangeEnd w:id="53"/>
@@ -9363,7 +9317,19 @@
         <w:rPr>
           <w:lang w:eastAsia="de-AT"/>
         </w:rPr>
-        <w:t>Grundsätzlich basiert die elektronische Gewichtserfassung auf Sensoren, die eine mechanische Belastung in ein elektrisches Signal umwandeln. Dieses Signal wird anschließend verstärkt, digitalisiert und dem übergeordneten System zur Weiterverarbeitung bereitgestellt. Zur Digitalisierung kann beispielsweise ein Analog</w:t>
+        <w:t xml:space="preserve">Grundsätzlich basiert die elektronische Gewichtserfassung auf Sensoren, die eine mechanische Belastung in ein elektrisches Signal umwandeln. Dieses Signal wird anschließend verstärkt, digitalisiert und dem übergeordneten System zur Weiterverarbeitung bereitgestellt. Zur Digitalisierung </w:t>
+      </w:r>
+      <w:r>
+        <w:rPr>
+          <w:lang w:eastAsia="de-AT"/>
+        </w:rPr>
+        <w:t>wird</w:t>
+      </w:r>
+      <w:r>
+        <w:rPr>
+          <w:lang w:eastAsia="de-AT"/>
+        </w:rPr>
+        <w:t xml:space="preserve"> ein Analog</w:t>
       </w:r>
       <w:r>
         <w:rPr>
@@ -9377,7 +9343,7 @@
           <w:lang w:eastAsia="de-AT"/>
         </w:rPr>
         <w:noBreakHyphen/>
-        <w:t>Wandler eingesetzt werden, der eine stabile und ausreichend hochauflösende Erfassung der Messwerte ermöglicht. Für die theoretische Betrachtung ist vor allem relevant, dass die Gewichtsdaten als zusätzlicher Parameter in die Gesamterfassung eines Artikels integriert werden können.</w:t>
+        <w:t>Wandler eingesetzt, der eine stabile und ausreichend hochauflösende Erfassung der Messwerte ermöglicht. Für die theoretische Betrachtung ist vor allem relevant, dass die Gewichtsdaten als zusätzlicher Parameter in die Gesamterfassung eines Artikels integriert werden können.</w:t>
       </w:r>
     </w:p>
     <w:p>
@@ -9405,13 +9371,220 @@
         <w:rPr>
           <w:lang w:eastAsia="de-AT"/>
         </w:rPr>
-        <w:t>Die erreichbare Messgenauigkeit hängt dabei allgemein von mechanischen, sensorischen und kalibrierungstechnischen Einflussgrößen ab. Die detaillierte hardwareseitige Realisierung sowie deren praktische Auslegung werden in den entsprechenden projektbezogenen Kapiteln behandelt.</w:t>
-      </w:r>
-    </w:p>
-    <w:p>
-      <w:pPr>
-        <w:jc w:val="left"/>
-      </w:pPr>
+        <w:t xml:space="preserve">Die erreichbare Messgenauigkeit hängt dabei allgemein von mechanischen, sensorischen und kalibrierungstechnischen Einflussgrößen ab. </w:t>
+      </w:r>
+    </w:p>
+    <w:p>
+      <w:pPr>
+        <w:pStyle w:val="Index"/>
+        <w:rPr>
+          <w:lang w:val="de-AT" w:eastAsia="de-AT"/>
+        </w:rPr>
+      </w:pPr>
+      <m:oMathPara>
+        <m:oMath>
+          <m:r>
+            <m:rPr>
+              <m:sty m:val="p"/>
+            </m:rPr>
+            <w:rPr>
+              <w:rFonts w:ascii="Cambria Math" w:hAnsi="Cambria Math"/>
+              <w:lang w:val="de-AT" w:eastAsia="de-AT"/>
+            </w:rPr>
+            <m:t xml:space="preserve">    </m:t>
+          </m:r>
+          <m:r>
+            <w:rPr>
+              <w:rFonts w:ascii="Cambria Math" w:hAnsi="Cambria Math"/>
+              <w:lang w:val="de-AT" w:eastAsia="de-AT"/>
+            </w:rPr>
+            <m:t>Umrechnungs</m:t>
+          </m:r>
+          <m:r>
+            <m:rPr>
+              <m:sty m:val="p"/>
+            </m:rPr>
+            <w:rPr>
+              <w:rFonts w:ascii="Cambria Math" w:hAnsi="Cambria Math"/>
+              <w:lang w:val="de-AT" w:eastAsia="de-AT"/>
+            </w:rPr>
+            <m:t xml:space="preserve"> </m:t>
+          </m:r>
+          <m:r>
+            <w:rPr>
+              <w:rFonts w:ascii="Cambria Math" w:hAnsi="Cambria Math"/>
+              <w:lang w:val="de-AT" w:eastAsia="de-AT"/>
+            </w:rPr>
+            <m:t>Faktor</m:t>
+          </m:r>
+          <m:r>
+            <w:rPr>
+              <w:rFonts w:ascii="Cambria Math" w:hAnsi="Cambria Math"/>
+              <w:lang w:val="de-AT" w:eastAsia="de-AT"/>
+            </w:rPr>
+            <m:t xml:space="preserve"> in </m:t>
+          </m:r>
+          <m:r>
+            <w:rPr>
+              <w:rFonts w:ascii="Cambria Math" w:hAnsi="Cambria Math"/>
+              <w:lang w:val="de-AT" w:eastAsia="de-AT"/>
+            </w:rPr>
+            <m:t>Gramm</m:t>
+          </m:r>
+          <m:r>
+            <m:rPr>
+              <m:sty m:val="p"/>
+            </m:rPr>
+            <w:rPr>
+              <w:rFonts w:ascii="Cambria Math" w:hAnsi="Cambria Math"/>
+              <w:lang w:val="de-AT" w:eastAsia="de-AT"/>
+            </w:rPr>
+            <m:t>=</m:t>
+          </m:r>
+          <m:f>
+            <m:fPr>
+              <m:ctrlPr>
+                <w:rPr>
+                  <w:rFonts w:ascii="Cambria Math" w:hAnsi="Cambria Math"/>
+                  <w:lang w:val="de-AT" w:eastAsia="de-AT"/>
+                </w:rPr>
+              </m:ctrlPr>
+            </m:fPr>
+            <m:num>
+              <m:r>
+                <w:rPr>
+                  <w:rFonts w:ascii="Cambria Math" w:hAnsi="Cambria Math"/>
+                  <w:lang w:val="de-AT" w:eastAsia="de-AT"/>
+                </w:rPr>
+                <m:t>Bekanntes</m:t>
+              </m:r>
+              <m:r>
+                <m:rPr>
+                  <m:sty m:val="p"/>
+                </m:rPr>
+                <w:rPr>
+                  <w:rFonts w:ascii="Cambria Math" w:hAnsi="Cambria Math"/>
+                  <w:lang w:val="de-AT" w:eastAsia="de-AT"/>
+                </w:rPr>
+                <m:t xml:space="preserve"> </m:t>
+              </m:r>
+              <m:r>
+                <w:rPr>
+                  <w:rFonts w:ascii="Cambria Math" w:hAnsi="Cambria Math"/>
+                  <w:lang w:val="de-AT" w:eastAsia="de-AT"/>
+                </w:rPr>
+                <m:t>Gewicht</m:t>
+              </m:r>
+              <m:r>
+                <w:rPr>
+                  <w:rFonts w:ascii="Cambria Math" w:hAnsi="Cambria Math"/>
+                  <w:lang w:val="de-AT" w:eastAsia="de-AT"/>
+                </w:rPr>
+                <m:t xml:space="preserve"> in </m:t>
+              </m:r>
+              <m:r>
+                <w:rPr>
+                  <w:rFonts w:ascii="Cambria Math" w:hAnsi="Cambria Math"/>
+                  <w:lang w:val="de-AT" w:eastAsia="de-AT"/>
+                </w:rPr>
+                <m:t>Gramm</m:t>
+              </m:r>
+            </m:num>
+            <m:den>
+              <m:r>
+                <w:rPr>
+                  <w:rFonts w:ascii="Cambria Math" w:hAnsi="Cambria Math"/>
+                  <w:lang w:val="de-AT" w:eastAsia="de-AT"/>
+                </w:rPr>
+                <m:t>Rohwert</m:t>
+              </m:r>
+              <m:r>
+                <m:rPr>
+                  <m:sty m:val="p"/>
+                </m:rPr>
+                <w:rPr>
+                  <w:rFonts w:ascii="Cambria Math" w:hAnsi="Cambria Math"/>
+                  <w:lang w:val="de-AT" w:eastAsia="de-AT"/>
+                </w:rPr>
+                <m:t xml:space="preserve"> </m:t>
+              </m:r>
+              <m:r>
+                <w:rPr>
+                  <w:rFonts w:ascii="Cambria Math" w:hAnsi="Cambria Math"/>
+                  <w:lang w:val="de-AT" w:eastAsia="de-AT"/>
+                </w:rPr>
+                <m:t>der</m:t>
+              </m:r>
+              <m:r>
+                <m:rPr>
+                  <m:sty m:val="p"/>
+                </m:rPr>
+                <w:rPr>
+                  <w:rFonts w:ascii="Cambria Math" w:hAnsi="Cambria Math"/>
+                  <w:lang w:val="de-AT" w:eastAsia="de-AT"/>
+                </w:rPr>
+                <m:t xml:space="preserve"> </m:t>
+              </m:r>
+              <m:r>
+                <w:rPr>
+                  <w:rFonts w:ascii="Cambria Math" w:hAnsi="Cambria Math"/>
+                  <w:lang w:val="de-AT" w:eastAsia="de-AT"/>
+                </w:rPr>
+                <m:t>W</m:t>
+              </m:r>
+              <m:r>
+                <m:rPr>
+                  <m:sty m:val="p"/>
+                </m:rPr>
+                <w:rPr>
+                  <w:rFonts w:ascii="Cambria Math" w:hAnsi="Cambria Math"/>
+                  <w:lang w:val="de-AT" w:eastAsia="de-AT"/>
+                </w:rPr>
+                <m:t>ä</m:t>
+              </m:r>
+              <m:r>
+                <w:rPr>
+                  <w:rFonts w:ascii="Cambria Math" w:hAnsi="Cambria Math"/>
+                  <w:lang w:val="de-AT" w:eastAsia="de-AT"/>
+                </w:rPr>
+                <m:t>gezelle</m:t>
+              </m:r>
+            </m:den>
+          </m:f>
+          <m:r>
+            <m:rPr>
+              <m:sty m:val="p"/>
+            </m:rPr>
+            <w:rPr>
+              <w:rFonts w:ascii="Cambria Math" w:hAnsi="Cambria Math"/>
+              <w:lang w:val="de-AT" w:eastAsia="de-AT"/>
+            </w:rPr>
+            <m:t xml:space="preserve"> </m:t>
+          </m:r>
+        </m:oMath>
+      </m:oMathPara>
+    </w:p>
+    <w:p>
+      <w:pPr>
+        <w:pStyle w:val="Text"/>
+        <w:rPr>
+          <w:lang w:eastAsia="de-AT"/>
+        </w:rPr>
+      </w:pPr>
+    </w:p>
+    <w:p>
+      <w:pPr>
+        <w:pStyle w:val="Text"/>
+        <w:rPr>
+          <w:lang w:eastAsia="de-AT"/>
+        </w:rPr>
+      </w:pPr>
+      <w:r>
+        <w:rPr>
+          <w:lang w:eastAsia="de-AT"/>
+        </w:rPr>
+        <w:t>Die detaillierte hardwareseitige Realisierung sowie deren praktische Auslegung werden in den entsprechenden projektbezogenen Kapiteln behandelt.</w:t>
+      </w:r>
     </w:p>
     <w:p>
       <w:pPr>
@@ -9997,6 +10170,7 @@
       <w:bookmarkStart w:id="60" w:name="_Toc223637579"/>
       <w:commentRangeStart w:id="61"/>
       <w:commentRangeStart w:id="62"/>
+      <w:commentRangeStart w:id="63"/>
       <w:r>
         <w:lastRenderedPageBreak/>
         <w:t>Interface</w:t>
@@ -10020,6 +10194,15 @@
         </w:rPr>
         <w:commentReference w:id="62"/>
       </w:r>
+      <w:commentRangeEnd w:id="63"/>
+      <w:r>
+        <w:rPr>
+          <w:rStyle w:val="Kommentarzeichen"/>
+          <w:b w:val="0"/>
+          <w:bCs w:val="0"/>
+        </w:rPr>
+        <w:commentReference w:id="63"/>
+      </w:r>
     </w:p>
     <w:p>
       <w:pPr>
@@ -10261,7 +10444,7 @@
           <w:lang w:val="de-AT" w:eastAsia="de-DE"/>
         </w:rPr>
       </w:pPr>
-      <w:commentRangeStart w:id="63"/>
+      <w:commentRangeStart w:id="64"/>
       <w:r>
         <w:rPr>
           <w:b/>
@@ -10278,13 +10461,13 @@
         </w:rPr>
         <w:t>Overview</w:t>
       </w:r>
-      <w:commentRangeEnd w:id="63"/>
+      <w:commentRangeEnd w:id="64"/>
       <w:proofErr w:type="spellEnd"/>
       <w:r>
         <w:rPr>
           <w:rStyle w:val="Kommentarzeichen"/>
         </w:rPr>
-        <w:commentReference w:id="63"/>
+        <w:commentReference w:id="64"/>
       </w:r>
     </w:p>
     <w:p>
@@ -10366,12 +10549,12 @@
       <w:pPr>
         <w:pStyle w:val="berschrift3"/>
       </w:pPr>
-      <w:bookmarkStart w:id="64" w:name="_Toc223637581"/>
+      <w:bookmarkStart w:id="65" w:name="_Toc223637581"/>
       <w:r>
         <w:lastRenderedPageBreak/>
         <w:t>Verwendung von Literatur, Internetquellen und KI</w:t>
       </w:r>
-      <w:bookmarkEnd w:id="64"/>
+      <w:bookmarkEnd w:id="65"/>
     </w:p>
     <w:p>
       <w:pPr>
@@ -10444,32 +10627,42 @@
       <w:pPr>
         <w:pStyle w:val="berschrift2"/>
       </w:pPr>
-      <w:bookmarkStart w:id="65" w:name="_Toc223637582"/>
+      <w:bookmarkStart w:id="66" w:name="_Toc223637582"/>
       <w:r>
         <w:lastRenderedPageBreak/>
         <w:t>Praktische Umsetzung</w:t>
       </w:r>
-      <w:bookmarkEnd w:id="65"/>
+      <w:bookmarkEnd w:id="66"/>
     </w:p>
     <w:p>
       <w:pPr>
         <w:pStyle w:val="berschrift3"/>
       </w:pPr>
-      <w:bookmarkStart w:id="66" w:name="_Toc223637583"/>
-      <w:commentRangeStart w:id="67"/>
+      <w:bookmarkStart w:id="67" w:name="_Toc223637583"/>
+      <w:commentRangeStart w:id="68"/>
+      <w:commentRangeStart w:id="69"/>
       <w:r>
         <w:t>Tiefenmessung mit Stereo-Vision</w:t>
       </w:r>
-      <w:commentRangeEnd w:id="67"/>
+      <w:commentRangeEnd w:id="68"/>
       <w:r>
         <w:rPr>
           <w:rStyle w:val="Kommentarzeichen"/>
           <w:b w:val="0"/>
           <w:bCs w:val="0"/>
         </w:rPr>
-        <w:commentReference w:id="67"/>
-      </w:r>
-      <w:bookmarkEnd w:id="66"/>
+        <w:commentReference w:id="68"/>
+      </w:r>
+      <w:bookmarkEnd w:id="67"/>
+      <w:commentRangeEnd w:id="69"/>
+      <w:r>
+        <w:rPr>
+          <w:rStyle w:val="Kommentarzeichen"/>
+          <w:b w:val="0"/>
+          <w:bCs w:val="0"/>
+        </w:rPr>
+        <w:commentReference w:id="69"/>
+      </w:r>
     </w:p>
     <w:p>
       <w:pPr>
@@ -10574,47 +10767,31 @@
         <w:t xml:space="preserve">, </w:t>
       </w:r>
       <w:r>
-        <w:t xml:space="preserve">konnte jedoch keine stabile Implementierung erreicht werden. Die resultierende Messabweichung </w:t>
-      </w:r>
-      <w:r>
-        <w:t>lag</w:t>
-      </w:r>
-      <w:r>
-        <w:t xml:space="preserve"> bei bis zu ±</w:t>
-      </w:r>
-      <w:r>
-        <w:t>5</w:t>
-      </w:r>
-      <w:r>
-        <w:t xml:space="preserve"> cm und war damit für die Anforderungen des Projekts in keiner Weise akzeptabel.</w:t>
-      </w:r>
-    </w:p>
-    <w:p>
-      <w:pPr>
-        <w:pStyle w:val="Text"/>
-      </w:pPr>
-      <w:r>
-        <w:t>Aus diesem Grund wurde von der Punktwolkenlösung Abstand genommen und ein alternativer Ansatz</w:t>
-      </w:r>
-      <w:r>
-        <w:t xml:space="preserve"> verwendet</w:t>
+        <w:t xml:space="preserve">konnte jedoch keine stabile Implementierung erreicht werden. </w:t>
+      </w:r>
+      <w:r>
+        <w:t>Die praktische Messabweichung betrug bis zu ±5 cm und entsprach damit in keiner Weise den Anforderungen des Projekts. Aus diesem Grund wurde der Ansatz mit der Punktwolke verworfen und stattdessen eine alternative Methode verwendet</w:t>
+      </w:r>
+      <w:r>
+        <w:t xml:space="preserve"> mit Pixel-Umrechnung</w:t>
       </w:r>
       <w:r>
         <w:t>.</w:t>
       </w:r>
+      <w:r>
+        <w:br w:type="page"/>
+      </w:r>
     </w:p>
     <w:p>
       <w:pPr>
         <w:pStyle w:val="Text"/>
         <w:rPr>
           <w:b/>
-          <w:bCs/>
         </w:rPr>
       </w:pPr>
       <w:r>
         <w:rPr>
           <w:b/>
-          <w:bCs/>
         </w:rPr>
         <w:lastRenderedPageBreak/>
         <w:t>Distanzabhängige Pixel-Umrechnung</w:t>
@@ -10639,6 +10816,165 @@
     <w:p>
       <w:pPr>
         <w:pStyle w:val="Text"/>
+      </w:pPr>
+      <m:oMathPara>
+        <m:oMath>
+          <m:r>
+            <w:rPr>
+              <w:rFonts w:ascii="Cambria Math" w:hAnsi="Cambria Math"/>
+            </w:rPr>
+            <m:t>Millimeter</m:t>
+          </m:r>
+          <m:r>
+            <m:rPr>
+              <m:sty m:val="p"/>
+            </m:rPr>
+            <w:rPr>
+              <w:rFonts w:ascii="Cambria Math" w:hAnsi="Cambria Math"/>
+            </w:rPr>
+            <m:t xml:space="preserve"> </m:t>
+          </m:r>
+          <m:r>
+            <w:rPr>
+              <w:rFonts w:ascii="Cambria Math" w:hAnsi="Cambria Math"/>
+            </w:rPr>
+            <m:t>pro</m:t>
+          </m:r>
+          <m:r>
+            <m:rPr>
+              <m:sty m:val="p"/>
+            </m:rPr>
+            <w:rPr>
+              <w:rFonts w:ascii="Cambria Math" w:hAnsi="Cambria Math"/>
+            </w:rPr>
+            <m:t xml:space="preserve"> </m:t>
+          </m:r>
+          <m:r>
+            <w:rPr>
+              <w:rFonts w:ascii="Cambria Math" w:hAnsi="Cambria Math"/>
+            </w:rPr>
+            <m:t>Pixel</m:t>
+          </m:r>
+          <m:r>
+            <m:rPr>
+              <m:sty m:val="p"/>
+            </m:rPr>
+            <w:rPr>
+              <w:rFonts w:ascii="Cambria Math" w:hAnsi="Cambria Math"/>
+            </w:rPr>
+            <m:t xml:space="preserve"> =</m:t>
+          </m:r>
+          <m:f>
+            <m:fPr>
+              <m:ctrlPr>
+                <w:rPr>
+                  <w:rFonts w:ascii="Cambria Math" w:hAnsi="Cambria Math"/>
+                </w:rPr>
+              </m:ctrlPr>
+            </m:fPr>
+            <m:num>
+              <m:r>
+                <w:rPr>
+                  <w:rFonts w:ascii="Cambria Math" w:hAnsi="Cambria Math"/>
+                </w:rPr>
+                <m:t>Reale</m:t>
+              </m:r>
+              <m:r>
+                <m:rPr>
+                  <m:sty m:val="p"/>
+                </m:rPr>
+                <w:rPr>
+                  <w:rFonts w:ascii="Cambria Math" w:hAnsi="Cambria Math"/>
+                </w:rPr>
+                <m:t xml:space="preserve"> </m:t>
+              </m:r>
+              <m:r>
+                <w:rPr>
+                  <w:rFonts w:ascii="Cambria Math" w:hAnsi="Cambria Math"/>
+                </w:rPr>
+                <m:t>Gr</m:t>
+              </m:r>
+              <m:r>
+                <m:rPr>
+                  <m:sty m:val="p"/>
+                </m:rPr>
+                <w:rPr>
+                  <w:rFonts w:ascii="Cambria Math" w:hAnsi="Cambria Math"/>
+                </w:rPr>
+                <m:t>öß</m:t>
+              </m:r>
+              <m:r>
+                <w:rPr>
+                  <w:rFonts w:ascii="Cambria Math" w:hAnsi="Cambria Math"/>
+                </w:rPr>
+                <m:t>e</m:t>
+              </m:r>
+              <m:r>
+                <m:rPr>
+                  <m:sty m:val="p"/>
+                </m:rPr>
+                <w:rPr>
+                  <w:rFonts w:ascii="Cambria Math" w:hAnsi="Cambria Math"/>
+                </w:rPr>
+                <m:t xml:space="preserve"> </m:t>
+              </m:r>
+              <m:r>
+                <w:rPr>
+                  <w:rFonts w:ascii="Cambria Math" w:hAnsi="Cambria Math"/>
+                </w:rPr>
+                <m:t>in</m:t>
+              </m:r>
+              <m:r>
+                <m:rPr>
+                  <m:sty m:val="p"/>
+                </m:rPr>
+                <w:rPr>
+                  <w:rFonts w:ascii="Cambria Math" w:hAnsi="Cambria Math"/>
+                </w:rPr>
+                <m:t xml:space="preserve"> </m:t>
+              </m:r>
+              <m:r>
+                <w:rPr>
+                  <w:rFonts w:ascii="Cambria Math" w:hAnsi="Cambria Math"/>
+                </w:rPr>
+                <m:t>Millimeter</m:t>
+              </m:r>
+            </m:num>
+            <m:den>
+              <m:r>
+                <w:rPr>
+                  <w:rFonts w:ascii="Cambria Math" w:hAnsi="Cambria Math"/>
+                </w:rPr>
+                <m:t>Pixelgr</m:t>
+              </m:r>
+              <m:r>
+                <m:rPr>
+                  <m:sty m:val="p"/>
+                </m:rPr>
+                <w:rPr>
+                  <w:rFonts w:ascii="Cambria Math" w:hAnsi="Cambria Math"/>
+                </w:rPr>
+                <m:t>öß</m:t>
+              </m:r>
+              <m:r>
+                <w:rPr>
+                  <w:rFonts w:ascii="Cambria Math" w:hAnsi="Cambria Math"/>
+                </w:rPr>
+                <m:t>e</m:t>
+              </m:r>
+            </m:den>
+          </m:f>
+        </m:oMath>
+      </m:oMathPara>
+    </w:p>
+    <w:p>
+      <w:pPr>
+        <w:pStyle w:val="Text"/>
+      </w:pPr>
+    </w:p>
+    <w:p>
+      <w:pPr>
+        <w:pStyle w:val="Text"/>
         <w:rPr>
           <w:b/>
         </w:rPr>
@@ -10647,128 +10983,6 @@
         <w:rPr>
           <w:b/>
         </w:rPr>
-        <w:t>Programm Ablauf</w:t>
-      </w:r>
-    </w:p>
-    <w:p>
-      <w:pPr>
-        <w:pStyle w:val="Text"/>
-      </w:pPr>
-      <w:r>
-        <w:t xml:space="preserve">Zunächst wird eine Kalibrierungsdatei geladen. Diese enthält die zentralen Referenzwerte, insbesondere den Abstand zwischen Kamera und </w:t>
-      </w:r>
-      <w:proofErr w:type="spellStart"/>
-      <w:r>
-        <w:t>Wägeplatte</w:t>
-      </w:r>
-      <w:proofErr w:type="spellEnd"/>
-      <w:r>
-        <w:t xml:space="preserve"> sowie den zugehörigen Umrechnungsfaktor in Millimeter pro Pixel.</w:t>
-      </w:r>
-    </w:p>
-    <w:p>
-      <w:pPr>
-        <w:pStyle w:val="Text"/>
-      </w:pPr>
-      <w:r>
-        <w:t xml:space="preserve">Anschließend wird </w:t>
-      </w:r>
-      <w:r>
-        <w:t xml:space="preserve">das </w:t>
-      </w:r>
-      <w:r>
-        <w:t>Tiefenbild aufgenommen. In einem Vorverarbeitungsschritt werden</w:t>
-      </w:r>
-      <w:r>
-        <w:t>, dann</w:t>
-      </w:r>
-      <w:r>
-        <w:t xml:space="preserve"> alle Pixel entfernt</w:t>
-      </w:r>
-      <w:r>
-        <w:t>,</w:t>
-      </w:r>
-      <w:r>
-        <w:t xml:space="preserve"> die außerhalb der definierten Region </w:t>
-      </w:r>
-      <w:proofErr w:type="spellStart"/>
-      <w:r>
-        <w:t>of</w:t>
-      </w:r>
-      <w:proofErr w:type="spellEnd"/>
-      <w:r>
-        <w:t xml:space="preserve"> Interest (ROI) liegen oder deren Tiefenwert außerhalb des zulässigen Bereichs zur </w:t>
-      </w:r>
-      <w:proofErr w:type="spellStart"/>
-      <w:r>
-        <w:t>Wägeplatte</w:t>
-      </w:r>
-      <w:proofErr w:type="spellEnd"/>
-      <w:r>
-        <w:t xml:space="preserve"> liegt. Dadurch bleiben ausschließlich jene Punkte erhalten, die dem </w:t>
-      </w:r>
-      <w:r>
-        <w:t>zu vermessendem Objekt</w:t>
-      </w:r>
-      <w:r>
-        <w:t xml:space="preserve"> zugeordnet werden können.</w:t>
-      </w:r>
-    </w:p>
-    <w:p>
-      <w:pPr>
-        <w:pStyle w:val="Text"/>
-      </w:pPr>
-      <w:r>
-        <w:t xml:space="preserve">Die verbleibenden Objektpunkte werden mithilfe einer </w:t>
-      </w:r>
-      <w:proofErr w:type="spellStart"/>
-      <w:r>
-        <w:t>Bounding</w:t>
-      </w:r>
-      <w:proofErr w:type="spellEnd"/>
-      <w:r>
-        <w:t xml:space="preserve"> Box analysiert. Die ermittelten Kantenlängen werden zunächst in Pixeln bestimmt. Abschließend erfolgt die Umrechnung in reale Maßeinheiten, indem die Pixelwerte mit dem zuvor geladenen Kalibrierfaktor multipliziert werden.</w:t>
-      </w:r>
-    </w:p>
-    <w:p>
-      <w:pPr>
-        <w:pStyle w:val="Text"/>
-      </w:pPr>
-    </w:p>
-    <w:p>
-      <w:pPr>
-        <w:pStyle w:val="Text"/>
-      </w:pPr>
-      <w:r>
-        <w:t>Auf diese Weise wird eine funktionsfähige und reproduzierbare Pixel-Umrechnung zur Bestimmung realer Objektabmessungen gewährleistet.</w:t>
-      </w:r>
-    </w:p>
-    <w:p>
-      <w:pPr>
-        <w:jc w:val="left"/>
-      </w:pPr>
-      <w:r>
-        <w:br w:type="page"/>
-      </w:r>
-    </w:p>
-    <w:p>
-      <w:pPr>
-        <w:pStyle w:val="StandardWeb"/>
-        <w:rPr>
-          <w:rFonts w:ascii="Arial" w:hAnsi="Arial"/>
-          <w:b/>
-          <w:bCs/>
-          <w:sz w:val="28"/>
-        </w:rPr>
-      </w:pPr>
-      <w:r>
-        <w:rPr>
-          <w:rFonts w:ascii="Arial" w:hAnsi="Arial"/>
-          <w:b/>
-          <w:bCs/>
-          <w:sz w:val="28"/>
-        </w:rPr>
-        <w:lastRenderedPageBreak/>
         <w:t>Visualisierung und Filterung des Tiefenbildes</w:t>
       </w:r>
     </w:p>
@@ -10777,7 +10991,25 @@
         <w:pStyle w:val="Text"/>
       </w:pPr>
       <w:r>
-        <w:t>Zur Analyse der Tiefendaten wurde das Tiefenbild mittels JET-Farbskala dargestellt (siehe Abbildung). Dabei kennzeichnet Rot geringe Distanzen, Grün mittlere Entfernungen und Blau weiter entfernte Bereiche. Diese Darstellung dient ausschließlich der visuellen Kontrolle und erleichtert die Bewertung der erfassten Tiefenstruktur.</w:t>
+        <w:t xml:space="preserve">Zur Analyse der Tiefendaten wurde das Tiefenbild mittels </w:t>
+      </w:r>
+      <w:r>
+        <w:rPr>
+          <w:rStyle w:val="Hervorhebung"/>
+        </w:rPr>
+        <w:t>JET-Farbskala</w:t>
+      </w:r>
+      <w:r>
+        <w:t xml:space="preserve"> dargestellt (siehe Abbildung). Dabei kennzeichnet Rot geringe Distanzen, Grün mittlere Entfernungen und Blau weiter entfernte Bereiche. Diese Darstellung dient ausschließlich der </w:t>
+      </w:r>
+      <w:r>
+        <w:rPr>
+          <w:rStyle w:val="Hervorhebung"/>
+        </w:rPr>
+        <w:t>visuellen Kontrolle</w:t>
+      </w:r>
+      <w:r>
+        <w:t xml:space="preserve"> und erleichtert die Bewertung der erfassten Tiefenstruktur.</w:t>
       </w:r>
     </w:p>
     <w:p>
@@ -10790,8 +11022,8 @@
           <w:noProof/>
         </w:rPr>
         <w:drawing>
-          <wp:inline distT="0" distB="0" distL="0" distR="0" wp14:anchorId="529F68B3" wp14:editId="347B073E">
-            <wp:extent cx="3794760" cy="2477148"/>
+          <wp:inline distT="0" distB="0" distL="0" distR="0" wp14:anchorId="529F68B3" wp14:editId="6C35540B">
+            <wp:extent cx="3471333" cy="2266022"/>
             <wp:effectExtent l="0" t="0" r="0" b="0"/>
             <wp:docPr id="835925023" name="Grafik 1" descr="Ein Bild, das Karte, Screenshot enthält.&#10;&#10;KI-generierte Inhalte können fehlerhaft sein."/>
             <wp:cNvGraphicFramePr>
@@ -10813,7 +11045,7 @@
                   <pic:spPr>
                     <a:xfrm>
                       <a:off x="0" y="0"/>
-                      <a:ext cx="3815435" cy="2490644"/>
+                      <a:ext cx="3521900" cy="2299031"/>
                     </a:xfrm>
                     <a:prstGeom prst="rect">
                       <a:avLst/>
@@ -10901,7 +11133,16 @@
         <w:pStyle w:val="Text"/>
       </w:pPr>
       <w:r>
-        <w:t xml:space="preserve">Für die Messung wird eine definierte ROI festgelegt (siehe Abbildung). Dadurch wird der auszuwertende Bereich gezielt auf die </w:t>
+        <w:t xml:space="preserve">Für die Messung wird eine definierte </w:t>
+      </w:r>
+      <w:r>
+        <w:rPr>
+          <w:rStyle w:val="Hervorhebung"/>
+        </w:rPr>
+        <w:t>ROI</w:t>
+      </w:r>
+      <w:r>
+        <w:t xml:space="preserve"> festgelegt (siehe Abbildung). Dadurch wird der auszuwertende Bereich gezielt auf die </w:t>
       </w:r>
       <w:proofErr w:type="spellStart"/>
       <w:r>
@@ -10927,9 +11168,10 @@
         <w:rPr>
           <w:noProof/>
         </w:rPr>
+        <w:lastRenderedPageBreak/>
         <w:drawing>
-          <wp:inline distT="0" distB="0" distL="0" distR="0" wp14:anchorId="5E2B8269" wp14:editId="53974DAD">
-            <wp:extent cx="3703320" cy="2481462"/>
+          <wp:inline distT="0" distB="0" distL="0" distR="0" wp14:anchorId="5E2B8269" wp14:editId="348D5D98">
+            <wp:extent cx="3157855" cy="2115966"/>
             <wp:effectExtent l="0" t="0" r="0" b="0"/>
             <wp:docPr id="60036506" name="Grafik 1" descr="Ein Bild, das Text, Screenshot enthält.&#10;&#10;KI-generierte Inhalte können fehlerhaft sein."/>
             <wp:cNvGraphicFramePr>
@@ -10951,7 +11193,7 @@
                   <pic:spPr>
                     <a:xfrm>
                       <a:off x="0" y="0"/>
-                      <a:ext cx="3721362" cy="2493552"/>
+                      <a:ext cx="3188345" cy="2136396"/>
                     </a:xfrm>
                     <a:prstGeom prst="rect">
                       <a:avLst/>
@@ -11021,8 +11263,7 @@
         <w:pStyle w:val="Text"/>
       </w:pPr>
       <w:r>
-        <w:lastRenderedPageBreak/>
-        <w:t xml:space="preserve">Zusätzlich erfolgt eine Tiefenfilterung. Dabei werden alle Punkte entfernt, deren Z-Wert unterhalb des Referenzabstands zur </w:t>
+        <w:t xml:space="preserve">Es erfolgt zudem eine Tiefenfilterung: Alle Punkte, deren Z-Wert unterhalb des Referenzabstands zur </w:t>
       </w:r>
       <w:proofErr w:type="spellStart"/>
       <w:r>
@@ -11030,16 +11271,22 @@
       </w:r>
       <w:proofErr w:type="spellEnd"/>
       <w:r>
-        <w:t xml:space="preserve"> liegt. Ein zusätzlicher Toleranzbereich von +1 cm berücksichtigt mögliches </w:t>
-      </w:r>
-      <w:proofErr w:type="spellStart"/>
-      <w:r>
-        <w:t>Sensorauschen</w:t>
-      </w:r>
-      <w:proofErr w:type="spellEnd"/>
-      <w:r>
-        <w:t xml:space="preserve"> und verhindert Fehlklassifikationen bei kleinen Objekten.</w:t>
-      </w:r>
+        <w:t xml:space="preserve"> liegt, werden entfernt. Ein zusätzlicher Puffer von </w:t>
+      </w:r>
+      <w:r>
+        <w:rPr>
+          <w:rStyle w:val="Hervorhebung"/>
+        </w:rPr>
+        <w:t>+1 cm</w:t>
+      </w:r>
+      <w:r>
+        <w:t xml:space="preserve"> berücksichtigt Schwankungen in den Tiefenwerten der von der OAK-D2 erzeugten Tiefenkarte und verhindert Fehlzuordnungen bei kleinen Objekten.</w:t>
+      </w:r>
+    </w:p>
+    <w:p>
+      <w:pPr>
+        <w:pStyle w:val="Text"/>
+      </w:pPr>
     </w:p>
     <w:p>
       <w:pPr>
@@ -11052,8 +11299,8 @@
           <w:noProof/>
         </w:rPr>
         <w:drawing>
-          <wp:inline distT="0" distB="0" distL="0" distR="0" wp14:anchorId="66F51B54" wp14:editId="4305E973">
-            <wp:extent cx="4297680" cy="2606905"/>
+          <wp:inline distT="0" distB="0" distL="0" distR="0" wp14:anchorId="66F51B54" wp14:editId="739B5241">
+            <wp:extent cx="4300442" cy="2455334"/>
             <wp:effectExtent l="0" t="0" r="0" b="0"/>
             <wp:docPr id="1594431449" name="Grafik 1" descr="Ein Bild, das Text, Screenshot, Diagramm enthält.&#10;&#10;KI-generierte Inhalte können fehlerhaft sein."/>
             <wp:cNvGraphicFramePr>
@@ -11068,7 +11315,7 @@
                   </pic:nvPicPr>
                   <pic:blipFill rotWithShape="1">
                     <a:blip r:embed="rId54"/>
-                    <a:srcRect b="8321"/>
+                    <a:srcRect b="13707"/>
                     <a:stretch>
                       <a:fillRect/>
                     </a:stretch>
@@ -11076,7 +11323,7 @@
                   <pic:spPr bwMode="auto">
                     <a:xfrm>
                       <a:off x="0" y="0"/>
-                      <a:ext cx="4324060" cy="2622906"/>
+                      <a:ext cx="4341574" cy="2478818"/>
                     </a:xfrm>
                     <a:prstGeom prst="rect">
                       <a:avLst/>
@@ -11153,72 +11400,184 @@
         <w:pStyle w:val="Text"/>
       </w:pPr>
       <w:r>
-        <w:t>Zu Beginn der Entwicklungsphase wurde die Pixelauswertung visuell überprüft, um die Kalibrierung der Umrechnungsfaktoren zu kontrollieren. Die blau markierten Messbereiche erleichterten dabei das Erkennen möglicher Fehler (siehe Abbildung). In der finalen Implementierung erfolgt die Objekterkennung automatisch, und die berechneten Abmessungen werden direkt an das Interface übergeben.</w:t>
-      </w:r>
-    </w:p>
-    <w:p>
-      <w:pPr>
-        <w:pStyle w:val="Text"/>
-      </w:pPr>
-    </w:p>
-    <w:p>
-      <w:pPr>
-        <w:pStyle w:val="Text"/>
-      </w:pPr>
-    </w:p>
-    <w:p>
-      <w:pPr>
-        <w:pStyle w:val="Text"/>
-      </w:pPr>
-    </w:p>
-    <w:p>
-      <w:pPr>
-        <w:pStyle w:val="Text"/>
-      </w:pPr>
-    </w:p>
-    <w:p>
-      <w:pPr>
-        <w:pStyle w:val="Text"/>
-      </w:pPr>
-    </w:p>
-    <w:p>
-      <w:pPr>
-        <w:pStyle w:val="Text"/>
-      </w:pPr>
-    </w:p>
-    <w:p>
-      <w:pPr>
-        <w:pStyle w:val="Text"/>
-      </w:pPr>
-    </w:p>
-    <w:p>
-      <w:pPr>
-        <w:pStyle w:val="Text"/>
-      </w:pPr>
-    </w:p>
-    <w:p>
-      <w:pPr>
-        <w:pStyle w:val="Text"/>
-      </w:pPr>
-      <w:r>
+        <w:t>Zur Kontrolle der Kalibrierung der Umrechnungsfaktoren wurde die Pixelauswertung live überprüft. D</w:t>
+      </w:r>
+      <w:r>
+        <w:t>ie</w:t>
+      </w:r>
+      <w:r>
+        <w:t xml:space="preserve"> </w:t>
+      </w:r>
+      <w:r>
+        <w:rPr>
+          <w:rStyle w:val="Hervorhebung"/>
+        </w:rPr>
+        <w:t xml:space="preserve">blau hervorgehobenen </w:t>
+      </w:r>
+      <w:r>
+        <w:rPr>
+          <w:rStyle w:val="Hervorhebung"/>
+        </w:rPr>
+        <w:t>Objektoberfläche</w:t>
+      </w:r>
+      <w:r>
+        <w:t xml:space="preserve"> erleichterten dabei das Erkennen möglicher </w:t>
+      </w:r>
+      <w:r>
+        <w:t>Objekte</w:t>
+      </w:r>
+      <w:r>
+        <w:t xml:space="preserve"> (siehe Abbildung). In der finalen Umsetzung erfolgt die Objekterkennung vollständig automatisch</w:t>
+      </w:r>
+      <w:r>
+        <w:t>.</w:t>
+      </w:r>
+      <w:r>
+        <w:br w:type="page"/>
+      </w:r>
+    </w:p>
+    <w:p>
+      <w:pPr>
+        <w:pStyle w:val="Text"/>
         <w:rPr>
           <w:b/>
-          <w:bCs/>
+        </w:rPr>
+      </w:pPr>
+      <w:r>
+        <w:rPr>
+          <w:b/>
         </w:rPr>
         <w:lastRenderedPageBreak/>
-        <w:t>Gemessene Werte</w:t>
-      </w:r>
-      <w:r>
+        <w:t>Programm Ablauf</w:t>
+      </w:r>
+    </w:p>
+    <w:p>
+      <w:pPr>
+        <w:pStyle w:val="Text"/>
+      </w:pPr>
+      <w:r>
+        <w:t xml:space="preserve">Zu Beginn </w:t>
+      </w:r>
+      <w:r>
+        <w:t xml:space="preserve">wird eine Kalibrierungsdatei geladen. Diese enthält die zentralen Referenzwerte, insbesondere den Abstand zwischen Kamera und </w:t>
+      </w:r>
+      <w:r>
+        <w:t xml:space="preserve">der </w:t>
+      </w:r>
+      <w:proofErr w:type="spellStart"/>
+      <w:r>
+        <w:t>Wägeplatte</w:t>
+      </w:r>
+      <w:proofErr w:type="spellEnd"/>
+      <w:r>
+        <w:t xml:space="preserve"> sowie den zugehörigen Umrechnungsfaktor in Millimeter pro Pixel.</w:t>
+      </w:r>
+    </w:p>
+    <w:p>
+      <w:pPr>
+        <w:pStyle w:val="Text"/>
+      </w:pPr>
+      <w:r>
+        <w:t xml:space="preserve">Anschließend wird das Tiefenbild aufgenommen. In einem Vorverarbeitungsschritt werden, dann alle Pixel entfernt, die außerhalb der definierten Region </w:t>
+      </w:r>
+      <w:proofErr w:type="spellStart"/>
+      <w:r>
+        <w:t>of</w:t>
+      </w:r>
+      <w:proofErr w:type="spellEnd"/>
+      <w:r>
+        <w:t xml:space="preserve"> Interest (ROI) liegen oder deren Tiefenwert außerhalb des zulässigen Bereichs zur </w:t>
+      </w:r>
+      <w:proofErr w:type="spellStart"/>
+      <w:r>
+        <w:t>Wägeplatte</w:t>
+      </w:r>
+      <w:proofErr w:type="spellEnd"/>
+      <w:r>
+        <w:t xml:space="preserve"> liegt. </w:t>
+      </w:r>
+    </w:p>
+    <w:p>
+      <w:pPr>
+        <w:pStyle w:val="Text"/>
+      </w:pPr>
+      <w:r>
+        <w:t xml:space="preserve">Die verbleibenden Objektpunkte werden mithilfe einer rotationsrobusten </w:t>
+      </w:r>
+      <w:proofErr w:type="spellStart"/>
+      <w:r>
+        <w:t>Bounding</w:t>
+      </w:r>
+      <w:proofErr w:type="spellEnd"/>
+      <w:r>
+        <w:t xml:space="preserve"> Box analysiert, die unabhängig von der Ausrichtung des Objekts stets die kleinstmögliche umschließende Box bestimmt. Aus dieser </w:t>
+      </w:r>
+      <w:proofErr w:type="spellStart"/>
+      <w:r>
+        <w:t>Bounding</w:t>
+      </w:r>
+      <w:proofErr w:type="spellEnd"/>
+      <w:r>
+        <w:t xml:space="preserve"> Box werden die Kantenlängen in Pixeln berechnet. Anschließend erfolgt die Umrechnung in reale Maßeinheiten, indem die ermittelten Pixelwerte mit dem zuvor bestimmten Kalibrierfaktor multipliziert werden.</w:t>
+      </w:r>
+      <w:r>
+        <w:t xml:space="preserve"> </w:t>
+      </w:r>
+      <w:r>
+        <w:t>Dieses Ergebnis mit den</w:t>
+      </w:r>
+      <w:r>
+        <w:t xml:space="preserve"> berechneten Abmessungen </w:t>
+      </w:r>
+      <w:r>
+        <w:t>wird</w:t>
+      </w:r>
+      <w:r>
+        <w:t xml:space="preserve"> direkt an das Interface übergeben.</w:t>
+      </w:r>
+    </w:p>
+    <w:p>
+      <w:pPr>
+        <w:pStyle w:val="Text"/>
         <w:rPr>
           <w:b/>
-          <w:bCs/>
-        </w:rPr>
-        <w:t xml:space="preserve"> von Vans-Schuh</w:t>
-      </w:r>
+          <w:lang w:val="de-AT"/>
+        </w:rPr>
+      </w:pPr>
       <w:r>
         <w:rPr>
           <w:b/>
-          <w:bCs/>
+          <w:lang w:val="de-AT"/>
+        </w:rPr>
+        <w:t>Strukturierung des Übergabe-</w:t>
+      </w:r>
+      <w:proofErr w:type="spellStart"/>
+      <w:r>
+        <w:rPr>
+          <w:b/>
+          <w:lang w:val="de-AT"/>
+        </w:rPr>
+        <w:t>Dictionar</w:t>
+      </w:r>
+      <w:r>
+        <w:rPr>
+          <w:b/>
+          <w:lang w:val="de-AT"/>
+        </w:rPr>
+        <w:t>ie</w:t>
+      </w:r>
+      <w:r>
+        <w:rPr>
+          <w:b/>
+          <w:lang w:val="de-AT"/>
+        </w:rPr>
+        <w:t>s</w:t>
+      </w:r>
+      <w:proofErr w:type="spellEnd"/>
+      <w:r>
+        <w:rPr>
+          <w:b/>
+          <w:lang w:val="de-AT"/>
         </w:rPr>
         <w:t>:</w:t>
       </w:r>
@@ -11226,174 +11585,985 @@
     <w:p>
       <w:pPr>
         <w:pStyle w:val="Text"/>
-        <w:numPr>
-          <w:ilvl w:val="0"/>
-          <w:numId w:val="43"/>
-        </w:numPr>
-      </w:pPr>
-      <w:r>
-        <w:t>Länge: 114 mm</w:t>
-      </w:r>
-    </w:p>
-    <w:p>
-      <w:pPr>
-        <w:pStyle w:val="Text"/>
-        <w:numPr>
-          <w:ilvl w:val="0"/>
-          <w:numId w:val="43"/>
-        </w:numPr>
-      </w:pPr>
-      <w:r>
-        <w:t>Breite: 265 mm</w:t>
-      </w:r>
-    </w:p>
-    <w:p>
-      <w:pPr>
-        <w:pStyle w:val="Text"/>
-        <w:numPr>
-          <w:ilvl w:val="0"/>
-          <w:numId w:val="43"/>
-        </w:numPr>
-      </w:pPr>
-      <w:r>
-        <w:t xml:space="preserve">Höhe: 98 mm </w:t>
-      </w:r>
-    </w:p>
-    <w:p>
-      <w:pPr>
-        <w:pStyle w:val="Text"/>
-        <w:keepNext/>
-        <w:jc w:val="center"/>
-      </w:pPr>
-      <w:r>
-        <w:rPr>
-          <w:noProof/>
-        </w:rPr>
-        <w:drawing>
-          <wp:inline distT="0" distB="0" distL="0" distR="0" wp14:anchorId="11492A5D" wp14:editId="55445E36">
-            <wp:extent cx="4385226" cy="1074420"/>
-            <wp:effectExtent l="0" t="0" r="0" b="0"/>
-            <wp:docPr id="1607923285" name="Grafik 1" descr="Ein Bild, das Text, Screenshot, Schrift enthält.&#10;&#10;KI-generierte Inhalte können fehlerhaft sein."/>
-            <wp:cNvGraphicFramePr>
-              <a:graphicFrameLocks xmlns:a="http://schemas.openxmlformats.org/drawingml/2006/main" noChangeAspect="1"/>
-            </wp:cNvGraphicFramePr>
-            <a:graphic xmlns:a="http://schemas.openxmlformats.org/drawingml/2006/main">
-              <a:graphicData uri="http://schemas.openxmlformats.org/drawingml/2006/picture">
-                <pic:pic xmlns:pic="http://schemas.openxmlformats.org/drawingml/2006/picture">
-                  <pic:nvPicPr>
-                    <pic:cNvPr id="1607923285" name="Grafik 1" descr="Ein Bild, das Text, Screenshot, Schrift enthält.&#10;&#10;KI-generierte Inhalte können fehlerhaft sein."/>
-                    <pic:cNvPicPr/>
-                  </pic:nvPicPr>
-                  <pic:blipFill>
-                    <a:blip r:embed="rId55"/>
-                    <a:stretch>
-                      <a:fillRect/>
-                    </a:stretch>
-                  </pic:blipFill>
-                  <pic:spPr>
-                    <a:xfrm>
-                      <a:off x="0" y="0"/>
-                      <a:ext cx="4411859" cy="1080945"/>
-                    </a:xfrm>
-                    <a:prstGeom prst="rect">
-                      <a:avLst/>
-                    </a:prstGeom>
-                  </pic:spPr>
-                </pic:pic>
-              </a:graphicData>
-            </a:graphic>
-          </wp:inline>
-        </w:drawing>
-      </w:r>
-    </w:p>
-    <w:p>
-      <w:pPr>
-        <w:pStyle w:val="Beschriftung"/>
-        <w:rPr>
-          <w:lang w:val="de-DE"/>
-        </w:rPr>
-      </w:pPr>
-      <w:r>
-        <w:rPr>
-          <w:lang w:val="de-DE"/>
-        </w:rPr>
-        <w:t xml:space="preserve">Abbildung </w:t>
-      </w:r>
-      <w:r>
-        <w:rPr>
-          <w:lang w:val="de-DE"/>
-        </w:rPr>
-        <w:fldChar w:fldCharType="begin"/>
-      </w:r>
-      <w:r>
-        <w:rPr>
-          <w:lang w:val="de-DE"/>
-        </w:rPr>
-        <w:instrText xml:space="preserve"> SEQ Abbildung \* ARABIC </w:instrText>
-      </w:r>
-      <w:r>
-        <w:rPr>
-          <w:lang w:val="de-DE"/>
-        </w:rPr>
-        <w:fldChar w:fldCharType="separate"/>
-      </w:r>
-      <w:r>
-        <w:rPr>
-          <w:noProof/>
-          <w:lang w:val="de-DE"/>
-        </w:rPr>
-        <w:t>6</w:t>
-      </w:r>
-      <w:r>
-        <w:rPr>
-          <w:lang w:val="de-DE"/>
-        </w:rPr>
-        <w:fldChar w:fldCharType="end"/>
-      </w:r>
-      <w:r>
-        <w:rPr>
-          <w:lang w:val="de-DE"/>
-        </w:rPr>
-        <w:t>: Ergebnis der Abmessungen</w:t>
-      </w:r>
-    </w:p>
-    <w:p>
-      <w:pPr>
-        <w:pStyle w:val="Text"/>
-        <w:jc w:val="center"/>
-      </w:pPr>
-    </w:p>
-    <w:p>
-      <w:pPr>
-        <w:pStyle w:val="Text"/>
-      </w:pPr>
-      <w:r>
-        <w:t xml:space="preserve">Die Messungen wurden unter nicht optimalen Lichtverhältnissen durchgeführt, wodurch geringfügige Abweichungen zum </w:t>
-      </w:r>
+        <w:pBdr>
+          <w:top w:val="single" w:sz="4" w:space="1" w:color="auto"/>
+          <w:left w:val="single" w:sz="4" w:space="4" w:color="auto"/>
+          <w:right w:val="single" w:sz="4" w:space="4" w:color="auto"/>
+        </w:pBdr>
+        <w:rPr>
+          <w:rStyle w:val="Hervorhebung"/>
+          <w:lang w:val="de-AT"/>
+        </w:rPr>
+      </w:pPr>
+      <w:r>
+        <w:rPr>
+          <w:rStyle w:val="Hervorhebung"/>
+          <w:lang w:val="de-AT"/>
+        </w:rPr>
+        <w:t>„</w:t>
+      </w:r>
+      <w:r>
+        <w:rPr>
+          <w:rStyle w:val="Hervorhebung"/>
+          <w:lang w:val="de-AT"/>
+        </w:rPr>
+        <w:t>distanz_meassure03.py</w:t>
+      </w:r>
+      <w:r>
+        <w:rPr>
+          <w:rStyle w:val="Hervorhebung"/>
+          <w:lang w:val="de-AT"/>
+        </w:rPr>
+        <w:t>“</w:t>
+      </w:r>
+    </w:p>
+    <w:p>
+      <w:pPr>
+        <w:pBdr>
+          <w:top w:val="single" w:sz="4" w:space="1" w:color="auto"/>
+          <w:left w:val="single" w:sz="4" w:space="4" w:color="auto"/>
+          <w:bottom w:val="single" w:sz="4" w:space="1" w:color="auto"/>
+          <w:right w:val="single" w:sz="4" w:space="4" w:color="auto"/>
+        </w:pBdr>
+        <w:shd w:val="clear" w:color="auto" w:fill="FEFEFE"/>
+        <w:jc w:val="left"/>
+        <w:rPr>
+          <w:rFonts w:ascii="Courier New" w:hAnsi="Courier New" w:cs="Courier New"/>
+          <w:color w:val="696969"/>
+          <w:lang w:val="de-AT"/>
+        </w:rPr>
+      </w:pPr>
+      <w:r>
+        <w:rPr>
+          <w:rFonts w:ascii="Courier New" w:hAnsi="Courier New" w:cs="Courier New"/>
+          <w:color w:val="696969"/>
+          <w:lang w:val="de-AT"/>
+        </w:rPr>
+        <w:t># Ergebnis-Dictionary</w:t>
+      </w:r>
+    </w:p>
+    <w:p>
+      <w:pPr>
+        <w:pBdr>
+          <w:top w:val="single" w:sz="4" w:space="1" w:color="auto"/>
+          <w:left w:val="single" w:sz="4" w:space="4" w:color="auto"/>
+          <w:bottom w:val="single" w:sz="4" w:space="1" w:color="auto"/>
+          <w:right w:val="single" w:sz="4" w:space="4" w:color="auto"/>
+        </w:pBdr>
+        <w:shd w:val="clear" w:color="auto" w:fill="FEFEFE"/>
+        <w:jc w:val="left"/>
+        <w:rPr>
+          <w:rFonts w:ascii="Courier New" w:hAnsi="Courier New" w:cs="Courier New"/>
+          <w:color w:val="696969"/>
+          <w:lang w:val="de-AT"/>
+        </w:rPr>
+      </w:pPr>
       <w:proofErr w:type="spellStart"/>
       <w:r>
-        <w:t>Realmaß</w:t>
+        <w:rPr>
+          <w:rFonts w:ascii="Courier New" w:hAnsi="Courier New" w:cs="Courier New"/>
+          <w:color w:val="696969"/>
+          <w:lang w:val="de-AT"/>
+        </w:rPr>
+        <w:t>result</w:t>
       </w:r>
       <w:proofErr w:type="spellEnd"/>
       <w:r>
-        <w:t xml:space="preserve"> entstanden. Insgesamt zeigt das Verfahren jedoch eine stabile und für die Anwendung ausreichende Genauigkeit.</w:t>
-      </w:r>
-    </w:p>
-    <w:p>
-      <w:pPr>
-        <w:pStyle w:val="Text"/>
-      </w:pPr>
-    </w:p>
-    <w:p>
-      <w:pPr>
-        <w:pStyle w:val="Text"/>
-      </w:pPr>
-    </w:p>
-    <w:p>
-      <w:pPr>
-        <w:pStyle w:val="Text"/>
-      </w:pPr>
-      <w:r>
+        <w:rPr>
+          <w:rFonts w:ascii="Courier New" w:hAnsi="Courier New" w:cs="Courier New"/>
+          <w:color w:val="696969"/>
+          <w:lang w:val="de-AT"/>
+        </w:rPr>
+        <w:t xml:space="preserve"> = {</w:t>
+      </w:r>
+    </w:p>
+    <w:p>
+      <w:pPr>
+        <w:pBdr>
+          <w:top w:val="single" w:sz="4" w:space="1" w:color="auto"/>
+          <w:left w:val="single" w:sz="4" w:space="4" w:color="auto"/>
+          <w:bottom w:val="single" w:sz="4" w:space="1" w:color="auto"/>
+          <w:right w:val="single" w:sz="4" w:space="4" w:color="auto"/>
+        </w:pBdr>
+        <w:shd w:val="clear" w:color="auto" w:fill="FEFEFE"/>
+        <w:jc w:val="left"/>
+        <w:rPr>
+          <w:rFonts w:ascii="Courier New" w:hAnsi="Courier New" w:cs="Courier New"/>
+          <w:color w:val="008000"/>
+          <w:lang w:val="de-AT"/>
+        </w:rPr>
+      </w:pPr>
+      <w:r>
+        <w:rPr>
+          <w:rFonts w:ascii="Courier New" w:hAnsi="Courier New" w:cs="Courier New"/>
+          <w:color w:val="545454"/>
+          <w:lang w:val="de-AT"/>
+        </w:rPr>
+        <w:t xml:space="preserve">    </w:t>
+      </w:r>
+      <w:r>
+        <w:rPr>
+          <w:rFonts w:ascii="Courier New" w:hAnsi="Courier New" w:cs="Courier New"/>
+          <w:color w:val="008000"/>
+          <w:lang w:val="de-AT"/>
+        </w:rPr>
+        <w:t>"</w:t>
+      </w:r>
+      <w:proofErr w:type="spellStart"/>
+      <w:r>
+        <w:rPr>
+          <w:rFonts w:ascii="Courier New" w:hAnsi="Courier New" w:cs="Courier New"/>
+          <w:color w:val="008000"/>
+          <w:lang w:val="de-AT"/>
+        </w:rPr>
+        <w:t>success</w:t>
+      </w:r>
+      <w:proofErr w:type="spellEnd"/>
+      <w:r>
+        <w:rPr>
+          <w:rFonts w:ascii="Courier New" w:hAnsi="Courier New" w:cs="Courier New"/>
+          <w:color w:val="008000"/>
+          <w:lang w:val="de-AT"/>
+        </w:rPr>
+        <w:t>"</w:t>
+      </w:r>
+      <w:r>
+        <w:rPr>
+          <w:rFonts w:ascii="Courier New" w:hAnsi="Courier New" w:cs="Courier New"/>
+          <w:color w:val="545454"/>
+          <w:lang w:val="de-AT"/>
+        </w:rPr>
+        <w:t>:</w:t>
+      </w:r>
+      <w:r>
+        <w:rPr>
+          <w:rFonts w:ascii="Courier New" w:hAnsi="Courier New" w:cs="Courier New"/>
+          <w:color w:val="545454"/>
+          <w:lang w:val="de-AT"/>
+        </w:rPr>
+        <w:t xml:space="preserve"> </w:t>
+      </w:r>
+      <w:r>
+        <w:rPr>
+          <w:rFonts w:ascii="Courier New" w:hAnsi="Courier New" w:cs="Courier New"/>
+          <w:color w:val="AA5D00"/>
+          <w:lang w:val="de-AT"/>
+        </w:rPr>
+        <w:t>True</w:t>
+      </w:r>
+      <w:r>
+        <w:rPr>
+          <w:rFonts w:ascii="Courier New" w:hAnsi="Courier New" w:cs="Courier New"/>
+          <w:color w:val="545454"/>
+          <w:lang w:val="de-AT"/>
+        </w:rPr>
+        <w:t>,</w:t>
+      </w:r>
+      <w:r>
+        <w:rPr>
+          <w:rFonts w:ascii="Courier New" w:hAnsi="Courier New" w:cs="Courier New"/>
+          <w:color w:val="AA5D00"/>
+          <w:lang w:val="de-AT"/>
+        </w:rPr>
+        <w:t xml:space="preserve">        </w:t>
+      </w:r>
+      <w:r>
+        <w:rPr>
+          <w:rFonts w:ascii="Courier New" w:hAnsi="Courier New" w:cs="Courier New"/>
+          <w:color w:val="696969"/>
+          <w:lang w:val="de-AT"/>
+        </w:rPr>
+        <w:t xml:space="preserve"> # Bei erfolgreichem Sc</w:t>
+      </w:r>
+      <w:r>
+        <w:rPr>
+          <w:rFonts w:ascii="Courier New" w:hAnsi="Courier New" w:cs="Courier New"/>
+          <w:color w:val="696969"/>
+          <w:lang w:val="de-AT"/>
+        </w:rPr>
+        <w:t>a</w:t>
+      </w:r>
+      <w:r>
+        <w:rPr>
+          <w:rFonts w:ascii="Courier New" w:hAnsi="Courier New" w:cs="Courier New"/>
+          <w:color w:val="696969"/>
+          <w:lang w:val="de-AT"/>
+        </w:rPr>
+        <w:t>n</w:t>
+      </w:r>
+      <w:r>
+        <w:rPr>
+          <w:rFonts w:ascii="Courier New" w:hAnsi="Courier New" w:cs="Courier New"/>
+          <w:color w:val="545454"/>
+          <w:lang w:val="de-AT"/>
+        </w:rPr>
+        <w:br/>
+      </w:r>
+      <w:r>
+        <w:rPr>
+          <w:rFonts w:ascii="Courier New" w:hAnsi="Courier New" w:cs="Courier New"/>
+          <w:color w:val="545454"/>
+          <w:lang w:val="de-AT"/>
+        </w:rPr>
+        <w:t xml:space="preserve">    </w:t>
+      </w:r>
+      <w:r>
+        <w:rPr>
+          <w:rFonts w:ascii="Courier New" w:hAnsi="Courier New" w:cs="Courier New"/>
+          <w:color w:val="008000"/>
+          <w:lang w:val="de-AT"/>
+        </w:rPr>
+        <w:t>"</w:t>
+      </w:r>
+      <w:proofErr w:type="spellStart"/>
+      <w:r>
+        <w:rPr>
+          <w:rFonts w:ascii="Courier New" w:hAnsi="Courier New" w:cs="Courier New"/>
+          <w:color w:val="008000"/>
+          <w:lang w:val="de-AT"/>
+        </w:rPr>
+        <w:t>length</w:t>
+      </w:r>
+      <w:proofErr w:type="spellEnd"/>
+      <w:r>
+        <w:rPr>
+          <w:rFonts w:ascii="Courier New" w:hAnsi="Courier New" w:cs="Courier New"/>
+          <w:color w:val="008000"/>
+          <w:lang w:val="de-AT"/>
+        </w:rPr>
+        <w:t>"</w:t>
+      </w:r>
+      <w:r>
+        <w:rPr>
+          <w:rFonts w:ascii="Courier New" w:hAnsi="Courier New" w:cs="Courier New"/>
+          <w:color w:val="008000"/>
+          <w:lang w:val="de-AT"/>
+        </w:rPr>
+        <w:t xml:space="preserve">: </w:t>
+      </w:r>
+      <w:r>
+        <w:rPr>
+          <w:rFonts w:ascii="Courier New" w:hAnsi="Courier New" w:cs="Courier New"/>
+          <w:color w:val="545454"/>
+          <w:lang w:val="de-AT"/>
+        </w:rPr>
+        <w:t xml:space="preserve"> </w:t>
+      </w:r>
+      <w:proofErr w:type="spellStart"/>
+      <w:r>
+        <w:rPr>
+          <w:rFonts w:ascii="Courier New" w:hAnsi="Courier New" w:cs="Courier New"/>
+          <w:color w:val="545454"/>
+          <w:lang w:val="de-AT"/>
+        </w:rPr>
+        <w:t>height_mm</w:t>
+      </w:r>
+      <w:proofErr w:type="spellEnd"/>
+      <w:r>
+        <w:rPr>
+          <w:rFonts w:ascii="Courier New" w:hAnsi="Courier New" w:cs="Courier New"/>
+          <w:color w:val="545454"/>
+          <w:lang w:val="de-AT"/>
+        </w:rPr>
+        <w:t>,</w:t>
+      </w:r>
+      <w:r>
+        <w:rPr>
+          <w:rFonts w:ascii="Courier New" w:hAnsi="Courier New" w:cs="Courier New"/>
+          <w:color w:val="545454"/>
+          <w:lang w:val="de-AT"/>
+        </w:rPr>
+        <w:t xml:space="preserve"> </w:t>
+      </w:r>
+      <w:r>
+        <w:rPr>
+          <w:rFonts w:ascii="Courier New" w:hAnsi="Courier New" w:cs="Courier New"/>
+          <w:color w:val="545454"/>
+          <w:lang w:val="de-AT"/>
+        </w:rPr>
+        <w:t xml:space="preserve"> </w:t>
+      </w:r>
+      <w:r>
+        <w:rPr>
+          <w:rFonts w:ascii="Courier New" w:hAnsi="Courier New" w:cs="Courier New"/>
+          <w:color w:val="545454"/>
+          <w:lang w:val="de-AT"/>
+        </w:rPr>
+        <w:t xml:space="preserve"> </w:t>
+      </w:r>
+      <w:r>
+        <w:rPr>
+          <w:rFonts w:ascii="Courier New" w:hAnsi="Courier New" w:cs="Courier New"/>
+          <w:color w:val="545454"/>
+          <w:lang w:val="de-AT"/>
+        </w:rPr>
+        <w:t xml:space="preserve"> </w:t>
+      </w:r>
+      <w:r>
+        <w:rPr>
+          <w:rFonts w:ascii="Courier New" w:hAnsi="Courier New" w:cs="Courier New"/>
+          <w:color w:val="696969"/>
+          <w:lang w:val="de-AT"/>
+        </w:rPr>
+        <w:t xml:space="preserve"># </w:t>
+      </w:r>
+      <w:proofErr w:type="spellStart"/>
+      <w:r>
+        <w:rPr>
+          <w:rFonts w:ascii="Courier New" w:hAnsi="Courier New" w:cs="Courier New"/>
+          <w:color w:val="696969"/>
+          <w:lang w:val="de-AT"/>
+        </w:rPr>
+        <w:t>Bounding</w:t>
+      </w:r>
+      <w:proofErr w:type="spellEnd"/>
+      <w:r>
+        <w:rPr>
+          <w:rFonts w:ascii="Courier New" w:hAnsi="Courier New" w:cs="Courier New"/>
+          <w:color w:val="696969"/>
+          <w:lang w:val="de-AT"/>
+        </w:rPr>
+        <w:t xml:space="preserve"> Box</w:t>
+      </w:r>
+      <w:r>
+        <w:rPr>
+          <w:rFonts w:ascii="Courier New" w:hAnsi="Courier New" w:cs="Courier New"/>
+          <w:color w:val="696969"/>
+          <w:lang w:val="de-AT"/>
+        </w:rPr>
+        <w:t xml:space="preserve"> </w:t>
+      </w:r>
+      <w:r>
+        <w:rPr>
+          <w:rFonts w:ascii="Courier New" w:hAnsi="Courier New" w:cs="Courier New"/>
+          <w:color w:val="696969"/>
+          <w:lang w:val="de-AT"/>
+        </w:rPr>
+        <w:t>Länge/Höhe</w:t>
+      </w:r>
+      <w:r>
+        <w:rPr>
+          <w:rFonts w:ascii="Courier New" w:hAnsi="Courier New" w:cs="Courier New"/>
+          <w:color w:val="545454"/>
+          <w:lang w:val="de-AT"/>
+        </w:rPr>
+        <w:br/>
+      </w:r>
+      <w:r>
+        <w:rPr>
+          <w:rFonts w:ascii="Courier New" w:hAnsi="Courier New" w:cs="Courier New"/>
+          <w:color w:val="545454"/>
+          <w:lang w:val="de-AT"/>
+        </w:rPr>
+        <w:t xml:space="preserve">    </w:t>
+      </w:r>
+      <w:r>
+        <w:rPr>
+          <w:rFonts w:ascii="Courier New" w:hAnsi="Courier New" w:cs="Courier New"/>
+          <w:color w:val="008000"/>
+          <w:lang w:val="de-AT"/>
+        </w:rPr>
+        <w:t>"</w:t>
+      </w:r>
+      <w:proofErr w:type="spellStart"/>
+      <w:r>
+        <w:rPr>
+          <w:rFonts w:ascii="Courier New" w:hAnsi="Courier New" w:cs="Courier New"/>
+          <w:color w:val="008000"/>
+          <w:lang w:val="de-AT"/>
+        </w:rPr>
+        <w:t>width</w:t>
+      </w:r>
+      <w:proofErr w:type="spellEnd"/>
+      <w:r>
+        <w:rPr>
+          <w:rFonts w:ascii="Courier New" w:hAnsi="Courier New" w:cs="Courier New"/>
+          <w:color w:val="008000"/>
+          <w:lang w:val="de-AT"/>
+        </w:rPr>
+        <w:t>"</w:t>
+      </w:r>
+      <w:r>
+        <w:rPr>
+          <w:rFonts w:ascii="Courier New" w:hAnsi="Courier New" w:cs="Courier New"/>
+          <w:color w:val="008000"/>
+          <w:lang w:val="de-AT"/>
+        </w:rPr>
+        <w:t>:</w:t>
+      </w:r>
+      <w:r>
+        <w:rPr>
+          <w:rFonts w:ascii="Courier New" w:hAnsi="Courier New" w:cs="Courier New"/>
+          <w:color w:val="545454"/>
+          <w:lang w:val="de-AT"/>
+        </w:rPr>
+        <w:t xml:space="preserve"> </w:t>
+      </w:r>
+      <w:r>
+        <w:rPr>
+          <w:rFonts w:ascii="Courier New" w:hAnsi="Courier New" w:cs="Courier New"/>
+          <w:color w:val="545454"/>
+          <w:lang w:val="de-AT"/>
+        </w:rPr>
+        <w:t xml:space="preserve"> </w:t>
+      </w:r>
+      <w:r>
+        <w:rPr>
+          <w:rFonts w:ascii="Courier New" w:hAnsi="Courier New" w:cs="Courier New"/>
+          <w:color w:val="545454"/>
+          <w:lang w:val="de-AT"/>
+        </w:rPr>
+        <w:t xml:space="preserve"> </w:t>
+      </w:r>
+      <w:proofErr w:type="spellStart"/>
+      <w:r>
+        <w:rPr>
+          <w:rFonts w:ascii="Courier New" w:hAnsi="Courier New" w:cs="Courier New"/>
+          <w:color w:val="545454"/>
+          <w:lang w:val="de-AT"/>
+        </w:rPr>
+        <w:t>width_mm</w:t>
+      </w:r>
+      <w:proofErr w:type="spellEnd"/>
+      <w:r>
+        <w:rPr>
+          <w:rFonts w:ascii="Courier New" w:hAnsi="Courier New" w:cs="Courier New"/>
+          <w:color w:val="545454"/>
+          <w:lang w:val="de-AT"/>
+        </w:rPr>
+        <w:t>,</w:t>
+      </w:r>
+      <w:r>
+        <w:rPr>
+          <w:rFonts w:ascii="Courier New" w:hAnsi="Courier New" w:cs="Courier New"/>
+          <w:color w:val="545454"/>
+          <w:lang w:val="de-AT"/>
+        </w:rPr>
+        <w:t xml:space="preserve"> </w:t>
+      </w:r>
+      <w:r>
+        <w:rPr>
+          <w:rFonts w:ascii="Courier New" w:hAnsi="Courier New" w:cs="Courier New"/>
+          <w:color w:val="545454"/>
+          <w:lang w:val="de-AT"/>
+        </w:rPr>
+        <w:t xml:space="preserve"> </w:t>
+      </w:r>
+      <w:r>
+        <w:rPr>
+          <w:rFonts w:ascii="Courier New" w:hAnsi="Courier New" w:cs="Courier New"/>
+          <w:color w:val="545454"/>
+          <w:lang w:val="de-AT"/>
+        </w:rPr>
+        <w:t xml:space="preserve"> </w:t>
+      </w:r>
+      <w:r>
+        <w:rPr>
+          <w:rFonts w:ascii="Courier New" w:hAnsi="Courier New" w:cs="Courier New"/>
+          <w:color w:val="545454"/>
+          <w:lang w:val="de-AT"/>
+        </w:rPr>
+        <w:t xml:space="preserve"> </w:t>
+      </w:r>
+      <w:r>
+        <w:rPr>
+          <w:rFonts w:ascii="Courier New" w:hAnsi="Courier New" w:cs="Courier New"/>
+          <w:color w:val="545454"/>
+          <w:lang w:val="de-AT"/>
+        </w:rPr>
+        <w:t xml:space="preserve"> </w:t>
+      </w:r>
+      <w:r>
+        <w:rPr>
+          <w:rFonts w:ascii="Courier New" w:hAnsi="Courier New" w:cs="Courier New"/>
+          <w:color w:val="696969"/>
+          <w:lang w:val="de-AT"/>
+        </w:rPr>
+        <w:t xml:space="preserve"># </w:t>
+      </w:r>
+      <w:proofErr w:type="spellStart"/>
+      <w:r>
+        <w:rPr>
+          <w:rFonts w:ascii="Courier New" w:hAnsi="Courier New" w:cs="Courier New"/>
+          <w:color w:val="696969"/>
+          <w:lang w:val="de-AT"/>
+        </w:rPr>
+        <w:t>Bounding</w:t>
+      </w:r>
+      <w:proofErr w:type="spellEnd"/>
+      <w:r>
+        <w:rPr>
+          <w:rFonts w:ascii="Courier New" w:hAnsi="Courier New" w:cs="Courier New"/>
+          <w:color w:val="696969"/>
+          <w:lang w:val="de-AT"/>
+        </w:rPr>
+        <w:t xml:space="preserve"> Box </w:t>
+      </w:r>
+      <w:r>
+        <w:rPr>
+          <w:rFonts w:ascii="Courier New" w:hAnsi="Courier New" w:cs="Courier New"/>
+          <w:color w:val="696969"/>
+          <w:lang w:val="de-AT"/>
+        </w:rPr>
+        <w:t>Breite</w:t>
+      </w:r>
+      <w:r>
+        <w:rPr>
+          <w:rFonts w:ascii="Courier New" w:hAnsi="Courier New" w:cs="Courier New"/>
+          <w:color w:val="545454"/>
+          <w:lang w:val="de-AT"/>
+        </w:rPr>
+        <w:br/>
+      </w:r>
+      <w:r>
+        <w:rPr>
+          <w:rFonts w:ascii="Courier New" w:hAnsi="Courier New" w:cs="Courier New"/>
+          <w:color w:val="545454"/>
+          <w:lang w:val="de-AT"/>
+        </w:rPr>
+        <w:t xml:space="preserve">    </w:t>
+      </w:r>
+      <w:r>
+        <w:rPr>
+          <w:rFonts w:ascii="Courier New" w:hAnsi="Courier New" w:cs="Courier New"/>
+          <w:color w:val="008000"/>
+          <w:lang w:val="de-AT"/>
+        </w:rPr>
+        <w:t>"</w:t>
+      </w:r>
+      <w:proofErr w:type="spellStart"/>
+      <w:r>
+        <w:rPr>
+          <w:rFonts w:ascii="Courier New" w:hAnsi="Courier New" w:cs="Courier New"/>
+          <w:color w:val="008000"/>
+          <w:lang w:val="de-AT"/>
+        </w:rPr>
+        <w:t>height</w:t>
+      </w:r>
+      <w:proofErr w:type="spellEnd"/>
+      <w:r>
+        <w:rPr>
+          <w:rFonts w:ascii="Courier New" w:hAnsi="Courier New" w:cs="Courier New"/>
+          <w:color w:val="008000"/>
+          <w:lang w:val="de-AT"/>
+        </w:rPr>
+        <w:t>"</w:t>
+      </w:r>
+      <w:r>
+        <w:rPr>
+          <w:rFonts w:ascii="Courier New" w:hAnsi="Courier New" w:cs="Courier New"/>
+          <w:color w:val="008000"/>
+          <w:lang w:val="de-AT"/>
+        </w:rPr>
+        <w:t>:</w:t>
+      </w:r>
+      <w:r>
+        <w:rPr>
+          <w:rFonts w:ascii="Courier New" w:hAnsi="Courier New" w:cs="Courier New"/>
+          <w:color w:val="545454"/>
+          <w:lang w:val="de-AT"/>
+        </w:rPr>
+        <w:t xml:space="preserve">  </w:t>
+      </w:r>
+      <w:proofErr w:type="spellStart"/>
+      <w:r>
+        <w:rPr>
+          <w:rFonts w:ascii="Courier New" w:hAnsi="Courier New" w:cs="Courier New"/>
+          <w:color w:val="545454"/>
+          <w:lang w:val="de-AT"/>
+        </w:rPr>
+        <w:t>hoehe_ueber_grund_obj</w:t>
+      </w:r>
+      <w:proofErr w:type="spellEnd"/>
+      <w:r>
+        <w:rPr>
+          <w:rFonts w:ascii="Courier New" w:hAnsi="Courier New" w:cs="Courier New"/>
+          <w:color w:val="545454"/>
+          <w:lang w:val="de-AT"/>
+        </w:rPr>
+        <w:t>,</w:t>
+      </w:r>
+      <w:r>
+        <w:rPr>
+          <w:rFonts w:ascii="Courier New" w:hAnsi="Courier New" w:cs="Courier New"/>
+          <w:color w:val="545454"/>
+          <w:lang w:val="de-AT"/>
+        </w:rPr>
+        <w:br/>
+      </w:r>
+      <w:r>
+        <w:rPr>
+          <w:rFonts w:ascii="Courier New" w:hAnsi="Courier New" w:cs="Courier New"/>
+          <w:color w:val="545454"/>
+          <w:lang w:val="de-AT"/>
+        </w:rPr>
+        <w:t xml:space="preserve">    </w:t>
+      </w:r>
+      <w:r>
+        <w:rPr>
+          <w:rFonts w:ascii="Courier New" w:hAnsi="Courier New" w:cs="Courier New"/>
+          <w:color w:val="008000"/>
+          <w:lang w:val="de-AT"/>
+        </w:rPr>
+        <w:t>"</w:t>
+      </w:r>
+      <w:proofErr w:type="spellStart"/>
+      <w:r>
+        <w:rPr>
+          <w:rFonts w:ascii="Courier New" w:hAnsi="Courier New" w:cs="Courier New"/>
+          <w:color w:val="008000"/>
+          <w:lang w:val="de-AT"/>
+        </w:rPr>
+        <w:t>volume</w:t>
+      </w:r>
+      <w:proofErr w:type="spellEnd"/>
+      <w:r>
+        <w:rPr>
+          <w:rFonts w:ascii="Courier New" w:hAnsi="Courier New" w:cs="Courier New"/>
+          <w:color w:val="008000"/>
+          <w:lang w:val="de-AT"/>
+        </w:rPr>
+        <w:t>"</w:t>
+      </w:r>
+      <w:r>
+        <w:rPr>
+          <w:rFonts w:ascii="Courier New" w:hAnsi="Courier New" w:cs="Courier New"/>
+          <w:color w:val="008000"/>
+          <w:lang w:val="de-AT"/>
+        </w:rPr>
+        <w:t>:</w:t>
+      </w:r>
+      <w:r>
+        <w:rPr>
+          <w:rFonts w:ascii="Courier New" w:hAnsi="Courier New" w:cs="Courier New"/>
+          <w:color w:val="545454"/>
+          <w:lang w:val="de-AT"/>
+        </w:rPr>
+        <w:t xml:space="preserve"> </w:t>
+      </w:r>
+      <w:r>
+        <w:rPr>
+          <w:rFonts w:ascii="Courier New" w:hAnsi="Courier New" w:cs="Courier New"/>
+          <w:color w:val="545454"/>
+          <w:lang w:val="de-AT"/>
+        </w:rPr>
+        <w:t xml:space="preserve"> volume_cm3</w:t>
+      </w:r>
+      <w:r>
+        <w:rPr>
+          <w:rFonts w:ascii="Courier New" w:hAnsi="Courier New" w:cs="Courier New"/>
+          <w:color w:val="545454"/>
+          <w:lang w:val="de-AT"/>
+        </w:rPr>
+        <w:t>,</w:t>
+      </w:r>
+      <w:r>
+        <w:rPr>
+          <w:rFonts w:ascii="Courier New" w:hAnsi="Courier New" w:cs="Courier New"/>
+          <w:color w:val="545454"/>
+          <w:lang w:val="de-AT"/>
+        </w:rPr>
+        <w:br/>
+      </w:r>
+      <w:r>
+        <w:rPr>
+          <w:rFonts w:ascii="Courier New" w:hAnsi="Courier New" w:cs="Courier New"/>
+          <w:color w:val="545454"/>
+          <w:lang w:val="de-AT"/>
+        </w:rPr>
+        <w:t xml:space="preserve">    </w:t>
+      </w:r>
+      <w:r>
+        <w:rPr>
+          <w:rFonts w:ascii="Courier New" w:hAnsi="Courier New" w:cs="Courier New"/>
+          <w:color w:val="008000"/>
+          <w:lang w:val="de-AT"/>
+        </w:rPr>
+        <w:t>"</w:t>
+      </w:r>
+      <w:proofErr w:type="spellStart"/>
+      <w:r>
+        <w:rPr>
+          <w:rFonts w:ascii="Courier New" w:hAnsi="Courier New" w:cs="Courier New"/>
+          <w:color w:val="008000"/>
+          <w:lang w:val="de-AT"/>
+        </w:rPr>
+        <w:t>abmessung</w:t>
+      </w:r>
+      <w:proofErr w:type="spellEnd"/>
+      <w:r>
+        <w:rPr>
+          <w:rFonts w:ascii="Courier New" w:hAnsi="Courier New" w:cs="Courier New"/>
+          <w:color w:val="008000"/>
+          <w:lang w:val="de-AT"/>
+        </w:rPr>
+        <w:t>"</w:t>
+      </w:r>
+      <w:r>
+        <w:rPr>
+          <w:rFonts w:ascii="Courier New" w:hAnsi="Courier New" w:cs="Courier New"/>
+          <w:color w:val="545454"/>
+          <w:lang w:val="de-AT"/>
+        </w:rPr>
+        <w:t>:</w:t>
+      </w:r>
+      <w:r>
+        <w:rPr>
+          <w:rFonts w:ascii="Courier New" w:hAnsi="Courier New" w:cs="Courier New"/>
+          <w:color w:val="545454"/>
+          <w:lang w:val="de-AT"/>
+        </w:rPr>
+        <w:t xml:space="preserve"> </w:t>
+      </w:r>
+      <w:r>
+        <w:rPr>
+          <w:rFonts w:ascii="Courier New" w:hAnsi="Courier New" w:cs="Courier New"/>
+          <w:color w:val="008000"/>
+          <w:lang w:val="de-AT"/>
+        </w:rPr>
+        <w:t>f"{height_mm:</w:t>
+      </w:r>
+      <w:r>
+        <w:rPr>
+          <w:rFonts w:ascii="Courier New" w:hAnsi="Courier New" w:cs="Courier New"/>
+          <w:color w:val="AA5D00"/>
+          <w:lang w:val="de-AT"/>
+        </w:rPr>
+        <w:t>.1</w:t>
+      </w:r>
+      <w:r>
+        <w:rPr>
+          <w:rFonts w:ascii="Courier New" w:hAnsi="Courier New" w:cs="Courier New"/>
+          <w:color w:val="008000"/>
+          <w:lang w:val="de-AT"/>
+        </w:rPr>
+        <w:t>f} x {width_mm:</w:t>
+      </w:r>
+      <w:r>
+        <w:rPr>
+          <w:rFonts w:ascii="Courier New" w:hAnsi="Courier New" w:cs="Courier New"/>
+          <w:color w:val="AA5D00"/>
+          <w:lang w:val="de-AT"/>
+        </w:rPr>
+        <w:t>.1</w:t>
+      </w:r>
+      <w:r>
+        <w:rPr>
+          <w:rFonts w:ascii="Courier New" w:hAnsi="Courier New" w:cs="Courier New"/>
+          <w:color w:val="008000"/>
+          <w:lang w:val="de-AT"/>
+        </w:rPr>
+        <w:t>f} x</w:t>
+      </w:r>
+      <w:r>
+        <w:rPr>
+          <w:rFonts w:ascii="Courier New" w:hAnsi="Courier New" w:cs="Courier New"/>
+          <w:color w:val="008000"/>
+          <w:lang w:val="de-AT"/>
+        </w:rPr>
+        <w:t xml:space="preserve"> </w:t>
+      </w:r>
+      <w:r>
+        <w:rPr>
+          <w:rFonts w:ascii="Courier New" w:hAnsi="Courier New" w:cs="Courier New"/>
+          <w:color w:val="008000"/>
+          <w:lang w:val="de-AT"/>
+        </w:rPr>
+        <w:t>{hoehe_ueber_grund_obj:</w:t>
+      </w:r>
+      <w:r>
+        <w:rPr>
+          <w:rFonts w:ascii="Courier New" w:hAnsi="Courier New" w:cs="Courier New"/>
+          <w:color w:val="AA5D00"/>
+          <w:lang w:val="de-AT"/>
+        </w:rPr>
+        <w:t>.1</w:t>
+      </w:r>
+      <w:r>
+        <w:rPr>
+          <w:rFonts w:ascii="Courier New" w:hAnsi="Courier New" w:cs="Courier New"/>
+          <w:color w:val="008000"/>
+          <w:lang w:val="de-AT"/>
+        </w:rPr>
+        <w:t>f}"</w:t>
+      </w:r>
+      <w:r>
+        <w:rPr>
+          <w:rFonts w:ascii="Courier New" w:hAnsi="Courier New" w:cs="Courier New"/>
+          <w:color w:val="008000"/>
+          <w:lang w:val="de-AT"/>
+        </w:rPr>
+        <w:t>,</w:t>
+      </w:r>
+    </w:p>
+    <w:p>
+      <w:pPr>
+        <w:pBdr>
+          <w:top w:val="single" w:sz="4" w:space="1" w:color="auto"/>
+          <w:left w:val="single" w:sz="4" w:space="4" w:color="auto"/>
+          <w:bottom w:val="single" w:sz="4" w:space="1" w:color="auto"/>
+          <w:right w:val="single" w:sz="4" w:space="4" w:color="auto"/>
+        </w:pBdr>
+        <w:shd w:val="clear" w:color="auto" w:fill="FEFEFE"/>
+        <w:jc w:val="left"/>
+        <w:rPr>
+          <w:rFonts w:ascii="Courier New" w:hAnsi="Courier New" w:cs="Courier New"/>
+          <w:color w:val="696969"/>
+          <w:lang w:val="en-GB"/>
+        </w:rPr>
+      </w:pPr>
+      <w:r>
+        <w:rPr>
+          <w:rFonts w:ascii="Courier New" w:hAnsi="Courier New" w:cs="Courier New"/>
+          <w:color w:val="696969"/>
+          <w:lang w:val="de-AT"/>
+        </w:rPr>
+        <w:t xml:space="preserve">  </w:t>
+      </w:r>
+      <w:r>
+        <w:rPr>
+          <w:rFonts w:ascii="Courier New" w:hAnsi="Courier New" w:cs="Courier New"/>
+          <w:color w:val="696969"/>
+          <w:lang w:val="de-AT"/>
+        </w:rPr>
+        <w:t xml:space="preserve"> </w:t>
+      </w:r>
+      <w:r>
+        <w:rPr>
+          <w:rFonts w:ascii="Courier New" w:hAnsi="Courier New" w:cs="Courier New"/>
+          <w:color w:val="008000"/>
+          <w:lang w:val="de-AT"/>
+        </w:rPr>
+        <w:t>"error":</w:t>
+      </w:r>
+      <w:r>
+        <w:rPr>
+          <w:rFonts w:ascii="Courier New" w:hAnsi="Courier New" w:cs="Courier New"/>
+          <w:color w:val="696969"/>
+          <w:lang w:val="en-GB"/>
+        </w:rPr>
+        <w:t xml:space="preserve"> </w:t>
+      </w:r>
+      <w:r>
+        <w:rPr>
+          <w:rFonts w:ascii="Courier New" w:hAnsi="Courier New" w:cs="Courier New"/>
+          <w:color w:val="AA5D00"/>
+          <w:lang w:val="de-AT"/>
+        </w:rPr>
+        <w:t>None</w:t>
+      </w:r>
+      <w:r>
+        <w:rPr>
+          <w:rFonts w:ascii="Courier New" w:hAnsi="Courier New" w:cs="Courier New"/>
+          <w:color w:val="696969"/>
+          <w:lang w:val="en-GB"/>
+        </w:rPr>
+        <w:t>,</w:t>
+      </w:r>
+    </w:p>
+    <w:p>
+      <w:pPr>
+        <w:pBdr>
+          <w:top w:val="single" w:sz="4" w:space="1" w:color="auto"/>
+          <w:left w:val="single" w:sz="4" w:space="4" w:color="auto"/>
+          <w:bottom w:val="single" w:sz="4" w:space="1" w:color="auto"/>
+          <w:right w:val="single" w:sz="4" w:space="4" w:color="auto"/>
+        </w:pBdr>
+        <w:shd w:val="clear" w:color="auto" w:fill="FEFEFE"/>
+        <w:jc w:val="left"/>
+        <w:rPr>
+          <w:rFonts w:ascii="Courier New" w:hAnsi="Courier New" w:cs="Courier New"/>
+          <w:color w:val="696969"/>
+          <w:lang w:val="en-GB"/>
+        </w:rPr>
+      </w:pPr>
+      <w:r>
+        <w:rPr>
+          <w:rFonts w:ascii="Courier New" w:hAnsi="Courier New" w:cs="Courier New"/>
+          <w:color w:val="696969"/>
+          <w:lang w:val="en-GB"/>
+        </w:rPr>
+        <w:t xml:space="preserve">  </w:t>
+      </w:r>
+      <w:r>
+        <w:rPr>
+          <w:rFonts w:ascii="Courier New" w:hAnsi="Courier New" w:cs="Courier New"/>
+          <w:color w:val="696969"/>
+          <w:lang w:val="en-GB"/>
+        </w:rPr>
+        <w:t xml:space="preserve"> </w:t>
+      </w:r>
+      <w:r>
+        <w:rPr>
+          <w:rFonts w:ascii="Courier New" w:hAnsi="Courier New" w:cs="Courier New"/>
+          <w:color w:val="008000"/>
+          <w:lang w:val="de-AT"/>
+        </w:rPr>
+        <w:t>"</w:t>
+      </w:r>
+      <w:proofErr w:type="spellStart"/>
+      <w:r>
+        <w:rPr>
+          <w:rFonts w:ascii="Courier New" w:hAnsi="Courier New" w:cs="Courier New"/>
+          <w:color w:val="008000"/>
+          <w:lang w:val="de-AT"/>
+        </w:rPr>
+        <w:t>depth_frame</w:t>
+      </w:r>
+      <w:proofErr w:type="spellEnd"/>
+      <w:r>
+        <w:rPr>
+          <w:rFonts w:ascii="Courier New" w:hAnsi="Courier New" w:cs="Courier New"/>
+          <w:color w:val="008000"/>
+          <w:lang w:val="de-AT"/>
+        </w:rPr>
+        <w:t xml:space="preserve">": </w:t>
+      </w:r>
+      <w:r>
+        <w:rPr>
+          <w:rFonts w:ascii="Courier New" w:hAnsi="Courier New" w:cs="Courier New"/>
+          <w:color w:val="AA5D00"/>
+          <w:lang w:val="de-AT"/>
+        </w:rPr>
+        <w:t>None</w:t>
+      </w:r>
+    </w:p>
+    <w:p>
+      <w:pPr>
+        <w:pBdr>
+          <w:top w:val="single" w:sz="4" w:space="1" w:color="auto"/>
+          <w:left w:val="single" w:sz="4" w:space="4" w:color="auto"/>
+          <w:bottom w:val="single" w:sz="4" w:space="1" w:color="auto"/>
+          <w:right w:val="single" w:sz="4" w:space="4" w:color="auto"/>
+        </w:pBdr>
+        <w:shd w:val="clear" w:color="auto" w:fill="FEFEFE"/>
+        <w:jc w:val="left"/>
+        <w:rPr>
+          <w:rFonts w:ascii="Courier New" w:hAnsi="Courier New" w:cs="Courier New"/>
+          <w:color w:val="696969"/>
+          <w:lang w:val="en-GB"/>
+        </w:rPr>
+      </w:pPr>
+      <w:r>
+        <w:rPr>
+          <w:rFonts w:ascii="Courier New" w:hAnsi="Courier New" w:cs="Courier New"/>
+          <w:color w:val="696969"/>
+          <w:lang w:val="en-GB"/>
+        </w:rPr>
+        <w:t>}</w:t>
+      </w:r>
+    </w:p>
+    <w:p>
+      <w:pPr>
+        <w:pStyle w:val="Text"/>
+        <w:rPr>
+          <w:lang w:val="en-GB"/>
+        </w:rPr>
+      </w:pPr>
+      <w:r>
+        <w:rPr>
+          <w:lang w:val="en-GB"/>
+        </w:rPr>
         <w:br w:type="page"/>
       </w:r>
     </w:p>
@@ -11401,45 +12571,49 @@
       <w:pPr>
         <w:pStyle w:val="berschrift3"/>
       </w:pPr>
-      <w:bookmarkStart w:id="68" w:name="_Toc223637584"/>
-      <w:commentRangeStart w:id="69"/>
-      <w:commentRangeStart w:id="70"/>
+      <w:bookmarkStart w:id="70" w:name="_Toc223637584"/>
+      <w:commentRangeStart w:id="71"/>
       <w:r>
         <w:lastRenderedPageBreak/>
         <w:t>Bildverarbeitung mit Barcode Erkennung</w:t>
       </w:r>
-      <w:commentRangeEnd w:id="69"/>
+      <w:commentRangeEnd w:id="71"/>
       <w:r>
         <w:rPr>
           <w:rStyle w:val="Kommentarzeichen"/>
           <w:b w:val="0"/>
           <w:bCs w:val="0"/>
         </w:rPr>
-        <w:commentReference w:id="69"/>
-      </w:r>
-      <w:commentRangeEnd w:id="70"/>
+        <w:commentReference w:id="71"/>
+      </w:r>
+      <w:bookmarkEnd w:id="70"/>
+    </w:p>
+    <w:p>
+      <w:pPr>
+        <w:pStyle w:val="Text"/>
+        <w:rPr>
+          <w:lang w:val="de-AT" w:eastAsia="de-AT"/>
+        </w:rPr>
+      </w:pPr>
+      <w:commentRangeStart w:id="72"/>
+      <w:r>
+        <w:rPr>
+          <w:lang w:val="de-AT" w:eastAsia="de-AT"/>
+        </w:rPr>
+        <w:t xml:space="preserve">Für die Bildverarbeitung </w:t>
+      </w:r>
+      <w:commentRangeEnd w:id="72"/>
       <w:r>
         <w:rPr>
           <w:rStyle w:val="Kommentarzeichen"/>
-          <w:b w:val="0"/>
-          <w:bCs w:val="0"/>
-        </w:rPr>
-        <w:commentReference w:id="70"/>
-      </w:r>
-      <w:bookmarkEnd w:id="68"/>
-    </w:p>
-    <w:p>
-      <w:pPr>
-        <w:pStyle w:val="Text"/>
+        </w:rPr>
+        <w:commentReference w:id="72"/>
+      </w:r>
+      <w:r>
         <w:rPr>
           <w:lang w:val="de-AT" w:eastAsia="de-AT"/>
         </w:rPr>
-      </w:pPr>
-      <w:r>
-        <w:rPr>
-          <w:lang w:val="de-AT" w:eastAsia="de-AT"/>
-        </w:rPr>
-        <w:t>Für die Bildverarbeitung sind die aufgenommenen Kamerabilder eine zentrale Grundlage, da in diesen Barcodes bzw. QR-Codes erkannt und anschließend ausgelesen werden sollen. Der entwickelte 3D-Scanner verfügt über vier Kameraperspektiven, wodurch ein Objekt aus mehreren Blickwinkeln erfasst wird. Dadurch erhöht sich die Wahrscheinlichkeit, dass sich mindestens ein Barcode vollständig sichtbar im Bild befindet und korrekt erkannt werden kann. Ziel dieser automatischen Erkennung ist es, den manuellen Arbeitsaufwand zu reduzieren und eine eindeutige Identifikation der gescannten Objekte zu ermöglichen.</w:t>
+        <w:t>sind die aufgenommenen Kamerabilder eine zentrale Grundlage, da in diesen Barcodes bzw. QR-Codes erkannt und anschließend ausgelesen werden sollen. Der entwickelte 3D-Scanner verfügt über vier Kameraperspektiven, wodurch ein Objekt aus mehreren Blickwinkeln erfasst wird. Dadurch erhöht sich die Wahrscheinlichkeit, dass sich mindestens ein Barcode vollständig sichtbar im Bild befindet und korrekt erkannt werden kann. Ziel dieser automatischen Erkennung ist es, den manuellen Arbeitsaufwand zu reduzieren und eine eindeutige Identifikation der gescannten Objekte zu ermöglichen.</w:t>
       </w:r>
     </w:p>
     <w:p>
@@ -11607,7 +12781,7 @@
                     <pic:cNvPicPr/>
                   </pic:nvPicPr>
                   <pic:blipFill>
-                    <a:blip r:embed="rId56"/>
+                    <a:blip r:embed="rId55"/>
                     <a:stretch>
                       <a:fillRect/>
                     </a:stretch>
@@ -11823,7 +12997,7 @@
                     </pic:cNvPicPr>
                   </pic:nvPicPr>
                   <pic:blipFill>
-                    <a:blip r:embed="rId57" cstate="print">
+                    <a:blip r:embed="rId56" cstate="print">
                       <a:extLst>
                         <a:ext uri="{28A0092B-C50C-407E-A947-70E740481C1C}">
                           <a14:useLocalDpi xmlns:a14="http://schemas.microsoft.com/office/drawing/2010/main" val="0"/>
@@ -11937,6 +13111,7 @@
       </w:pPr>
       <w:r>
         <w:rPr>
+          <w:noProof/>
           <w:lang w:val="de-AT"/>
         </w:rPr>
         <w:drawing>
@@ -11957,7 +13132,7 @@
                     </pic:cNvPicPr>
                   </pic:nvPicPr>
                   <pic:blipFill>
-                    <a:blip r:embed="rId58" cstate="print">
+                    <a:blip r:embed="rId57" cstate="print">
                       <a:extLst>
                         <a:ext uri="{28A0092B-C50C-407E-A947-70E740481C1C}">
                           <a14:useLocalDpi xmlns:a14="http://schemas.microsoft.com/office/drawing/2010/main" val="0"/>
@@ -12035,6 +13210,9 @@
         <w:jc w:val="center"/>
       </w:pPr>
       <w:r>
+        <w:rPr>
+          <w:noProof/>
+        </w:rPr>
         <w:drawing>
           <wp:inline distT="0" distB="0" distL="0" distR="0" wp14:anchorId="5B38532F" wp14:editId="475810EF">
             <wp:extent cx="5358130" cy="1332706"/>
@@ -12051,7 +13229,7 @@
                     <pic:cNvPicPr/>
                   </pic:nvPicPr>
                   <pic:blipFill>
-                    <a:blip r:embed="rId59"/>
+                    <a:blip r:embed="rId58"/>
                     <a:stretch>
                       <a:fillRect/>
                     </a:stretch>
@@ -12151,22 +13329,22 @@
       <w:pPr>
         <w:pStyle w:val="berschrift3"/>
       </w:pPr>
-      <w:bookmarkStart w:id="71" w:name="_Toc223637585"/>
-      <w:commentRangeStart w:id="72"/>
+      <w:bookmarkStart w:id="73" w:name="_Toc223637585"/>
+      <w:commentRangeStart w:id="74"/>
       <w:r>
         <w:lastRenderedPageBreak/>
         <w:t>Gewichtserfassung</w:t>
       </w:r>
-      <w:commentRangeEnd w:id="72"/>
+      <w:commentRangeEnd w:id="74"/>
       <w:r>
         <w:rPr>
           <w:rStyle w:val="Kommentarzeichen"/>
           <w:b w:val="0"/>
           <w:bCs w:val="0"/>
         </w:rPr>
-        <w:commentReference w:id="72"/>
-      </w:r>
-      <w:bookmarkEnd w:id="71"/>
+        <w:commentReference w:id="74"/>
+      </w:r>
+      <w:bookmarkEnd w:id="73"/>
     </w:p>
     <w:p>
       <w:pPr>
@@ -12222,26 +13400,26 @@
       </w:r>
       <w:r>
         <w:rPr>
+          <w:rStyle w:val="Hervorhebung"/>
+        </w:rPr>
+        <w:t>NAU7802</w:t>
+      </w:r>
+      <w:r>
+        <w:t xml:space="preserve"> angeschlossen und über diesen Analog-Digital-Wandler ausgelesen. Die Kommunikation erfolgt über die </w:t>
+      </w:r>
+      <w:r>
+        <w:rPr>
           <w:bCs/>
         </w:rPr>
-        <w:t>NAU7802</w:t>
-      </w:r>
-      <w:r>
-        <w:t xml:space="preserve"> angeschlossen und über diesen Analog-Digital-Wandler ausgelesen. Die Kommunikation erfolgt über die </w:t>
+        <w:t>I²C-Schnittstelle</w:t>
+      </w:r>
+      <w:r>
+        <w:t xml:space="preserve">, welche vom </w:t>
       </w:r>
       <w:r>
         <w:rPr>
           <w:bCs/>
         </w:rPr>
-        <w:t>I²C-Schnittstelle</w:t>
-      </w:r>
-      <w:r>
-        <w:t xml:space="preserve">, welche vom </w:t>
-      </w:r>
-      <w:r>
-        <w:rPr>
-          <w:bCs/>
-        </w:rPr>
         <w:t>Raspberry Pi</w:t>
       </w:r>
       <w:r>
@@ -12253,24 +13431,37 @@
         <w:pStyle w:val="Text"/>
       </w:pPr>
       <w:r>
-        <w:t xml:space="preserve">Da die eingesetzten ADCs nur auf zwei mögliche I²C-Adressen (0x2A und 0x2B) konfiguriert werden können, kommt es beim Betrieb mehrerer Module am selben I²C-Bus zu Adresskonflikten. Zur Lösung dieses Problems wird ein </w:t>
-      </w:r>
-      <w:commentRangeStart w:id="73"/>
-      <w:r>
-        <w:rPr>
-          <w:bCs/>
-        </w:rPr>
-        <w:t>TCA9548A</w:t>
+        <w:t>Da die eingesetzten ADCs nur auf zwei mögliche I²C-Adressen (</w:t>
+      </w:r>
+      <w:r>
+        <w:rPr>
+          <w:rStyle w:val="Hervorhebung"/>
+        </w:rPr>
+        <w:t>0x2A</w:t>
+      </w:r>
+      <w:r>
+        <w:t xml:space="preserve"> und </w:t>
+      </w:r>
+      <w:r>
+        <w:rPr>
+          <w:rStyle w:val="Hervorhebung"/>
+        </w:rPr>
+        <w:t>0x2B</w:t>
+      </w:r>
+      <w:r>
+        <w:t>) konfiguriert werden können, kommt es beim Betrieb mehrerer Module am selben I²C-Bus zu Adresskonflikten. Zur Lösung dieses Problems wird ein</w:t>
+      </w:r>
+      <w:r>
+        <w:t xml:space="preserve"> Multiplexer mit der Bezeichnung</w:t>
       </w:r>
       <w:r>
         <w:t xml:space="preserve"> </w:t>
       </w:r>
-      <w:commentRangeEnd w:id="73"/>
-      <w:r>
-        <w:rPr>
-          <w:rStyle w:val="Kommentarzeichen"/>
-        </w:rPr>
-        <w:commentReference w:id="73"/>
+      <w:r>
+        <w:rPr>
+          <w:rStyle w:val="Hervorhebung"/>
+        </w:rPr>
+        <w:t xml:space="preserve">TCA9548A </w:t>
       </w:r>
       <w:r>
         <w:t>eingesetzt.</w:t>
@@ -12289,24 +13480,20 @@
         <w:t>Der</w:t>
       </w:r>
       <w:r>
+        <w:t xml:space="preserve"> M</w:t>
+      </w:r>
+      <w:r>
+        <w:t>UX</w:t>
+      </w:r>
+      <w:r>
+        <w:t xml:space="preserve"> ist ein</w:t>
+      </w:r>
+      <w:r>
         <w:t xml:space="preserve"> </w:t>
       </w:r>
-      <w:proofErr w:type="spellStart"/>
-      <w:r>
-        <w:t>Mux</w:t>
-      </w:r>
-      <w:proofErr w:type="spellEnd"/>
-      <w:r>
-        <w:t xml:space="preserve"> ist ein</w:t>
-      </w:r>
-      <w:r>
-        <w:t xml:space="preserve"> </w:t>
-      </w:r>
-      <w:proofErr w:type="gramStart"/>
-      <w:r>
-        <w:t>Multiplexer</w:t>
-      </w:r>
-      <w:proofErr w:type="gramEnd"/>
+      <w:r>
+        <w:t>Multiplexer,</w:t>
+      </w:r>
       <w:r>
         <w:t xml:space="preserve"> der es</w:t>
       </w:r>
@@ -12432,16 +13619,16 @@
       <w:r>
         <w:t>Die Initialisierung der ADCs erfolgt bei jedem Scanvorgang erneut, da die Zeitabstände zwischen den Messungen variieren können und de</w:t>
       </w:r>
-      <w:commentRangeStart w:id="74"/>
+      <w:commentRangeStart w:id="75"/>
       <w:r>
         <w:t>r Multiplexer jeweils neu konfiguriert werden muss.</w:t>
       </w:r>
-      <w:commentRangeEnd w:id="74"/>
+      <w:commentRangeEnd w:id="75"/>
       <w:r>
         <w:rPr>
           <w:rStyle w:val="Kommentarzeichen"/>
         </w:rPr>
-        <w:commentReference w:id="74"/>
+        <w:commentReference w:id="75"/>
       </w:r>
     </w:p>
     <w:p>
@@ -12865,42 +14052,26 @@
           <w:right w:val="single" w:sz="4" w:space="4" w:color="auto"/>
         </w:pBdr>
         <w:rPr>
-          <w:lang w:val="en-GB"/>
-        </w:rPr>
-      </w:pPr>
-      <w:r>
-        <w:rPr>
-          <w:lang w:val="en-GB"/>
+          <w:rStyle w:val="Hervorhebung"/>
+        </w:rPr>
+      </w:pPr>
+      <w:r>
+        <w:rPr>
+          <w:rStyle w:val="Hervorhebung"/>
         </w:rPr>
         <w:t>„</w:t>
       </w:r>
       <w:proofErr w:type="spellStart"/>
-      <w:proofErr w:type="gramStart"/>
-      <w:r>
-        <w:rPr>
-          <w:lang w:val="en-GB"/>
-        </w:rPr>
-        <w:t>weight</w:t>
-      </w:r>
-      <w:proofErr w:type="gramEnd"/>
-      <w:r>
-        <w:rPr>
-          <w:lang w:val="en-GB"/>
-        </w:rPr>
-        <w:t>_</w:t>
-      </w:r>
-      <w:proofErr w:type="gramStart"/>
-      <w:r>
-        <w:rPr>
-          <w:lang w:val="en-GB"/>
-        </w:rPr>
-        <w:t>calibration.json</w:t>
+      <w:r>
+        <w:rPr>
+          <w:rStyle w:val="Hervorhebung"/>
+        </w:rPr>
+        <w:t>weight_calibration.json</w:t>
       </w:r>
       <w:proofErr w:type="spellEnd"/>
-      <w:proofErr w:type="gramEnd"/>
-      <w:r>
-        <w:rPr>
-          <w:lang w:val="en-GB"/>
+      <w:r>
+        <w:rPr>
+          <w:rStyle w:val="Hervorhebung"/>
         </w:rPr>
         <w:t>“</w:t>
       </w:r>
@@ -13431,19 +14602,19 @@
           <w:lang w:eastAsia="de-AT"/>
         </w:rPr>
       </w:pPr>
-      <w:commentRangeStart w:id="75"/>
+      <w:commentRangeStart w:id="76"/>
       <w:r>
         <w:rPr>
           <w:lang w:eastAsia="de-AT"/>
         </w:rPr>
         <w:t>Abbildung</w:t>
       </w:r>
-      <w:commentRangeEnd w:id="75"/>
+      <w:commentRangeEnd w:id="76"/>
       <w:r>
         <w:rPr>
           <w:rStyle w:val="Kommentarzeichen"/>
         </w:rPr>
-        <w:commentReference w:id="75"/>
+        <w:commentReference w:id="76"/>
       </w:r>
     </w:p>
     <w:p>
@@ -13550,7 +14721,7 @@
                     </pic:cNvPicPr>
                   </pic:nvPicPr>
                   <pic:blipFill>
-                    <a:blip r:embed="rId60" cstate="print">
+                    <a:blip r:embed="rId59" cstate="print">
                       <a:extLst>
                         <a:ext uri="{28A0092B-C50C-407E-A947-70E740481C1C}">
                           <a14:useLocalDpi xmlns:a14="http://schemas.microsoft.com/office/drawing/2010/main" val="0"/>
@@ -13711,21 +14882,21 @@
       <w:pPr>
         <w:pStyle w:val="berschrift3"/>
       </w:pPr>
-      <w:bookmarkStart w:id="76" w:name="_Toc223637587"/>
-      <w:commentRangeStart w:id="77"/>
+      <w:bookmarkStart w:id="77" w:name="_Toc223637587"/>
+      <w:commentRangeStart w:id="78"/>
       <w:r>
         <w:lastRenderedPageBreak/>
         <w:t>User Interface für die Datenverarbeitung</w:t>
       </w:r>
-      <w:bookmarkEnd w:id="76"/>
-      <w:commentRangeEnd w:id="77"/>
+      <w:bookmarkEnd w:id="77"/>
+      <w:commentRangeEnd w:id="78"/>
       <w:r>
         <w:rPr>
           <w:rStyle w:val="Kommentarzeichen"/>
           <w:b w:val="0"/>
           <w:bCs w:val="0"/>
         </w:rPr>
-        <w:commentReference w:id="77"/>
+        <w:commentReference w:id="78"/>
       </w:r>
     </w:p>
     <w:p>
@@ -14658,12 +15829,12 @@
       <w:pPr>
         <w:pStyle w:val="berschrift2"/>
       </w:pPr>
-      <w:bookmarkStart w:id="78" w:name="_Toc223637588"/>
+      <w:bookmarkStart w:id="79" w:name="_Toc223637588"/>
       <w:r>
         <w:lastRenderedPageBreak/>
         <w:t>Weitere individuelle Abschnitte</w:t>
       </w:r>
-      <w:bookmarkEnd w:id="78"/>
+      <w:bookmarkEnd w:id="79"/>
       <w:r>
         <w:t xml:space="preserve"> </w:t>
       </w:r>
@@ -14728,12 +15899,12 @@
       <w:pPr>
         <w:pStyle w:val="berschrift2"/>
       </w:pPr>
-      <w:bookmarkStart w:id="79" w:name="_Toc223637590"/>
+      <w:bookmarkStart w:id="80" w:name="_Toc223637590"/>
       <w:r>
         <w:lastRenderedPageBreak/>
         <w:t>Zusammenfassung individueller Teil</w:t>
       </w:r>
-      <w:bookmarkEnd w:id="79"/>
+      <w:bookmarkEnd w:id="80"/>
     </w:p>
     <w:p>
       <w:pPr>
@@ -14865,7 +16036,7 @@
       <w:pPr>
         <w:pStyle w:val="Text"/>
         <w:sectPr>
-          <w:headerReference w:type="default" r:id="rId61"/>
+          <w:headerReference w:type="default" r:id="rId60"/>
           <w:pgSz w:w="11906" w:h="16838"/>
           <w:pgMar w:top="1417" w:right="1440" w:bottom="1134" w:left="1440" w:header="708" w:footer="708" w:gutter="0"/>
           <w:cols w:space="720"/>
@@ -14878,26 +16049,26 @@
       <w:pPr>
         <w:pStyle w:val="berschrift1"/>
       </w:pPr>
-      <w:bookmarkStart w:id="80" w:name="_Ref200468988"/>
-      <w:bookmarkStart w:id="81" w:name="_Ref200469530"/>
-      <w:bookmarkStart w:id="82" w:name="_Toc223637591"/>
+      <w:bookmarkStart w:id="81" w:name="_Ref200468988"/>
+      <w:bookmarkStart w:id="82" w:name="_Ref200469530"/>
+      <w:bookmarkStart w:id="83" w:name="_Toc223637591"/>
       <w:r>
         <w:lastRenderedPageBreak/>
         <w:t>Zusammenfassung und Ausblick</w:t>
       </w:r>
-      <w:bookmarkEnd w:id="80"/>
       <w:bookmarkEnd w:id="81"/>
       <w:bookmarkEnd w:id="82"/>
+      <w:bookmarkEnd w:id="83"/>
     </w:p>
     <w:p>
       <w:pPr>
         <w:pStyle w:val="berschrift2"/>
       </w:pPr>
-      <w:bookmarkStart w:id="83" w:name="_Toc223637592"/>
+      <w:bookmarkStart w:id="84" w:name="_Toc223637592"/>
       <w:r>
         <w:t>Zusammenfassung der gesamten Arbeit</w:t>
       </w:r>
-      <w:bookmarkEnd w:id="83"/>
+      <w:bookmarkEnd w:id="84"/>
     </w:p>
     <w:p>
       <w:pPr>
@@ -14912,6 +16083,191 @@
         </w:rPr>
         <w:t>(FV = Text)</w:t>
       </w:r>
+    </w:p>
+    <w:p>
+      <w:pPr>
+        <w:pStyle w:val="Text"/>
+      </w:pPr>
+    </w:p>
+    <w:p>
+      <w:pPr>
+        <w:pStyle w:val="Text"/>
+        <w:rPr>
+          <w:b/>
+        </w:rPr>
+      </w:pPr>
+      <w:r>
+        <w:rPr>
+          <w:b/>
+        </w:rPr>
+        <w:t>Gemessene Werte von Vans-Schuh:</w:t>
+      </w:r>
+    </w:p>
+    <w:p>
+      <w:pPr>
+        <w:pStyle w:val="Text"/>
+        <w:numPr>
+          <w:ilvl w:val="0"/>
+          <w:numId w:val="43"/>
+        </w:numPr>
+      </w:pPr>
+      <w:r>
+        <w:t>Länge: 114 mm</w:t>
+      </w:r>
+    </w:p>
+    <w:p>
+      <w:pPr>
+        <w:pStyle w:val="Text"/>
+        <w:numPr>
+          <w:ilvl w:val="0"/>
+          <w:numId w:val="43"/>
+        </w:numPr>
+      </w:pPr>
+      <w:r>
+        <w:t>Breite: 265 mm</w:t>
+      </w:r>
+    </w:p>
+    <w:p>
+      <w:pPr>
+        <w:pStyle w:val="Text"/>
+        <w:numPr>
+          <w:ilvl w:val="0"/>
+          <w:numId w:val="43"/>
+        </w:numPr>
+      </w:pPr>
+      <w:r>
+        <w:t xml:space="preserve">Höhe: 98 mm </w:t>
+      </w:r>
+    </w:p>
+    <w:p>
+      <w:pPr>
+        <w:pStyle w:val="Text"/>
+        <w:keepNext/>
+        <w:jc w:val="center"/>
+      </w:pPr>
+      <w:r>
+        <w:rPr>
+          <w:noProof/>
+        </w:rPr>
+        <w:drawing>
+          <wp:inline distT="0" distB="0" distL="0" distR="0" wp14:anchorId="3C8FB0A3" wp14:editId="6F783BC6">
+            <wp:extent cx="4385226" cy="1074420"/>
+            <wp:effectExtent l="0" t="0" r="0" b="0"/>
+            <wp:docPr id="1607923285" name="Grafik 1" descr="Ein Bild, das Text, Screenshot, Schrift enthält.&#10;&#10;KI-generierte Inhalte können fehlerhaft sein."/>
+            <wp:cNvGraphicFramePr>
+              <a:graphicFrameLocks xmlns:a="http://schemas.openxmlformats.org/drawingml/2006/main" noChangeAspect="1"/>
+            </wp:cNvGraphicFramePr>
+            <a:graphic xmlns:a="http://schemas.openxmlformats.org/drawingml/2006/main">
+              <a:graphicData uri="http://schemas.openxmlformats.org/drawingml/2006/picture">
+                <pic:pic xmlns:pic="http://schemas.openxmlformats.org/drawingml/2006/picture">
+                  <pic:nvPicPr>
+                    <pic:cNvPr id="1607923285" name="Grafik 1" descr="Ein Bild, das Text, Screenshot, Schrift enthält.&#10;&#10;KI-generierte Inhalte können fehlerhaft sein."/>
+                    <pic:cNvPicPr/>
+                  </pic:nvPicPr>
+                  <pic:blipFill>
+                    <a:blip r:embed="rId61"/>
+                    <a:stretch>
+                      <a:fillRect/>
+                    </a:stretch>
+                  </pic:blipFill>
+                  <pic:spPr>
+                    <a:xfrm>
+                      <a:off x="0" y="0"/>
+                      <a:ext cx="4411859" cy="1080945"/>
+                    </a:xfrm>
+                    <a:prstGeom prst="rect">
+                      <a:avLst/>
+                    </a:prstGeom>
+                  </pic:spPr>
+                </pic:pic>
+              </a:graphicData>
+            </a:graphic>
+          </wp:inline>
+        </w:drawing>
+      </w:r>
+    </w:p>
+    <w:p>
+      <w:pPr>
+        <w:pStyle w:val="Beschriftung"/>
+        <w:rPr>
+          <w:lang w:val="de-DE"/>
+        </w:rPr>
+      </w:pPr>
+      <w:r>
+        <w:rPr>
+          <w:lang w:val="de-DE"/>
+        </w:rPr>
+        <w:t xml:space="preserve">Abbildung </w:t>
+      </w:r>
+      <w:r>
+        <w:rPr>
+          <w:lang w:val="de-DE"/>
+        </w:rPr>
+        <w:fldChar w:fldCharType="begin"/>
+      </w:r>
+      <w:r>
+        <w:rPr>
+          <w:lang w:val="de-DE"/>
+        </w:rPr>
+        <w:instrText xml:space="preserve"> SEQ Abbildung \* ARABIC </w:instrText>
+      </w:r>
+      <w:r>
+        <w:rPr>
+          <w:lang w:val="de-DE"/>
+        </w:rPr>
+        <w:fldChar w:fldCharType="separate"/>
+      </w:r>
+      <w:r>
+        <w:rPr>
+          <w:noProof/>
+          <w:lang w:val="de-DE"/>
+        </w:rPr>
+        <w:t>6</w:t>
+      </w:r>
+      <w:r>
+        <w:rPr>
+          <w:lang w:val="de-DE"/>
+        </w:rPr>
+        <w:fldChar w:fldCharType="end"/>
+      </w:r>
+      <w:r>
+        <w:rPr>
+          <w:lang w:val="de-DE"/>
+        </w:rPr>
+        <w:t>: Ergebnis der Abmessungen</w:t>
+      </w:r>
+    </w:p>
+    <w:p>
+      <w:pPr>
+        <w:pStyle w:val="Text"/>
+        <w:jc w:val="center"/>
+      </w:pPr>
+    </w:p>
+    <w:p>
+      <w:pPr>
+        <w:pStyle w:val="Text"/>
+      </w:pPr>
+      <w:r>
+        <w:t xml:space="preserve">Die Messungen wurden unter nicht optimalen Lichtverhältnissen durchgeführt, wodurch geringfügige Abweichungen zum </w:t>
+      </w:r>
+      <w:proofErr w:type="spellStart"/>
+      <w:r>
+        <w:t>Realmaß</w:t>
+      </w:r>
+      <w:proofErr w:type="spellEnd"/>
+      <w:r>
+        <w:t xml:space="preserve"> entstanden. Insgesamt zeigt das Verfahren jedoch eine stabile und für die Anwendung ausreichende Genauigkeit.</w:t>
+      </w:r>
+    </w:p>
+    <w:p>
+      <w:pPr>
+        <w:pStyle w:val="Text"/>
+      </w:pPr>
+    </w:p>
+    <w:p>
+      <w:pPr>
+        <w:pStyle w:val="Text"/>
+      </w:pPr>
     </w:p>
     <w:p>
       <w:pPr>
@@ -14926,8 +16282,8 @@
           <w:color w:val="0066FF"/>
         </w:rPr>
         <w:drawing>
-          <wp:inline distT="0" distB="0" distL="0" distR="0" wp14:anchorId="612B9350" wp14:editId="1912DE27">
-            <wp:extent cx="5731510" cy="3637915"/>
+          <wp:inline distT="0" distB="0" distL="0" distR="0" wp14:anchorId="612B9350" wp14:editId="35D59469">
+            <wp:extent cx="2801227" cy="1778000"/>
             <wp:effectExtent l="0" t="0" r="0" b="0"/>
             <wp:docPr id="1065083219" name="Grafik 1" descr="Ein Bild, das Text, Screenshot enthält.&#10;&#10;KI-generierte Inhalte können fehlerhaft sein."/>
             <wp:cNvGraphicFramePr>
@@ -14949,7 +16305,7 @@
                   <pic:spPr>
                     <a:xfrm>
                       <a:off x="0" y="0"/>
-                      <a:ext cx="5731510" cy="3637915"/>
+                      <a:ext cx="2803601" cy="1779507"/>
                     </a:xfrm>
                     <a:prstGeom prst="rect">
                       <a:avLst/>
@@ -14976,8 +16332,8 @@
         </w:rPr>
         <w:lastRenderedPageBreak/>
         <w:drawing>
-          <wp:inline distT="0" distB="0" distL="0" distR="0" wp14:anchorId="3597A9BE" wp14:editId="18C91C21">
-            <wp:extent cx="5731510" cy="4028440"/>
+          <wp:inline distT="0" distB="0" distL="0" distR="0" wp14:anchorId="3597A9BE" wp14:editId="1A556E6F">
+            <wp:extent cx="4053840" cy="2849275"/>
             <wp:effectExtent l="0" t="0" r="0" b="0"/>
             <wp:docPr id="604162184" name="Grafik 1" descr="Ein Bild, das Text, Computer, Screenshot, Ausgabegerät enthält.&#10;&#10;KI-generierte Inhalte können fehlerhaft sein."/>
             <wp:cNvGraphicFramePr>
@@ -14999,7 +16355,7 @@
                   <pic:spPr>
                     <a:xfrm>
                       <a:off x="0" y="0"/>
-                      <a:ext cx="5731510" cy="4028440"/>
+                      <a:ext cx="4061347" cy="2854551"/>
                     </a:xfrm>
                     <a:prstGeom prst="rect">
                       <a:avLst/>
@@ -15017,6 +16373,7 @@
         <w:pStyle w:val="Text"/>
         <w:rPr>
           <w:color w:val="0066FF"/>
+          <w:lang w:val="de-AT"/>
         </w:rPr>
       </w:pPr>
       <w:r>
@@ -15025,8 +16382,8 @@
           <w:color w:val="0066FF"/>
         </w:rPr>
         <w:drawing>
-          <wp:inline distT="0" distB="0" distL="0" distR="0" wp14:anchorId="73EAC898" wp14:editId="06B0766E">
-            <wp:extent cx="3228410" cy="4304665"/>
+          <wp:inline distT="0" distB="0" distL="0" distR="0" wp14:anchorId="73EAC898" wp14:editId="4253F088">
+            <wp:extent cx="2362135" cy="3149600"/>
             <wp:effectExtent l="0" t="0" r="0" b="0"/>
             <wp:docPr id="1648256658" name="Grafik 2" descr="Ein Bild, das Elektronik, Text, Im Haus, Waage enthält.&#10;&#10;KI-generierte Inhalte können fehlerhaft sein."/>
             <wp:cNvGraphicFramePr>
@@ -15057,7 +16414,7 @@
                   <pic:spPr bwMode="auto">
                     <a:xfrm>
                       <a:off x="0" y="0"/>
-                      <a:ext cx="3233364" cy="4311271"/>
+                      <a:ext cx="2367508" cy="3156765"/>
                     </a:xfrm>
                     <a:prstGeom prst="rect">
                       <a:avLst/>
@@ -15073,6 +16430,68 @@
           </wp:inline>
         </w:drawing>
       </w:r>
+      <w:r>
+        <w:rPr>
+          <w:color w:val="0066FF"/>
+          <w:lang w:val="de-AT"/>
+        </w:rPr>
+        <w:drawing>
+          <wp:inline distT="0" distB="0" distL="0" distR="0" wp14:anchorId="57616C5C" wp14:editId="403EBFE1">
+            <wp:extent cx="2369227" cy="3157220"/>
+            <wp:effectExtent l="0" t="0" r="0" b="0"/>
+            <wp:docPr id="1276151025" name="Grafik 4" descr="Ein Bild, das Waage, Text, Elektronik enthält.&#10;&#10;KI-generierte Inhalte können fehlerhaft sein."/>
+            <wp:cNvGraphicFramePr>
+              <a:graphicFrameLocks xmlns:a="http://schemas.openxmlformats.org/drawingml/2006/main" noChangeAspect="1"/>
+            </wp:cNvGraphicFramePr>
+            <a:graphic xmlns:a="http://schemas.openxmlformats.org/drawingml/2006/main">
+              <a:graphicData uri="http://schemas.openxmlformats.org/drawingml/2006/picture">
+                <pic:pic xmlns:pic="http://schemas.openxmlformats.org/drawingml/2006/picture">
+                  <pic:nvPicPr>
+                    <pic:cNvPr id="1276151025" name="Grafik 4" descr="Ein Bild, das Waage, Text, Elektronik enthält.&#10;&#10;KI-generierte Inhalte können fehlerhaft sein."/>
+                    <pic:cNvPicPr>
+                      <a:picLocks noChangeAspect="1" noChangeArrowheads="1"/>
+                    </pic:cNvPicPr>
+                  </pic:nvPicPr>
+                  <pic:blipFill>
+                    <a:blip r:embed="rId65" cstate="print">
+                      <a:extLst>
+                        <a:ext uri="{28A0092B-C50C-407E-A947-70E740481C1C}">
+                          <a14:useLocalDpi xmlns:a14="http://schemas.microsoft.com/office/drawing/2010/main" val="0"/>
+                        </a:ext>
+                      </a:extLst>
+                    </a:blip>
+                    <a:srcRect/>
+                    <a:stretch>
+                      <a:fillRect/>
+                    </a:stretch>
+                  </pic:blipFill>
+                  <pic:spPr bwMode="auto">
+                    <a:xfrm>
+                      <a:off x="0" y="0"/>
+                      <a:ext cx="2370736" cy="3159231"/>
+                    </a:xfrm>
+                    <a:prstGeom prst="rect">
+                      <a:avLst/>
+                    </a:prstGeom>
+                    <a:noFill/>
+                    <a:ln>
+                      <a:noFill/>
+                    </a:ln>
+                  </pic:spPr>
+                </pic:pic>
+              </a:graphicData>
+            </a:graphic>
+          </wp:inline>
+        </w:drawing>
+      </w:r>
+    </w:p>
+    <w:p>
+      <w:pPr>
+        <w:pStyle w:val="Text"/>
+        <w:rPr>
+          <w:color w:val="0066FF"/>
+        </w:rPr>
+      </w:pPr>
     </w:p>
     <w:p>
       <w:pPr>
@@ -15096,8 +16515,8 @@
         </w:rPr>
         <w:lastRenderedPageBreak/>
         <w:drawing>
-          <wp:inline distT="0" distB="0" distL="0" distR="0" wp14:anchorId="5386A699" wp14:editId="5FED5DAE">
-            <wp:extent cx="5731510" cy="4032250"/>
+          <wp:inline distT="0" distB="0" distL="0" distR="0" wp14:anchorId="5386A699" wp14:editId="61B6FAFE">
+            <wp:extent cx="5394960" cy="3795479"/>
             <wp:effectExtent l="0" t="0" r="0" b="0"/>
             <wp:docPr id="341728143" name="Grafik 1" descr="Ein Bild, das Elektronik, Text, Screenshot, Computer enthält.&#10;&#10;KI-generierte Inhalte können fehlerhaft sein."/>
             <wp:cNvGraphicFramePr>
@@ -15111,7 +16530,7 @@
                     <pic:cNvPicPr/>
                   </pic:nvPicPr>
                   <pic:blipFill>
-                    <a:blip r:embed="rId65"/>
+                    <a:blip r:embed="rId66"/>
                     <a:stretch>
                       <a:fillRect/>
                     </a:stretch>
@@ -15119,7 +16538,7 @@
                   <pic:spPr>
                     <a:xfrm>
                       <a:off x="0" y="0"/>
-                      <a:ext cx="5731510" cy="4032250"/>
+                      <a:ext cx="5404464" cy="3802165"/>
                     </a:xfrm>
                     <a:prstGeom prst="rect">
                       <a:avLst/>
@@ -15137,6 +16556,7 @@
         <w:pStyle w:val="Text"/>
         <w:rPr>
           <w:color w:val="0066FF"/>
+          <w:lang w:val="de-AT"/>
         </w:rPr>
       </w:pPr>
       <w:r>
@@ -15145,8 +16565,8 @@
           <w:color w:val="0066FF"/>
         </w:rPr>
         <w:drawing>
-          <wp:inline distT="0" distB="0" distL="0" distR="0" wp14:anchorId="3BCC4450" wp14:editId="5DA10E5A">
-            <wp:extent cx="3519390" cy="4692650"/>
+          <wp:inline distT="0" distB="0" distL="0" distR="0" wp14:anchorId="3BCC4450" wp14:editId="27248CEA">
+            <wp:extent cx="2382375" cy="3176588"/>
             <wp:effectExtent l="0" t="0" r="0" b="0"/>
             <wp:docPr id="1248076157" name="Grafik 4" descr="Ein Bild, das Handtuch, Im Haus, Papiertuch, Toilettenpapier enthält.&#10;&#10;KI-generierte Inhalte können fehlerhaft sein."/>
             <wp:cNvGraphicFramePr>
@@ -15162,7 +16582,7 @@
                     </pic:cNvPicPr>
                   </pic:nvPicPr>
                   <pic:blipFill>
-                    <a:blip r:embed="rId66" cstate="print">
+                    <a:blip r:embed="rId67" cstate="print">
                       <a:extLst>
                         <a:ext uri="{28A0092B-C50C-407E-A947-70E740481C1C}">
                           <a14:useLocalDpi xmlns:a14="http://schemas.microsoft.com/office/drawing/2010/main" val="0"/>
@@ -15177,7 +16597,7 @@
                   <pic:spPr bwMode="auto">
                     <a:xfrm>
                       <a:off x="0" y="0"/>
-                      <a:ext cx="3523825" cy="4698564"/>
+                      <a:ext cx="2387436" cy="3183336"/>
                     </a:xfrm>
                     <a:prstGeom prst="rect">
                       <a:avLst/>
@@ -15193,19 +16613,80 @@
           </wp:inline>
         </w:drawing>
       </w:r>
-    </w:p>
-    <w:p>
-      <w:pPr>
-        <w:pStyle w:val="Text"/>
+      <w:r>
         <w:rPr>
           <w:color w:val="0066FF"/>
-        </w:rPr>
-      </w:pPr>
-      <w:r>
+          <w:lang w:val="de-AT"/>
+        </w:rPr>
+        <w:drawing>
+          <wp:inline distT="0" distB="0" distL="0" distR="0" wp14:anchorId="2EA01583" wp14:editId="4797D71F">
+            <wp:extent cx="2379070" cy="3175608"/>
+            <wp:effectExtent l="0" t="0" r="0" b="0"/>
+            <wp:docPr id="1207463695" name="Grafik 2" descr="Ein Bild, das Text, Papiertuch, Handtuch enthält.&#10;&#10;KI-generierte Inhalte können fehlerhaft sein."/>
+            <wp:cNvGraphicFramePr>
+              <a:graphicFrameLocks xmlns:a="http://schemas.openxmlformats.org/drawingml/2006/main" noChangeAspect="1"/>
+            </wp:cNvGraphicFramePr>
+            <a:graphic xmlns:a="http://schemas.openxmlformats.org/drawingml/2006/main">
+              <a:graphicData uri="http://schemas.openxmlformats.org/drawingml/2006/picture">
+                <pic:pic xmlns:pic="http://schemas.openxmlformats.org/drawingml/2006/picture">
+                  <pic:nvPicPr>
+                    <pic:cNvPr id="1207463695" name="Grafik 2" descr="Ein Bild, das Text, Papiertuch, Handtuch enthält.&#10;&#10;KI-generierte Inhalte können fehlerhaft sein."/>
+                    <pic:cNvPicPr>
+                      <a:picLocks noChangeAspect="1" noChangeArrowheads="1"/>
+                    </pic:cNvPicPr>
+                  </pic:nvPicPr>
+                  <pic:blipFill>
+                    <a:blip r:embed="rId68" cstate="print">
+                      <a:extLst>
+                        <a:ext uri="{28A0092B-C50C-407E-A947-70E740481C1C}">
+                          <a14:useLocalDpi xmlns:a14="http://schemas.microsoft.com/office/drawing/2010/main" val="0"/>
+                        </a:ext>
+                      </a:extLst>
+                    </a:blip>
+                    <a:srcRect/>
+                    <a:stretch>
+                      <a:fillRect/>
+                    </a:stretch>
+                  </pic:blipFill>
+                  <pic:spPr bwMode="auto">
+                    <a:xfrm>
+                      <a:off x="0" y="0"/>
+                      <a:ext cx="2396388" cy="3198724"/>
+                    </a:xfrm>
+                    <a:prstGeom prst="rect">
+                      <a:avLst/>
+                    </a:prstGeom>
+                    <a:noFill/>
+                    <a:ln>
+                      <a:noFill/>
+                    </a:ln>
+                  </pic:spPr>
+                </pic:pic>
+              </a:graphicData>
+            </a:graphic>
+          </wp:inline>
+        </w:drawing>
+      </w:r>
+    </w:p>
+    <w:p>
+      <w:pPr>
+        <w:pStyle w:val="Text"/>
         <w:rPr>
           <w:color w:val="0066FF"/>
         </w:rPr>
-        <w:lastRenderedPageBreak/>
+      </w:pPr>
+    </w:p>
+    <w:p>
+      <w:pPr>
+        <w:pStyle w:val="Text"/>
+        <w:rPr>
+          <w:color w:val="0066FF"/>
+        </w:rPr>
+      </w:pPr>
+      <w:r>
+        <w:rPr>
+          <w:color w:val="0066FF"/>
+        </w:rPr>
         <w:t xml:space="preserve">Bei Leerer </w:t>
       </w:r>
       <w:proofErr w:type="spellStart"/>
@@ -15229,6 +16710,7 @@
           <w:noProof/>
           <w:color w:val="0066FF"/>
         </w:rPr>
+        <w:lastRenderedPageBreak/>
         <w:drawing>
           <wp:inline distT="0" distB="0" distL="0" distR="0" wp14:anchorId="2AD0F7DA" wp14:editId="1F31E87E">
             <wp:extent cx="5731510" cy="4119245"/>
@@ -15245,7 +16727,7 @@
                     <pic:cNvPicPr/>
                   </pic:nvPicPr>
                   <pic:blipFill>
-                    <a:blip r:embed="rId67"/>
+                    <a:blip r:embed="rId69"/>
                     <a:stretch>
                       <a:fillRect/>
                     </a:stretch>
@@ -15306,12 +16788,12 @@
       <w:pPr>
         <w:pStyle w:val="berschrift2"/>
       </w:pPr>
-      <w:bookmarkStart w:id="84" w:name="_Toc223637593"/>
+      <w:bookmarkStart w:id="85" w:name="_Toc223637593"/>
       <w:r>
         <w:lastRenderedPageBreak/>
         <w:t>Ausblick</w:t>
       </w:r>
-      <w:bookmarkEnd w:id="84"/>
+      <w:bookmarkEnd w:id="85"/>
     </w:p>
     <w:p>
       <w:pPr>
@@ -15419,10 +16901,10 @@
       <w:pPr>
         <w:pStyle w:val="Text"/>
         <w:sectPr>
-          <w:headerReference w:type="default" r:id="rId68"/>
-          <w:footerReference w:type="default" r:id="rId69"/>
-          <w:headerReference w:type="first" r:id="rId70"/>
-          <w:footerReference w:type="first" r:id="rId71"/>
+          <w:headerReference w:type="default" r:id="rId70"/>
+          <w:footerReference w:type="default" r:id="rId71"/>
+          <w:headerReference w:type="first" r:id="rId72"/>
+          <w:footerReference w:type="first" r:id="rId73"/>
           <w:pgSz w:w="11906" w:h="16838"/>
           <w:pgMar w:top="1417" w:right="1440" w:bottom="1134" w:left="1440" w:header="708" w:footer="708" w:gutter="0"/>
           <w:cols w:space="720"/>
@@ -15435,14 +16917,14 @@
       <w:pPr>
         <w:pStyle w:val="berschrift1"/>
       </w:pPr>
-      <w:bookmarkStart w:id="85" w:name="_Ref200468159"/>
-      <w:bookmarkStart w:id="86" w:name="_Toc223637594"/>
+      <w:bookmarkStart w:id="86" w:name="_Ref200468159"/>
+      <w:bookmarkStart w:id="87" w:name="_Toc223637594"/>
       <w:r>
         <w:lastRenderedPageBreak/>
         <w:t>Erklärung der Eigenständigkeit</w:t>
       </w:r>
-      <w:bookmarkEnd w:id="85"/>
       <w:bookmarkEnd w:id="86"/>
+      <w:bookmarkEnd w:id="87"/>
     </w:p>
     <w:p>
       <w:pPr>
@@ -15575,10 +17057,10 @@
       <w:pPr>
         <w:pStyle w:val="Text"/>
         <w:sectPr>
-          <w:headerReference w:type="default" r:id="rId72"/>
-          <w:footerReference w:type="default" r:id="rId73"/>
-          <w:headerReference w:type="first" r:id="rId74"/>
-          <w:footerReference w:type="first" r:id="rId75"/>
+          <w:headerReference w:type="default" r:id="rId74"/>
+          <w:footerReference w:type="default" r:id="rId75"/>
+          <w:headerReference w:type="first" r:id="rId76"/>
+          <w:footerReference w:type="first" r:id="rId77"/>
           <w:pgSz w:w="11906" w:h="16838"/>
           <w:pgMar w:top="1417" w:right="1440" w:bottom="1134" w:left="1440" w:header="708" w:footer="708" w:gutter="0"/>
           <w:cols w:space="720"/>
@@ -15591,10 +17073,10 @@
       <w:pPr>
         <w:pStyle w:val="berschrift1"/>
         <w:sectPr>
-          <w:headerReference w:type="default" r:id="rId76"/>
-          <w:footerReference w:type="default" r:id="rId77"/>
-          <w:headerReference w:type="first" r:id="rId78"/>
-          <w:footerReference w:type="first" r:id="rId79"/>
+          <w:headerReference w:type="default" r:id="rId78"/>
+          <w:footerReference w:type="default" r:id="rId79"/>
+          <w:headerReference w:type="first" r:id="rId80"/>
+          <w:footerReference w:type="first" r:id="rId81"/>
           <w:pgSz w:w="11906" w:h="16838"/>
           <w:pgMar w:top="1417" w:right="1440" w:bottom="1134" w:left="1440" w:header="708" w:footer="708" w:gutter="0"/>
           <w:cols w:space="720"/>
@@ -15602,35 +17084,34 @@
           <w:docGrid w:type="lines" w:linePitch="360"/>
         </w:sectPr>
       </w:pPr>
-      <w:bookmarkStart w:id="87" w:name="_Ref200469499"/>
-      <w:bookmarkStart w:id="88" w:name="_Toc223637595"/>
+      <w:bookmarkStart w:id="88" w:name="_Ref200469499"/>
+      <w:bookmarkStart w:id="89" w:name="_Toc223637595"/>
       <w:r>
         <w:lastRenderedPageBreak/>
         <w:t>Arbeitsnachweise</w:t>
       </w:r>
-      <w:bookmarkEnd w:id="87"/>
       <w:bookmarkEnd w:id="88"/>
+      <w:bookmarkEnd w:id="89"/>
     </w:p>
     <w:p>
       <w:pPr>
         <w:pStyle w:val="berschrift1"/>
       </w:pPr>
-      <w:bookmarkStart w:id="89" w:name="_Toc84751256"/>
-      <w:bookmarkStart w:id="90" w:name="_Toc211138167"/>
-      <w:bookmarkStart w:id="91" w:name="_Toc211137922"/>
-      <w:bookmarkStart w:id="92" w:name="_Toc84757221"/>
-      <w:bookmarkStart w:id="93" w:name="_Toc210560305"/>
-      <w:bookmarkStart w:id="94" w:name="_Toc210560252"/>
-      <w:bookmarkStart w:id="95" w:name="_Ref210560064"/>
-      <w:bookmarkStart w:id="96" w:name="_Toc84751368"/>
-      <w:bookmarkStart w:id="97" w:name="_Ref200467937"/>
-      <w:bookmarkStart w:id="98" w:name="_Ref200469033"/>
-      <w:bookmarkStart w:id="99" w:name="_Toc223637596"/>
+      <w:bookmarkStart w:id="90" w:name="_Toc84751256"/>
+      <w:bookmarkStart w:id="91" w:name="_Toc211138167"/>
+      <w:bookmarkStart w:id="92" w:name="_Toc211137922"/>
+      <w:bookmarkStart w:id="93" w:name="_Toc84757221"/>
+      <w:bookmarkStart w:id="94" w:name="_Toc210560305"/>
+      <w:bookmarkStart w:id="95" w:name="_Toc210560252"/>
+      <w:bookmarkStart w:id="96" w:name="_Ref210560064"/>
+      <w:bookmarkStart w:id="97" w:name="_Toc84751368"/>
+      <w:bookmarkStart w:id="98" w:name="_Ref200467937"/>
+      <w:bookmarkStart w:id="99" w:name="_Ref200469033"/>
+      <w:bookmarkStart w:id="100" w:name="_Toc223637596"/>
       <w:r>
         <w:lastRenderedPageBreak/>
         <w:t>Verzeichnisse</w:t>
       </w:r>
-      <w:bookmarkEnd w:id="89"/>
       <w:bookmarkEnd w:id="90"/>
       <w:bookmarkEnd w:id="91"/>
       <w:bookmarkEnd w:id="92"/>
@@ -15641,6 +17122,7 @@
       <w:bookmarkEnd w:id="97"/>
       <w:bookmarkEnd w:id="98"/>
       <w:bookmarkEnd w:id="99"/>
+      <w:bookmarkEnd w:id="100"/>
       <w:r>
         <w:t xml:space="preserve"> </w:t>
       </w:r>
@@ -15649,28 +17131,28 @@
       <w:pPr>
         <w:pStyle w:val="berschrift2"/>
       </w:pPr>
-      <w:bookmarkStart w:id="100" w:name="_Toc210560306"/>
-      <w:bookmarkStart w:id="101" w:name="_Toc211138168"/>
-      <w:bookmarkStart w:id="102" w:name="_Toc84757222"/>
-      <w:bookmarkStart w:id="103" w:name="_Toc84751369"/>
-      <w:bookmarkStart w:id="104" w:name="_Toc84751257"/>
-      <w:bookmarkStart w:id="105" w:name="_Toc210560253"/>
-      <w:bookmarkStart w:id="106" w:name="_Toc211137923"/>
-      <w:bookmarkStart w:id="107" w:name="_Toc223637597"/>
+      <w:bookmarkStart w:id="101" w:name="_Toc210560306"/>
+      <w:bookmarkStart w:id="102" w:name="_Toc211138168"/>
+      <w:bookmarkStart w:id="103" w:name="_Toc84757222"/>
+      <w:bookmarkStart w:id="104" w:name="_Toc84751369"/>
+      <w:bookmarkStart w:id="105" w:name="_Toc84751257"/>
+      <w:bookmarkStart w:id="106" w:name="_Toc210560253"/>
+      <w:bookmarkStart w:id="107" w:name="_Toc211137923"/>
+      <w:bookmarkStart w:id="108" w:name="_Toc223637597"/>
       <w:r>
         <w:t>Literatur</w:t>
       </w:r>
-      <w:bookmarkEnd w:id="100"/>
       <w:bookmarkEnd w:id="101"/>
       <w:bookmarkEnd w:id="102"/>
       <w:bookmarkEnd w:id="103"/>
       <w:bookmarkEnd w:id="104"/>
       <w:bookmarkEnd w:id="105"/>
       <w:bookmarkEnd w:id="106"/>
+      <w:bookmarkEnd w:id="107"/>
       <w:r>
         <w:t>verzeichnis</w:t>
       </w:r>
-      <w:bookmarkEnd w:id="107"/>
+      <w:bookmarkEnd w:id="108"/>
       <w:r>
         <w:t xml:space="preserve"> </w:t>
       </w:r>
@@ -15706,18 +17188,17 @@
       <w:pPr>
         <w:pStyle w:val="berschrift2"/>
       </w:pPr>
-      <w:bookmarkStart w:id="108" w:name="_Toc84757225"/>
-      <w:bookmarkStart w:id="109" w:name="_Toc211138171"/>
-      <w:bookmarkStart w:id="110" w:name="_Toc211137927"/>
-      <w:bookmarkStart w:id="111" w:name="_Toc84751260"/>
-      <w:bookmarkStart w:id="112" w:name="_Toc210560307"/>
-      <w:bookmarkStart w:id="113" w:name="_Toc210560254"/>
-      <w:bookmarkStart w:id="114" w:name="_Toc84751372"/>
-      <w:bookmarkStart w:id="115" w:name="_Toc223637598"/>
+      <w:bookmarkStart w:id="109" w:name="_Toc84757225"/>
+      <w:bookmarkStart w:id="110" w:name="_Toc211138171"/>
+      <w:bookmarkStart w:id="111" w:name="_Toc211137927"/>
+      <w:bookmarkStart w:id="112" w:name="_Toc84751260"/>
+      <w:bookmarkStart w:id="113" w:name="_Toc210560307"/>
+      <w:bookmarkStart w:id="114" w:name="_Toc210560254"/>
+      <w:bookmarkStart w:id="115" w:name="_Toc84751372"/>
+      <w:bookmarkStart w:id="116" w:name="_Toc223637598"/>
       <w:r>
         <w:t>Abkürzungsverzeichnis</w:t>
       </w:r>
-      <w:bookmarkEnd w:id="108"/>
       <w:bookmarkEnd w:id="109"/>
       <w:bookmarkEnd w:id="110"/>
       <w:bookmarkEnd w:id="111"/>
@@ -15725,6 +17206,7 @@
       <w:bookmarkEnd w:id="113"/>
       <w:bookmarkEnd w:id="114"/>
       <w:bookmarkEnd w:id="115"/>
+      <w:bookmarkEnd w:id="116"/>
     </w:p>
     <w:p>
       <w:pPr>
@@ -15753,13 +17235,13 @@
         </w:rPr>
         <w:t>)</w:t>
       </w:r>
-      <w:bookmarkStart w:id="116" w:name="_Toc211138172"/>
-      <w:bookmarkStart w:id="117" w:name="_Toc211137928"/>
-      <w:bookmarkStart w:id="118" w:name="_Toc84757226"/>
-      <w:bookmarkStart w:id="119" w:name="_Toc84751373"/>
-      <w:bookmarkStart w:id="120" w:name="_Toc84751261"/>
-      <w:bookmarkStart w:id="121" w:name="_Toc210560308"/>
-      <w:bookmarkStart w:id="122" w:name="_Toc210560255"/>
+      <w:bookmarkStart w:id="117" w:name="_Toc211138172"/>
+      <w:bookmarkStart w:id="118" w:name="_Toc211137928"/>
+      <w:bookmarkStart w:id="119" w:name="_Toc84757226"/>
+      <w:bookmarkStart w:id="120" w:name="_Toc84751373"/>
+      <w:bookmarkStart w:id="121" w:name="_Toc84751261"/>
+      <w:bookmarkStart w:id="122" w:name="_Toc210560308"/>
+      <w:bookmarkStart w:id="123" w:name="_Toc210560255"/>
       <w:r>
         <w:rPr>
           <w:color w:val="0066FF"/>
@@ -15771,11 +17253,10 @@
       <w:pPr>
         <w:pStyle w:val="berschrift2"/>
       </w:pPr>
-      <w:bookmarkStart w:id="123" w:name="_Toc223637599"/>
+      <w:bookmarkStart w:id="124" w:name="_Toc223637599"/>
       <w:r>
         <w:t>Tabellen</w:t>
       </w:r>
-      <w:bookmarkEnd w:id="116"/>
       <w:bookmarkEnd w:id="117"/>
       <w:bookmarkEnd w:id="118"/>
       <w:bookmarkEnd w:id="119"/>
@@ -15783,6 +17264,7 @@
       <w:bookmarkEnd w:id="121"/>
       <w:bookmarkEnd w:id="122"/>
       <w:bookmarkEnd w:id="123"/>
+      <w:bookmarkEnd w:id="124"/>
     </w:p>
     <w:p>
       <w:pPr>
@@ -15816,28 +17298,28 @@
       <w:pPr>
         <w:pStyle w:val="berschrift2"/>
       </w:pPr>
-      <w:bookmarkStart w:id="124" w:name="_Toc210560256"/>
-      <w:bookmarkStart w:id="125" w:name="_Toc210560309"/>
-      <w:bookmarkStart w:id="126" w:name="_Toc211137929"/>
-      <w:bookmarkStart w:id="127" w:name="_Toc84757227"/>
-      <w:bookmarkStart w:id="128" w:name="_Toc84751374"/>
-      <w:bookmarkStart w:id="129" w:name="_Toc84751262"/>
-      <w:bookmarkStart w:id="130" w:name="_Toc211138173"/>
-      <w:bookmarkStart w:id="131" w:name="_Toc223637600"/>
+      <w:bookmarkStart w:id="125" w:name="_Toc210560256"/>
+      <w:bookmarkStart w:id="126" w:name="_Toc210560309"/>
+      <w:bookmarkStart w:id="127" w:name="_Toc211137929"/>
+      <w:bookmarkStart w:id="128" w:name="_Toc84757227"/>
+      <w:bookmarkStart w:id="129" w:name="_Toc84751374"/>
+      <w:bookmarkStart w:id="130" w:name="_Toc84751262"/>
+      <w:bookmarkStart w:id="131" w:name="_Toc211138173"/>
+      <w:bookmarkStart w:id="132" w:name="_Toc223637600"/>
       <w:r>
         <w:t>Abbildunge</w:t>
       </w:r>
-      <w:bookmarkEnd w:id="124"/>
       <w:bookmarkEnd w:id="125"/>
+      <w:bookmarkEnd w:id="126"/>
       <w:r>
         <w:t>n</w:t>
       </w:r>
-      <w:bookmarkEnd w:id="126"/>
       <w:bookmarkEnd w:id="127"/>
       <w:bookmarkEnd w:id="128"/>
       <w:bookmarkEnd w:id="129"/>
       <w:bookmarkEnd w:id="130"/>
       <w:bookmarkEnd w:id="131"/>
+      <w:bookmarkEnd w:id="132"/>
     </w:p>
     <w:p>
       <w:pPr>
@@ -15893,10 +17375,10 @@
           <w:color w:val="0066FF"/>
         </w:rPr>
         <w:sectPr>
-          <w:headerReference w:type="default" r:id="rId80"/>
-          <w:footerReference w:type="default" r:id="rId81"/>
-          <w:headerReference w:type="first" r:id="rId82"/>
-          <w:footerReference w:type="first" r:id="rId83"/>
+          <w:headerReference w:type="default" r:id="rId82"/>
+          <w:footerReference w:type="default" r:id="rId83"/>
+          <w:headerReference w:type="first" r:id="rId84"/>
+          <w:footerReference w:type="first" r:id="rId85"/>
           <w:pgSz w:w="11906" w:h="16838"/>
           <w:pgMar w:top="1417" w:right="1440" w:bottom="1134" w:left="1440" w:header="708" w:footer="708" w:gutter="0"/>
           <w:cols w:space="720"/>
@@ -15909,22 +17391,22 @@
       <w:pPr>
         <w:pStyle w:val="berschrift1"/>
       </w:pPr>
-      <w:bookmarkStart w:id="132" w:name="_Toc211138174"/>
-      <w:bookmarkStart w:id="133" w:name="_Toc211137930"/>
-      <w:bookmarkStart w:id="134" w:name="_Toc84751375"/>
-      <w:bookmarkStart w:id="135" w:name="_Toc84751263"/>
-      <w:bookmarkStart w:id="136" w:name="_Ref84675439"/>
-      <w:bookmarkStart w:id="137" w:name="_Toc223637601"/>
+      <w:bookmarkStart w:id="133" w:name="_Toc211138174"/>
+      <w:bookmarkStart w:id="134" w:name="_Toc211137930"/>
+      <w:bookmarkStart w:id="135" w:name="_Toc84751375"/>
+      <w:bookmarkStart w:id="136" w:name="_Toc84751263"/>
+      <w:bookmarkStart w:id="137" w:name="_Ref84675439"/>
+      <w:bookmarkStart w:id="138" w:name="_Toc223637601"/>
       <w:r>
         <w:lastRenderedPageBreak/>
         <w:t>Anhang</w:t>
       </w:r>
-      <w:bookmarkEnd w:id="132"/>
       <w:bookmarkEnd w:id="133"/>
       <w:bookmarkEnd w:id="134"/>
       <w:bookmarkEnd w:id="135"/>
       <w:bookmarkEnd w:id="136"/>
       <w:bookmarkEnd w:id="137"/>
+      <w:bookmarkEnd w:id="138"/>
     </w:p>
     <w:p>
       <w:pPr>
@@ -15933,8 +17415,8 @@
           <w:color w:val="0066FF"/>
         </w:rPr>
       </w:pPr>
-      <w:bookmarkStart w:id="138" w:name="_Ref210468443"/>
-      <w:bookmarkStart w:id="139" w:name="_Ref210464602"/>
+      <w:bookmarkStart w:id="139" w:name="_Ref210468443"/>
+      <w:bookmarkStart w:id="140" w:name="_Ref210464602"/>
       <w:r>
         <w:rPr>
           <w:color w:val="0066FF"/>
@@ -15955,8 +17437,8 @@
         </w:rPr>
         <w:t>) Optionales Kapitel. Hier werden Datenblätter, große Zeichnungen, Skizzen, Bilder, etc. eingefügt, die im Fließtext der vorigen Kapitel nicht eingefügt werden, da sie dort die Übersichtlichkeit bzw. Struktur dieser Kapitel verschlechtern würden.</w:t>
       </w:r>
-      <w:bookmarkEnd w:id="138"/>
       <w:bookmarkEnd w:id="139"/>
+      <w:bookmarkEnd w:id="140"/>
     </w:p>
     <w:p>
       <w:pPr>
@@ -15980,10 +17462,10 @@
       </w:pPr>
     </w:p>
     <w:sectPr>
-      <w:headerReference w:type="default" r:id="rId84"/>
-      <w:footerReference w:type="default" r:id="rId85"/>
-      <w:headerReference w:type="first" r:id="rId86"/>
-      <w:footerReference w:type="first" r:id="rId87"/>
+      <w:headerReference w:type="default" r:id="rId86"/>
+      <w:footerReference w:type="default" r:id="rId87"/>
+      <w:headerReference w:type="first" r:id="rId88"/>
+      <w:footerReference w:type="first" r:id="rId89"/>
       <w:pgSz w:w="11906" w:h="16838"/>
       <w:pgMar w:top="1417" w:right="1440" w:bottom="1134" w:left="1440" w:header="708" w:footer="708" w:gutter="0"/>
       <w:cols w:space="720"/>
@@ -16315,7 +17797,7 @@
       </w:r>
     </w:p>
   </w:comment>
-  <w:comment w:id="63" w:author="GRANEGGER Felix, SchülerIn" w:date="2026-03-10T20:11:00Z" w:initials="FG">
+  <w:comment w:id="63" w:author="GRANEGGER Felix, SchülerIn" w:date="2026-03-11T20:35:00Z" w:initials="FG">
     <w:p>
       <w:pPr>
         <w:pStyle w:val="Kommentartext"/>
@@ -16331,11 +17813,11 @@
         <w:rPr>
           <w:lang w:val="de-AT"/>
         </w:rPr>
-        <w:t>Im Anhang hinzufügen - kurze flussdiagramm</w:t>
+        <w:t>Nicht mehr ganz neu aber korrektur lesen</w:t>
       </w:r>
     </w:p>
   </w:comment>
-  <w:comment w:id="67" w:author="GRANEGGER Felix, SchülerIn" w:date="2026-02-26T20:30:00Z" w:initials="FG">
+  <w:comment w:id="64" w:author="GRANEGGER Felix, SchülerIn" w:date="2026-03-10T20:11:00Z" w:initials="FG">
     <w:p>
       <w:pPr>
         <w:pStyle w:val="Kommentartext"/>
@@ -16351,11 +17833,11 @@
         <w:rPr>
           <w:lang w:val="de-AT"/>
         </w:rPr>
-        <w:t>Spezifischer werden mit code ausschnitte</w:t>
+        <w:t>Im Anhang hinzufügen - kurze flussdiagramm</w:t>
       </w:r>
     </w:p>
   </w:comment>
-  <w:comment w:id="69" w:author="GRANEGGER Felix, SchülerIn" w:date="2026-03-03T14:53:00Z" w:initials="FG">
+  <w:comment w:id="68" w:author="GRANEGGER Felix, SchülerIn" w:date="2026-02-26T20:30:00Z" w:initials="FG">
     <w:p>
       <w:pPr>
         <w:pStyle w:val="Kommentartext"/>
@@ -16371,11 +17853,11 @@
         <w:rPr>
           <w:lang w:val="de-AT"/>
         </w:rPr>
-        <w:t>Schön schreiben</w:t>
+        <w:t>Spezifischer werden mit code ausschnitte</w:t>
       </w:r>
     </w:p>
   </w:comment>
-  <w:comment w:id="70" w:author="GRANEGGER Felix, SchülerIn" w:date="2026-03-03T14:55:00Z" w:initials="FG">
+  <w:comment w:id="69" w:author="GRANEGGER Felix, SchülerIn" w:date="2026-03-11T21:07:00Z" w:initials="FG">
     <w:p>
       <w:pPr>
         <w:pStyle w:val="Kommentartext"/>
@@ -16391,11 +17873,11 @@
         <w:rPr>
           <w:lang w:val="de-AT"/>
         </w:rPr>
-        <w:t>Verlängern auch noch</w:t>
+        <w:t>Ziemlich zufrieden (code immer gut aber braucht es nicht unbedingt)</w:t>
       </w:r>
     </w:p>
   </w:comment>
-  <w:comment w:id="72" w:author="GRANEGGER Felix, SchülerIn" w:date="2026-03-03T14:53:00Z" w:initials="FG">
+  <w:comment w:id="71" w:author="GRANEGGER Felix, SchülerIn" w:date="2026-03-03T14:53:00Z" w:initials="FG">
     <w:p>
       <w:pPr>
         <w:pStyle w:val="Kommentartext"/>
@@ -16411,11 +17893,16 @@
         <w:rPr>
           <w:lang w:val="de-AT"/>
         </w:rPr>
-        <w:t>Ki entfernen</w:t>
-      </w:r>
-    </w:p>
-  </w:comment>
-  <w:comment w:id="73" w:author="GRANEGGER Felix, SchülerIn" w:date="2026-03-10T13:52:00Z" w:initials="FG">
+        <w:t>Schön schreiben - vervollständigen</w:t>
+      </w:r>
+      <w:r>
+        <w:rPr>
+          <w:lang w:val="de-AT"/>
+        </w:rPr>
+        <w:br/>
+        <w:t xml:space="preserve">    Code ausschnitte</w:t>
+      </w:r>
+    </w:p>
     <w:p>
       <w:pPr>
         <w:pStyle w:val="Kommentartext"/>
@@ -16423,19 +17910,11 @@
       </w:pPr>
       <w:r>
         <w:rPr>
-          <w:rStyle w:val="Kommentarzeichen"/>
-        </w:rPr>
-        <w:annotationRef/>
-      </w:r>
-      <w:r>
-        <w:rPr>
           <w:lang w:val="de-AT"/>
         </w:rPr>
-        <w:t>Welchen genau??</w:t>
-      </w:r>
-    </w:p>
-  </w:comment>
-  <w:comment w:id="74" w:author="GRANEGGER Felix, SchülerIn" w:date="2026-03-03T14:40:00Z" w:initials="FG">
+        <w:t xml:space="preserve">    Bilder zu erklärung mit ROI Fenster</w:t>
+      </w:r>
+    </w:p>
     <w:p>
       <w:pPr>
         <w:pStyle w:val="Kommentartext"/>
@@ -16443,19 +17922,13 @@
       </w:pPr>
       <w:r>
         <w:rPr>
-          <w:rStyle w:val="Kommentarzeichen"/>
-        </w:rPr>
-        <w:annotationRef/>
-      </w:r>
-      <w:r>
-        <w:rPr>
           <w:lang w:val="de-AT"/>
         </w:rPr>
-        <w:t>überprüfen</w:t>
+        <w:t xml:space="preserve">    Faktoren wie padding und so genauer erklären</w:t>
       </w:r>
     </w:p>
   </w:comment>
-  <w:comment w:id="75" w:author="GRANEGGER Felix, SchülerIn" w:date="2026-03-10T13:55:00Z" w:initials="FG">
+  <w:comment w:id="72" w:author="GRANEGGER Felix, SchülerIn" w:date="2026-03-11T21:15:00Z" w:initials="FG">
     <w:p>
       <w:pPr>
         <w:pStyle w:val="Kommentartext"/>
@@ -16471,11 +17944,71 @@
         <w:rPr>
           <w:lang w:val="de-AT"/>
         </w:rPr>
+        <w:t>Bis hier wurde korrigiert - 11.03.2026</w:t>
+      </w:r>
+    </w:p>
+  </w:comment>
+  <w:comment w:id="74" w:author="GRANEGGER Felix, SchülerIn" w:date="2026-03-03T14:53:00Z" w:initials="FG">
+    <w:p>
+      <w:pPr>
+        <w:pStyle w:val="Kommentartext"/>
+        <w:jc w:val="left"/>
+      </w:pPr>
+      <w:r>
+        <w:rPr>
+          <w:rStyle w:val="Kommentarzeichen"/>
+        </w:rPr>
+        <w:annotationRef/>
+      </w:r>
+      <w:r>
+        <w:rPr>
+          <w:lang w:val="de-AT"/>
+        </w:rPr>
+        <w:t>Ki entfernen</w:t>
+      </w:r>
+    </w:p>
+  </w:comment>
+  <w:comment w:id="75" w:author="GRANEGGER Felix, SchülerIn" w:date="2026-03-03T14:40:00Z" w:initials="FG">
+    <w:p>
+      <w:pPr>
+        <w:pStyle w:val="Kommentartext"/>
+        <w:jc w:val="left"/>
+      </w:pPr>
+      <w:r>
+        <w:rPr>
+          <w:rStyle w:val="Kommentarzeichen"/>
+        </w:rPr>
+        <w:annotationRef/>
+      </w:r>
+      <w:r>
+        <w:rPr>
+          <w:lang w:val="de-AT"/>
+        </w:rPr>
+        <w:t>überprüfen</w:t>
+      </w:r>
+    </w:p>
+  </w:comment>
+  <w:comment w:id="76" w:author="GRANEGGER Felix, SchülerIn" w:date="2026-03-10T13:55:00Z" w:initials="FG">
+    <w:p>
+      <w:pPr>
+        <w:pStyle w:val="Kommentartext"/>
+        <w:jc w:val="left"/>
+      </w:pPr>
+      <w:r>
+        <w:rPr>
+          <w:rStyle w:val="Kommentarzeichen"/>
+        </w:rPr>
+        <w:annotationRef/>
+      </w:r>
+      <w:r>
+        <w:rPr>
+          <w:lang w:val="de-AT"/>
+        </w:rPr>
         <w:t>Hier ein ausschnitt der csv datei mit richtigen messergenissen und anzeige der Überschriften</w:t>
       </w:r>
     </w:p>
   </w:comment>
-  <w:comment w:id="77" w:author="GRANEGGER Felix, SchülerIn" w:date="2026-03-05T21:30:00Z" w:initials="FG">
+  <w:comment w:id="78" w:author="GRANEGGER Felix, SchülerIn" w:date="2026-03-05T21:30:00Z" w:initials="FG">
     <w:p>
       <w:pPr>
         <w:pStyle w:val="Kommentartext"/>
@@ -16511,12 +18044,13 @@
   <w15:commentEx w15:paraId="4A192756" w15:done="0"/>
   <w15:commentEx w15:paraId="597B687E" w15:done="0"/>
   <w15:commentEx w15:paraId="6E6481BD" w15:paraIdParent="597B687E" w15:done="0"/>
+  <w15:commentEx w15:paraId="770269BB" w15:paraIdParent="597B687E" w15:done="0"/>
   <w15:commentEx w15:paraId="0041BFF0" w15:done="0"/>
   <w15:commentEx w15:paraId="4350E179" w15:done="0"/>
+  <w15:commentEx w15:paraId="5249F485" w15:paraIdParent="4350E179" w15:done="0"/>
   <w15:commentEx w15:paraId="76D4A996" w15:done="0"/>
-  <w15:commentEx w15:paraId="11DBE143" w15:paraIdParent="76D4A996" w15:done="0"/>
+  <w15:commentEx w15:paraId="71E0EBA0" w15:done="0"/>
   <w15:commentEx w15:paraId="775156F2" w15:done="0"/>
-  <w15:commentEx w15:paraId="28B5AC17" w15:done="0"/>
   <w15:commentEx w15:paraId="3966106B" w15:done="0"/>
   <w15:commentEx w15:paraId="63BDED20" w15:done="0"/>
   <w15:commentEx w15:paraId="126FE310" w15:done="0"/>
@@ -16536,12 +18070,13 @@
   <w16cex:commentExtensible w16cex:durableId="02CEEAE4" w16cex:dateUtc="2026-02-18T19:53:00Z"/>
   <w16cex:commentExtensible w16cex:durableId="48B7EE91" w16cex:dateUtc="2026-03-10T14:00:00Z"/>
   <w16cex:commentExtensible w16cex:durableId="2119F9A4" w16cex:dateUtc="2026-03-10T14:22:00Z"/>
+  <w16cex:commentExtensible w16cex:durableId="71AACF6F" w16cex:dateUtc="2026-03-11T19:35:00Z"/>
   <w16cex:commentExtensible w16cex:durableId="70986559" w16cex:dateUtc="2026-03-10T19:11:00Z"/>
   <w16cex:commentExtensible w16cex:durableId="25BF1CEC" w16cex:dateUtc="2026-02-26T19:30:00Z"/>
+  <w16cex:commentExtensible w16cex:durableId="682DFDBE" w16cex:dateUtc="2026-03-11T20:07:00Z"/>
   <w16cex:commentExtensible w16cex:durableId="2F0D5A91" w16cex:dateUtc="2026-03-03T13:53:00Z"/>
-  <w16cex:commentExtensible w16cex:durableId="2492BA6D" w16cex:dateUtc="2026-03-03T13:55:00Z"/>
+  <w16cex:commentExtensible w16cex:durableId="192D8CB9" w16cex:dateUtc="2026-03-11T20:15:00Z"/>
   <w16cex:commentExtensible w16cex:durableId="28F10064" w16cex:dateUtc="2026-03-03T13:53:00Z"/>
-  <w16cex:commentExtensible w16cex:durableId="74672A0B" w16cex:dateUtc="2026-03-10T12:52:00Z"/>
   <w16cex:commentExtensible w16cex:durableId="46D6F6B3" w16cex:dateUtc="2026-03-03T13:40:00Z"/>
   <w16cex:commentExtensible w16cex:durableId="6C7B3964" w16cex:dateUtc="2026-03-10T12:55:00Z"/>
   <w16cex:commentExtensible w16cex:durableId="4DD3F4B5" w16cex:dateUtc="2026-03-05T20:30:00Z"/>
@@ -16561,12 +18096,13 @@
   <w16cid:commentId w16cid:paraId="4A192756" w16cid:durableId="02CEEAE4"/>
   <w16cid:commentId w16cid:paraId="597B687E" w16cid:durableId="48B7EE91"/>
   <w16cid:commentId w16cid:paraId="6E6481BD" w16cid:durableId="2119F9A4"/>
+  <w16cid:commentId w16cid:paraId="770269BB" w16cid:durableId="71AACF6F"/>
   <w16cid:commentId w16cid:paraId="0041BFF0" w16cid:durableId="70986559"/>
   <w16cid:commentId w16cid:paraId="4350E179" w16cid:durableId="25BF1CEC"/>
+  <w16cid:commentId w16cid:paraId="5249F485" w16cid:durableId="682DFDBE"/>
   <w16cid:commentId w16cid:paraId="76D4A996" w16cid:durableId="2F0D5A91"/>
-  <w16cid:commentId w16cid:paraId="11DBE143" w16cid:durableId="2492BA6D"/>
+  <w16cid:commentId w16cid:paraId="71E0EBA0" w16cid:durableId="192D8CB9"/>
   <w16cid:commentId w16cid:paraId="775156F2" w16cid:durableId="28F10064"/>
-  <w16cid:commentId w16cid:paraId="28B5AC17" w16cid:durableId="74672A0B"/>
   <w16cid:commentId w16cid:paraId="3966106B" w16cid:durableId="46D6F6B3"/>
   <w16cid:commentId w16cid:paraId="63BDED20" w16cid:durableId="6C7B3964"/>
   <w16cid:commentId w16cid:paraId="126FE310" w16cid:durableId="4DD3F4B5"/>
@@ -28307,6 +29843,47 @@
 </file>
 
 <file path=customXml/item1.xml><?xml version="1.0" encoding="utf-8"?>
+<?mso-contentType ?>
+<FormTemplates xmlns="http://schemas.microsoft.com/sharepoint/v3/contenttype/forms">
+  <Display>DocumentLibraryForm</Display>
+  <Edit>DocumentLibraryForm</Edit>
+  <New>DocumentLibraryForm</New>
+</FormTemplates>
+</file>
+
+<file path=customXml/item2.xml><?xml version="1.0" encoding="utf-8"?>
+<inkml:ink xmlns:inkml="http://www.w3.org/2003/InkML">
+  <inkml:definitions>
+    <inkml:context xml:id="ctx0">
+      <inkml:inkSource xml:id="inkSrc0">
+        <inkml:traceFormat>
+          <inkml:channel name="X" type="integer" min="-2.14748E9" max="2.14748E9" units="cm"/>
+          <inkml:channel name="Y" type="integer" min="-2.14748E9" max="2.14748E9" units="cm"/>
+          <inkml:channel name="F" type="integer" max="32767" units="dev"/>
+          <inkml:channel name="OA" type="integer" max="360" units="deg"/>
+          <inkml:channel name="OE" type="integer" max="90" units="deg"/>
+        </inkml:traceFormat>
+        <inkml:channelProperties>
+          <inkml:channelProperty channel="X" name="resolution" value="1000" units="1/cm"/>
+          <inkml:channelProperty channel="Y" name="resolution" value="1000" units="1/cm"/>
+          <inkml:channelProperty channel="F" name="resolution" value="0" units="1/dev"/>
+          <inkml:channelProperty channel="OA" name="resolution" value="1000" units="1/deg"/>
+          <inkml:channelProperty channel="OE" name="resolution" value="1000" units="1/deg"/>
+        </inkml:channelProperties>
+      </inkml:inkSource>
+      <inkml:timestamp xml:id="ts0" timeString="2025-06-10T16:08:50.568"/>
+    </inkml:context>
+    <inkml:brush xml:id="br0">
+      <inkml:brushProperty name="width" value="0.05" units="cm"/>
+      <inkml:brushProperty name="height" value="0.05" units="cm"/>
+      <inkml:brushProperty name="color" value="#E71224"/>
+    </inkml:brush>
+  </inkml:definitions>
+  <inkml:trace contextRef="#ctx0" brushRef="#br0">1236 239 3217 0 0,'-18'-44'2449'0'0,"11"24"-2251"0"0,-2 1 0 0 0,-14-27 0 0 0,19 39-210 0 0,-1 0 0 0 0,0 1-1 0 0,0 0 1 0 0,-1-1 0 0 0,0 2 0 0 0,0-1-1 0 0,0 1 1 0 0,0 0 0 0 0,-14-8-1 0 0,8 6-57 0 0,-1 1 0 0 0,1 1 1 0 0,-1 0-1 0 0,0 0 0 0 0,0 1 0 0 0,0 1 0 0 0,0 0 0 0 0,-1 1 0 0 0,-22-1 0 0 0,19 4-190 0 0,0 0-1 0 0,0 1 1 0 0,0 1-1 0 0,1 0 1 0 0,-1 1-1 0 0,1 1 1 0 0,-21 9-1 0 0,-37 17-295 0 0,-131 76-1 0 0,173-87 985 0 0,0 2 0 0 0,2 1 0 0 0,1 2 0 0 0,1 0 0 0 0,1 2 0 0 0,-28 37 0 0 0,-16 22-328 0 0,-54 78 18 0 0,113-145-112 0 0,0 0 1 0 0,2 1-1 0 0,1 0 0 0 0,0 0 0 0 0,2 1 1 0 0,0 0-1 0 0,-5 27 0 0 0,4 3 6 0 0,3 0-1 0 0,1 0 0 0 0,3 0 1 0 0,2 1-1 0 0,2-1 1 0 0,13 62-1 0 0,-11-89 37 0 0,1-1 0 0 0,2 1 0 0 0,0-1 0 0 0,1-1 0 0 0,1 0 0 0 0,2 0-1 0 0,0-1 1 0 0,1-1 0 0 0,1 0 0 0 0,1 0 0 0 0,25 25 0 0 0,-31-38 8 0 0,1 0 0 0 0,0-1 0 0 0,0 0 0 0 0,1-1-1 0 0,0 0 1 0 0,0 0 0 0 0,0-1 0 0 0,0 0 0 0 0,1-1 0 0 0,-1-1 0 0 0,1 0 0 0 0,23 1 0 0 0,0-2-27 0 0,-1-1 0 0 0,0-2 0 0 0,43-8 0 0 0,15-10 179 0 0,-1-4 0 0 0,111-46 0 0 0,-162 55-168 0 0,0 1-21 0 0,5-1 26 0 0,-2-3-1 0 0,45-23 0 0 0,-67 26 22 0 0,-1 0 0 0 0,0-2-1 0 0,-2 0 1 0 0,0-1 0 0 0,-1-1 0 0 0,0-1 0 0 0,-2 0-1 0 0,22-37 1 0 0,-28 39-39 0 0,0 1 1 0 0,-1-1-1 0 0,-1-1 0 0 0,-1 0 1 0 0,-1 1-1 0 0,0-2 0 0 0,-2 1 0 0 0,0 0 1 0 0,0-25-1 0 0,-2-13 167 0 0,-14-108-1 0 0,10 143-149 0 0,-1 0-1 0 0,0 1 1 0 0,-2-1-1 0 0,-1 1 1 0 0,-1 0-1 0 0,0 1 1 0 0,-1 0-1 0 0,-23-35 0 0 0,22 41 15 0 0,-1 0 0 0 0,0 0-1 0 0,-1 1 1 0 0,-1 0 0 0 0,0 1-1 0 0,0 1 1 0 0,-1 0 0 0 0,-1 1-1 0 0,0 0 1 0 0,0 1 0 0 0,-25-10-1 0 0,15 9-505 0 0,-1 1-1 0 0,0 2 1 0 0,0 0 0 0 0,-49-5-1 0 0,41 10-389 0 0</inkml:trace>
+</inkml:ink>
+</file>
+
+<file path=customXml/item3.xml><?xml version="1.0" encoding="utf-8"?>
 <ct:contentTypeSchema xmlns:ct="http://schemas.microsoft.com/office/2006/metadata/contentType" xmlns:ma="http://schemas.microsoft.com/office/2006/metadata/properties/metaAttributes" ct:_="" ma:_="" ma:contentTypeName="Dokument" ma:contentTypeID="0x01010025C71E9534E21E4A9F2CF33BA7DCE92D" ma:contentTypeVersion="3" ma:contentTypeDescription="Ein neues Dokument erstellen." ma:contentTypeScope="" ma:versionID="32b9bbdf2bbf4e0fb27a426421665337">
   <xsd:schema xmlns:xsd="http://www.w3.org/2001/XMLSchema" xmlns:xs="http://www.w3.org/2001/XMLSchema" xmlns:p="http://schemas.microsoft.com/office/2006/metadata/properties" xmlns:ns2="5a9e9855-01b6-487f-b294-67c59083cc31" targetNamespace="http://schemas.microsoft.com/office/2006/metadata/properties" ma:root="true" ma:fieldsID="ec87b9b32475f90c9dbf7ae918480825" ns2:_="">
     <xsd:import namespace="5a9e9855-01b6-487f-b294-67c59083cc31"/>
@@ -28444,43 +30021,13 @@
 </ct:contentTypeSchema>
 </file>
 
-<file path=customXml/item2.xml><?xml version="1.0" encoding="utf-8"?>
-<b:Sources xmlns:b="http://schemas.openxmlformats.org/officeDocument/2006/bibliography" xmlns="http://schemas.openxmlformats.org/officeDocument/2006/bibliography" SelectedStyle="\APASixthEditionOfficeOnline.xsl" StyleName="APA" Version="6"/>
+<file path=customXml/item4.xml><?xml version="1.0" encoding="utf-8"?>
+<p:properties xmlns:p="http://schemas.microsoft.com/office/2006/metadata/properties" xmlns:xsi="http://www.w3.org/2001/XMLSchema-instance" xmlns:pc="http://schemas.microsoft.com/office/infopath/2007/PartnerControls">
+  <documentManagement/>
+</p:properties>
 </file>
 
-<file path=customXml/item3.xml><?xml version="1.0" encoding="utf-8"?>
-<inkml:ink xmlns:inkml="http://www.w3.org/2003/InkML">
-  <inkml:definitions>
-    <inkml:context xml:id="ctx0">
-      <inkml:inkSource xml:id="inkSrc0">
-        <inkml:traceFormat>
-          <inkml:channel name="X" type="integer" min="-2.14748E9" max="2.14748E9" units="cm"/>
-          <inkml:channel name="Y" type="integer" min="-2.14748E9" max="2.14748E9" units="cm"/>
-          <inkml:channel name="F" type="integer" max="32767" units="dev"/>
-          <inkml:channel name="OA" type="integer" max="360" units="deg"/>
-          <inkml:channel name="OE" type="integer" max="90" units="deg"/>
-        </inkml:traceFormat>
-        <inkml:channelProperties>
-          <inkml:channelProperty channel="X" name="resolution" value="1000" units="1/cm"/>
-          <inkml:channelProperty channel="Y" name="resolution" value="1000" units="1/cm"/>
-          <inkml:channelProperty channel="F" name="resolution" value="0" units="1/dev"/>
-          <inkml:channelProperty channel="OA" name="resolution" value="1000" units="1/deg"/>
-          <inkml:channelProperty channel="OE" name="resolution" value="1000" units="1/deg"/>
-        </inkml:channelProperties>
-      </inkml:inkSource>
-      <inkml:timestamp xml:id="ts0" timeString="2025-06-10T16:08:50.568"/>
-    </inkml:context>
-    <inkml:brush xml:id="br0">
-      <inkml:brushProperty name="width" value="0.05" units="cm"/>
-      <inkml:brushProperty name="height" value="0.05" units="cm"/>
-      <inkml:brushProperty name="color" value="#E71224"/>
-    </inkml:brush>
-  </inkml:definitions>
-  <inkml:trace contextRef="#ctx0" brushRef="#br0">1236 239 3217 0 0,'-18'-44'2449'0'0,"11"24"-2251"0"0,-2 1 0 0 0,-14-27 0 0 0,19 39-210 0 0,-1 0 0 0 0,0 1-1 0 0,0 0 1 0 0,-1-1 0 0 0,0 2 0 0 0,0-1-1 0 0,0 1 1 0 0,0 0 0 0 0,-14-8-1 0 0,8 6-57 0 0,-1 1 0 0 0,1 1 1 0 0,-1 0-1 0 0,0 0 0 0 0,0 1 0 0 0,0 1 0 0 0,0 0 0 0 0,-1 1 0 0 0,-22-1 0 0 0,19 4-190 0 0,0 0-1 0 0,0 1 1 0 0,0 1-1 0 0,1 0 1 0 0,-1 1-1 0 0,1 1 1 0 0,-21 9-1 0 0,-37 17-295 0 0,-131 76-1 0 0,173-87 985 0 0,0 2 0 0 0,2 1 0 0 0,1 2 0 0 0,1 0 0 0 0,1 2 0 0 0,-28 37 0 0 0,-16 22-328 0 0,-54 78 18 0 0,113-145-112 0 0,0 0 1 0 0,2 1-1 0 0,1 0 0 0 0,0 0 0 0 0,2 1 1 0 0,0 0-1 0 0,-5 27 0 0 0,4 3 6 0 0,3 0-1 0 0,1 0 0 0 0,3 0 1 0 0,2 1-1 0 0,2-1 1 0 0,13 62-1 0 0,-11-89 37 0 0,1-1 0 0 0,2 1 0 0 0,0-1 0 0 0,1-1 0 0 0,1 0 0 0 0,2 0-1 0 0,0-1 1 0 0,1-1 0 0 0,1 0 0 0 0,1 0 0 0 0,25 25 0 0 0,-31-38 8 0 0,1 0 0 0 0,0-1 0 0 0,0 0 0 0 0,1-1-1 0 0,0 0 1 0 0,0 0 0 0 0,0-1 0 0 0,0 0 0 0 0,1-1 0 0 0,-1-1 0 0 0,1 0 0 0 0,23 1 0 0 0,0-2-27 0 0,-1-1 0 0 0,0-2 0 0 0,43-8 0 0 0,15-10 179 0 0,-1-4 0 0 0,111-46 0 0 0,-162 55-168 0 0,0 1-21 0 0,5-1 26 0 0,-2-3-1 0 0,45-23 0 0 0,-67 26 22 0 0,-1 0 0 0 0,0-2-1 0 0,-2 0 1 0 0,0-1 0 0 0,-1-1 0 0 0,0-1 0 0 0,-2 0-1 0 0,22-37 1 0 0,-28 39-39 0 0,0 1 1 0 0,-1-1-1 0 0,-1-1 0 0 0,-1 0 1 0 0,-1 1-1 0 0,0-2 0 0 0,-2 1 0 0 0,0 0 1 0 0,0-25-1 0 0,-2-13 167 0 0,-14-108-1 0 0,10 143-149 0 0,-1 0-1 0 0,0 1 1 0 0,-2-1-1 0 0,-1 1 1 0 0,-1 0-1 0 0,0 1 1 0 0,-1 0-1 0 0,-23-35 0 0 0,22 41 15 0 0,-1 0 0 0 0,0 0-1 0 0,-1 1 1 0 0,-1 0 0 0 0,0 1-1 0 0,0 1 1 0 0,-1 0 0 0 0,-1 1-1 0 0,0 0 1 0 0,0 1 0 0 0,-25-10-1 0 0,15 9-505 0 0,-1 1-1 0 0,0 2 1 0 0,0 0 0 0 0,-49-5-1 0 0,41 10-389 0 0</inkml:trace>
-</inkml:ink>
-</file>
-
-<file path=customXml/item4.xml><?xml version="1.0" encoding="utf-8"?>
+<file path=customXml/item5.xml><?xml version="1.0" encoding="utf-8"?>
 <inkml:ink xmlns:inkml="http://www.w3.org/2003/InkML">
   <inkml:definitions>
     <inkml:context xml:id="ctx0">
@@ -28524,22 +30071,7 @@
 </inkml:ink>
 </file>
 
-<file path=customXml/item5.xml><?xml version="1.0" encoding="utf-8"?>
-<?mso-contentType ?>
-<FormTemplates xmlns="http://schemas.microsoft.com/sharepoint/v3/contenttype/forms">
-  <Display>DocumentLibraryForm</Display>
-  <Edit>DocumentLibraryForm</Edit>
-  <New>DocumentLibraryForm</New>
-</FormTemplates>
-</file>
-
 <file path=customXml/item6.xml><?xml version="1.0" encoding="utf-8"?>
-<p:properties xmlns:p="http://schemas.microsoft.com/office/2006/metadata/properties" xmlns:xsi="http://www.w3.org/2001/XMLSchema-instance" xmlns:pc="http://schemas.microsoft.com/office/infopath/2007/PartnerControls">
-  <documentManagement/>
-</p:properties>
-</file>
-
-<file path=customXml/item7.xml><?xml version="1.0" encoding="utf-8"?>
 <inkml:ink xmlns:inkml="http://www.w3.org/2003/InkML">
   <inkml:definitions>
     <inkml:context xml:id="ctx0">
@@ -28573,7 +30105,27 @@
 </inkml:ink>
 </file>
 
+<file path=customXml/item7.xml><?xml version="1.0" encoding="utf-8"?>
+<b:Sources xmlns:b="http://schemas.openxmlformats.org/officeDocument/2006/bibliography" xmlns="http://schemas.openxmlformats.org/officeDocument/2006/bibliography" SelectedStyle="\APASixthEditionOfficeOnline.xsl" StyleName="APA" Version="6"/>
+</file>
+
 <file path=customXml/itemProps1.xml><?xml version="1.0" encoding="utf-8"?>
+<ds:datastoreItem xmlns:ds="http://schemas.openxmlformats.org/officeDocument/2006/customXml" ds:itemID="{6A655C0C-F4A3-4931-9F7F-84CBD61DCE8F}">
+  <ds:schemaRefs>
+    <ds:schemaRef ds:uri="http://schemas.microsoft.com/sharepoint/v3/contenttype/forms"/>
+  </ds:schemaRefs>
+</ds:datastoreItem>
+</file>
+
+<file path=customXml/itemProps2.xml><?xml version="1.0" encoding="utf-8"?>
+<ds:datastoreItem xmlns:ds="http://schemas.openxmlformats.org/officeDocument/2006/customXml" ds:itemID="{4B023D59-82BC-4D0F-A651-C98E01C1F15C}">
+  <ds:schemaRefs>
+    <ds:schemaRef ds:uri="http://www.w3.org/2003/InkML"/>
+  </ds:schemaRefs>
+</ds:datastoreItem>
+</file>
+
+<file path=customXml/itemProps3.xml><?xml version="1.0" encoding="utf-8"?>
 <ds:datastoreItem xmlns:ds="http://schemas.openxmlformats.org/officeDocument/2006/customXml" ds:itemID="{4B023D59-82BC-4D0F-A651-C98E01C1F15C}">
   <ds:schemaRefs>
     <ds:schemaRef ds:uri="http://schemas.microsoft.com/office/2006/metadata/contentType"/>
@@ -28591,39 +30143,7 @@
 </ds:datastoreItem>
 </file>
 
-<file path=customXml/itemProps2.xml><?xml version="1.0" encoding="utf-8"?>
-<ds:datastoreItem xmlns:ds="http://schemas.openxmlformats.org/officeDocument/2006/customXml" ds:itemID="{01D51A4F-7BE7-46DF-A7D0-BDB91C1C49A3}">
-  <ds:schemaRefs>
-    <ds:schemaRef ds:uri="http://schemas.openxmlformats.org/officeDocument/2006/bibliography"/>
-  </ds:schemaRefs>
-</ds:datastoreItem>
-</file>
-
-<file path=customXml/itemProps3.xml><?xml version="1.0" encoding="utf-8"?>
-<ds:datastoreItem xmlns:ds="http://schemas.openxmlformats.org/officeDocument/2006/customXml" ds:itemID="{4B023D59-82BC-4D0F-A651-C98E01C1F15C}">
-  <ds:schemaRefs>
-    <ds:schemaRef ds:uri="http://www.w3.org/2003/InkML"/>
-  </ds:schemaRefs>
-</ds:datastoreItem>
-</file>
-
 <file path=customXml/itemProps4.xml><?xml version="1.0" encoding="utf-8"?>
-<ds:datastoreItem xmlns:ds="http://schemas.openxmlformats.org/officeDocument/2006/customXml" ds:itemID="{4B023D59-82BC-4D0F-A651-C98E01C1F15C}">
-  <ds:schemaRefs>
-    <ds:schemaRef ds:uri="http://www.w3.org/2003/InkML"/>
-  </ds:schemaRefs>
-</ds:datastoreItem>
-</file>
-
-<file path=customXml/itemProps5.xml><?xml version="1.0" encoding="utf-8"?>
-<ds:datastoreItem xmlns:ds="http://schemas.openxmlformats.org/officeDocument/2006/customXml" ds:itemID="{6A655C0C-F4A3-4931-9F7F-84CBD61DCE8F}">
-  <ds:schemaRefs>
-    <ds:schemaRef ds:uri="http://schemas.microsoft.com/sharepoint/v3/contenttype/forms"/>
-  </ds:schemaRefs>
-</ds:datastoreItem>
-</file>
-
-<file path=customXml/itemProps6.xml><?xml version="1.0" encoding="utf-8"?>
 <ds:datastoreItem xmlns:ds="http://schemas.openxmlformats.org/officeDocument/2006/customXml" ds:itemID="{CE199482-6225-420D-8982-84EA3B0C446C}">
   <ds:schemaRefs>
     <ds:schemaRef ds:uri="http://schemas.microsoft.com/office/2006/metadata/properties"/>
@@ -28632,10 +30152,26 @@
 </ds:datastoreItem>
 </file>
 
-<file path=customXml/itemProps7.xml><?xml version="1.0" encoding="utf-8"?>
+<file path=customXml/itemProps5.xml><?xml version="1.0" encoding="utf-8"?>
+<ds:datastoreItem xmlns:ds="http://schemas.openxmlformats.org/officeDocument/2006/customXml" ds:itemID="{4B023D59-82BC-4D0F-A651-C98E01C1F15C}">
+  <ds:schemaRefs>
+    <ds:schemaRef ds:uri="http://www.w3.org/2003/InkML"/>
+  </ds:schemaRefs>
+</ds:datastoreItem>
+</file>
+
+<file path=customXml/itemProps6.xml><?xml version="1.0" encoding="utf-8"?>
 <ds:datastoreItem xmlns:ds="http://schemas.openxmlformats.org/officeDocument/2006/customXml" ds:itemID="{01D51A4F-7BE7-46DF-A7D0-BDB91C1C49A3}">
   <ds:schemaRefs>
     <ds:schemaRef ds:uri="http://www.w3.org/2003/InkML"/>
   </ds:schemaRefs>
 </ds:datastoreItem>
+</file>
+
+<file path=customXml/itemProps7.xml><?xml version="1.0" encoding="utf-8"?>
+<ds:datastoreItem xmlns:ds="http://schemas.openxmlformats.org/officeDocument/2006/customXml" ds:itemID="{01D51A4F-7BE7-46DF-A7D0-BDB91C1C49A3}">
+  <ds:schemaRefs>
+    <ds:schemaRef ds:uri="http://schemas.openxmlformats.org/officeDocument/2006/bibliography"/>
+  </ds:schemaRefs>
+</ds:datastoreItem>
 </file>
</xml_diff>

<commit_message>
pip install libarys hinzugefügt - mit doku hinzugefügt
</commit_message>
<xml_diff>
--- a/D_Documentation/Doku-Felix.docx
+++ b/D_Documentation/Doku-Felix.docx
@@ -7,6 +7,9 @@
         <w:jc w:val="center"/>
       </w:pPr>
       <w:r>
+        <w:rPr>
+          <w:noProof/>
+        </w:rPr>
         <w:drawing>
           <wp:inline distT="0" distB="0" distL="0" distR="0" wp14:anchorId="3AB7653E" wp14:editId="28B3CC26">
             <wp:extent cx="5039995" cy="1054735"/>
@@ -4772,15 +4775,7 @@
         <w:pStyle w:val="Text"/>
       </w:pPr>
       <w:r>
-        <w:t xml:space="preserve">Dabei werden die Kameras und Sensoren softwareseitig angesteuert, um die Länge, Breite, Höhe sowie das Gewicht der Artikel präzise zu bestimmen. Gleichzeitig </w:t>
-      </w:r>
-      <w:proofErr w:type="gramStart"/>
-      <w:r>
-        <w:t>erfolgt</w:t>
-      </w:r>
-      <w:proofErr w:type="gramEnd"/>
-      <w:r>
-        <w:t xml:space="preserve"> die automatische Erkennung und Auswertung von Barcode- und QR-Codes, wodurch manuelle Eingaben minimiert und Fehlerquellen reduziert werden. </w:t>
+        <w:t xml:space="preserve">Dabei werden die Kameras und Sensoren softwareseitig angesteuert, um die Länge, Breite, Höhe sowie das Gewicht der Artikel präzise zu bestimmen. Gleichzeitig erfolgt die automatische Erkennung und Auswertung von Barcode- und QR-Codes, wodurch manuelle Eingaben minimiert und Fehlerquellen reduziert werden. </w:t>
       </w:r>
     </w:p>
     <w:p>
@@ -4980,14 +4975,7 @@
         <w:rPr>
           <w:color w:val="0066FF"/>
         </w:rPr>
-        <w:t xml:space="preserve">(FV = Text) Beschreibung der theoretischen Grundlagen. Wichtig dabei ist die Angabe der verwendeten Literatur- und Internetquellen, sowie die korrekte Angabe der Verwendung KI, wenn </w:t>
-      </w:r>
-      <w:proofErr w:type="gramStart"/>
-      <w:r>
-        <w:rPr>
-          <w:color w:val="0066FF"/>
-        </w:rPr>
-        <w:t xml:space="preserve">von dieser </w:t>
+        <w:t xml:space="preserve">(FV = Text) Beschreibung der theoretischen Grundlagen. Wichtig dabei ist die Angabe der verwendeten Literatur- und Internetquellen, sowie die korrekte Angabe der Verwendung KI, wenn von dieser </w:t>
       </w:r>
       <w:r>
         <w:rPr>
@@ -4996,7 +4984,6 @@
         </w:rPr>
         <w:t>fachliche Inhalte</w:t>
       </w:r>
-      <w:proofErr w:type="gramEnd"/>
       <w:r>
         <w:rPr>
           <w:color w:val="0066FF"/>
@@ -5677,6 +5664,9 @@
         <w:jc w:val="center"/>
       </w:pPr>
       <w:r>
+        <w:rPr>
+          <w:noProof/>
+        </w:rPr>
         <w:lastRenderedPageBreak/>
         <w:drawing>
           <wp:anchor distT="0" distB="0" distL="114300" distR="114300" simplePos="0" relativeHeight="251655168" behindDoc="0" locked="0" layoutInCell="1" allowOverlap="1" wp14:anchorId="425D857A" wp14:editId="18D6703D">
@@ -5722,6 +5712,9 @@
         </w:drawing>
       </w:r>
       <w:r>
+        <w:rPr>
+          <w:noProof/>
+        </w:rPr>
         <w:drawing>
           <wp:anchor distT="0" distB="0" distL="114300" distR="114300" simplePos="0" relativeHeight="251657216" behindDoc="0" locked="0" layoutInCell="1" allowOverlap="1" wp14:anchorId="759CA29B" wp14:editId="15171B55">
             <wp:simplePos x="0" y="0"/>
@@ -5766,6 +5759,9 @@
         </w:drawing>
       </w:r>
       <w:r>
+        <w:rPr>
+          <w:noProof/>
+        </w:rPr>
         <w:drawing>
           <wp:anchor distT="0" distB="0" distL="114300" distR="114300" simplePos="0" relativeHeight="251659264" behindDoc="0" locked="0" layoutInCell="1" allowOverlap="1" wp14:anchorId="32804BA5" wp14:editId="7EE2C284">
             <wp:simplePos x="0" y="0"/>
@@ -5810,6 +5806,9 @@
         </w:drawing>
       </w:r>
       <w:r>
+        <w:rPr>
+          <w:noProof/>
+        </w:rPr>
         <w:drawing>
           <wp:inline distT="0" distB="0" distL="0" distR="0" wp14:anchorId="5C4D5064" wp14:editId="1D11F1B5">
             <wp:extent cx="5731510" cy="4182745"/>
@@ -5974,28 +5973,14 @@
         <w:rPr>
           <w:color w:val="0066FF"/>
         </w:rPr>
-        <w:t xml:space="preserve">(FV = Text) Diese Abschnitte sind individuell </w:t>
-      </w:r>
-      <w:proofErr w:type="gramStart"/>
+        <w:t xml:space="preserve">(FV = Text) Diese Abschnitte sind individuell mit Ihren </w:t>
+      </w:r>
+      <w:proofErr w:type="spellStart"/>
       <w:r>
         <w:rPr>
           <w:color w:val="0066FF"/>
         </w:rPr>
-        <w:t xml:space="preserve">mit Ihren </w:t>
-      </w:r>
-      <w:proofErr w:type="spellStart"/>
-      <w:r>
-        <w:rPr>
-          <w:color w:val="0066FF"/>
-        </w:rPr>
-        <w:t>Betreuer</w:t>
-      </w:r>
-      <w:proofErr w:type="gramEnd"/>
-      <w:r>
-        <w:rPr>
-          <w:color w:val="0066FF"/>
-        </w:rPr>
-        <w:t>:innen</w:t>
+        <w:t>Betreuer:innen</w:t>
       </w:r>
       <w:proofErr w:type="spellEnd"/>
       <w:r>
@@ -6050,21 +6035,7 @@
         <w:rPr>
           <w:color w:val="0066FF"/>
         </w:rPr>
-        <w:t xml:space="preserve">(FV = Text) </w:t>
-      </w:r>
-      <w:proofErr w:type="gramStart"/>
-      <w:r>
-        <w:rPr>
-          <w:color w:val="0066FF"/>
-        </w:rPr>
-        <w:t>Hier</w:t>
-      </w:r>
-      <w:proofErr w:type="gramEnd"/>
-      <w:r>
-        <w:rPr>
-          <w:color w:val="0066FF"/>
-        </w:rPr>
-        <w:t xml:space="preserve"> werden die wichtigsten Fakten der individuellen Aufgabe des Schülers / der Schülerin kurz zusammengefasst werden.</w:t>
+        <w:t>(FV = Text) Hier werden die wichtigsten Fakten der individuellen Aufgabe des Schülers / der Schülerin kurz zusammengefasst werden.</w:t>
       </w:r>
     </w:p>
     <w:p>
@@ -6321,14 +6292,12 @@
         </w:rPr>
         <w:t xml:space="preserve">Als geplantes Ergebnis entsteht eine vollständig integrierte Softwarelösung, welche die Sensoransteuerung, Datenauswertung und Visualisierung </w:t>
       </w:r>
-      <w:proofErr w:type="gramStart"/>
       <w:r>
         <w:rPr>
           <w:lang w:eastAsia="de-AT"/>
         </w:rPr>
         <w:t>vereint</w:t>
       </w:r>
-      <w:proofErr w:type="gramEnd"/>
       <w:r>
         <w:rPr>
           <w:lang w:eastAsia="de-AT"/>
@@ -6822,7 +6791,13 @@
         <w:t xml:space="preserve">: </w:t>
       </w:r>
       <w:r>
-        <w:t>Tiefenberechnung aus Disparität</w:t>
+        <w:t xml:space="preserve">Tiefenberechnung </w:t>
+      </w:r>
+      <w:r>
+        <w:t xml:space="preserve">von der </w:t>
+      </w:r>
+      <w:r>
+        <w:t>Disparität</w:t>
       </w:r>
     </w:p>
     <w:p>
@@ -7101,6 +7076,9 @@
         <w:jc w:val="center"/>
       </w:pPr>
       <w:r>
+        <w:rPr>
+          <w:noProof/>
+        </w:rPr>
         <w:drawing>
           <wp:inline distT="0" distB="0" distL="0" distR="0" wp14:anchorId="495CBD20" wp14:editId="05D04D0B">
             <wp:extent cx="2952628" cy="920262"/>
@@ -7404,7 +7382,7 @@
                 <w:rPr>
                   <w:rFonts w:ascii="Cambria Math"/>
                 </w:rPr>
-                <m:t>focalLength</m:t>
+                <m:t>Brennweite</m:t>
               </m:r>
               <m:r>
                 <w:rPr>
@@ -7416,8 +7394,16 @@
                 <m:rPr>
                   <m:nor/>
                 </m:rPr>
-                <m:t>baseline</m:t>
+                <m:t>B</m:t>
               </m:r>
+              <w:proofErr w:type="spellStart"/>
+              <m:r>
+                <m:rPr>
+                  <m:nor/>
+                </m:rPr>
+                <m:t>aseline</m:t>
+              </m:r>
+              <w:proofErr w:type="spellEnd"/>
             </m:num>
             <m:den>
               <m:r>
@@ -7429,6 +7415,9 @@
             </m:den>
           </m:f>
           <m:r>
+            <m:rPr>
+              <m:sty m:val="p"/>
+            </m:rPr>
             <w:br/>
           </m:r>
         </m:oMath>
@@ -7845,25 +7834,26 @@
     <w:p>
       <w:pPr>
         <w:pStyle w:val="Text"/>
-        <w:rPr>
-          <w:lang w:val="en-GB"/>
-        </w:rPr>
-      </w:pPr>
+      </w:pPr>
+      <w:proofErr w:type="spellStart"/>
       <m:oMathPara>
         <m:oMath>
           <m:r>
             <m:rPr>
               <m:nor/>
             </m:rPr>
-            <w:rPr>
-              <w:lang w:val="en-GB"/>
-            </w:rPr>
-            <m:t>MinZ [400P]</m:t>
+            <m:t>MinZ</m:t>
+          </m:r>
+          <w:proofErr w:type="spellEnd"/>
+          <m:r>
+            <m:rPr>
+              <m:nor/>
+            </m:rPr>
+            <m:t xml:space="preserve"> [400P]</m:t>
           </m:r>
           <m:r>
             <w:rPr>
               <w:rFonts w:ascii="Cambria Math" w:hAnsi="Cambria Math"/>
-              <w:lang w:val="en-GB"/>
             </w:rPr>
             <m:t>=</m:t>
           </m:r>
@@ -7880,7 +7870,6 @@
               <m:r>
                 <w:rPr>
                   <w:rFonts w:ascii="Cambria Math" w:hAnsi="Cambria Math"/>
-                  <w:lang w:val="en-GB"/>
                 </w:rPr>
                 <m:t>441⋅7,5</m:t>
               </m:r>
@@ -7889,7 +7878,6 @@
               <m:r>
                 <w:rPr>
                   <w:rFonts w:ascii="Cambria Math" w:hAnsi="Cambria Math"/>
-                  <w:lang w:val="en-GB"/>
                 </w:rPr>
                 <m:t>95</m:t>
               </m:r>
@@ -7898,7 +7886,6 @@
           <m:r>
             <w:rPr>
               <w:rFonts w:ascii="Cambria Math" w:hAnsi="Cambria Math"/>
-              <w:lang w:val="en-GB"/>
             </w:rPr>
             <m:t>≈35</m:t>
           </m:r>
@@ -7906,9 +7893,6 @@
             <m:rPr>
               <m:nor/>
             </m:rPr>
-            <w:rPr>
-              <w:lang w:val="en-GB"/>
-            </w:rPr>
             <m:t> cm</m:t>
           </m:r>
         </m:oMath>
@@ -7924,71 +7908,30 @@
         <w:pStyle w:val="Text"/>
       </w:pPr>
       <w:r>
-        <w:t xml:space="preserve">Mit dem </w:t>
+        <w:t xml:space="preserve">Der </w:t>
       </w:r>
       <w:r>
         <w:rPr>
           <w:rStyle w:val="Hervorhebung"/>
         </w:rPr>
-        <w:t>„</w:t>
-      </w:r>
+        <w:t xml:space="preserve">Stereo Extended </w:t>
+      </w:r>
+      <w:proofErr w:type="spellStart"/>
       <w:r>
         <w:rPr>
           <w:rStyle w:val="Hervorhebung"/>
         </w:rPr>
-        <w:t xml:space="preserve">Stereo Extended </w:t>
-      </w:r>
-      <w:proofErr w:type="spellStart"/>
+        <w:t>Disparity</w:t>
+      </w:r>
+      <w:proofErr w:type="spellEnd"/>
       <w:r>
         <w:rPr>
           <w:rStyle w:val="Hervorhebung"/>
         </w:rPr>
-        <w:t>Disparity</w:t>
-      </w:r>
-      <w:proofErr w:type="spellEnd"/>
-      <w:r>
-        <w:rPr>
-          <w:rStyle w:val="Hervorhebung"/>
-        </w:rPr>
         <w:t xml:space="preserve"> Mode</w:t>
       </w:r>
       <w:r>
-        <w:rPr>
-          <w:rStyle w:val="Hervorhebung"/>
-        </w:rPr>
-        <w:t>“</w:t>
-      </w:r>
-      <w:r>
-        <w:t xml:space="preserve"> kann die</w:t>
-      </w:r>
-      <w:r>
-        <w:t xml:space="preserve">se </w:t>
-      </w:r>
-      <w:r>
-        <w:t xml:space="preserve"> </w:t>
-      </w:r>
-      <w:r>
-        <w:t>D</w:t>
-      </w:r>
-      <w:r>
-        <w:t>istanz</w:t>
-      </w:r>
-      <w:r>
-        <w:t xml:space="preserve"> (</w:t>
-      </w:r>
-      <w:proofErr w:type="spellStart"/>
-      <w:r>
-        <w:t>MinZ</w:t>
-      </w:r>
-      <w:proofErr w:type="spellEnd"/>
-      <w:r>
-        <w:t>)</w:t>
-      </w:r>
-      <w:r>
-        <w:t xml:space="preserve"> weiter verkleinert werden, sodass auch Objekte näher an der Kamera gemessen werden können.</w:t>
-      </w:r>
-      <w:r>
-        <w:t xml:space="preserve"> </w:t>
+        <w:t xml:space="preserve"> reduziert die minimale Messtiefe weiter, sodass auch Objekte in sehr geringem Abstand zur Kamera erfasst werden können. Allerdings erfolgt diese Erweiterung auf Kosten der Messgenauigkeit.</w:t>
       </w:r>
       <w:r>
         <w:br w:type="page"/>
@@ -8023,7 +7966,7 @@
           <w:noProof/>
         </w:rPr>
         <w:drawing>
-          <wp:inline distT="0" distB="0" distL="0" distR="0" wp14:anchorId="20DDD150" wp14:editId="6E5C4C64">
+          <wp:inline distT="0" distB="0" distL="0" distR="0" wp14:anchorId="20DDD150" wp14:editId="08536DD5">
             <wp:extent cx="2856556" cy="2465070"/>
             <wp:effectExtent l="0" t="0" r="0" b="0"/>
             <wp:docPr id="1830180983" name="Grafik 2" descr="Ein Bild, das Diagramm, Reihe, parallel, Steigung enthält.&#10;&#10;KI-generierte Inhalte können fehlerhaft sein."/>
@@ -9869,40 +9812,61 @@
             <w:pPr>
               <w:pStyle w:val="TextinTabelle"/>
               <w:jc w:val="center"/>
+              <w:rPr>
+                <w:lang w:val="en-GB"/>
+              </w:rPr>
             </w:pPr>
             <w:r>
+              <w:rPr>
+                <w:lang w:val="en-GB"/>
+              </w:rPr>
               <w:t>Scans/</w:t>
             </w:r>
             <w:r>
               <w:rPr>
                 <w:rStyle w:val="SchwacheHervorhebung"/>
+                <w:lang w:val="en-GB"/>
               </w:rPr>
               <w:t>date</w:t>
             </w:r>
             <w:r>
+              <w:rPr>
+                <w:lang w:val="en-GB"/>
+              </w:rPr>
               <w:t>/Fotos/</w:t>
             </w:r>
             <w:proofErr w:type="spellStart"/>
             <w:r>
+              <w:rPr>
+                <w:lang w:val="en-GB"/>
+              </w:rPr>
               <w:t>Scan_</w:t>
             </w:r>
             <w:r>
               <w:rPr>
                 <w:rStyle w:val="SchwacheHervorhebung"/>
+                <w:lang w:val="en-GB"/>
               </w:rPr>
               <w:t>date</w:t>
             </w:r>
             <w:r>
+              <w:rPr>
+                <w:lang w:val="en-GB"/>
+              </w:rPr>
               <w:t>_</w:t>
             </w:r>
             <w:r>
               <w:rPr>
                 <w:rStyle w:val="SchwacheHervorhebung"/>
+                <w:lang w:val="en-GB"/>
               </w:rPr>
               <w:t>time</w:t>
             </w:r>
             <w:proofErr w:type="spellEnd"/>
             <w:r>
+              <w:rPr>
+                <w:lang w:val="en-GB"/>
+              </w:rPr>
               <w:t>/iso_Bild.jpg</w:t>
             </w:r>
           </w:p>
@@ -10795,6 +10759,9 @@
         <w:jc w:val="center"/>
       </w:pPr>
       <w:r>
+        <w:rPr>
+          <w:noProof/>
+        </w:rPr>
         <w:drawing>
           <wp:inline distT="0" distB="0" distL="0" distR="0" wp14:anchorId="529F68B3" wp14:editId="6C35540B">
             <wp:extent cx="3471333" cy="2266022"/>
@@ -10912,6 +10879,9 @@
         <w:jc w:val="center"/>
       </w:pPr>
       <w:r>
+        <w:rPr>
+          <w:noProof/>
+        </w:rPr>
         <w:lastRenderedPageBreak/>
         <w:drawing>
           <wp:inline distT="0" distB="0" distL="0" distR="0" wp14:anchorId="5E2B8269" wp14:editId="348D5D98">
@@ -11021,6 +10991,9 @@
         <w:jc w:val="center"/>
       </w:pPr>
       <w:r>
+        <w:rPr>
+          <w:noProof/>
+        </w:rPr>
         <w:drawing>
           <wp:inline distT="0" distB="0" distL="0" distR="0" wp14:anchorId="66F51B54" wp14:editId="739B5241">
             <wp:extent cx="4300442" cy="2455334"/>
@@ -12000,6 +11973,7 @@
         <w:rPr>
           <w:rFonts w:ascii="Courier New" w:hAnsi="Courier New" w:cs="Courier New"/>
           <w:color w:val="696969"/>
+          <w:lang w:val="en-GB"/>
         </w:rPr>
       </w:pPr>
       <w:r>
@@ -12020,29 +11994,15 @@
         <w:rPr>
           <w:rFonts w:ascii="Courier New" w:hAnsi="Courier New" w:cs="Courier New"/>
           <w:color w:val="008000"/>
-        </w:rPr>
-        <w:t>"</w:t>
-      </w:r>
-      <w:proofErr w:type="spellStart"/>
-      <w:r>
-        <w:rPr>
-          <w:rFonts w:ascii="Courier New" w:hAnsi="Courier New" w:cs="Courier New"/>
-          <w:color w:val="008000"/>
-        </w:rPr>
-        <w:t>error</w:t>
-      </w:r>
-      <w:proofErr w:type="spellEnd"/>
-      <w:r>
-        <w:rPr>
-          <w:rFonts w:ascii="Courier New" w:hAnsi="Courier New" w:cs="Courier New"/>
-          <w:color w:val="008000"/>
-        </w:rPr>
-        <w:t>":</w:t>
+          <w:lang w:val="en-GB"/>
+        </w:rPr>
+        <w:t>"error":</w:t>
       </w:r>
       <w:r>
         <w:rPr>
           <w:rFonts w:ascii="Courier New" w:hAnsi="Courier New" w:cs="Courier New"/>
           <w:color w:val="696969"/>
+          <w:lang w:val="en-GB"/>
         </w:rPr>
         <w:t xml:space="preserve"> </w:t>
       </w:r>
@@ -12050,6 +12010,7 @@
         <w:rPr>
           <w:rFonts w:ascii="Courier New" w:hAnsi="Courier New" w:cs="Courier New"/>
           <w:color w:val="AA5D00"/>
+          <w:lang w:val="en-GB"/>
         </w:rPr>
         <w:t>None</w:t>
       </w:r>
@@ -12057,6 +12018,7 @@
         <w:rPr>
           <w:rFonts w:ascii="Courier New" w:hAnsi="Courier New" w:cs="Courier New"/>
           <w:color w:val="696969"/>
+          <w:lang w:val="en-GB"/>
         </w:rPr>
         <w:t>,</w:t>
       </w:r>
@@ -12074,12 +12036,14 @@
         <w:rPr>
           <w:rFonts w:ascii="Courier New" w:hAnsi="Courier New" w:cs="Courier New"/>
           <w:color w:val="696969"/>
+          <w:lang w:val="en-GB"/>
         </w:rPr>
       </w:pPr>
       <w:r>
         <w:rPr>
           <w:rFonts w:ascii="Courier New" w:hAnsi="Courier New" w:cs="Courier New"/>
           <w:color w:val="696969"/>
+          <w:lang w:val="en-GB"/>
         </w:rPr>
         <w:t xml:space="preserve">  </w:t>
       </w:r>
@@ -12087,6 +12051,7 @@
         <w:rPr>
           <w:rFonts w:ascii="Courier New" w:hAnsi="Courier New" w:cs="Courier New"/>
           <w:color w:val="696969"/>
+          <w:lang w:val="en-GB"/>
         </w:rPr>
         <w:t xml:space="preserve"> </w:t>
       </w:r>
@@ -12094,6 +12059,7 @@
         <w:rPr>
           <w:rFonts w:ascii="Courier New" w:hAnsi="Courier New" w:cs="Courier New"/>
           <w:color w:val="008000"/>
+          <w:lang w:val="en-GB"/>
         </w:rPr>
         <w:t>"</w:t>
       </w:r>
@@ -12102,6 +12068,7 @@
         <w:rPr>
           <w:rFonts w:ascii="Courier New" w:hAnsi="Courier New" w:cs="Courier New"/>
           <w:color w:val="008000"/>
+          <w:lang w:val="en-GB"/>
         </w:rPr>
         <w:t>depth_frame</w:t>
       </w:r>
@@ -12110,6 +12077,7 @@
         <w:rPr>
           <w:rFonts w:ascii="Courier New" w:hAnsi="Courier New" w:cs="Courier New"/>
           <w:color w:val="008000"/>
+          <w:lang w:val="en-GB"/>
         </w:rPr>
         <w:t xml:space="preserve">": </w:t>
       </w:r>
@@ -12117,6 +12085,7 @@
         <w:rPr>
           <w:rFonts w:ascii="Courier New" w:hAnsi="Courier New" w:cs="Courier New"/>
           <w:color w:val="AA5D00"/>
+          <w:lang w:val="en-GB"/>
         </w:rPr>
         <w:t>None</w:t>
       </w:r>
@@ -12134,12 +12103,14 @@
         <w:rPr>
           <w:rFonts w:ascii="Courier New" w:hAnsi="Courier New" w:cs="Courier New"/>
           <w:color w:val="696969"/>
+          <w:lang w:val="en-GB"/>
         </w:rPr>
       </w:pPr>
       <w:r>
         <w:rPr>
           <w:rFonts w:ascii="Courier New" w:hAnsi="Courier New" w:cs="Courier New"/>
           <w:color w:val="696969"/>
+          <w:lang w:val="en-GB"/>
         </w:rPr>
         <w:t>}</w:t>
       </w:r>
@@ -12389,6 +12360,9 @@
         <w:jc w:val="center"/>
       </w:pPr>
       <w:r>
+        <w:rPr>
+          <w:noProof/>
+        </w:rPr>
         <w:drawing>
           <wp:inline distT="0" distB="0" distL="0" distR="0" wp14:anchorId="433260B2" wp14:editId="7EB46753">
             <wp:extent cx="5878286" cy="1478364"/>
@@ -12514,6 +12488,9 @@
         <w:jc w:val="center"/>
       </w:pPr>
       <w:r>
+        <w:rPr>
+          <w:noProof/>
+        </w:rPr>
         <w:drawing>
           <wp:inline distT="0" distB="0" distL="0" distR="0" wp14:anchorId="0BC8316B" wp14:editId="3898DAF4">
             <wp:extent cx="2544465" cy="1907080"/>
@@ -12674,6 +12651,9 @@
         <w:jc w:val="center"/>
       </w:pPr>
       <w:r>
+        <w:rPr>
+          <w:noProof/>
+        </w:rPr>
         <w:drawing>
           <wp:inline distT="0" distB="0" distL="0" distR="0" wp14:anchorId="686DDD33" wp14:editId="3154A09A">
             <wp:extent cx="1805272" cy="1607820"/>
@@ -12950,6 +12930,9 @@
         <w:jc w:val="center"/>
       </w:pPr>
       <w:r>
+        <w:rPr>
+          <w:noProof/>
+        </w:rPr>
         <w:drawing>
           <wp:inline distT="0" distB="0" distL="0" distR="0" wp14:anchorId="5B38532F" wp14:editId="475810EF">
             <wp:extent cx="5358130" cy="1332706"/>
@@ -13295,13 +13278,7 @@
         <w:t>Multiplexer</w:t>
       </w:r>
       <w:r>
-        <w:t xml:space="preserve"> (</w:t>
-      </w:r>
-      <w:r>
-        <w:t>MUX</w:t>
-      </w:r>
-      <w:r>
-        <w:t>)</w:t>
+        <w:t xml:space="preserve"> (MUX)</w:t>
       </w:r>
       <w:r>
         <w:t xml:space="preserve"> </w:t>
@@ -13316,21 +13293,13 @@
         <w:t>s</w:t>
       </w:r>
       <w:r>
-        <w:t xml:space="preserve"> mehrere ADC-Module mit identischer Adresse zu betreiben, indem die einzelnen Geräte auf separate Kanäle verteilt werden. </w:t>
-      </w:r>
-      <w:proofErr w:type="gramStart"/>
-      <w:r>
-        <w:t>Über d</w:t>
+        <w:t xml:space="preserve"> mehrere ADC-Module mit identischer Adresse zu betreiben, indem die einzelnen Geräte auf separate Kanäle verteilt werden. Über d</w:t>
       </w:r>
       <w:r>
         <w:t>iesen</w:t>
       </w:r>
       <w:r>
-        <w:t xml:space="preserve"> Multiplexer</w:t>
-      </w:r>
-      <w:proofErr w:type="gramEnd"/>
-      <w:r>
-        <w:t xml:space="preserve"> kann jeweils ein </w:t>
+        <w:t xml:space="preserve"> Multiplexer kann jeweils ein </w:t>
       </w:r>
       <w:r>
         <w:t xml:space="preserve">bestimmter </w:t>
@@ -13484,13 +13453,8 @@
         </w:numPr>
       </w:pPr>
       <w:r>
-        <w:t xml:space="preserve">Initialisierung der ADCs </w:t>
-      </w:r>
-      <w:proofErr w:type="gramStart"/>
-      <w:r>
-        <w:t>über den Multiplexer</w:t>
-      </w:r>
-      <w:proofErr w:type="gramEnd"/>
+        <w:t>Initialisierung der ADCs über den Multiplexer</w:t>
+      </w:r>
     </w:p>
     <w:p>
       <w:pPr>
@@ -13829,11 +13793,13 @@
         </w:pBdr>
         <w:rPr>
           <w:rStyle w:val="Hervorhebung"/>
+          <w:lang w:val="en-GB"/>
         </w:rPr>
       </w:pPr>
       <w:r>
         <w:rPr>
           <w:rStyle w:val="Hervorhebung"/>
+          <w:lang w:val="en-GB"/>
         </w:rPr>
         <w:t>„</w:t>
       </w:r>
@@ -13841,6 +13807,7 @@
       <w:r>
         <w:rPr>
           <w:rStyle w:val="Hervorhebung"/>
+          <w:lang w:val="en-GB"/>
         </w:rPr>
         <w:t>weight_calibration.json</w:t>
       </w:r>
@@ -13848,6 +13815,7 @@
       <w:r>
         <w:rPr>
           <w:rStyle w:val="Hervorhebung"/>
+          <w:lang w:val="en-GB"/>
         </w:rPr>
         <w:t>“</w:t>
       </w:r>
@@ -13871,6 +13839,7 @@
         <w:rPr>
           <w:rFonts w:ascii="Courier New" w:hAnsi="Courier New" w:cs="Courier New"/>
           <w:color w:val="545454"/>
+          <w:lang w:val="en-GB"/>
         </w:rPr>
         <w:t>{</w:t>
       </w:r>
@@ -13878,6 +13847,7 @@
         <w:rPr>
           <w:rFonts w:ascii="Courier New" w:hAnsi="Courier New" w:cs="Courier New"/>
           <w:color w:val="545454"/>
+          <w:lang w:val="en-GB"/>
         </w:rPr>
         <w:br/>
         <w:t xml:space="preserve">    </w:t>
@@ -13886,6 +13856,7 @@
         <w:rPr>
           <w:rFonts w:ascii="Courier New" w:hAnsi="Courier New" w:cs="Courier New"/>
           <w:color w:val="008000"/>
+          <w:lang w:val="en-GB"/>
         </w:rPr>
         <w:t>"</w:t>
       </w:r>
@@ -13894,6 +13865,7 @@
         <w:rPr>
           <w:rFonts w:ascii="Courier New" w:hAnsi="Courier New" w:cs="Courier New"/>
           <w:color w:val="008000"/>
+          <w:lang w:val="en-GB"/>
         </w:rPr>
         <w:t>faktoren</w:t>
       </w:r>
@@ -13902,6 +13874,7 @@
         <w:rPr>
           <w:rFonts w:ascii="Courier New" w:hAnsi="Courier New" w:cs="Courier New"/>
           <w:color w:val="008000"/>
+          <w:lang w:val="en-GB"/>
         </w:rPr>
         <w:t>"</w:t>
       </w:r>
@@ -13909,6 +13882,7 @@
         <w:rPr>
           <w:rFonts w:ascii="Courier New" w:hAnsi="Courier New" w:cs="Courier New"/>
           <w:color w:val="545454"/>
+          <w:lang w:val="en-GB"/>
         </w:rPr>
         <w:t>: [</w:t>
       </w:r>
@@ -13916,6 +13890,7 @@
         <w:rPr>
           <w:rFonts w:ascii="Courier New" w:hAnsi="Courier New" w:cs="Courier New"/>
           <w:color w:val="545454"/>
+          <w:lang w:val="en-GB"/>
         </w:rPr>
         <w:br/>
         <w:t xml:space="preserve">        </w:t>
@@ -13924,6 +13899,7 @@
         <w:rPr>
           <w:rFonts w:ascii="Courier New" w:hAnsi="Courier New" w:cs="Courier New"/>
           <w:color w:val="AA5D00"/>
+          <w:lang w:val="en-GB"/>
         </w:rPr>
         <w:t>-0.004423</w:t>
       </w:r>
@@ -13931,6 +13907,7 @@
         <w:rPr>
           <w:rFonts w:ascii="Courier New" w:hAnsi="Courier New" w:cs="Courier New"/>
           <w:color w:val="545454"/>
+          <w:lang w:val="en-GB"/>
         </w:rPr>
         <w:t>,</w:t>
       </w:r>
@@ -13938,6 +13915,7 @@
         <w:rPr>
           <w:rFonts w:ascii="Courier New" w:hAnsi="Courier New" w:cs="Courier New"/>
           <w:color w:val="545454"/>
+          <w:lang w:val="en-GB"/>
         </w:rPr>
         <w:br/>
         <w:t xml:space="preserve">        </w:t>
@@ -13946,6 +13924,7 @@
         <w:rPr>
           <w:rFonts w:ascii="Courier New" w:hAnsi="Courier New" w:cs="Courier New"/>
           <w:color w:val="AA5D00"/>
+          <w:lang w:val="en-GB"/>
         </w:rPr>
         <w:t>-0.00425</w:t>
       </w:r>
@@ -13953,6 +13932,7 @@
         <w:rPr>
           <w:rFonts w:ascii="Courier New" w:hAnsi="Courier New" w:cs="Courier New"/>
           <w:color w:val="545454"/>
+          <w:lang w:val="en-GB"/>
         </w:rPr>
         <w:t>,</w:t>
       </w:r>
@@ -13960,6 +13940,7 @@
         <w:rPr>
           <w:rFonts w:ascii="Courier New" w:hAnsi="Courier New" w:cs="Courier New"/>
           <w:color w:val="545454"/>
+          <w:lang w:val="en-GB"/>
         </w:rPr>
         <w:br/>
         <w:t xml:space="preserve">        </w:t>
@@ -13968,6 +13949,7 @@
         <w:rPr>
           <w:rFonts w:ascii="Courier New" w:hAnsi="Courier New" w:cs="Courier New"/>
           <w:color w:val="AA5D00"/>
+          <w:lang w:val="en-GB"/>
         </w:rPr>
         <w:t>-0.004543</w:t>
       </w:r>
@@ -13975,6 +13957,7 @@
         <w:rPr>
           <w:rFonts w:ascii="Courier New" w:hAnsi="Courier New" w:cs="Courier New"/>
           <w:color w:val="545454"/>
+          <w:lang w:val="en-GB"/>
         </w:rPr>
         <w:br/>
         <w:t>    ],</w:t>
@@ -13983,6 +13966,7 @@
         <w:rPr>
           <w:rFonts w:ascii="Courier New" w:hAnsi="Courier New" w:cs="Courier New"/>
           <w:color w:val="545454"/>
+          <w:lang w:val="en-GB"/>
         </w:rPr>
         <w:br/>
         <w:t xml:space="preserve">    </w:t>
@@ -13991,6 +13975,7 @@
         <w:rPr>
           <w:rFonts w:ascii="Courier New" w:hAnsi="Courier New" w:cs="Courier New"/>
           <w:color w:val="008000"/>
+          <w:lang w:val="en-GB"/>
         </w:rPr>
         <w:t>"</w:t>
       </w:r>
@@ -13999,6 +13984,7 @@
         <w:rPr>
           <w:rFonts w:ascii="Courier New" w:hAnsi="Courier New" w:cs="Courier New"/>
           <w:color w:val="008000"/>
+          <w:lang w:val="en-GB"/>
         </w:rPr>
         <w:t>zero_offsets</w:t>
       </w:r>
@@ -14007,6 +13993,7 @@
         <w:rPr>
           <w:rFonts w:ascii="Courier New" w:hAnsi="Courier New" w:cs="Courier New"/>
           <w:color w:val="008000"/>
+          <w:lang w:val="en-GB"/>
         </w:rPr>
         <w:t>"</w:t>
       </w:r>
@@ -14014,6 +14001,7 @@
         <w:rPr>
           <w:rFonts w:ascii="Courier New" w:hAnsi="Courier New" w:cs="Courier New"/>
           <w:color w:val="545454"/>
+          <w:lang w:val="en-GB"/>
         </w:rPr>
         <w:t>: [</w:t>
       </w:r>
@@ -14021,6 +14009,7 @@
         <w:rPr>
           <w:rFonts w:ascii="Courier New" w:hAnsi="Courier New" w:cs="Courier New"/>
           <w:color w:val="545454"/>
+          <w:lang w:val="en-GB"/>
         </w:rPr>
         <w:br/>
         <w:t xml:space="preserve">        </w:t>
@@ -14029,6 +14018,7 @@
         <w:rPr>
           <w:rFonts w:ascii="Courier New" w:hAnsi="Courier New" w:cs="Courier New"/>
           <w:color w:val="AA5D00"/>
+          <w:lang w:val="en-GB"/>
         </w:rPr>
         <w:t>0</w:t>
       </w:r>
@@ -14036,6 +14026,7 @@
         <w:rPr>
           <w:rFonts w:ascii="Courier New" w:hAnsi="Courier New" w:cs="Courier New"/>
           <w:color w:val="545454"/>
+          <w:lang w:val="en-GB"/>
         </w:rPr>
         <w:t>,</w:t>
       </w:r>
@@ -14043,6 +14034,7 @@
         <w:rPr>
           <w:rFonts w:ascii="Courier New" w:hAnsi="Courier New" w:cs="Courier New"/>
           <w:color w:val="545454"/>
+          <w:lang w:val="en-GB"/>
         </w:rPr>
         <w:br/>
         <w:t xml:space="preserve">        </w:t>
@@ -14051,6 +14043,7 @@
         <w:rPr>
           <w:rFonts w:ascii="Courier New" w:hAnsi="Courier New" w:cs="Courier New"/>
           <w:color w:val="AA5D00"/>
+          <w:lang w:val="en-GB"/>
         </w:rPr>
         <w:t>0</w:t>
       </w:r>
@@ -14058,6 +14051,7 @@
         <w:rPr>
           <w:rFonts w:ascii="Courier New" w:hAnsi="Courier New" w:cs="Courier New"/>
           <w:color w:val="545454"/>
+          <w:lang w:val="en-GB"/>
         </w:rPr>
         <w:t>,</w:t>
       </w:r>
@@ -14065,6 +14059,7 @@
         <w:rPr>
           <w:rFonts w:ascii="Courier New" w:hAnsi="Courier New" w:cs="Courier New"/>
           <w:color w:val="545454"/>
+          <w:lang w:val="en-GB"/>
         </w:rPr>
         <w:br/>
         <w:t xml:space="preserve">        </w:t>
@@ -14073,6 +14068,7 @@
         <w:rPr>
           <w:rFonts w:ascii="Courier New" w:hAnsi="Courier New" w:cs="Courier New"/>
           <w:color w:val="AA5D00"/>
+          <w:lang w:val="en-GB"/>
         </w:rPr>
         <w:t>0</w:t>
       </w:r>
@@ -14080,6 +14076,7 @@
         <w:rPr>
           <w:rFonts w:ascii="Courier New" w:hAnsi="Courier New" w:cs="Courier New"/>
           <w:color w:val="545454"/>
+          <w:lang w:val="en-GB"/>
         </w:rPr>
         <w:br/>
         <w:t>    ],</w:t>
@@ -14088,6 +14085,7 @@
         <w:rPr>
           <w:rFonts w:ascii="Courier New" w:hAnsi="Courier New" w:cs="Courier New"/>
           <w:color w:val="545454"/>
+          <w:lang w:val="en-GB"/>
         </w:rPr>
         <w:br/>
         <w:t xml:space="preserve">    </w:t>
@@ -14096,6 +14094,7 @@
         <w:rPr>
           <w:rFonts w:ascii="Courier New" w:hAnsi="Courier New" w:cs="Courier New"/>
           <w:color w:val="008000"/>
+          <w:lang w:val="en-GB"/>
         </w:rPr>
         <w:t>"_</w:t>
       </w:r>
@@ -14104,6 +14103,7 @@
         <w:rPr>
           <w:rFonts w:ascii="Courier New" w:hAnsi="Courier New" w:cs="Courier New"/>
           <w:color w:val="008000"/>
+          <w:lang w:val="en-GB"/>
         </w:rPr>
         <w:t>comment_default_factors</w:t>
       </w:r>
@@ -14112,6 +14112,7 @@
         <w:rPr>
           <w:rFonts w:ascii="Courier New" w:hAnsi="Courier New" w:cs="Courier New"/>
           <w:color w:val="008000"/>
+          <w:lang w:val="en-GB"/>
         </w:rPr>
         <w:t>"</w:t>
       </w:r>
@@ -14119,6 +14120,7 @@
         <w:rPr>
           <w:rFonts w:ascii="Courier New" w:hAnsi="Courier New" w:cs="Courier New"/>
           <w:color w:val="545454"/>
+          <w:lang w:val="en-GB"/>
         </w:rPr>
         <w:t xml:space="preserve">: </w:t>
       </w:r>
@@ -14126,56 +14128,16 @@
         <w:rPr>
           <w:rFonts w:ascii="Courier New" w:hAnsi="Courier New" w:cs="Courier New"/>
           <w:color w:val="008000"/>
-        </w:rPr>
-        <w:t xml:space="preserve">"Original </w:t>
-      </w:r>
-      <w:proofErr w:type="spellStart"/>
+          <w:lang w:val="en-GB"/>
+        </w:rPr>
+        <w:t xml:space="preserve">"Original calibration factors from code: [-0.004423, -0.00425, -0.004543]. </w:t>
+      </w:r>
       <w:r>
         <w:rPr>
           <w:rFonts w:ascii="Courier New" w:hAnsi="Courier New" w:cs="Courier New"/>
           <w:color w:val="008000"/>
         </w:rPr>
-        <w:t>calibration</w:t>
-      </w:r>
-      <w:proofErr w:type="spellEnd"/>
-      <w:r>
-        <w:rPr>
-          <w:rFonts w:ascii="Courier New" w:hAnsi="Courier New" w:cs="Courier New"/>
-          <w:color w:val="008000"/>
-        </w:rPr>
-        <w:t xml:space="preserve"> </w:t>
-      </w:r>
-      <w:proofErr w:type="spellStart"/>
-      <w:r>
-        <w:rPr>
-          <w:rFonts w:ascii="Courier New" w:hAnsi="Courier New" w:cs="Courier New"/>
-          <w:color w:val="008000"/>
-        </w:rPr>
-        <w:t>factors</w:t>
-      </w:r>
-      <w:proofErr w:type="spellEnd"/>
-      <w:r>
-        <w:rPr>
-          <w:rFonts w:ascii="Courier New" w:hAnsi="Courier New" w:cs="Courier New"/>
-          <w:color w:val="008000"/>
-        </w:rPr>
-        <w:t xml:space="preserve"> </w:t>
-      </w:r>
-      <w:proofErr w:type="spellStart"/>
-      <w:r>
-        <w:rPr>
-          <w:rFonts w:ascii="Courier New" w:hAnsi="Courier New" w:cs="Courier New"/>
-          <w:color w:val="008000"/>
-        </w:rPr>
-        <w:t>from</w:t>
-      </w:r>
-      <w:proofErr w:type="spellEnd"/>
-      <w:r>
-        <w:rPr>
-          <w:rFonts w:ascii="Courier New" w:hAnsi="Courier New" w:cs="Courier New"/>
-          <w:color w:val="008000"/>
-        </w:rPr>
-        <w:t xml:space="preserve"> code: [-0.004423, -0.00425, -0.004543]. Copy </w:t>
+        <w:t xml:space="preserve">Copy </w:t>
       </w:r>
       <w:proofErr w:type="spellStart"/>
       <w:r>
@@ -14439,17 +14401,20 @@
         </w:pBdr>
         <w:rPr>
           <w:rStyle w:val="Hervorhebung"/>
+          <w:lang w:val="en-GB"/>
         </w:rPr>
       </w:pPr>
       <w:r>
         <w:rPr>
           <w:rStyle w:val="Hervorhebung"/>
+          <w:lang w:val="en-GB"/>
         </w:rPr>
         <w:t>„</w:t>
       </w:r>
       <w:r>
         <w:rPr>
           <w:rStyle w:val="Hervorhebung"/>
+          <w:lang w:val="en-GB"/>
         </w:rPr>
         <w:t>Interface_v08.py “</w:t>
       </w:r>
@@ -14903,192 +14868,166 @@
           <w:bCs/>
           <w:lang w:eastAsia="de-AT"/>
         </w:rPr>
-        <w:t>„2.3.x …</w:t>
-      </w:r>
-      <w:proofErr w:type="gramStart"/>
-      <w:r>
-        <w:rPr>
-          <w:b/>
+        <w:t>„2.3.x ……….“</w:t>
+      </w:r>
+      <w:r>
+        <w:rPr>
+          <w:lang w:eastAsia="de-AT"/>
+        </w:rPr>
+        <w:t xml:space="preserve"> beschrieben.</w:t>
+      </w:r>
+    </w:p>
+    <w:p>
+      <w:pPr>
+        <w:pStyle w:val="berschrift3"/>
+      </w:pPr>
+      <w:r>
+        <w:lastRenderedPageBreak/>
+        <w:t>Datenmanagement</w:t>
+      </w:r>
+    </w:p>
+    <w:p>
+      <w:pPr>
+        <w:pStyle w:val="Text"/>
+        <w:rPr>
+          <w:lang w:eastAsia="de-AT"/>
+        </w:rPr>
+      </w:pPr>
+      <w:r>
+        <w:rPr>
+          <w:lang w:eastAsia="de-AT"/>
+        </w:rPr>
+        <w:t xml:space="preserve">Für die Verarbeitung der erfassten Daten wurde eine </w:t>
+      </w:r>
+      <w:r>
+        <w:rPr>
           <w:bCs/>
           <w:lang w:eastAsia="de-AT"/>
         </w:rPr>
-        <w:t>……</w:t>
-      </w:r>
-      <w:r>
-        <w:rPr>
-          <w:b/>
+        <w:t>CSV-Datei</w:t>
+      </w:r>
+      <w:r>
+        <w:rPr>
+          <w:lang w:eastAsia="de-AT"/>
+        </w:rPr>
+        <w:t xml:space="preserve"> implementiert, die mit dem </w:t>
+      </w:r>
+      <w:r>
+        <w:rPr>
           <w:bCs/>
           <w:lang w:eastAsia="de-AT"/>
         </w:rPr>
-        <w:t>.</w:t>
-      </w:r>
-      <w:proofErr w:type="gramEnd"/>
-      <w:r>
-        <w:rPr>
-          <w:b/>
+        <w:t xml:space="preserve">SAP-System der Firma </w:t>
+      </w:r>
+      <w:r>
+        <w:rPr>
+          <w:rStyle w:val="Hervorhebung"/>
+        </w:rPr>
+        <w:t>Leitner</w:t>
+      </w:r>
+      <w:r>
+        <w:rPr>
+          <w:lang w:eastAsia="de-AT"/>
+        </w:rPr>
+        <w:t xml:space="preserve"> kompatibel ist. Dadurch können die aufgenommenen Daten ohne zusätzliche Anpassungen in das System importiert werden. Der Export erfolgt in einem Format, das den Anforderungen des SAP-Imports entspricht und somit eine einfache sowie schnelle Weiterverarbeitung der Messdaten ermöglicht.</w:t>
+      </w:r>
+    </w:p>
+    <w:p>
+      <w:pPr>
+        <w:pStyle w:val="Text"/>
+        <w:rPr>
+          <w:lang w:eastAsia="de-AT"/>
+        </w:rPr>
+      </w:pPr>
+    </w:p>
+    <w:p>
+      <w:pPr>
+        <w:pStyle w:val="Text"/>
+        <w:rPr>
+          <w:lang w:eastAsia="de-AT"/>
+        </w:rPr>
+      </w:pPr>
+      <w:commentRangeStart w:id="88"/>
+      <w:r>
+        <w:rPr>
+          <w:lang w:eastAsia="de-AT"/>
+        </w:rPr>
+        <w:t>Abbildung</w:t>
+      </w:r>
+      <w:commentRangeEnd w:id="88"/>
+      <w:r>
+        <w:rPr>
+          <w:rStyle w:val="Kommentarzeichen"/>
+        </w:rPr>
+        <w:commentReference w:id="88"/>
+      </w:r>
+    </w:p>
+    <w:p>
+      <w:pPr>
+        <w:pStyle w:val="Text"/>
+        <w:rPr>
+          <w:lang w:eastAsia="de-AT"/>
+        </w:rPr>
+      </w:pPr>
+    </w:p>
+    <w:p>
+      <w:pPr>
+        <w:pStyle w:val="Text"/>
+        <w:rPr>
+          <w:lang w:eastAsia="de-AT"/>
+        </w:rPr>
+      </w:pPr>
+    </w:p>
+    <w:p>
+      <w:pPr>
+        <w:pStyle w:val="Text"/>
+        <w:rPr>
+          <w:lang w:eastAsia="de-AT"/>
+        </w:rPr>
+      </w:pPr>
+      <w:r>
+        <w:rPr>
+          <w:lang w:eastAsia="de-AT"/>
+        </w:rPr>
+        <w:t xml:space="preserve">Ursprünglich wurde geprüft, ob eine </w:t>
+      </w:r>
+      <w:r>
+        <w:rPr>
           <w:bCs/>
           <w:lang w:eastAsia="de-AT"/>
         </w:rPr>
-        <w:t>“</w:t>
+        <w:t>direkte automatisierte Anbindung an das SAP-System</w:t>
       </w:r>
       <w:r>
         <w:rPr>
           <w:lang w:eastAsia="de-AT"/>
         </w:rPr>
-        <w:t xml:space="preserve"> beschrieben.</w:t>
-      </w:r>
-    </w:p>
-    <w:p>
-      <w:pPr>
-        <w:pStyle w:val="berschrift3"/>
-      </w:pPr>
-      <w:r>
-        <w:lastRenderedPageBreak/>
-        <w:t>Datenmanagement</w:t>
-      </w:r>
-    </w:p>
-    <w:p>
-      <w:pPr>
-        <w:pStyle w:val="Text"/>
-        <w:rPr>
-          <w:lang w:eastAsia="de-AT"/>
-        </w:rPr>
-      </w:pPr>
-      <w:r>
-        <w:rPr>
-          <w:lang w:eastAsia="de-AT"/>
-        </w:rPr>
-        <w:t xml:space="preserve">Für die Verarbeitung der erfassten Daten wurde eine </w:t>
+        <w:t xml:space="preserve"> umgesetzt werden kann. Eine solche Integration war jedoch nicht möglich, da von Seiten der </w:t>
       </w:r>
       <w:r>
         <w:rPr>
           <w:bCs/>
           <w:lang w:eastAsia="de-AT"/>
         </w:rPr>
-        <w:t>CSV-Datei</w:t>
-      </w:r>
-      <w:r>
-        <w:rPr>
-          <w:lang w:eastAsia="de-AT"/>
-        </w:rPr>
-        <w:t xml:space="preserve"> implementiert, die mit dem </w:t>
+        <w:t xml:space="preserve">IT-Abteilung der Firma </w:t>
+      </w:r>
+      <w:r>
+        <w:rPr>
+          <w:rStyle w:val="Hervorhebung"/>
+        </w:rPr>
+        <w:t>Leitner</w:t>
       </w:r>
       <w:r>
         <w:rPr>
           <w:bCs/>
           <w:lang w:eastAsia="de-AT"/>
         </w:rPr>
-        <w:t xml:space="preserve">SAP-System der Firma </w:t>
-      </w:r>
-      <w:r>
-        <w:rPr>
-          <w:rStyle w:val="Hervorhebung"/>
-        </w:rPr>
-        <w:t>Leitner</w:t>
+        <w:t xml:space="preserve"> keine Freigabe für eine direkte Schnittstelle</w:t>
       </w:r>
       <w:r>
         <w:rPr>
           <w:lang w:eastAsia="de-AT"/>
         </w:rPr>
-        <w:t xml:space="preserve"> kompatibel ist. Dadurch können die aufgenommenen Daten ohne zusätzliche Anpassungen in das System importiert werden. Der Export erfolgt in einem Format, das den Anforderungen des SAP-Imports entspricht und somit eine einfache sowie schnelle Weiterverarbeitung der Messdaten ermöglicht.</w:t>
-      </w:r>
-    </w:p>
-    <w:p>
-      <w:pPr>
-        <w:pStyle w:val="Text"/>
-        <w:rPr>
-          <w:lang w:eastAsia="de-AT"/>
-        </w:rPr>
-      </w:pPr>
-    </w:p>
-    <w:p>
-      <w:pPr>
-        <w:pStyle w:val="Text"/>
-        <w:rPr>
-          <w:lang w:eastAsia="de-AT"/>
-        </w:rPr>
-      </w:pPr>
-      <w:commentRangeStart w:id="88"/>
-      <w:r>
-        <w:rPr>
-          <w:lang w:eastAsia="de-AT"/>
-        </w:rPr>
-        <w:t>Abbildung</w:t>
-      </w:r>
-      <w:commentRangeEnd w:id="88"/>
-      <w:r>
-        <w:rPr>
-          <w:rStyle w:val="Kommentarzeichen"/>
-        </w:rPr>
-        <w:commentReference w:id="88"/>
-      </w:r>
-    </w:p>
-    <w:p>
-      <w:pPr>
-        <w:pStyle w:val="Text"/>
-        <w:rPr>
-          <w:lang w:eastAsia="de-AT"/>
-        </w:rPr>
-      </w:pPr>
-    </w:p>
-    <w:p>
-      <w:pPr>
-        <w:pStyle w:val="Text"/>
-        <w:rPr>
-          <w:lang w:eastAsia="de-AT"/>
-        </w:rPr>
-      </w:pPr>
-    </w:p>
-    <w:p>
-      <w:pPr>
-        <w:pStyle w:val="Text"/>
-        <w:rPr>
-          <w:lang w:eastAsia="de-AT"/>
-        </w:rPr>
-      </w:pPr>
-      <w:r>
-        <w:rPr>
-          <w:lang w:eastAsia="de-AT"/>
-        </w:rPr>
-        <w:t xml:space="preserve">Ursprünglich wurde geprüft, ob eine </w:t>
-      </w:r>
-      <w:r>
-        <w:rPr>
-          <w:bCs/>
-          <w:lang w:eastAsia="de-AT"/>
-        </w:rPr>
-        <w:t>direkte automatisierte Anbindung an das SAP-System</w:t>
-      </w:r>
-      <w:r>
-        <w:rPr>
-          <w:lang w:eastAsia="de-AT"/>
-        </w:rPr>
-        <w:t xml:space="preserve"> umgesetzt werden kann. Eine solche Integration war jedoch nicht möglich, da von Seiten der </w:t>
-      </w:r>
-      <w:r>
-        <w:rPr>
-          <w:bCs/>
-          <w:lang w:eastAsia="de-AT"/>
-        </w:rPr>
-        <w:t xml:space="preserve">IT-Abteilung der Firma </w:t>
-      </w:r>
-      <w:r>
-        <w:rPr>
-          <w:rStyle w:val="Hervorhebung"/>
-        </w:rPr>
-        <w:t>Leitner</w:t>
-      </w:r>
-      <w:r>
-        <w:rPr>
-          <w:bCs/>
-          <w:lang w:eastAsia="de-AT"/>
-        </w:rPr>
-        <w:t xml:space="preserve"> keine Freigabe für eine direkte Schnittstelle</w:t>
-      </w:r>
-      <w:r>
-        <w:rPr>
-          <w:lang w:eastAsia="de-AT"/>
-        </w:rPr>
         <w:t xml:space="preserve"> erteilt wurde. Aus diesem Grund erfolgt die Datenübertragung über eine CSV-Datei, die anschließend manuell in das SAP-System importiert werden kann.</w:t>
       </w:r>
     </w:p>
@@ -15106,6 +15045,9 @@
         <w:jc w:val="center"/>
       </w:pPr>
       <w:r>
+        <w:rPr>
+          <w:noProof/>
+        </w:rPr>
         <w:drawing>
           <wp:inline distT="0" distB="0" distL="0" distR="0" wp14:anchorId="33E9DFFA" wp14:editId="2E425276">
             <wp:extent cx="3444240" cy="2375402"/>
@@ -16233,28 +16175,14 @@
         <w:rPr>
           <w:color w:val="0066FF"/>
         </w:rPr>
-        <w:t xml:space="preserve">(FV = Text) Diese Abschnitte sind individuell </w:t>
-      </w:r>
-      <w:proofErr w:type="gramStart"/>
+        <w:t xml:space="preserve">(FV = Text) Diese Abschnitte sind individuell mit Ihren </w:t>
+      </w:r>
+      <w:proofErr w:type="spellStart"/>
       <w:r>
         <w:rPr>
           <w:color w:val="0066FF"/>
         </w:rPr>
-        <w:t xml:space="preserve">mit Ihren </w:t>
-      </w:r>
-      <w:proofErr w:type="spellStart"/>
-      <w:r>
-        <w:rPr>
-          <w:color w:val="0066FF"/>
-        </w:rPr>
-        <w:t>Betreuer</w:t>
-      </w:r>
-      <w:proofErr w:type="gramEnd"/>
-      <w:r>
-        <w:rPr>
-          <w:color w:val="0066FF"/>
-        </w:rPr>
-        <w:t>:innen</w:t>
+        <w:t>Betreuer:innen</w:t>
       </w:r>
       <w:proofErr w:type="spellEnd"/>
       <w:r>
@@ -16389,6 +16317,7 @@
       </w:pPr>
       <w:r>
         <w:rPr>
+          <w:noProof/>
           <w:lang w:eastAsia="de-AT"/>
         </w:rPr>
         <w:lastRenderedPageBreak/>
@@ -16629,6 +16558,9 @@
         <w:jc w:val="center"/>
       </w:pPr>
       <w:r>
+        <w:rPr>
+          <w:noProof/>
+        </w:rPr>
         <w:drawing>
           <wp:inline distT="0" distB="0" distL="0" distR="0" wp14:anchorId="3C8FB0A3" wp14:editId="6F783BC6">
             <wp:extent cx="4385226" cy="1074420"/>
@@ -16738,6 +16670,7 @@
       </w:pPr>
       <w:r>
         <w:rPr>
+          <w:noProof/>
           <w:color w:val="0066FF"/>
         </w:rPr>
         <w:drawing>
@@ -16786,6 +16719,7 @@
       </w:pPr>
       <w:r>
         <w:rPr>
+          <w:noProof/>
           <w:color w:val="0066FF"/>
         </w:rPr>
         <w:lastRenderedPageBreak/>
@@ -16835,6 +16769,7 @@
       </w:pPr>
       <w:r>
         <w:rPr>
+          <w:noProof/>
           <w:color w:val="0066FF"/>
         </w:rPr>
         <w:drawing>
@@ -16888,6 +16823,7 @@
       </w:r>
       <w:r>
         <w:rPr>
+          <w:noProof/>
           <w:color w:val="0066FF"/>
         </w:rPr>
         <w:drawing>
@@ -16965,6 +16901,7 @@
       </w:pPr>
       <w:r>
         <w:rPr>
+          <w:noProof/>
           <w:color w:val="0066FF"/>
         </w:rPr>
         <w:lastRenderedPageBreak/>
@@ -17014,6 +16951,7 @@
       </w:pPr>
       <w:r>
         <w:rPr>
+          <w:noProof/>
           <w:color w:val="0066FF"/>
         </w:rPr>
         <w:drawing>
@@ -17067,6 +17005,7 @@
       </w:r>
       <w:r>
         <w:rPr>
+          <w:noProof/>
           <w:color w:val="0066FF"/>
         </w:rPr>
         <w:drawing>
@@ -17158,6 +17097,7 @@
       </w:pPr>
       <w:r>
         <w:rPr>
+          <w:noProof/>
           <w:color w:val="0066FF"/>
         </w:rPr>
         <w:lastRenderedPageBreak/>
@@ -17679,21 +17619,7 @@
         <w:rPr>
           <w:color w:val="0066FF"/>
         </w:rPr>
-        <w:t>(</w:t>
-      </w:r>
-      <w:proofErr w:type="gramStart"/>
-      <w:r>
-        <w:rPr>
-          <w:color w:val="0066FF"/>
-        </w:rPr>
-        <w:t>FV Text</w:t>
-      </w:r>
-      <w:proofErr w:type="gramEnd"/>
-      <w:r>
-        <w:rPr>
-          <w:color w:val="0066FF"/>
-        </w:rPr>
-        <w:t>)</w:t>
+        <w:t>(FV Text)</w:t>
       </w:r>
       <w:bookmarkStart w:id="133" w:name="_Toc211138172"/>
       <w:bookmarkStart w:id="134" w:name="_Toc211137928"/>
@@ -17736,21 +17662,7 @@
         <w:rPr>
           <w:color w:val="0066FF"/>
         </w:rPr>
-        <w:t>(</w:t>
-      </w:r>
-      <w:proofErr w:type="gramStart"/>
-      <w:r>
-        <w:rPr>
-          <w:color w:val="0066FF"/>
-        </w:rPr>
-        <w:t>FV Text</w:t>
-      </w:r>
-      <w:proofErr w:type="gramEnd"/>
-      <w:r>
-        <w:rPr>
-          <w:color w:val="0066FF"/>
-        </w:rPr>
-        <w:t>) Optionaler Abschnitt. Nur verwenden, wenn mehr als 10 verschiedene Tabellen im gesamten Dokument vorkommen.</w:t>
+        <w:t>(FV Text) Optionaler Abschnitt. Nur verwenden, wenn mehr als 10 verschiedene Tabellen im gesamten Dokument vorkommen.</w:t>
       </w:r>
     </w:p>
     <w:p/>
@@ -17868,19 +17780,7 @@
           <w:rPr>
             <w:rStyle w:val="Hyperlink"/>
           </w:rPr>
-          <w:t>Abbildung 2: OAK-</w:t>
-        </w:r>
-        <w:r>
-          <w:rPr>
-            <w:rStyle w:val="Hyperlink"/>
-          </w:rPr>
-          <w:t>D</w:t>
-        </w:r>
-        <w:r>
-          <w:rPr>
-            <w:rStyle w:val="Hyperlink"/>
-          </w:rPr>
-          <w:t xml:space="preserve"> 2S</w:t>
+          <w:t>Abbildung 2: OAK-D 2S</w:t>
         </w:r>
         <w:r>
           <w:rPr>
@@ -18574,21 +18474,7 @@
         <w:rPr>
           <w:color w:val="0066FF"/>
         </w:rPr>
-        <w:t>(</w:t>
-      </w:r>
-      <w:proofErr w:type="gramStart"/>
-      <w:r>
-        <w:rPr>
-          <w:color w:val="0066FF"/>
-        </w:rPr>
-        <w:t>FV Text</w:t>
-      </w:r>
-      <w:proofErr w:type="gramEnd"/>
-      <w:r>
-        <w:rPr>
-          <w:color w:val="0066FF"/>
-        </w:rPr>
-        <w:t>) Optionales Kapitel. Hier werden Datenblätter, große Zeichnungen, Skizzen, Bilder, etc. eingefügt, die im Fließtext der vorigen Kapitel nicht eingefügt werden, da sie dort die Übersichtlichkeit bzw. Struktur dieser Kapitel verschlechtern würden.</w:t>
+        <w:t>(FV Text) Optionales Kapitel. Hier werden Datenblätter, große Zeichnungen, Skizzen, Bilder, etc. eingefügt, die im Fließtext der vorigen Kapitel nicht eingefügt werden, da sie dort die Übersichtlichkeit bzw. Struktur dieser Kapitel verschlechtern würden.</w:t>
       </w:r>
       <w:bookmarkEnd w:id="155"/>
       <w:bookmarkEnd w:id="156"/>
@@ -18780,7 +18666,7 @@
         <w:pStyle w:val="Kommentartext"/>
         <w:jc w:val="left"/>
       </w:pPr>
-      <w:hyperlink r:id="rId4" w:history="1">
+      <w:hyperlink r:id="rId4" w:anchor="Configuring%20Stereo%20Depth-Short%20range%20stereo%20depth" w:history="1">
         <w:r>
           <w:rPr>
             <w:rStyle w:val="Hyperlink"/>
@@ -19373,6 +19259,9 @@
       <w:pStyle w:val="Fuzeile"/>
     </w:pPr>
     <w:r>
+      <w:rPr>
+        <w:noProof/>
+      </w:rPr>
       <w:drawing>
         <wp:inline distT="0" distB="0" distL="0" distR="0" wp14:anchorId="5CFDC676" wp14:editId="0EB381CD">
           <wp:extent cx="1388745" cy="698500"/>
@@ -19514,13 +19403,8 @@
       </w:pBdr>
     </w:pPr>
     <w:r>
-      <w:t xml:space="preserve">Granegger </w:t>
+      <w:t>Granegger Felix</w:t>
     </w:r>
-    <w:proofErr w:type="gramStart"/>
-    <w:r>
-      <w:t>Felix</w:t>
-    </w:r>
-    <w:proofErr w:type="gramEnd"/>
     <w:r>
       <w:tab/>
       <w:t>Kapitel 2</w:t>
@@ -20030,25 +19914,27 @@
         <w:sz w:val="20"/>
         <w:szCs w:val="20"/>
         <w:u w:val="single"/>
+        <w:lang w:val="en-GB"/>
       </w:rPr>
     </w:pPr>
     <w:r>
       <w:fldChar w:fldCharType="begin"/>
     </w:r>
     <w:r>
+      <w:rPr>
+        <w:lang w:val="en-GB"/>
+      </w:rPr>
       <w:instrText xml:space="preserve"> REF _Ref210462616 \h </w:instrText>
     </w:r>
     <w:r>
       <w:fldChar w:fldCharType="separate"/>
     </w:r>
     <w:r>
-      <w:t xml:space="preserve">Error: Reference source not </w:t>
+      <w:rPr>
+        <w:lang w:val="en-GB"/>
+      </w:rPr>
+      <w:t>Error: Reference source not found</w:t>
     </w:r>
-    <w:proofErr w:type="spellStart"/>
-    <w:r>
-      <w:t>found</w:t>
-    </w:r>
-    <w:proofErr w:type="spellEnd"/>
     <w:r>
       <w:fldChar w:fldCharType="end"/>
     </w:r>
@@ -20057,6 +19943,7 @@
         <w:sz w:val="20"/>
         <w:szCs w:val="20"/>
         <w:u w:val="single"/>
+        <w:lang w:val="en-GB"/>
       </w:rPr>
       <w:tab/>
     </w:r>
@@ -20065,6 +19952,7 @@
         <w:sz w:val="20"/>
         <w:szCs w:val="20"/>
         <w:u w:val="single"/>
+        <w:lang w:val="en-GB"/>
       </w:rPr>
       <w:tab/>
     </w:r>
@@ -20073,6 +19961,7 @@
         <w:sz w:val="20"/>
         <w:szCs w:val="20"/>
         <w:u w:val="single"/>
+        <w:lang w:val="en-GB"/>
       </w:rPr>
       <w:tab/>
     </w:r>
@@ -20081,6 +19970,7 @@
         <w:sz w:val="20"/>
         <w:szCs w:val="20"/>
         <w:u w:val="single"/>
+        <w:lang w:val="en-GB"/>
       </w:rPr>
       <w:tab/>
     </w:r>
@@ -20097,6 +19987,7 @@
         <w:sz w:val="20"/>
         <w:szCs w:val="20"/>
         <w:u w:val="single"/>
+        <w:lang w:val="en-GB"/>
       </w:rPr>
       <w:instrText xml:space="preserve"> PAGE </w:instrText>
     </w:r>
@@ -20113,6 +20004,7 @@
         <w:sz w:val="20"/>
         <w:szCs w:val="20"/>
         <w:u w:val="single"/>
+        <w:lang w:val="en-GB"/>
       </w:rPr>
       <w:t>0</w:t>
     </w:r>
@@ -20128,6 +20020,9 @@
   <w:p>
     <w:pPr>
       <w:pStyle w:val="Kopfzeile"/>
+      <w:rPr>
+        <w:lang w:val="en-GB"/>
+      </w:rPr>
     </w:pPr>
   </w:p>
 </w:hdr>
@@ -32097,97 +31992,6 @@
 </file>
 
 <file path=customXml/item1.xml><?xml version="1.0" encoding="utf-8"?>
-<p:properties xmlns:p="http://schemas.microsoft.com/office/2006/metadata/properties" xmlns:xsi="http://www.w3.org/2001/XMLSchema-instance" xmlns:pc="http://schemas.microsoft.com/office/infopath/2007/PartnerControls">
-  <documentManagement/>
-</p:properties>
-</file>
-
-<file path=customXml/item2.xml><?xml version="1.0" encoding="utf-8"?>
-<?mso-contentType ?>
-<FormTemplates xmlns="http://schemas.microsoft.com/sharepoint/v3/contenttype/forms">
-  <Display>DocumentLibraryForm</Display>
-  <Edit>DocumentLibraryForm</Edit>
-  <New>DocumentLibraryForm</New>
-</FormTemplates>
-</file>
-
-<file path=customXml/item3.xml><?xml version="1.0" encoding="utf-8"?>
-<inkml:ink xmlns:inkml="http://www.w3.org/2003/InkML">
-  <inkml:definitions>
-    <inkml:context xml:id="ctx0">
-      <inkml:inkSource xml:id="inkSrc0">
-        <inkml:traceFormat>
-          <inkml:channel name="X" type="integer" min="-2.14748E9" max="2.14748E9" units="cm"/>
-          <inkml:channel name="Y" type="integer" min="-2.14748E9" max="2.14748E9" units="cm"/>
-          <inkml:channel name="F" type="integer" max="32767" units="dev"/>
-          <inkml:channel name="OA" type="integer" max="360" units="deg"/>
-          <inkml:channel name="OE" type="integer" max="90" units="deg"/>
-        </inkml:traceFormat>
-        <inkml:channelProperties>
-          <inkml:channelProperty channel="X" name="resolution" value="1000" units="1/cm"/>
-          <inkml:channelProperty channel="Y" name="resolution" value="1000" units="1/cm"/>
-          <inkml:channelProperty channel="F" name="resolution" value="0" units="1/dev"/>
-          <inkml:channelProperty channel="OA" name="resolution" value="1000" units="1/deg"/>
-          <inkml:channelProperty channel="OE" name="resolution" value="1000" units="1/deg"/>
-        </inkml:channelProperties>
-      </inkml:inkSource>
-      <inkml:timestamp xml:id="ts0" timeString="2025-06-10T16:08:54.030"/>
-    </inkml:context>
-    <inkml:brush xml:id="br0">
-      <inkml:brushProperty name="width" value="0.05" units="cm"/>
-      <inkml:brushProperty name="height" value="0.05" units="cm"/>
-      <inkml:brushProperty name="color" value="#E71224"/>
-    </inkml:brush>
-  </inkml:definitions>
-  <inkml:trace contextRef="#ctx0" brushRef="#br0">5 208 2425 0 0,'0'0'5878'0'0,"24"0"-3468"0"0,-17 1-2405 0 0,0 0 1 0 0,0 0-1 0 0,0 0 0 0 0,0 1 1 0 0,0 0-1 0 0,11 5 0 0 0,-9-5 40 0 0,0 0-1 0 0,0 0 0 0 0,0-1 0 0 0,1 0 1 0 0,-1 0-1 0 0,0-1 0 0 0,17-3 1 0 0,4 2 74 0 0,-22 1-105 0 0,1-1 1 0 0,0 2-1 0 0,-1-1 0 0 0,1 1 1 0 0,-1 0-1 0 0,1 1 1 0 0,-1 0-1 0 0,1 0 1 0 0,-1 1-1 0 0,14 7 0 0 0,-22-10-10 0 0,1 0 1 0 0,0 1-1 0 0,-1-1 0 0 0,1 1 0 0 0,0-1 0 0 0,-1 1 0 0 0,1-1 0 0 0,0 1 0 0 0,-1 0 0 0 0,1-1 0 0 0,-1 1 0 0 0,1 0 0 0 0,-1-1 0 0 0,0 1 0 0 0,1 0 0 0 0,-1 0 0 0 0,0-1 0 0 0,1 1 0 0 0,-1 0 0 0 0,0 0 0 0 0,0 0 0 0 0,0-1 0 0 0,0 1 0 0 0,0 0 1 0 0,0 0-1 0 0,0 0 0 0 0,0 0 0 0 0,0-1 0 0 0,0 1 0 0 0,0 0 0 0 0,0 0 0 0 0,-1 0 0 0 0,1-1 0 0 0,0 1 0 0 0,-1 0 0 0 0,1 0 0 0 0,0-1 0 0 0,-1 1 0 0 0,1 0 0 0 0,-2 0 0 0 0,-2 4 13 0 0,0-1 0 0 0,-1 1 0 0 0,0-1 0 0 0,-10 6 0 0 0,-6 7-17 0 0,-52 46-71 0 0,46-41 27 0 0,-30 31 0 0 0,55-51 44 0 0,1 0 0 0 0,-1 0 0 0 0,0 0 0 0 0,1 0-1 0 0,-1 0 1 0 0,1 0 0 0 0,0 0 0 0 0,0 0 0 0 0,-1 1-1 0 0,1-1 1 0 0,1 0 0 0 0,-1 1 0 0 0,0-1 0 0 0,1 1-1 0 0,-1-1 1 0 0,1 1 0 0 0,0-1 0 0 0,0 5-1 0 0,0-6 1 0 0,1 1 0 0 0,0-1 0 0 0,-1 1 0 0 0,1-1 0 0 0,0 1 0 0 0,0-1 0 0 0,0 0-1 0 0,0 1 1 0 0,0-1 0 0 0,0 0 0 0 0,0 0 0 0 0,0 0 0 0 0,1 0 0 0 0,-1 0-1 0 0,0 0 1 0 0,1 0 0 0 0,-1 0 0 0 0,1 0 0 0 0,-1-1 0 0 0,1 1 0 0 0,-1-1 0 0 0,1 1-1 0 0,-1-1 1 0 0,1 1 0 0 0,0-1 0 0 0,-1 0 0 0 0,1 0 0 0 0,-1 0 0 0 0,3 0-1 0 0,29 4-18 0 0,-11-1-40 0 0,-1-1 0 0 0,25-2 0 0 0,-39 0 42 0 0,1-1-1 0 0,0 0 1 0 0,0 0-1 0 0,-1-1 1 0 0,1 0-1 0 0,-1-1 1 0 0,0 0 0 0 0,0 0-1 0 0,12-7 1 0 0,29-13-1642 0 0,-12 16-3216 0 0,-30 7 3490 0 0</inkml:trace>
-  <inkml:trace contextRef="#ctx0" brushRef="#br0" timeOffset="537.36">1 353 3761 0 0,'14'-4'313'0'0,"1"1"1"0"0,0 1 0 0 0,0 0-1 0 0,0 1 1 0 0,1 1 0 0 0,-1 0-1 0 0,0 1 1 0 0,0 0 0 0 0,0 2-1 0 0,0-1 1 0 0,-1 2 0 0 0,1 0-1 0 0,-1 1 1 0 0,1 0 0 0 0,13 8-1 0 0,-21-9-404 0 0,1-2 0 0 0,0 1 0 0 0,0-1 0 0 0,0 0-1 0 0,0-1 1 0 0,0 0 0 0 0,0 0 0 0 0,1 0 0 0 0,-1-1 0 0 0,0-1-1 0 0,0 1 1 0 0,1-2 0 0 0,-1 1 0 0 0,0-1 0 0 0,0 0 0 0 0,9-4 0 0 0,-11 5-498 0 0</inkml:trace>
-  <inkml:trace contextRef="#ctx0" brushRef="#br0" timeOffset="1907.49">580 318 4417 0 0,'0'0'535'0'0,"25"18"674"0"0,-15-14-1066 0 0,1 0-1 0 0,0-1 0 0 0,-1 0 0 0 0,1-1 1 0 0,17 2-1 0 0,-15-3-53 0 0,0-1 1 0 0,0 0-1 0 0,19-4 1 0 0,-28 4-78 0 0,0-1 0 0 0,-1 1 0 0 0,1-1 1 0 0,-1 0-1 0 0,1-1 0 0 0,-1 1 0 0 0,1 0 1 0 0,-1-1-1 0 0,0 0 0 0 0,0 0 1 0 0,0 0-1 0 0,0 0 0 0 0,0 0 0 0 0,0-1 1 0 0,-1 1-1 0 0,1-1 0 0 0,2-4 1 0 0,-4 5-7 0 0,0 0 0 0 0,0 0 0 0 0,-1 0 0 0 0,1 0 0 0 0,-1 0 1 0 0,0 0-1 0 0,1 0 0 0 0,-1 0 0 0 0,0 0 0 0 0,0 0 1 0 0,0 0-1 0 0,-1 0 0 0 0,1 0 0 0 0,0 0 0 0 0,-1 0 0 0 0,1 0 1 0 0,-1 0-1 0 0,0 0 0 0 0,-1-3 0 0 0,2 4-6 0 0,-1 0-1 0 0,0-1 1 0 0,0 1-1 0 0,0 0 1 0 0,1 0 0 0 0,-1 0-1 0 0,0 0 1 0 0,-1 0-1 0 0,1 0 1 0 0,0 0 0 0 0,0 0-1 0 0,0 0 1 0 0,0 1-1 0 0,-1-1 1 0 0,1 0-1 0 0,0 1 1 0 0,-1-1 0 0 0,1 1-1 0 0,0-1 1 0 0,-1 1-1 0 0,1 0 1 0 0,-1 0 0 0 0,1-1-1 0 0,0 1 1 0 0,-1 0-1 0 0,1 0 1 0 0,-1 0-1 0 0,1 1 1 0 0,-1-1 0 0 0,1 0-1 0 0,-1 0 1 0 0,1 1-1 0 0,-2 0 1 0 0,-13 4-18 0 0,0 1 0 0 0,0 1 1 0 0,0 0-1 0 0,1 1 0 0 0,-16 12 0 0 0,26-16 81 0 0,-1 0 0 0 0,2 0 0 0 0,-1 0 0 0 0,0 1 0 0 0,1 0 1 0 0,0 0-1 0 0,0 0 0 0 0,1 0 0 0 0,-1 0 0 0 0,1 1 0 0 0,0 0 0 0 0,1 0 0 0 0,-1 0 0 0 0,1 0 0 0 0,0 0 0 0 0,1 0 0 0 0,-2 9 0 0 0,3-10-43 0 0,-1-1 0 0 0,2 1 0 0 0,-1-1 0 0 0,0 1 0 0 0,1-1 0 0 0,0 1-1 0 0,0-1 1 0 0,0 0 0 0 0,1 1 0 0 0,-1-1 0 0 0,1 0 0 0 0,0 0 0 0 0,0 0 0 0 0,4 5 0 0 0,-1-3-13 0 0,0 1-1 0 0,0-1 1 0 0,1 0 0 0 0,0 0 0 0 0,0-1 0 0 0,1 0 0 0 0,11 8 0 0 0,-10-9 30 0 0,-1 1 0 0 0,0-1 0 0 0,1-1 0 0 0,0 0 0 0 0,-1 0 1 0 0,1 0-1 0 0,1-1 0 0 0,-1 0 0 0 0,0-1 0 0 0,0 1 0 0 0,1-2 0 0 0,-1 1 0 0 0,1-1 0 0 0,-1-1 0 0 0,0 1 0 0 0,14-4 0 0 0,-13 1 19 0 0,0 0 0 0 0,0 0-1 0 0,-1-1 1 0 0,1-1 0 0 0,-1 1-1 0 0,0-1 1 0 0,0-1 0 0 0,0 0-1 0 0,-1 0 1 0 0,0 0 0 0 0,0-1-1 0 0,-1 0 1 0 0,1 0-1 0 0,-1-1 1 0 0,-1 1 0 0 0,0-1-1 0 0,0-1 1 0 0,0 1 0 0 0,-1-1-1 0 0,-1 1 1 0 0,6-18 0 0 0,3-2 566 0 0,-23 48-322 0 0,9-18-301 0 0,1 1 0 0 0,0 0 1 0 0,-1 0-1 0 0,1-1 0 0 0,0 1 0 0 0,0 0 1 0 0,1 0-1 0 0,-1 0 0 0 0,1 0 0 0 0,-1 0 1 0 0,1 0-1 0 0,0 0 0 0 0,0 0 0 0 0,1 5 1 0 0,-1-8 0 0 0,0-1 0 0 0,0 1 0 0 0,0 0 0 0 0,0 0 0 0 0,0 0 0 0 0,0 0 0 0 0,-1 0 0 0 0,1 0 0 0 0,0 0 0 0 0,0 0 0 0 0,0 0-1 0 0,0 0 1 0 0,0 0 0 0 0,0 0 0 0 0,0 0 0 0 0,0 0 0 0 0,0 0 0 0 0,0 0 0 0 0,0 0 0 0 0,0 0 0 0 0,0 0 0 0 0,0 0 0 0 0,0 0 0 0 0,0 0 0 0 0,0 0 0 0 0,0 0 0 0 0,-1 0 0 0 0,1 0 0 0 0,0 0 0 0 0,0 0 0 0 0,0 0 0 0 0,0 0 0 0 0,0 0 0 0 0,0 0 0 0 0,9 36 2 0 0,-9-36 0 0 0,0 1 0 0 0,0 0 0 0 0,0-1-1 0 0,0 1 1 0 0,0-1 0 0 0,1 1 0 0 0,-1 0 0 0 0,0-1 0 0 0,0 1 0 0 0,0-1 0 0 0,1 1-1 0 0,-1-1 1 0 0,0 1 0 0 0,0-1 0 0 0,1 1 0 0 0,-1-1 0 0 0,0 1 0 0 0,1-1 0 0 0,-1 1-1 0 0,1-1 1 0 0,-1 1 0 0 0,1-1 0 0 0,-1 0 0 0 0,1 1 0 0 0,-1-1 0 0 0,1 0 0 0 0,-1 0-1 0 0,1 1 1 0 0,-1-1 0 0 0,1 0 0 0 0,-1 0 0 0 0,2 1 0 0 0,5 1 24 0 0,-1 1-15 0 0,-4-1-3 0 0,0-1 0 0 0,0 0-1 0 0,0 0 1 0 0,0 0-1 0 0,0 0 1 0 0,0-1 0 0 0,0 1-1 0 0,0 0 1 0 0,0-1-1 0 0,0 0 1 0 0,4 1 0 0 0,-2-1 6 0 0,-1-1 1 0 0,1 0 0 0 0,-1 1 0 0 0,1-1 0 0 0,-1-1-1 0 0,0 1 1 0 0,1 0 0 0 0,-1-1 0 0 0,0 0 0 0 0,0 0 0 0 0,0 1-1 0 0,0-2 1 0 0,0 1 0 0 0,0 0 0 0 0,-1-1 0 0 0,1 1-1 0 0,3-6 1 0 0,2-3 48 0 0,0 0 0 0 0,-1 0-1 0 0,9-18 1 0 0,-15 28-59 0 0,-1 1 0 0 0,0 0 0 0 0,1 0 0 0 0,-1 0 0 0 0,0-1 0 0 0,1 1 0 0 0,-1 0-1 0 0,0 0 1 0 0,1 0 0 0 0,-1 0 0 0 0,1 0 0 0 0,-1 0 0 0 0,0 0 0 0 0,1 0 0 0 0,-1 0 0 0 0,1 0 0 0 0,-1 0 0 0 0,0 0 0 0 0,1 0 0 0 0,-1 0 0 0 0,0 0 0 0 0,1 0-1 0 0,-1 0 1 0 0,1 0 0 0 0,-1 1 0 0 0,0-1 0 0 0,1 0 0 0 0,-1 0 0 0 0,0 0 0 0 0,1 1 0 0 0,-1-1 0 0 0,1 1 0 0 0,15 10 220 0 0,-11-8-150 0 0,16 12 108 0 0,-20-14-176 0 0,1 0 0 0 0,-1 0 0 0 0,1 1 0 0 0,0-1 0 0 0,-1 0 0 0 0,1 0 0 0 0,0-1 0 0 0,0 1 1 0 0,-1 0-1 0 0,1 0 0 0 0,3 0 0 0 0,14 9 241 0 0,-16-8-777 0 0,0 1 0 0 0,0-1 1 0 0,0 0-1 0 0,1-1 1 0 0,-1 1-1 0 0,0-1 0 0 0,7 3 1 0 0,16 2-598 0 0,-20-4-110 0 0</inkml:trace>
-  <inkml:trace contextRef="#ctx0" brushRef="#br0" timeOffset="2280.99">1565 26 4089 0 0,'0'0'1209'0'0,"0"0"-1132"0"0,0 0-1 0 0,0 0 1 0 0,0-1-1 0 0,0 1 1 0 0,0 0 0 0 0,0 0-1 0 0,0 0 1 0 0,0 0-1 0 0,0-1 1 0 0,0 1-1 0 0,0 0 1 0 0,0 0-1 0 0,0 0 1 0 0,0 0-1 0 0,0 0 1 0 0,0-1-1 0 0,0 1 1 0 0,-1 0-1 0 0,1 0 1 0 0,0 0-1 0 0,0 0 1 0 0,0 0-1 0 0,0 0 1 0 0,0 0-1 0 0,0-1 1 0 0,0 1-1 0 0,0 0 1 0 0,-1 0-1 0 0,1 0 1 0 0,0 0-1 0 0,0 0 1 0 0,0 0-1 0 0,0 0 1 0 0,0 0-1 0 0,-1 0 1 0 0,1 0-1 0 0,0 0 1 0 0,0 0-1 0 0,0 0 1 0 0,0 0-1 0 0,0 0 1 0 0,-1 0-1 0 0,1 0 1 0 0,0 0-1 0 0,0 0 1 0 0,0 0-1 0 0,0 0 1 0 0,0 0-1 0 0,-1 0 1 0 0,1 0-1 0 0,0 0 1 0 0,0 0-1 0 0,0 0 1 0 0,0 0-1 0 0,0 0 1 0 0,-1 0-1 0 0,-1 5-10 0 0,-1 0-1 0 0,1 1 0 0 0,0-1 1 0 0,1 0-1 0 0,-1 0 1 0 0,1 1-1 0 0,0-1 0 0 0,1 1 1 0 0,-1-1-1 0 0,1 7 0 0 0,3 67 129 0 0,-2-49-157 0 0,4 73-83 0 0,21 127 0 0 0,-23-221-74 0 0,0 3-3773 0 0</inkml:trace>
-  <inkml:trace contextRef="#ctx0" brushRef="#br0" timeOffset="2798.33">1444 424 2192 0 0,'0'0'112'0'0,"-1"0"0"0"0,1 0 0 0 0,0-1-1 0 0,-1 1 1 0 0,1 0 0 0 0,0 0 0 0 0,0-1-1 0 0,-1 1 1 0 0,1 0 0 0 0,0-1 0 0 0,0 1-1 0 0,-1 0 1 0 0,1-1 0 0 0,0 1-1 0 0,0 0 1 0 0,0-1 0 0 0,0 1 0 0 0,-1-1-1 0 0,1 1 1 0 0,0 0 0 0 0,0-1 0 0 0,0 1-1 0 0,0-1 1 0 0,0 1 0 0 0,0-1 0 0 0,0 1-1 0 0,0 0 1 0 0,0-1 0 0 0,0 1-1 0 0,0-1 1 0 0,1 1 0 0 0,-1 0 0 0 0,0-1-1 0 0,0 1 1 0 0,0-1 0 0 0,0 1 0 0 0,1 0-1 0 0,-1-1 1 0 0,0 1 0 0 0,0 0 0 0 0,1-1-1 0 0,-1 1 1 0 0,0 0 0 0 0,1 0-1 0 0,-1-1 1 0 0,12-18 1969 0 0,25-6-1791 0 0,-37 24-276 0 0,0 1-1 0 0,0 0 0 0 0,1-1 0 0 0,-1 1 0 0 0,0 0 0 0 0,1-1 0 0 0,-1 1 0 0 0,0 0 1 0 0,1-1-1 0 0,-1 1 0 0 0,1 0 0 0 0,-1 0 0 0 0,1-1 0 0 0,-1 1 0 0 0,0 0 0 0 0,1 0 1 0 0,-1 0-1 0 0,1 0 0 0 0,-1 0 0 0 0,1-1 0 0 0,-1 1 0 0 0,1 0 0 0 0,-1 0 0 0 0,1 0 1 0 0,-1 0-1 0 0,1 0 0 0 0,-1 1 0 0 0,1-1 0 0 0,-1 0 0 0 0,1 0 0 0 0,-1 0 0 0 0,1 0 1 0 0,-1 0-1 0 0,0 1 0 0 0,1-1 0 0 0,-1 0 0 0 0,1 0 0 0 0,-1 1 0 0 0,0-1 0 0 0,1 0 1 0 0,-1 1-1 0 0,0-1 0 0 0,1 1 0 0 0,6 5 43 0 0,3 2-14 0 0,1-1 0 0 0,-1 0 1 0 0,1-1-1 0 0,19 8 0 0 0,-26-13-198 0 0,0 0 1 0 0,0 1-1 0 0,0-2 1 0 0,0 1-1 0 0,0 0 0 0 0,0-1 1 0 0,0 0-1 0 0,0 0 1 0 0,0 0-1 0 0,1 0 1 0 0,-1-1-1 0 0,0 1 0 0 0,0-1 1 0 0,0 0-1 0 0,0-1 1 0 0,0 1-1 0 0,0-1 0 0 0,-1 1 1 0 0,8-5-1 0 0,5-6-909 0 0,-7 6 943 0 0</inkml:trace>
-  <inkml:trace contextRef="#ctx0" brushRef="#br0" timeOffset="3356.09">1840 346 3401 0 0,'0'0'3806'0'0,"-2"3"-3743"0"0,-1 3-50 0 0,0 1 0 0 0,0-1 0 0 0,0 1 0 0 0,0 0 0 0 0,1 0 0 0 0,1 0 0 0 0,-1 0 0 0 0,1 0 0 0 0,-1 12 1 0 0,2-14-7 0 0,-1 0 0 0 0,1 0 0 0 0,0 0 0 0 0,0 1 0 0 0,1-1 0 0 0,-1 0 0 0 0,1 0 0 0 0,1 0 0 0 0,-1 0 0 0 0,1 0 0 0 0,-1 0 0 0 0,1 0 0 0 0,1-1 0 0 0,4 9 0 0 0,-6-11 12 0 0,1 0 0 0 0,0-1 0 0 0,-1 1 0 0 0,1-1 0 0 0,0 1 0 0 0,0-1 1 0 0,0 0-1 0 0,-1 0 0 0 0,1 0 0 0 0,0 0 0 0 0,1 0 0 0 0,-1 0 0 0 0,0 0 1 0 0,0-1-1 0 0,0 1 0 0 0,0-1 0 0 0,1 0 0 0 0,-1 0 0 0 0,5 0 642 0 0,-10-26 1203 0 0,4 24-1851 0 0,-1 0-1 0 0,0 0 0 0 0,-1 0 1 0 0,1 0-1 0 0,0 0 1 0 0,0 0-1 0 0,-1 0 1 0 0,1 0-1 0 0,-1 0 0 0 0,0 1 1 0 0,0-1-1 0 0,-1-3 1 0 0,-2 0 71 0 0,0 0 1 0 0,-1 0 0 0 0,1 0 0 0 0,-1 1 0 0 0,0 0 0 0 0,0 0 0 0 0,-7-5 0 0 0,6 6-43 0 0,0-3 62 0 0,7 2-115 0 0,1 1 0 0 0,0-1 0 0 0,0 1 0 0 0,0 0 0 0 0,0-1 0 0 0,0 1 0 0 0,1 0-1 0 0,0 1 1 0 0,-1-1 0 0 0,1 0 0 0 0,0 1 0 0 0,0-1 0 0 0,1 1 0 0 0,-1 0 0 0 0,4-2 0 0 0,7-2-23 0 0,0 0 1 0 0,0 1-1 0 0,1 0 1 0 0,-1 2 0 0 0,1-1-1 0 0,18 0 1 0 0,41-12-3622 0 0,-67 15 2699 0 0,-1 1-138 0 0</inkml:trace>
-  <inkml:trace contextRef="#ctx0" brushRef="#br0" timeOffset="3740.67">2229 335 4217 0 0,'0'0'95'0'0,"0"-1"-1"0"0,0 1 1 0 0,0 0 0 0 0,0-1 0 0 0,1 1-1 0 0,-1 0 1 0 0,0 0 0 0 0,0-1-1 0 0,0 1 1 0 0,0 0 0 0 0,1-1 0 0 0,-1 1-1 0 0,0 0 1 0 0,0 0 0 0 0,1-1 0 0 0,-1 1-1 0 0,0 0 1 0 0,0 0 0 0 0,1 0-1 0 0,-1 0 1 0 0,0-1 0 0 0,1 1 0 0 0,-1 0-1 0 0,0 0 1 0 0,1 0 0 0 0,-1 0 0 0 0,0 0-1 0 0,1 0 1 0 0,-1 0 0 0 0,0 0-1 0 0,1 0 1 0 0,-1 0 0 0 0,0 0 0 0 0,1 0-1 0 0,0 0 1 0 0,8 10 1419 0 0,2 19-612 0 0,-8 20-538 0 0,-3-42-416 0 0,0 0 0 0 0,0 0 0 0 0,0-1 0 0 0,1 1 0 0 0,0 0 0 0 0,0 0 0 0 0,1-1 0 0 0,0 1 0 0 0,0-1 0 0 0,0 0 0 0 0,1 1 0 0 0,0-1 0 0 0,0 0 0 0 0,5 7 0 0 0,-6-10-558 0 0,1 1-319 0 0</inkml:trace>
-  <inkml:trace contextRef="#ctx0" brushRef="#br0" timeOffset="3921.31">2292 212 3929 0 0,'-1'-2'370'0'0,"0"0"1"0"0,0 0-1 0 0,0 0 0 0 0,0 0 1 0 0,0 0-1 0 0,1 0 1 0 0,-1 0-1 0 0,1 0 1 0 0,0-1-1 0 0,-1 1 0 0 0,1-4 1 0 0,0 6-415 0 0</inkml:trace>
-  <inkml:trace contextRef="#ctx0" brushRef="#br0" timeOffset="5174.93">2503 367 1624 0 0,'0'0'4464'0'0,"2"2"-4200"0"0,1 0-1 0 0,-1 0 1 0 0,0 0-1 0 0,1 0 1 0 0,-1-1 0 0 0,1 1-1 0 0,0-1 1 0 0,5 2-1 0 0,-3-1-237 0 0,1-1-1 0 0,0 1 0 0 0,0-2 0 0 0,0 1 0 0 0,0-1 0 0 0,0 0 0 0 0,1 0 0 0 0,-1 0 0 0 0,0-1 0 0 0,0 0 0 0 0,0 0 0 0 0,9-4 0 0 0,-9 2-2 0 0,1 0-1 0 0,-1-1 1 0 0,0 0 0 0 0,0 0 0 0 0,9-9-1 0 0,-14 12-17 0 0,0-1 0 0 0,1 1-1 0 0,-1 0 1 0 0,0-1-1 0 0,0 1 1 0 0,0 0-1 0 0,-1-1 1 0 0,1 0-1 0 0,0 1 1 0 0,0-1 0 0 0,-1 1-1 0 0,1-1 1 0 0,-1 0-1 0 0,1 1 1 0 0,-1-1-1 0 0,0 0 1 0 0,0 1 0 0 0,0-1-1 0 0,0 0 1 0 0,0 0-1 0 0,0 1 1 0 0,0-1-1 0 0,-1 0 1 0 0,1 1-1 0 0,0-1 1 0 0,-1 0 0 0 0,1 1-1 0 0,-1-1 1 0 0,-1-2-1 0 0,1 2-3 0 0,-1 1 0 0 0,1-1 0 0 0,0 1 0 0 0,0 0 0 0 0,-1 0 0 0 0,1-1 0 0 0,-1 1 0 0 0,1 0 0 0 0,-1 0 0 0 0,0 0 0 0 0,1 1 0 0 0,-1-1 0 0 0,0 0 0 0 0,1 1-1 0 0,-1-1 1 0 0,0 1 0 0 0,0-1 0 0 0,0 1 0 0 0,1 0 0 0 0,-1 0 0 0 0,0 0 0 0 0,0 0 0 0 0,0 0 0 0 0,0 0 0 0 0,1 0 0 0 0,-1 1 0 0 0,0-1 0 0 0,0 1 0 0 0,0-1 0 0 0,1 1 0 0 0,-4 1 0 0 0,0 0 3 0 0,0 0 1 0 0,0 1 0 0 0,0 0-1 0 0,0-1 1 0 0,0 1 0 0 0,0 1-1 0 0,1-1 1 0 0,0 1 0 0 0,-5 5 0 0 0,-11 12 13 0 0,18-19 18 0 0,0 0-1 0 0,0 0 0 0 0,0-1 1 0 0,0 2-1 0 0,0-1 1 0 0,1 0-1 0 0,-1 0 1 0 0,1 1-1 0 0,-1-1 1 0 0,1 0-1 0 0,0 1 1 0 0,0-1-1 0 0,0 1 1 0 0,0 0-1 0 0,0-1 0 0 0,1 1 1 0 0,-1 0-1 0 0,1 0 1 0 0,0-1-1 0 0,0 1 1 0 0,0 0-1 0 0,0 0 1 0 0,1 4-1 0 0,-1-3-8 0 0,0 0-1 0 0,1 0 1 0 0,0 0 0 0 0,0 0-1 0 0,0 0 1 0 0,0 0-1 0 0,1 0 1 0 0,-1 0 0 0 0,1-1-1 0 0,0 1 1 0 0,0-1 0 0 0,1 1-1 0 0,-1-1 1 0 0,0 0-1 0 0,1 0 1 0 0,0 0 0 0 0,0 0-1 0 0,0 0 1 0 0,0-1 0 0 0,0 1-1 0 0,1-1 1 0 0,-1 0-1 0 0,1 0 1 0 0,0 0 0 0 0,4 1-1 0 0,1 2-24 0 0,0-1 1 0 0,0 0-1 0 0,1 0 0 0 0,-1-1 0 0 0,1 0 0 0 0,0-1 0 0 0,0 0 0 0 0,0-1 1 0 0,0 0-1 0 0,0 0 0 0 0,0-1 0 0 0,0-1 0 0 0,0 1 0 0 0,0-2 1 0 0,0 1-1 0 0,0-2 0 0 0,14-4 0 0 0,-22 7 6 0 0,-1-1 1 0 0,1 0-1 0 0,-1 1 1 0 0,1-1-1 0 0,-1 0 1 0 0,0 0-1 0 0,1 0 1 0 0,-1 0-1 0 0,0 0 0 0 0,1-1 1 0 0,-1 1-1 0 0,0 0 1 0 0,0-1-1 0 0,0 1 1 0 0,0 0-1 0 0,-1-1 1 0 0,1 1-1 0 0,0-1 0 0 0,0 0 1 0 0,-1 1-1 0 0,1-1 1 0 0,-1 1-1 0 0,0-1 1 0 0,1 0-1 0 0,-1 0 1 0 0,0 1-1 0 0,0-1 0 0 0,0 0 1 0 0,0 1-1 0 0,0-1 1 0 0,-1 0-1 0 0,1 1 1 0 0,0-1-1 0 0,-1 0 1 0 0,1 1-1 0 0,-1-1 0 0 0,0 1 1 0 0,1-1-1 0 0,-1 1 1 0 0,0-1-1 0 0,0 1 1 0 0,0-1-1 0 0,0 1 1 0 0,0 0-1 0 0,0-1 0 0 0,0 1 1 0 0,-1 0-1 0 0,1 0 1 0 0,0 0-1 0 0,-2-1 1 0 0,2 1 18 0 0,0 0 0 0 0,0 0 0 0 0,1 0 0 0 0,-1 0 0 0 0,0-1 0 0 0,1 1 0 0 0,-1 0-1 0 0,1 0 1 0 0,0 0 0 0 0,-1-1 0 0 0,1 1 0 0 0,0 0 0 0 0,0-1 0 0 0,0 1 0 0 0,0 0 0 0 0,0 0 0 0 0,0-1 0 0 0,0 1 0 0 0,0 0 0 0 0,1-1 0 0 0,-1 1 0 0 0,0 0 0 0 0,1 0 0 0 0,-1-1 0 0 0,1 1 0 0 0,-1 0 0 0 0,1 0 0 0 0,0 0 0 0 0,-1 0 0 0 0,1 0 0 0 0,0 0 0 0 0,0 0 0 0 0,0 0 0 0 0,0 0 0 0 0,2-1 0 0 0,-1 0-47 0 0,1 1 0 0 0,-1 1 0 0 0,1-1 1 0 0,-1 0-1 0 0,1 0 0 0 0,-1 1 1 0 0,1 0-1 0 0,0-1 0 0 0,-1 1 0 0 0,1 0 1 0 0,0 0-1 0 0,-1 1 0 0 0,1-1 1 0 0,-1 0-1 0 0,1 1 0 0 0,0-1 0 0 0,-1 1 1 0 0,1 0-1 0 0,-1 0 0 0 0,0 0 1 0 0,1 0-1 0 0,3 3 0 0 0,-2-2-109 0 0,1 0 0 0 0,0 0 0 0 0,-1-1 0 0 0,1 1 0 0 0,0-1-1 0 0,0 0 1 0 0,0-1 0 0 0,0 1 0 0 0,0-1 0 0 0,0 0 0 0 0,5-1 0 0 0,33-9-4310 0 0,-35 8 3159 0 0</inkml:trace>
-  <inkml:trace contextRef="#ctx0" brushRef="#br0" timeOffset="5981.97">3170 36 5377 0 0,'-8'-3'4857'0'0,"-2"11"-3287"0"0,1 14-1849 0 0,7 12 244 0 0,1 0 0 0 0,2-1 0 0 0,1 1 0 0 0,1 0 0 0 0,2-1 0 0 0,2 0 0 0 0,0 0 0 0 0,3 0-1 0 0,15 36 1 0 0,-23-57-192 0 0,-11-19-139 0 0,-8-7 219 0 0,-11-8 149 0 0,22 18 3 0 0,3 2-2 0 0,-4 2 7 0 0,-2-3 1 0 0,0 1 0 0 0,1 0 0 0 0,-1 1 0 0 0,0 0 0 0 0,0 0 0 0 0,0 1 0 0 0,0 0 0 0 0,0 1 0 0 0,-10 1 0 0 0,19-1 402 0 0,7-2 74 0 0,26 0-139 0 0,33-7 1 0 0,-56 6-838 0 0,-1 0 0 0 0,1 0 0 0 0,0-1 0 0 0,-1-1 0 0 0,1 0-1 0 0,-1 0 1 0 0,0 0 0 0 0,9-7 0 0 0,-11 6 249 0 0,0 0-326 0 0</inkml:trace>
-  <inkml:trace contextRef="#ctx0" brushRef="#br0" timeOffset="6556.61">3575 1 1816 0 0,'0'0'7770'0'0,"0"11"-6007"0"0,1 12-1488 0 0,0 0 0 0 0,-5 38 0 0 0,1-35-254 0 0,2 0-1 0 0,2 36 1 0 0,3 13-82 0 0,-5-56 3 0 0,2 0 0 0 0,0-1 1 0 0,1 1-1 0 0,1 0 0 0 0,1-1 1 0 0,0 1-1 0 0,9 19 0 0 0,-8-28-191 0 0,3 5-356 0 0,-6-8-3797 0 0</inkml:trace>
-  <inkml:trace contextRef="#ctx0" brushRef="#br0" timeOffset="7116.94">3726 736 1048 0 0,'0'0'150'0'0,"-18"-13"6504"0"0,-10 9-6188 0 0,21 2-374 0 0,0 0 173 0 0,-6 8 1065 0 0,3-1-1239 0 0,0 1 0 0 0,1 0 0 0 0,0 1 0 0 0,0 0 0 0 0,0 0 0 0 0,1 1-1 0 0,0 0 1 0 0,0 0 0 0 0,-10 16 0 0 0,18-23-89 0 0,-1-1 0 0 0,1 1 0 0 0,0-1 0 0 0,0 0 0 0 0,-1 1 0 0 0,1-1-1 0 0,0 1 1 0 0,0 0 0 0 0,0-1 0 0 0,-1 1 0 0 0,1-1 0 0 0,0 1 0 0 0,0-1 0 0 0,0 1 0 0 0,0-1-1 0 0,0 1 1 0 0,0-1 0 0 0,0 1 0 0 0,0 0 0 0 0,0-1 0 0 0,0 1 0 0 0,1-1 0 0 0,-1 1-1 0 0,0-1 1 0 0,0 1 0 0 0,0-1 0 0 0,1 1 0 0 0,-1-1 0 0 0,0 1 0 0 0,1 0 0 0 0,16 2 129 0 0,20-11 87 0 0,-36 8-216 0 0,5-3 27 0 0,0 1 1 0 0,0-1-1 0 0,0 0 1 0 0,-1-1-1 0 0,1 1 0 0 0,8-8 1 0 0,-12 9-11 0 0,0 1 1 0 0,0-1-1 0 0,0 0 1 0 0,-1 1-1 0 0,1-1 1 0 0,0 0 0 0 0,-1 0-1 0 0,0 0 1 0 0,1 0-1 0 0,-1 0 1 0 0,0-1-1 0 0,0 1 1 0 0,0 0-1 0 0,0-1 1 0 0,0 1-1 0 0,-1 0 1 0 0,1-1-1 0 0,-1 1 1 0 0,1-1-1 0 0,-1-3 1 0 0,0 6-11 0 0,0 0 0 0 0,0-1 0 0 0,-1 1 1 0 0,1 0-1 0 0,0-1 0 0 0,0 1 0 0 0,0 0 0 0 0,0-1 0 0 0,0 1 1 0 0,-1 0-1 0 0,1-1 0 0 0,0 1 0 0 0,0 0 0 0 0,-1 0 1 0 0,1-1-1 0 0,0 1 0 0 0,0 0 0 0 0,-1 0 0 0 0,1 0 0 0 0,0-1 1 0 0,-1 1-1 0 0,1 0 0 0 0,0 0 0 0 0,-1 0 0 0 0,1 0 0 0 0,0 0 1 0 0,-1 0-1 0 0,1 0 0 0 0,0 0 0 0 0,-1-1 0 0 0,1 1 1 0 0,0 0-1 0 0,-1 0 0 0 0,1 1 0 0 0,0-1 0 0 0,-1 0 0 0 0,1 0 1 0 0,0 0-1 0 0,-1 0 0 0 0,1 0 0 0 0,-23 9 22 0 0,-11 6-42 0 0,33-14 7 0 0,3-1-1 0 0,-4 4-43 0 0,1-4 48 0 0,1 1 0 0 0,0-1 1 0 0,-1 0-1 0 0,1 0 0 0 0,0 1 0 0 0,0-1 0 0 0,-1 0 1 0 0,1 1-1 0 0,0-1 0 0 0,0 0 0 0 0,-1 1 0 0 0,1-1 1 0 0,0 0-1 0 0,0 1 0 0 0,0-1 0 0 0,0 0 0 0 0,-1 1 0 0 0,1-1 1 0 0,0 1-1 0 0,0-1 0 0 0,0 0 0 0 0,0 1 0 0 0,0-1 1 0 0,0 1-1 0 0,0-1 0 0 0,0 1 0 0 0,0-1 0 0 0,0 0 0 0 0,0 1 1 0 0,0-1-1 0 0,1 1 0 0 0,-1-1 0 0 0,0 0 0 0 0,0 1 1 0 0,0-1-1 0 0,1 0 0 0 0,-1 1 0 0 0,0-1 0 0 0,0 0 1 0 0,1 1-1 0 0,-1-1 0 0 0,0 0 0 0 0,0 1 0 0 0,1-1 0 0 0,-1 0 1 0 0,0 0-1 0 0,1 1 0 0 0,-1-1 0 0 0,0 0 0 0 0,1 0 1 0 0,-1 0-1 0 0,1 0 0 0 0,-1 0 0 0 0,0 1 0 0 0,1-1 1 0 0,-1 0-1 0 0,1 0 0 0 0,-1 0 0 0 0,0 0 0 0 0,1 0 0 0 0,0 0 1 0 0,2 0 3 0 0,0 0 1 0 0,-1 0-1 0 0,1 0 1 0 0,0 0-1 0 0,0-1 1 0 0,-1 1-1 0 0,1-1 1 0 0,0 0-1 0 0,-1 1 1 0 0,1-1-1 0 0,-1-1 1 0 0,1 1-1 0 0,-1 0 1 0 0,1 0-1 0 0,-1-1 1 0 0,0 1-1 0 0,0-1 1 0 0,1 0-1 0 0,-1 0 1 0 0,0 0-1 0 0,-1 0 1 0 0,1 0-1 0 0,0 0 1 0 0,-1 0-1 0 0,1-1 1 0 0,-1 1-1 0 0,0-1 1 0 0,1 1-1 0 0,-1-1 1 0 0,0 1-1 0 0,-1-1 1 0 0,1 0-1 0 0,0-4 1 0 0,-1 7-16 0 0,0-1 0 0 0,0 1 1 0 0,0-1-1 0 0,0 1 0 0 0,0-1 0 0 0,0 1 0 0 0,0-1 1 0 0,0 1-1 0 0,0-1 0 0 0,0 1 0 0 0,0-1 0 0 0,0 1 1 0 0,-1-1-1 0 0,1 1 0 0 0,0-1 0 0 0,0 1 0 0 0,-1 0 1 0 0,1-1-1 0 0,0 1 0 0 0,-1-1 0 0 0,1 1 1 0 0,0 0-1 0 0,-1-1 0 0 0,1 1 0 0 0,-1 0 0 0 0,1-1 1 0 0,0 1-1 0 0,-1 0 0 0 0,1 0 0 0 0,-1-1 0 0 0,-17 3-1171 0 0,-17 17-3193 0 0,27-12 2680 0 0</inkml:trace>
-  <inkml:trace contextRef="#ctx0" brushRef="#br0" timeOffset="8040.3">3146 323 288 0 0,'0'0'1288'0'0,"-9"-7"3628"0"0,8 14-4679 0 0,-1-1 0 0 0,1 0 0 0 0,0 0 0 0 0,1 0 0 0 0,0 10 0 0 0,0-9-159 0 0,-2 3 18 0 0,0 5 19 0 0,0-1-1 0 0,1 0 0 0 0,1 20 0 0 0,1-29-91 0 0,-1 0 0 0 0,2 0 1 0 0,-1 0-1 0 0,0 0 0 0 0,1 0 0 0 0,0 0 0 0 0,0 0 1 0 0,1 0-1 0 0,-1-1 0 0 0,1 1 0 0 0,6 7 0 0 0,-4-6 0 0 0,-1 0 0 0 0,0 1 0 0 0,-1-1 0 0 0,0 1 0 0 0,0 0 0 0 0,0 0 0 0 0,2 10 0 0 0,-4-13-14 0 0,0 0 0 0 0,0 0 1 0 0,-1 0-1 0 0,1 0 0 0 0,-1 0 0 0 0,0 0 0 0 0,0 0 0 0 0,0 0 1 0 0,0 0-1 0 0,-1 0 0 0 0,0 0 0 0 0,0 0 0 0 0,0 0 1 0 0,0 0-1 0 0,-3 5 0 0 0,-9-6 270 0 0</inkml:trace>
-</inkml:ink>
-</file>
-
-<file path=customXml/item4.xml><?xml version="1.0" encoding="utf-8"?>
-<inkml:ink xmlns:inkml="http://www.w3.org/2003/InkML">
-  <inkml:definitions>
-    <inkml:context xml:id="ctx0">
-      <inkml:inkSource xml:id="inkSrc0">
-        <inkml:traceFormat>
-          <inkml:channel name="X" type="integer" min="-2.14748E9" max="2.14748E9" units="cm"/>
-          <inkml:channel name="Y" type="integer" min="-2.14748E9" max="2.14748E9" units="cm"/>
-          <inkml:channel name="F" type="integer" max="32767" units="dev"/>
-          <inkml:channel name="OA" type="integer" max="360" units="deg"/>
-          <inkml:channel name="OE" type="integer" max="90" units="deg"/>
-        </inkml:traceFormat>
-        <inkml:channelProperties>
-          <inkml:channelProperty channel="X" name="resolution" value="1000" units="1/cm"/>
-          <inkml:channelProperty channel="Y" name="resolution" value="1000" units="1/cm"/>
-          <inkml:channelProperty channel="F" name="resolution" value="0" units="1/dev"/>
-          <inkml:channelProperty channel="OA" name="resolution" value="1000" units="1/deg"/>
-          <inkml:channelProperty channel="OE" name="resolution" value="1000" units="1/deg"/>
-        </inkml:channelProperties>
-      </inkml:inkSource>
-      <inkml:timestamp xml:id="ts0" timeString="2025-06-10T16:08:50.568"/>
-    </inkml:context>
-    <inkml:brush xml:id="br0">
-      <inkml:brushProperty name="width" value="0.05" units="cm"/>
-      <inkml:brushProperty name="height" value="0.05" units="cm"/>
-      <inkml:brushProperty name="color" value="#E71224"/>
-    </inkml:brush>
-  </inkml:definitions>
-  <inkml:trace contextRef="#ctx0" brushRef="#br0">1236 239 3217 0 0,'-18'-44'2449'0'0,"11"24"-2251"0"0,-2 1 0 0 0,-14-27 0 0 0,19 39-210 0 0,-1 0 0 0 0,0 1-1 0 0,0 0 1 0 0,-1-1 0 0 0,0 2 0 0 0,0-1-1 0 0,0 1 1 0 0,0 0 0 0 0,-14-8-1 0 0,8 6-57 0 0,-1 1 0 0 0,1 1 1 0 0,-1 0-1 0 0,0 0 0 0 0,0 1 0 0 0,0 1 0 0 0,0 0 0 0 0,-1 1 0 0 0,-22-1 0 0 0,19 4-190 0 0,0 0-1 0 0,0 1 1 0 0,0 1-1 0 0,1 0 1 0 0,-1 1-1 0 0,1 1 1 0 0,-21 9-1 0 0,-37 17-295 0 0,-131 76-1 0 0,173-87 985 0 0,0 2 0 0 0,2 1 0 0 0,1 2 0 0 0,1 0 0 0 0,1 2 0 0 0,-28 37 0 0 0,-16 22-328 0 0,-54 78 18 0 0,113-145-112 0 0,0 0 1 0 0,2 1-1 0 0,1 0 0 0 0,0 0 0 0 0,2 1 1 0 0,0 0-1 0 0,-5 27 0 0 0,4 3 6 0 0,3 0-1 0 0,1 0 0 0 0,3 0 1 0 0,2 1-1 0 0,2-1 1 0 0,13 62-1 0 0,-11-89 37 0 0,1-1 0 0 0,2 1 0 0 0,0-1 0 0 0,1-1 0 0 0,1 0 0 0 0,2 0-1 0 0,0-1 1 0 0,1-1 0 0 0,1 0 0 0 0,1 0 0 0 0,25 25 0 0 0,-31-38 8 0 0,1 0 0 0 0,0-1 0 0 0,0 0 0 0 0,1-1-1 0 0,0 0 1 0 0,0 0 0 0 0,0-1 0 0 0,0 0 0 0 0,1-1 0 0 0,-1-1 0 0 0,1 0 0 0 0,23 1 0 0 0,0-2-27 0 0,-1-1 0 0 0,0-2 0 0 0,43-8 0 0 0,15-10 179 0 0,-1-4 0 0 0,111-46 0 0 0,-162 55-168 0 0,0 1-21 0 0,5-1 26 0 0,-2-3-1 0 0,45-23 0 0 0,-67 26 22 0 0,-1 0 0 0 0,0-2-1 0 0,-2 0 1 0 0,0-1 0 0 0,-1-1 0 0 0,0-1 0 0 0,-2 0-1 0 0,22-37 1 0 0,-28 39-39 0 0,0 1 1 0 0,-1-1-1 0 0,-1-1 0 0 0,-1 0 1 0 0,-1 1-1 0 0,0-2 0 0 0,-2 1 0 0 0,0 0 1 0 0,0-25-1 0 0,-2-13 167 0 0,-14-108-1 0 0,10 143-149 0 0,-1 0-1 0 0,0 1 1 0 0,-2-1-1 0 0,-1 1 1 0 0,-1 0-1 0 0,0 1 1 0 0,-1 0-1 0 0,-23-35 0 0 0,22 41 15 0 0,-1 0 0 0 0,0 0-1 0 0,-1 1 1 0 0,-1 0 0 0 0,0 1-1 0 0,0 1 1 0 0,-1 0 0 0 0,-1 1-1 0 0,0 0 1 0 0,0 1 0 0 0,-25-10-1 0 0,15 9-505 0 0,-1 1-1 0 0,0 2 1 0 0,0 0 0 0 0,-49-5-1 0 0,41 10-389 0 0</inkml:trace>
-</inkml:ink>
-</file>
-
-<file path=customXml/item5.xml><?xml version="1.0" encoding="utf-8"?>
 <ct:contentTypeSchema xmlns:ct="http://schemas.microsoft.com/office/2006/metadata/contentType" xmlns:ma="http://schemas.microsoft.com/office/2006/metadata/properties/metaAttributes" ct:_="" ma:_="" ma:contentTypeName="Dokument" ma:contentTypeID="0x01010025C71E9534E21E4A9F2CF33BA7DCE92D" ma:contentTypeVersion="3" ma:contentTypeDescription="Ein neues Dokument erstellen." ma:contentTypeScope="" ma:versionID="32b9bbdf2bbf4e0fb27a426421665337">
   <xsd:schema xmlns:xsd="http://www.w3.org/2001/XMLSchema" xmlns:xs="http://www.w3.org/2001/XMLSchema" xmlns:p="http://schemas.microsoft.com/office/2006/metadata/properties" xmlns:ns2="5a9e9855-01b6-487f-b294-67c59083cc31" targetNamespace="http://schemas.microsoft.com/office/2006/metadata/properties" ma:root="true" ma:fieldsID="ec87b9b32475f90c9dbf7ae918480825" ns2:_="">
     <xsd:import namespace="5a9e9855-01b6-487f-b294-67c59083cc31"/>
@@ -32325,6 +32129,128 @@
 </ct:contentTypeSchema>
 </file>
 
+<file path=customXml/item2.xml><?xml version="1.0" encoding="utf-8"?>
+<inkml:ink xmlns:inkml="http://www.w3.org/2003/InkML">
+  <inkml:definitions>
+    <inkml:context xml:id="ctx0">
+      <inkml:inkSource xml:id="inkSrc0">
+        <inkml:traceFormat>
+          <inkml:channel name="X" type="integer" min="-2.14748E9" max="2.14748E9" units="cm"/>
+          <inkml:channel name="Y" type="integer" min="-2.14748E9" max="2.14748E9" units="cm"/>
+          <inkml:channel name="F" type="integer" max="32767" units="dev"/>
+          <inkml:channel name="OA" type="integer" max="360" units="deg"/>
+          <inkml:channel name="OE" type="integer" max="90" units="deg"/>
+        </inkml:traceFormat>
+        <inkml:channelProperties>
+          <inkml:channelProperty channel="X" name="resolution" value="1000" units="1/cm"/>
+          <inkml:channelProperty channel="Y" name="resolution" value="1000" units="1/cm"/>
+          <inkml:channelProperty channel="F" name="resolution" value="0" units="1/dev"/>
+          <inkml:channelProperty channel="OA" name="resolution" value="1000" units="1/deg"/>
+          <inkml:channelProperty channel="OE" name="resolution" value="1000" units="1/deg"/>
+        </inkml:channelProperties>
+      </inkml:inkSource>
+      <inkml:timestamp xml:id="ts0" timeString="2025-06-10T16:08:54.030"/>
+    </inkml:context>
+    <inkml:brush xml:id="br0">
+      <inkml:brushProperty name="width" value="0.05" units="cm"/>
+      <inkml:brushProperty name="height" value="0.05" units="cm"/>
+      <inkml:brushProperty name="color" value="#E71224"/>
+    </inkml:brush>
+  </inkml:definitions>
+  <inkml:trace contextRef="#ctx0" brushRef="#br0">5 208 2425 0 0,'0'0'5878'0'0,"24"0"-3468"0"0,-17 1-2405 0 0,0 0 1 0 0,0 0-1 0 0,0 0 0 0 0,0 1 1 0 0,0 0-1 0 0,11 5 0 0 0,-9-5 40 0 0,0 0-1 0 0,0 0 0 0 0,0-1 0 0 0,1 0 1 0 0,-1 0-1 0 0,0-1 0 0 0,17-3 1 0 0,4 2 74 0 0,-22 1-105 0 0,1-1 1 0 0,0 2-1 0 0,-1-1 0 0 0,1 1 1 0 0,-1 0-1 0 0,1 1 1 0 0,-1 0-1 0 0,1 0 1 0 0,-1 1-1 0 0,14 7 0 0 0,-22-10-10 0 0,1 0 1 0 0,0 1-1 0 0,-1-1 0 0 0,1 1 0 0 0,0-1 0 0 0,-1 1 0 0 0,1-1 0 0 0,0 1 0 0 0,-1 0 0 0 0,1-1 0 0 0,-1 1 0 0 0,1 0 0 0 0,-1-1 0 0 0,0 1 0 0 0,1 0 0 0 0,-1 0 0 0 0,0-1 0 0 0,1 1 0 0 0,-1 0 0 0 0,0 0 0 0 0,0 0 0 0 0,0-1 0 0 0,0 1 0 0 0,0 0 1 0 0,0 0-1 0 0,0 0 0 0 0,0 0 0 0 0,0-1 0 0 0,0 1 0 0 0,0 0 0 0 0,0 0 0 0 0,-1 0 0 0 0,1-1 0 0 0,0 1 0 0 0,-1 0 0 0 0,1 0 0 0 0,0-1 0 0 0,-1 1 0 0 0,1 0 0 0 0,-2 0 0 0 0,-2 4 13 0 0,0-1 0 0 0,-1 1 0 0 0,0-1 0 0 0,-10 6 0 0 0,-6 7-17 0 0,-52 46-71 0 0,46-41 27 0 0,-30 31 0 0 0,55-51 44 0 0,1 0 0 0 0,-1 0 0 0 0,0 0 0 0 0,1 0-1 0 0,-1 0 1 0 0,1 0 0 0 0,0 0 0 0 0,0 0 0 0 0,-1 1-1 0 0,1-1 1 0 0,1 0 0 0 0,-1 1 0 0 0,0-1 0 0 0,1 1-1 0 0,-1-1 1 0 0,1 1 0 0 0,0-1 0 0 0,0 5-1 0 0,0-6 1 0 0,1 1 0 0 0,0-1 0 0 0,-1 1 0 0 0,1-1 0 0 0,0 1 0 0 0,0-1 0 0 0,0 0-1 0 0,0 1 1 0 0,0-1 0 0 0,0 0 0 0 0,0 0 0 0 0,0 0 0 0 0,1 0 0 0 0,-1 0-1 0 0,0 0 1 0 0,1 0 0 0 0,-1 0 0 0 0,1 0 0 0 0,-1-1 0 0 0,1 1 0 0 0,-1-1 0 0 0,1 1-1 0 0,-1-1 1 0 0,1 1 0 0 0,0-1 0 0 0,-1 0 0 0 0,1 0 0 0 0,-1 0 0 0 0,3 0-1 0 0,29 4-18 0 0,-11-1-40 0 0,-1-1 0 0 0,25-2 0 0 0,-39 0 42 0 0,1-1-1 0 0,0 0 1 0 0,0 0-1 0 0,-1-1 1 0 0,1 0-1 0 0,-1-1 1 0 0,0 0 0 0 0,0 0-1 0 0,12-7 1 0 0,29-13-1642 0 0,-12 16-3216 0 0,-30 7 3490 0 0</inkml:trace>
+  <inkml:trace contextRef="#ctx0" brushRef="#br0" timeOffset="537.36">1 353 3761 0 0,'14'-4'313'0'0,"1"1"1"0"0,0 1 0 0 0,0 0-1 0 0,0 1 1 0 0,1 1 0 0 0,-1 0-1 0 0,0 1 1 0 0,0 0 0 0 0,0 2-1 0 0,0-1 1 0 0,-1 2 0 0 0,1 0-1 0 0,-1 1 1 0 0,1 0 0 0 0,13 8-1 0 0,-21-9-404 0 0,1-2 0 0 0,0 1 0 0 0,0-1 0 0 0,0 0-1 0 0,0-1 1 0 0,0 0 0 0 0,0 0 0 0 0,1 0 0 0 0,-1-1 0 0 0,0-1-1 0 0,0 1 1 0 0,1-2 0 0 0,-1 1 0 0 0,0-1 0 0 0,0 0 0 0 0,9-4 0 0 0,-11 5-498 0 0</inkml:trace>
+  <inkml:trace contextRef="#ctx0" brushRef="#br0" timeOffset="1907.49">580 318 4417 0 0,'0'0'535'0'0,"25"18"674"0"0,-15-14-1066 0 0,1 0-1 0 0,0-1 0 0 0,-1 0 0 0 0,1-1 1 0 0,17 2-1 0 0,-15-3-53 0 0,0-1 1 0 0,0 0-1 0 0,19-4 1 0 0,-28 4-78 0 0,0-1 0 0 0,-1 1 0 0 0,1-1 1 0 0,-1 0-1 0 0,1-1 0 0 0,-1 1 0 0 0,1 0 1 0 0,-1-1-1 0 0,0 0 0 0 0,0 0 1 0 0,0 0-1 0 0,0 0 0 0 0,0 0 0 0 0,0-1 1 0 0,-1 1-1 0 0,1-1 0 0 0,2-4 1 0 0,-4 5-7 0 0,0 0 0 0 0,0 0 0 0 0,-1 0 0 0 0,1 0 0 0 0,-1 0 1 0 0,0 0-1 0 0,1 0 0 0 0,-1 0 0 0 0,0 0 0 0 0,0 0 1 0 0,0 0-1 0 0,-1 0 0 0 0,1 0 0 0 0,0 0 0 0 0,-1 0 0 0 0,1 0 1 0 0,-1 0-1 0 0,0 0 0 0 0,-1-3 0 0 0,2 4-6 0 0,-1 0-1 0 0,0-1 1 0 0,0 1-1 0 0,0 0 1 0 0,1 0 0 0 0,-1 0-1 0 0,0 0 1 0 0,-1 0-1 0 0,1 0 1 0 0,0 0 0 0 0,0 0-1 0 0,0 0 1 0 0,0 1-1 0 0,-1-1 1 0 0,1 0-1 0 0,0 1 1 0 0,-1-1 0 0 0,1 1-1 0 0,0-1 1 0 0,-1 1-1 0 0,1 0 1 0 0,-1 0 0 0 0,1-1-1 0 0,0 1 1 0 0,-1 0-1 0 0,1 0 1 0 0,-1 0-1 0 0,1 1 1 0 0,-1-1 0 0 0,1 0-1 0 0,-1 0 1 0 0,1 1-1 0 0,-2 0 1 0 0,-13 4-18 0 0,0 1 0 0 0,0 1 1 0 0,0 0-1 0 0,1 1 0 0 0,-16 12 0 0 0,26-16 81 0 0,-1 0 0 0 0,2 0 0 0 0,-1 0 0 0 0,0 1 0 0 0,1 0 1 0 0,0 0-1 0 0,0 0 0 0 0,1 0 0 0 0,-1 0 0 0 0,1 1 0 0 0,0 0 0 0 0,1 0 0 0 0,-1 0 0 0 0,1 0 0 0 0,0 0 0 0 0,1 0 0 0 0,-2 9 0 0 0,3-10-43 0 0,-1-1 0 0 0,2 1 0 0 0,-1-1 0 0 0,0 1 0 0 0,1-1 0 0 0,0 1-1 0 0,0-1 1 0 0,0 0 0 0 0,1 1 0 0 0,-1-1 0 0 0,1 0 0 0 0,0 0 0 0 0,0 0 0 0 0,4 5 0 0 0,-1-3-13 0 0,0 1-1 0 0,0-1 1 0 0,1 0 0 0 0,0 0 0 0 0,0-1 0 0 0,1 0 0 0 0,11 8 0 0 0,-10-9 30 0 0,-1 1 0 0 0,0-1 0 0 0,1-1 0 0 0,0 0 0 0 0,-1 0 1 0 0,1 0-1 0 0,1-1 0 0 0,-1 0 0 0 0,0-1 0 0 0,0 1 0 0 0,1-2 0 0 0,-1 1 0 0 0,1-1 0 0 0,-1-1 0 0 0,0 1 0 0 0,14-4 0 0 0,-13 1 19 0 0,0 0 0 0 0,0 0-1 0 0,-1-1 1 0 0,1-1 0 0 0,-1 1-1 0 0,0-1 1 0 0,0-1 0 0 0,0 0-1 0 0,-1 0 1 0 0,0 0 0 0 0,0-1-1 0 0,-1 0 1 0 0,1 0-1 0 0,-1-1 1 0 0,-1 1 0 0 0,0-1-1 0 0,0-1 1 0 0,0 1 0 0 0,-1-1-1 0 0,-1 1 1 0 0,6-18 0 0 0,3-2 566 0 0,-23 48-322 0 0,9-18-301 0 0,1 1 0 0 0,0 0 1 0 0,-1 0-1 0 0,1-1 0 0 0,0 1 0 0 0,0 0 1 0 0,1 0-1 0 0,-1 0 0 0 0,1 0 0 0 0,-1 0 1 0 0,1 0-1 0 0,0 0 0 0 0,0 0 0 0 0,1 5 1 0 0,-1-8 0 0 0,0-1 0 0 0,0 1 0 0 0,0 0 0 0 0,0 0 0 0 0,0 0 0 0 0,0 0 0 0 0,-1 0 0 0 0,1 0 0 0 0,0 0 0 0 0,0 0 0 0 0,0 0-1 0 0,0 0 1 0 0,0 0 0 0 0,0 0 0 0 0,0 0 0 0 0,0 0 0 0 0,0 0 0 0 0,0 0 0 0 0,0 0 0 0 0,0 0 0 0 0,0 0 0 0 0,0 0 0 0 0,0 0 0 0 0,0 0 0 0 0,0 0 0 0 0,0 0 0 0 0,-1 0 0 0 0,1 0 0 0 0,0 0 0 0 0,0 0 0 0 0,0 0 0 0 0,0 0 0 0 0,0 0 0 0 0,0 0 0 0 0,9 36 2 0 0,-9-36 0 0 0,0 1 0 0 0,0 0 0 0 0,0-1-1 0 0,0 1 1 0 0,0-1 0 0 0,1 1 0 0 0,-1 0 0 0 0,0-1 0 0 0,0 1 0 0 0,0-1 0 0 0,1 1-1 0 0,-1-1 1 0 0,0 1 0 0 0,0-1 0 0 0,1 1 0 0 0,-1-1 0 0 0,0 1 0 0 0,1-1 0 0 0,-1 1-1 0 0,1-1 1 0 0,-1 1 0 0 0,1-1 0 0 0,-1 0 0 0 0,1 1 0 0 0,-1-1 0 0 0,1 0 0 0 0,-1 0-1 0 0,1 1 1 0 0,-1-1 0 0 0,1 0 0 0 0,-1 0 0 0 0,2 1 0 0 0,5 1 24 0 0,-1 1-15 0 0,-4-1-3 0 0,0-1 0 0 0,0 0-1 0 0,0 0 1 0 0,0 0-1 0 0,0 0 1 0 0,0-1 0 0 0,0 1-1 0 0,0 0 1 0 0,0-1-1 0 0,0 0 1 0 0,4 1 0 0 0,-2-1 6 0 0,-1-1 1 0 0,1 0 0 0 0,-1 1 0 0 0,1-1 0 0 0,-1-1-1 0 0,0 1 1 0 0,1 0 0 0 0,-1-1 0 0 0,0 0 0 0 0,0 0 0 0 0,0 1-1 0 0,0-2 1 0 0,0 1 0 0 0,0 0 0 0 0,-1-1 0 0 0,1 1-1 0 0,3-6 1 0 0,2-3 48 0 0,0 0 0 0 0,-1 0-1 0 0,9-18 1 0 0,-15 28-59 0 0,-1 1 0 0 0,0 0 0 0 0,1 0 0 0 0,-1 0 0 0 0,0-1 0 0 0,1 1 0 0 0,-1 0-1 0 0,0 0 1 0 0,1 0 0 0 0,-1 0 0 0 0,1 0 0 0 0,-1 0 0 0 0,0 0 0 0 0,1 0 0 0 0,-1 0 0 0 0,1 0 0 0 0,-1 0 0 0 0,0 0 0 0 0,1 0 0 0 0,-1 0 0 0 0,0 0 0 0 0,1 0-1 0 0,-1 0 1 0 0,1 0 0 0 0,-1 1 0 0 0,0-1 0 0 0,1 0 0 0 0,-1 0 0 0 0,0 0 0 0 0,1 1 0 0 0,-1-1 0 0 0,1 1 0 0 0,15 10 220 0 0,-11-8-150 0 0,16 12 108 0 0,-20-14-176 0 0,1 0 0 0 0,-1 0 0 0 0,1 1 0 0 0,0-1 0 0 0,-1 0 0 0 0,1 0 0 0 0,0-1 0 0 0,0 1 1 0 0,-1 0-1 0 0,1 0 0 0 0,3 0 0 0 0,14 9 241 0 0,-16-8-777 0 0,0 1 0 0 0,0-1 1 0 0,0 0-1 0 0,1-1 1 0 0,-1 1-1 0 0,0-1 0 0 0,7 3 1 0 0,16 2-598 0 0,-20-4-110 0 0</inkml:trace>
+  <inkml:trace contextRef="#ctx0" brushRef="#br0" timeOffset="2280.99">1565 26 4089 0 0,'0'0'1209'0'0,"0"0"-1132"0"0,0 0-1 0 0,0 0 1 0 0,0-1-1 0 0,0 1 1 0 0,0 0 0 0 0,0 0-1 0 0,0 0 1 0 0,0 0-1 0 0,0-1 1 0 0,0 1-1 0 0,0 0 1 0 0,0 0-1 0 0,0 0 1 0 0,0 0-1 0 0,0 0 1 0 0,0-1-1 0 0,0 1 1 0 0,-1 0-1 0 0,1 0 1 0 0,0 0-1 0 0,0 0 1 0 0,0 0-1 0 0,0 0 1 0 0,0 0-1 0 0,0-1 1 0 0,0 1-1 0 0,0 0 1 0 0,-1 0-1 0 0,1 0 1 0 0,0 0-1 0 0,0 0 1 0 0,0 0-1 0 0,0 0 1 0 0,0 0-1 0 0,-1 0 1 0 0,1 0-1 0 0,0 0 1 0 0,0 0-1 0 0,0 0 1 0 0,0 0-1 0 0,0 0 1 0 0,-1 0-1 0 0,1 0 1 0 0,0 0-1 0 0,0 0 1 0 0,0 0-1 0 0,0 0 1 0 0,0 0-1 0 0,-1 0 1 0 0,1 0-1 0 0,0 0 1 0 0,0 0-1 0 0,0 0 1 0 0,0 0-1 0 0,0 0 1 0 0,-1 0-1 0 0,-1 5-10 0 0,-1 0-1 0 0,1 1 0 0 0,0-1 1 0 0,1 0-1 0 0,-1 0 1 0 0,1 1-1 0 0,0-1 0 0 0,1 1 1 0 0,-1-1-1 0 0,1 7 0 0 0,3 67 129 0 0,-2-49-157 0 0,4 73-83 0 0,21 127 0 0 0,-23-221-74 0 0,0 3-3773 0 0</inkml:trace>
+  <inkml:trace contextRef="#ctx0" brushRef="#br0" timeOffset="2798.33">1444 424 2192 0 0,'0'0'112'0'0,"-1"0"0"0"0,1 0 0 0 0,0-1-1 0 0,-1 1 1 0 0,1 0 0 0 0,0 0 0 0 0,0-1-1 0 0,-1 1 1 0 0,1 0 0 0 0,0-1 0 0 0,0 1-1 0 0,-1 0 1 0 0,1-1 0 0 0,0 1-1 0 0,0 0 1 0 0,0-1 0 0 0,0 1 0 0 0,-1-1-1 0 0,1 1 1 0 0,0 0 0 0 0,0-1 0 0 0,0 1-1 0 0,0-1 1 0 0,0 1 0 0 0,0-1 0 0 0,0 1-1 0 0,0 0 1 0 0,0-1 0 0 0,0 1-1 0 0,0-1 1 0 0,1 1 0 0 0,-1 0 0 0 0,0-1-1 0 0,0 1 1 0 0,0-1 0 0 0,0 1 0 0 0,1 0-1 0 0,-1-1 1 0 0,0 1 0 0 0,0 0 0 0 0,1-1-1 0 0,-1 1 1 0 0,0 0 0 0 0,1 0-1 0 0,-1-1 1 0 0,12-18 1969 0 0,25-6-1791 0 0,-37 24-276 0 0,0 1-1 0 0,0 0 0 0 0,1-1 0 0 0,-1 1 0 0 0,0 0 0 0 0,1-1 0 0 0,-1 1 0 0 0,0 0 1 0 0,1-1-1 0 0,-1 1 0 0 0,1 0 0 0 0,-1 0 0 0 0,1-1 0 0 0,-1 1 0 0 0,0 0 0 0 0,1 0 1 0 0,-1 0-1 0 0,1 0 0 0 0,-1 0 0 0 0,1-1 0 0 0,-1 1 0 0 0,1 0 0 0 0,-1 0 0 0 0,1 0 1 0 0,-1 0-1 0 0,1 0 0 0 0,-1 1 0 0 0,1-1 0 0 0,-1 0 0 0 0,1 0 0 0 0,-1 0 0 0 0,1 0 1 0 0,-1 0-1 0 0,0 1 0 0 0,1-1 0 0 0,-1 0 0 0 0,1 0 0 0 0,-1 1 0 0 0,0-1 0 0 0,1 0 1 0 0,-1 1-1 0 0,0-1 0 0 0,1 1 0 0 0,6 5 43 0 0,3 2-14 0 0,1-1 0 0 0,-1 0 1 0 0,1-1-1 0 0,19 8 0 0 0,-26-13-198 0 0,0 0 1 0 0,0 1-1 0 0,0-2 1 0 0,0 1-1 0 0,0 0 0 0 0,0-1 1 0 0,0 0-1 0 0,0 0 1 0 0,0 0-1 0 0,1 0 1 0 0,-1-1-1 0 0,0 1 0 0 0,0-1 1 0 0,0 0-1 0 0,0-1 1 0 0,0 1-1 0 0,0-1 0 0 0,-1 1 1 0 0,8-5-1 0 0,5-6-909 0 0,-7 6 943 0 0</inkml:trace>
+  <inkml:trace contextRef="#ctx0" brushRef="#br0" timeOffset="3356.09">1840 346 3401 0 0,'0'0'3806'0'0,"-2"3"-3743"0"0,-1 3-50 0 0,0 1 0 0 0,0-1 0 0 0,0 1 0 0 0,0 0 0 0 0,1 0 0 0 0,1 0 0 0 0,-1 0 0 0 0,1 0 0 0 0,-1 12 1 0 0,2-14-7 0 0,-1 0 0 0 0,1 0 0 0 0,0 0 0 0 0,0 1 0 0 0,1-1 0 0 0,-1 0 0 0 0,1 0 0 0 0,1 0 0 0 0,-1 0 0 0 0,1 0 0 0 0,-1 0 0 0 0,1 0 0 0 0,1-1 0 0 0,4 9 0 0 0,-6-11 12 0 0,1 0 0 0 0,0-1 0 0 0,-1 1 0 0 0,1-1 0 0 0,0 1 0 0 0,0-1 1 0 0,0 0-1 0 0,-1 0 0 0 0,1 0 0 0 0,0 0 0 0 0,1 0 0 0 0,-1 0 0 0 0,0 0 1 0 0,0-1-1 0 0,0 1 0 0 0,0-1 0 0 0,1 0 0 0 0,-1 0 0 0 0,5 0 642 0 0,-10-26 1203 0 0,4 24-1851 0 0,-1 0-1 0 0,0 0 0 0 0,-1 0 1 0 0,1 0-1 0 0,0 0 1 0 0,0 0-1 0 0,-1 0 1 0 0,1 0-1 0 0,-1 0 0 0 0,0 1 1 0 0,0-1-1 0 0,-1-3 1 0 0,-2 0 71 0 0,0 0 1 0 0,-1 0 0 0 0,1 0 0 0 0,-1 1 0 0 0,0 0 0 0 0,0 0 0 0 0,-7-5 0 0 0,6 6-43 0 0,0-3 62 0 0,7 2-115 0 0,1 1 0 0 0,0-1 0 0 0,0 1 0 0 0,0 0 0 0 0,0-1 0 0 0,0 1 0 0 0,1 0-1 0 0,0 1 1 0 0,-1-1 0 0 0,1 0 0 0 0,0 1 0 0 0,0-1 0 0 0,1 1 0 0 0,-1 0 0 0 0,4-2 0 0 0,7-2-23 0 0,0 0 1 0 0,0 1-1 0 0,1 0 1 0 0,-1 2 0 0 0,1-1-1 0 0,18 0 1 0 0,41-12-3622 0 0,-67 15 2699 0 0,-1 1-138 0 0</inkml:trace>
+  <inkml:trace contextRef="#ctx0" brushRef="#br0" timeOffset="3740.67">2229 335 4217 0 0,'0'0'95'0'0,"0"-1"-1"0"0,0 1 1 0 0,0 0 0 0 0,0-1 0 0 0,1 1-1 0 0,-1 0 1 0 0,0 0 0 0 0,0-1-1 0 0,0 1 1 0 0,0 0 0 0 0,1-1 0 0 0,-1 1-1 0 0,0 0 1 0 0,0 0 0 0 0,1-1 0 0 0,-1 1-1 0 0,0 0 1 0 0,0 0 0 0 0,1 0-1 0 0,-1 0 1 0 0,0-1 0 0 0,1 1 0 0 0,-1 0-1 0 0,0 0 1 0 0,1 0 0 0 0,-1 0 0 0 0,0 0-1 0 0,1 0 1 0 0,-1 0 0 0 0,0 0-1 0 0,1 0 1 0 0,-1 0 0 0 0,0 0 0 0 0,1 0-1 0 0,0 0 1 0 0,8 10 1419 0 0,2 19-612 0 0,-8 20-538 0 0,-3-42-416 0 0,0 0 0 0 0,0 0 0 0 0,0-1 0 0 0,1 1 0 0 0,0 0 0 0 0,0 0 0 0 0,1-1 0 0 0,0 1 0 0 0,0-1 0 0 0,0 0 0 0 0,1 1 0 0 0,0-1 0 0 0,0 0 0 0 0,5 7 0 0 0,-6-10-558 0 0,1 1-319 0 0</inkml:trace>
+  <inkml:trace contextRef="#ctx0" brushRef="#br0" timeOffset="3921.31">2292 212 3929 0 0,'-1'-2'370'0'0,"0"0"1"0"0,0 0-1 0 0,0 0 0 0 0,0 0 1 0 0,0 0-1 0 0,1 0 1 0 0,-1 0-1 0 0,1 0 1 0 0,0-1-1 0 0,-1 1 0 0 0,1-4 1 0 0,0 6-415 0 0</inkml:trace>
+  <inkml:trace contextRef="#ctx0" brushRef="#br0" timeOffset="5174.93">2503 367 1624 0 0,'0'0'4464'0'0,"2"2"-4200"0"0,1 0-1 0 0,-1 0 1 0 0,0 0-1 0 0,1 0 1 0 0,-1-1 0 0 0,1 1-1 0 0,0-1 1 0 0,5 2-1 0 0,-3-1-237 0 0,1-1-1 0 0,0 1 0 0 0,0-2 0 0 0,0 1 0 0 0,0-1 0 0 0,0 0 0 0 0,1 0 0 0 0,-1 0 0 0 0,0-1 0 0 0,0 0 0 0 0,0 0 0 0 0,9-4 0 0 0,-9 2-2 0 0,1 0-1 0 0,-1-1 1 0 0,0 0 0 0 0,0 0 0 0 0,9-9-1 0 0,-14 12-17 0 0,0-1 0 0 0,1 1-1 0 0,-1 0 1 0 0,0-1-1 0 0,0 1 1 0 0,0 0-1 0 0,-1-1 1 0 0,1 0-1 0 0,0 1 1 0 0,0-1 0 0 0,-1 1-1 0 0,1-1 1 0 0,-1 0-1 0 0,1 1 1 0 0,-1-1-1 0 0,0 0 1 0 0,0 1 0 0 0,0-1-1 0 0,0 0 1 0 0,0 0-1 0 0,0 1 1 0 0,0-1-1 0 0,-1 0 1 0 0,1 1-1 0 0,0-1 1 0 0,-1 0 0 0 0,1 1-1 0 0,-1-1 1 0 0,-1-2-1 0 0,1 2-3 0 0,-1 1 0 0 0,1-1 0 0 0,0 1 0 0 0,0 0 0 0 0,-1 0 0 0 0,1-1 0 0 0,-1 1 0 0 0,1 0 0 0 0,-1 0 0 0 0,0 0 0 0 0,1 1 0 0 0,-1-1 0 0 0,0 0 0 0 0,1 1-1 0 0,-1-1 1 0 0,0 1 0 0 0,0-1 0 0 0,0 1 0 0 0,1 0 0 0 0,-1 0 0 0 0,0 0 0 0 0,0 0 0 0 0,0 0 0 0 0,0 0 0 0 0,1 0 0 0 0,-1 1 0 0 0,0-1 0 0 0,0 1 0 0 0,0-1 0 0 0,1 1 0 0 0,-4 1 0 0 0,0 0 3 0 0,0 0 1 0 0,0 1 0 0 0,0 0-1 0 0,0-1 1 0 0,0 1 0 0 0,0 1-1 0 0,1-1 1 0 0,0 1 0 0 0,-5 5 0 0 0,-11 12 13 0 0,18-19 18 0 0,0 0-1 0 0,0 0 0 0 0,0-1 1 0 0,0 2-1 0 0,0-1 1 0 0,1 0-1 0 0,-1 0 1 0 0,1 1-1 0 0,-1-1 1 0 0,1 0-1 0 0,0 1 1 0 0,0-1-1 0 0,0 1 1 0 0,0 0-1 0 0,0-1 0 0 0,1 1 1 0 0,-1 0-1 0 0,1 0 1 0 0,0-1-1 0 0,0 1 1 0 0,0 0-1 0 0,0 0 1 0 0,1 4-1 0 0,-1-3-8 0 0,0 0-1 0 0,1 0 1 0 0,0 0 0 0 0,0 0-1 0 0,0 0 1 0 0,0 0-1 0 0,1 0 1 0 0,-1 0 0 0 0,1-1-1 0 0,0 1 1 0 0,0-1 0 0 0,1 1-1 0 0,-1-1 1 0 0,0 0-1 0 0,1 0 1 0 0,0 0 0 0 0,0 0-1 0 0,0 0 1 0 0,0-1 0 0 0,0 1-1 0 0,1-1 1 0 0,-1 0-1 0 0,1 0 1 0 0,0 0 0 0 0,4 1-1 0 0,1 2-24 0 0,0-1 1 0 0,0 0-1 0 0,1 0 0 0 0,-1-1 0 0 0,1 0 0 0 0,0-1 0 0 0,0 0 0 0 0,0-1 1 0 0,0 0-1 0 0,0 0 0 0 0,0-1 0 0 0,0-1 0 0 0,0 1 0 0 0,0-2 1 0 0,0 1-1 0 0,0-2 0 0 0,14-4 0 0 0,-22 7 6 0 0,-1-1 1 0 0,1 0-1 0 0,-1 1 1 0 0,1-1-1 0 0,-1 0 1 0 0,0 0-1 0 0,1 0 1 0 0,-1 0-1 0 0,0 0 0 0 0,1-1 1 0 0,-1 1-1 0 0,0 0 1 0 0,0-1-1 0 0,0 1 1 0 0,0 0-1 0 0,-1-1 1 0 0,1 1-1 0 0,0-1 0 0 0,0 0 1 0 0,-1 1-1 0 0,1-1 1 0 0,-1 1-1 0 0,0-1 1 0 0,1 0-1 0 0,-1 0 1 0 0,0 1-1 0 0,0-1 0 0 0,0 0 1 0 0,0 1-1 0 0,0-1 1 0 0,-1 0-1 0 0,1 1 1 0 0,0-1-1 0 0,-1 0 1 0 0,1 1-1 0 0,-1-1 0 0 0,0 1 1 0 0,1-1-1 0 0,-1 1 1 0 0,0-1-1 0 0,0 1 1 0 0,0-1-1 0 0,0 1 1 0 0,0 0-1 0 0,0-1 0 0 0,0 1 1 0 0,-1 0-1 0 0,1 0 1 0 0,0 0-1 0 0,-2-1 1 0 0,2 1 18 0 0,0 0 0 0 0,0 0 0 0 0,1 0 0 0 0,-1 0 0 0 0,0-1 0 0 0,1 1 0 0 0,-1 0-1 0 0,1 0 1 0 0,0 0 0 0 0,-1-1 0 0 0,1 1 0 0 0,0 0 0 0 0,0-1 0 0 0,0 1 0 0 0,0 0 0 0 0,0 0 0 0 0,0-1 0 0 0,0 1 0 0 0,0 0 0 0 0,1-1 0 0 0,-1 1 0 0 0,0 0 0 0 0,1 0 0 0 0,-1-1 0 0 0,1 1 0 0 0,-1 0 0 0 0,1 0 0 0 0,0 0 0 0 0,-1 0 0 0 0,1 0 0 0 0,0 0 0 0 0,0 0 0 0 0,0 0 0 0 0,0 0 0 0 0,2-1 0 0 0,-1 0-47 0 0,1 1 0 0 0,-1 1 0 0 0,1-1 1 0 0,-1 0-1 0 0,1 0 0 0 0,-1 1 1 0 0,1 0-1 0 0,0-1 0 0 0,-1 1 0 0 0,1 0 1 0 0,0 0-1 0 0,-1 1 0 0 0,1-1 1 0 0,-1 0-1 0 0,1 1 0 0 0,0-1 0 0 0,-1 1 1 0 0,1 0-1 0 0,-1 0 0 0 0,0 0 1 0 0,1 0-1 0 0,3 3 0 0 0,-2-2-109 0 0,1 0 0 0 0,0 0 0 0 0,-1-1 0 0 0,1 1 0 0 0,0-1-1 0 0,0 0 1 0 0,0-1 0 0 0,0 1 0 0 0,0-1 0 0 0,0 0 0 0 0,5-1 0 0 0,33-9-4310 0 0,-35 8 3159 0 0</inkml:trace>
+  <inkml:trace contextRef="#ctx0" brushRef="#br0" timeOffset="5981.97">3170 36 5377 0 0,'-8'-3'4857'0'0,"-2"11"-3287"0"0,1 14-1849 0 0,7 12 244 0 0,1 0 0 0 0,2-1 0 0 0,1 1 0 0 0,1 0 0 0 0,2-1 0 0 0,2 0 0 0 0,0 0 0 0 0,3 0-1 0 0,15 36 1 0 0,-23-57-192 0 0,-11-19-139 0 0,-8-7 219 0 0,-11-8 149 0 0,22 18 3 0 0,3 2-2 0 0,-4 2 7 0 0,-2-3 1 0 0,0 1 0 0 0,1 0 0 0 0,-1 1 0 0 0,0 0 0 0 0,0 0 0 0 0,0 1 0 0 0,0 0 0 0 0,0 1 0 0 0,-10 1 0 0 0,19-1 402 0 0,7-2 74 0 0,26 0-139 0 0,33-7 1 0 0,-56 6-838 0 0,-1 0 0 0 0,1 0 0 0 0,0-1 0 0 0,-1-1 0 0 0,1 0-1 0 0,-1 0 1 0 0,0 0 0 0 0,9-7 0 0 0,-11 6 249 0 0,0 0-326 0 0</inkml:trace>
+  <inkml:trace contextRef="#ctx0" brushRef="#br0" timeOffset="6556.61">3575 1 1816 0 0,'0'0'7770'0'0,"0"11"-6007"0"0,1 12-1488 0 0,0 0 0 0 0,-5 38 0 0 0,1-35-254 0 0,2 0-1 0 0,2 36 1 0 0,3 13-82 0 0,-5-56 3 0 0,2 0 0 0 0,0-1 1 0 0,1 1-1 0 0,1 0 0 0 0,1-1 1 0 0,0 1-1 0 0,9 19 0 0 0,-8-28-191 0 0,3 5-356 0 0,-6-8-3797 0 0</inkml:trace>
+  <inkml:trace contextRef="#ctx0" brushRef="#br0" timeOffset="7116.94">3726 736 1048 0 0,'0'0'150'0'0,"-18"-13"6504"0"0,-10 9-6188 0 0,21 2-374 0 0,0 0 173 0 0,-6 8 1065 0 0,3-1-1239 0 0,0 1 0 0 0,1 0 0 0 0,0 1 0 0 0,0 0 0 0 0,0 0 0 0 0,1 1-1 0 0,0 0 1 0 0,0 0 0 0 0,-10 16 0 0 0,18-23-89 0 0,-1-1 0 0 0,1 1 0 0 0,0-1 0 0 0,0 0 0 0 0,-1 1 0 0 0,1-1-1 0 0,0 1 1 0 0,0 0 0 0 0,0-1 0 0 0,-1 1 0 0 0,1-1 0 0 0,0 1 0 0 0,0-1 0 0 0,0 1 0 0 0,0-1-1 0 0,0 1 1 0 0,0-1 0 0 0,0 1 0 0 0,0 0 0 0 0,0-1 0 0 0,0 1 0 0 0,1-1 0 0 0,-1 1-1 0 0,0-1 1 0 0,0 1 0 0 0,0-1 0 0 0,1 1 0 0 0,-1-1 0 0 0,0 1 0 0 0,1 0 0 0 0,16 2 129 0 0,20-11 87 0 0,-36 8-216 0 0,5-3 27 0 0,0 1 1 0 0,0-1-1 0 0,0 0 1 0 0,-1-1-1 0 0,1 1 0 0 0,8-8 1 0 0,-12 9-11 0 0,0 1 1 0 0,0-1-1 0 0,0 0 1 0 0,-1 1-1 0 0,1-1 1 0 0,0 0 0 0 0,-1 0-1 0 0,0 0 1 0 0,1 0-1 0 0,-1 0 1 0 0,0-1-1 0 0,0 1 1 0 0,0 0-1 0 0,0-1 1 0 0,0 1-1 0 0,-1 0 1 0 0,1-1-1 0 0,-1 1 1 0 0,1-1-1 0 0,-1-3 1 0 0,0 6-11 0 0,0 0 0 0 0,0-1 0 0 0,-1 1 1 0 0,1 0-1 0 0,0-1 0 0 0,0 1 0 0 0,0 0 0 0 0,0-1 0 0 0,0 1 1 0 0,-1 0-1 0 0,1-1 0 0 0,0 1 0 0 0,0 0 0 0 0,-1 0 1 0 0,1-1-1 0 0,0 1 0 0 0,0 0 0 0 0,-1 0 0 0 0,1 0 0 0 0,0-1 1 0 0,-1 1-1 0 0,1 0 0 0 0,0 0 0 0 0,-1 0 0 0 0,1 0 0 0 0,0 0 1 0 0,-1 0-1 0 0,1 0 0 0 0,0 0 0 0 0,-1-1 0 0 0,1 1 1 0 0,0 0-1 0 0,-1 0 0 0 0,1 1 0 0 0,0-1 0 0 0,-1 0 0 0 0,1 0 1 0 0,0 0-1 0 0,-1 0 0 0 0,1 0 0 0 0,-23 9 22 0 0,-11 6-42 0 0,33-14 7 0 0,3-1-1 0 0,-4 4-43 0 0,1-4 48 0 0,1 1 0 0 0,0-1 1 0 0,-1 0-1 0 0,1 0 0 0 0,0 1 0 0 0,0-1 0 0 0,-1 0 1 0 0,1 1-1 0 0,0-1 0 0 0,0 0 0 0 0,-1 1 0 0 0,1-1 1 0 0,0 0-1 0 0,0 1 0 0 0,0-1 0 0 0,0 0 0 0 0,-1 1 0 0 0,1-1 1 0 0,0 1-1 0 0,0-1 0 0 0,0 0 0 0 0,0 1 0 0 0,0-1 1 0 0,0 1-1 0 0,0-1 0 0 0,0 1 0 0 0,0-1 0 0 0,0 0 0 0 0,0 1 1 0 0,0-1-1 0 0,1 1 0 0 0,-1-1 0 0 0,0 0 0 0 0,0 1 1 0 0,0-1-1 0 0,1 0 0 0 0,-1 1 0 0 0,0-1 0 0 0,0 0 1 0 0,1 1-1 0 0,-1-1 0 0 0,0 0 0 0 0,0 1 0 0 0,1-1 0 0 0,-1 0 1 0 0,0 0-1 0 0,1 1 0 0 0,-1-1 0 0 0,0 0 0 0 0,1 0 1 0 0,-1 0-1 0 0,1 0 0 0 0,-1 0 0 0 0,0 1 0 0 0,1-1 1 0 0,-1 0-1 0 0,1 0 0 0 0,-1 0 0 0 0,0 0 0 0 0,1 0 0 0 0,0 0 1 0 0,2 0 3 0 0,0 0 1 0 0,-1 0-1 0 0,1 0 1 0 0,0 0-1 0 0,0-1 1 0 0,-1 1-1 0 0,1-1 1 0 0,0 0-1 0 0,-1 1 1 0 0,1-1-1 0 0,-1-1 1 0 0,1 1-1 0 0,-1 0 1 0 0,1 0-1 0 0,-1-1 1 0 0,0 1-1 0 0,0-1 1 0 0,1 0-1 0 0,-1 0 1 0 0,0 0-1 0 0,-1 0 1 0 0,1 0-1 0 0,0 0 1 0 0,-1 0-1 0 0,1-1 1 0 0,-1 1-1 0 0,0-1 1 0 0,1 1-1 0 0,-1-1 1 0 0,0 1-1 0 0,-1-1 1 0 0,1 0-1 0 0,0-4 1 0 0,-1 7-16 0 0,0-1 0 0 0,0 1 1 0 0,0-1-1 0 0,0 1 0 0 0,0-1 0 0 0,0 1 0 0 0,0-1 1 0 0,0 1-1 0 0,0-1 0 0 0,0 1 0 0 0,0-1 0 0 0,0 1 1 0 0,-1-1-1 0 0,1 1 0 0 0,0-1 0 0 0,0 1 0 0 0,-1 0 1 0 0,1-1-1 0 0,0 1 0 0 0,-1-1 0 0 0,1 1 1 0 0,0 0-1 0 0,-1-1 0 0 0,1 1 0 0 0,-1 0 0 0 0,1-1 1 0 0,0 1-1 0 0,-1 0 0 0 0,1 0 0 0 0,-1-1 0 0 0,-17 3-1171 0 0,-17 17-3193 0 0,27-12 2680 0 0</inkml:trace>
+  <inkml:trace contextRef="#ctx0" brushRef="#br0" timeOffset="8040.3">3146 323 288 0 0,'0'0'1288'0'0,"-9"-7"3628"0"0,8 14-4679 0 0,-1-1 0 0 0,1 0 0 0 0,0 0 0 0 0,1 0 0 0 0,0 10 0 0 0,0-9-159 0 0,-2 3 18 0 0,0 5 19 0 0,0-1-1 0 0,1 0 0 0 0,1 20 0 0 0,1-29-91 0 0,-1 0 0 0 0,2 0 1 0 0,-1 0-1 0 0,0 0 0 0 0,1 0 0 0 0,0 0 0 0 0,0 0 1 0 0,1 0-1 0 0,-1-1 0 0 0,1 1 0 0 0,6 7 0 0 0,-4-6 0 0 0,-1 0 0 0 0,0 1 0 0 0,-1-1 0 0 0,0 1 0 0 0,0 0 0 0 0,0 0 0 0 0,2 10 0 0 0,-4-13-14 0 0,0 0 0 0 0,0 0 1 0 0,-1 0-1 0 0,1 0 0 0 0,-1 0 0 0 0,0 0 0 0 0,0 0 0 0 0,0 0 1 0 0,0 0-1 0 0,-1 0 0 0 0,0 0 0 0 0,0 0 0 0 0,0 0 1 0 0,0 0-1 0 0,-3 5 0 0 0,-9-6 270 0 0</inkml:trace>
+</inkml:ink>
+</file>
+
+<file path=customXml/item3.xml><?xml version="1.0" encoding="utf-8"?>
+<p:properties xmlns:p="http://schemas.microsoft.com/office/2006/metadata/properties" xmlns:xsi="http://www.w3.org/2001/XMLSchema-instance" xmlns:pc="http://schemas.microsoft.com/office/infopath/2007/PartnerControls">
+  <documentManagement/>
+</p:properties>
+</file>
+
+<file path=customXml/item4.xml><?xml version="1.0" encoding="utf-8"?>
+<b:Sources xmlns:b="http://schemas.openxmlformats.org/officeDocument/2006/bibliography" xmlns="http://schemas.openxmlformats.org/officeDocument/2006/bibliography" SelectedStyle="\APASixthEditionOfficeOnline.xsl" StyleName="APA" Version="6">
+  <b:Source>
+    <b:Tag>Ric17</b:Tag>
+    <b:SourceType>ArticleInAPeriodical</b:SourceType>
+    <b:Guid>{BBCE18EC-6D82-4F83-B9E5-AE18A37CB371}</b:Guid>
+    <b:Author>
+      <b:Author>
+        <b:NameList>
+          <b:Person>
+            <b:Last>Walter</b:Last>
+            <b:First>Richard</b:First>
+          </b:Person>
+        </b:NameList>
+      </b:Author>
+    </b:Author>
+    <b:Title>Netzwerktechnik und die Wichtigkeit in einer mordernen Gesellschaft</b:Title>
+    <b:Year>2017</b:Year>
+    <b:Pages>15-18</b:Pages>
+    <b:PeriodicalTitle>Zeitschrift für Technik Nr. 2</b:PeriodicalTitle>
+    <b:Month>März</b:Month>
+    <b:RefOrder>2</b:RefOrder>
+  </b:Source>
+  <b:Source>
+    <b:Tag>Lux</b:Tag>
+    <b:SourceType>InternetSite</b:SourceType>
+    <b:Guid>{6D23B1A0-C6E5-4919-9A01-7DED1C3E53B9}</b:Guid>
+    <b:Title>Luxonis</b:Title>
+    <b:LCID>de-DE</b:LCID>
+    <b:Author>
+      <b:Author>
+        <b:Corporate>Luxonis</b:Corporate>
+      </b:Author>
+    </b:Author>
+    <b:URL>https://www.luxonis.com</b:URL>
+    <b:RefOrder>1</b:RefOrder>
+  </b:Source>
+</b:Sources>
+</file>
+
+<file path=customXml/item5.xml><?xml version="1.0" encoding="utf-8"?>
+<inkml:ink xmlns:inkml="http://www.w3.org/2003/InkML">
+  <inkml:definitions>
+    <inkml:context xml:id="ctx0">
+      <inkml:inkSource xml:id="inkSrc0">
+        <inkml:traceFormat>
+          <inkml:channel name="X" type="integer" min="-2.14748E9" max="2.14748E9" units="cm"/>
+          <inkml:channel name="Y" type="integer" min="-2.14748E9" max="2.14748E9" units="cm"/>
+          <inkml:channel name="F" type="integer" max="32767" units="dev"/>
+          <inkml:channel name="OA" type="integer" max="360" units="deg"/>
+          <inkml:channel name="OE" type="integer" max="90" units="deg"/>
+        </inkml:traceFormat>
+        <inkml:channelProperties>
+          <inkml:channelProperty channel="X" name="resolution" value="1000" units="1/cm"/>
+          <inkml:channelProperty channel="Y" name="resolution" value="1000" units="1/cm"/>
+          <inkml:channelProperty channel="F" name="resolution" value="0" units="1/dev"/>
+          <inkml:channelProperty channel="OA" name="resolution" value="1000" units="1/deg"/>
+          <inkml:channelProperty channel="OE" name="resolution" value="1000" units="1/deg"/>
+        </inkml:channelProperties>
+      </inkml:inkSource>
+      <inkml:timestamp xml:id="ts0" timeString="2025-06-10T16:08:50.568"/>
+    </inkml:context>
+    <inkml:brush xml:id="br0">
+      <inkml:brushProperty name="width" value="0.05" units="cm"/>
+      <inkml:brushProperty name="height" value="0.05" units="cm"/>
+      <inkml:brushProperty name="color" value="#E71224"/>
+    </inkml:brush>
+  </inkml:definitions>
+  <inkml:trace contextRef="#ctx0" brushRef="#br0">1236 239 3217 0 0,'-18'-44'2449'0'0,"11"24"-2251"0"0,-2 1 0 0 0,-14-27 0 0 0,19 39-210 0 0,-1 0 0 0 0,0 1-1 0 0,0 0 1 0 0,-1-1 0 0 0,0 2 0 0 0,0-1-1 0 0,0 1 1 0 0,0 0 0 0 0,-14-8-1 0 0,8 6-57 0 0,-1 1 0 0 0,1 1 1 0 0,-1 0-1 0 0,0 0 0 0 0,0 1 0 0 0,0 1 0 0 0,0 0 0 0 0,-1 1 0 0 0,-22-1 0 0 0,19 4-190 0 0,0 0-1 0 0,0 1 1 0 0,0 1-1 0 0,1 0 1 0 0,-1 1-1 0 0,1 1 1 0 0,-21 9-1 0 0,-37 17-295 0 0,-131 76-1 0 0,173-87 985 0 0,0 2 0 0 0,2 1 0 0 0,1 2 0 0 0,1 0 0 0 0,1 2 0 0 0,-28 37 0 0 0,-16 22-328 0 0,-54 78 18 0 0,113-145-112 0 0,0 0 1 0 0,2 1-1 0 0,1 0 0 0 0,0 0 0 0 0,2 1 1 0 0,0 0-1 0 0,-5 27 0 0 0,4 3 6 0 0,3 0-1 0 0,1 0 0 0 0,3 0 1 0 0,2 1-1 0 0,2-1 1 0 0,13 62-1 0 0,-11-89 37 0 0,1-1 0 0 0,2 1 0 0 0,0-1 0 0 0,1-1 0 0 0,1 0 0 0 0,2 0-1 0 0,0-1 1 0 0,1-1 0 0 0,1 0 0 0 0,1 0 0 0 0,25 25 0 0 0,-31-38 8 0 0,1 0 0 0 0,0-1 0 0 0,0 0 0 0 0,1-1-1 0 0,0 0 1 0 0,0 0 0 0 0,0-1 0 0 0,0 0 0 0 0,1-1 0 0 0,-1-1 0 0 0,1 0 0 0 0,23 1 0 0 0,0-2-27 0 0,-1-1 0 0 0,0-2 0 0 0,43-8 0 0 0,15-10 179 0 0,-1-4 0 0 0,111-46 0 0 0,-162 55-168 0 0,0 1-21 0 0,5-1 26 0 0,-2-3-1 0 0,45-23 0 0 0,-67 26 22 0 0,-1 0 0 0 0,0-2-1 0 0,-2 0 1 0 0,0-1 0 0 0,-1-1 0 0 0,0-1 0 0 0,-2 0-1 0 0,22-37 1 0 0,-28 39-39 0 0,0 1 1 0 0,-1-1-1 0 0,-1-1 0 0 0,-1 0 1 0 0,-1 1-1 0 0,0-2 0 0 0,-2 1 0 0 0,0 0 1 0 0,0-25-1 0 0,-2-13 167 0 0,-14-108-1 0 0,10 143-149 0 0,-1 0-1 0 0,0 1 1 0 0,-2-1-1 0 0,-1 1 1 0 0,-1 0-1 0 0,0 1 1 0 0,-1 0-1 0 0,-23-35 0 0 0,22 41 15 0 0,-1 0 0 0 0,0 0-1 0 0,-1 1 1 0 0,-1 0 0 0 0,0 1-1 0 0,0 1 1 0 0,-1 0 0 0 0,-1 1-1 0 0,0 0 1 0 0,0 1 0 0 0,-25-10-1 0 0,15 9-505 0 0,-1 1-1 0 0,0 2 1 0 0,0 0 0 0 0,-49-5-1 0 0,41 10-389 0 0</inkml:trace>
+</inkml:ink>
+</file>
+
 <file path=customXml/item6.xml><?xml version="1.0" encoding="utf-8"?>
 <b:Sources xmlns:b="http://schemas.openxmlformats.org/officeDocument/2006/bibliography" xmlns="http://schemas.openxmlformats.org/officeDocument/2006/bibliography" SelectedStyle="\APASixthEditionOfficeOnline.xsl" StyleName="APA" Version="6">
   <b:Source>
@@ -32366,79 +32292,15 @@
 </file>
 
 <file path=customXml/item7.xml><?xml version="1.0" encoding="utf-8"?>
-<b:Sources xmlns:b="http://schemas.openxmlformats.org/officeDocument/2006/bibliography" xmlns="http://schemas.openxmlformats.org/officeDocument/2006/bibliography" SelectedStyle="\APASixthEditionOfficeOnline.xsl" StyleName="APA" Version="6">
-  <b:Source>
-    <b:Tag>Ric17</b:Tag>
-    <b:SourceType>ArticleInAPeriodical</b:SourceType>
-    <b:Guid>{BBCE18EC-6D82-4F83-B9E5-AE18A37CB371}</b:Guid>
-    <b:Author>
-      <b:Author>
-        <b:NameList>
-          <b:Person>
-            <b:Last>Walter</b:Last>
-            <b:First>Richard</b:First>
-          </b:Person>
-        </b:NameList>
-      </b:Author>
-    </b:Author>
-    <b:Title>Netzwerktechnik und die Wichtigkeit in einer mordernen Gesellschaft</b:Title>
-    <b:Year>2017</b:Year>
-    <b:Pages>15-18</b:Pages>
-    <b:PeriodicalTitle>Zeitschrift für Technik Nr. 2</b:PeriodicalTitle>
-    <b:Month>März</b:Month>
-    <b:RefOrder>2</b:RefOrder>
-  </b:Source>
-  <b:Source>
-    <b:Tag>Lux</b:Tag>
-    <b:SourceType>InternetSite</b:SourceType>
-    <b:Guid>{6D23B1A0-C6E5-4919-9A01-7DED1C3E53B9}</b:Guid>
-    <b:Title>Luxonis</b:Title>
-    <b:LCID>de-DE</b:LCID>
-    <b:Author>
-      <b:Author>
-        <b:Corporate>Luxonis</b:Corporate>
-      </b:Author>
-    </b:Author>
-    <b:URL>https://www.luxonis.com</b:URL>
-    <b:RefOrder>1</b:RefOrder>
-  </b:Source>
-</b:Sources>
+<?mso-contentType ?>
+<FormTemplates xmlns="http://schemas.microsoft.com/sharepoint/v3/contenttype/forms">
+  <Display>DocumentLibraryForm</Display>
+  <Edit>DocumentLibraryForm</Edit>
+  <New>DocumentLibraryForm</New>
+</FormTemplates>
 </file>
 
 <file path=customXml/itemProps1.xml><?xml version="1.0" encoding="utf-8"?>
-<ds:datastoreItem xmlns:ds="http://schemas.openxmlformats.org/officeDocument/2006/customXml" ds:itemID="{CE199482-6225-420D-8982-84EA3B0C446C}">
-  <ds:schemaRefs>
-    <ds:schemaRef ds:uri="http://schemas.microsoft.com/office/2006/metadata/properties"/>
-    <ds:schemaRef ds:uri="http://schemas.microsoft.com/office/infopath/2007/PartnerControls"/>
-  </ds:schemaRefs>
-</ds:datastoreItem>
-</file>
-
-<file path=customXml/itemProps2.xml><?xml version="1.0" encoding="utf-8"?>
-<ds:datastoreItem xmlns:ds="http://schemas.openxmlformats.org/officeDocument/2006/customXml" ds:itemID="{6A655C0C-F4A3-4931-9F7F-84CBD61DCE8F}">
-  <ds:schemaRefs>
-    <ds:schemaRef ds:uri="http://schemas.microsoft.com/sharepoint/v3/contenttype/forms"/>
-  </ds:schemaRefs>
-</ds:datastoreItem>
-</file>
-
-<file path=customXml/itemProps3.xml><?xml version="1.0" encoding="utf-8"?>
-<ds:datastoreItem xmlns:ds="http://schemas.openxmlformats.org/officeDocument/2006/customXml" ds:itemID="{4B023D59-82BC-4D0F-A651-C98E01C1F15C}">
-  <ds:schemaRefs>
-    <ds:schemaRef ds:uri="http://www.w3.org/2003/InkML"/>
-  </ds:schemaRefs>
-</ds:datastoreItem>
-</file>
-
-<file path=customXml/itemProps4.xml><?xml version="1.0" encoding="utf-8"?>
-<ds:datastoreItem xmlns:ds="http://schemas.openxmlformats.org/officeDocument/2006/customXml" ds:itemID="{4B023D59-82BC-4D0F-A651-C98E01C1F15C}">
-  <ds:schemaRefs>
-    <ds:schemaRef ds:uri="http://www.w3.org/2003/InkML"/>
-  </ds:schemaRefs>
-</ds:datastoreItem>
-</file>
-
-<file path=customXml/itemProps5.xml><?xml version="1.0" encoding="utf-8"?>
 <ds:datastoreItem xmlns:ds="http://schemas.openxmlformats.org/officeDocument/2006/customXml" ds:itemID="{4B023D59-82BC-4D0F-A651-C98E01C1F15C}">
   <ds:schemaRefs>
     <ds:schemaRef ds:uri="http://schemas.microsoft.com/office/2006/metadata/contentType"/>
@@ -32456,7 +32318,24 @@
 </ds:datastoreItem>
 </file>
 
-<file path=customXml/itemProps6.xml><?xml version="1.0" encoding="utf-8"?>
+<file path=customXml/itemProps2.xml><?xml version="1.0" encoding="utf-8"?>
+<ds:datastoreItem xmlns:ds="http://schemas.openxmlformats.org/officeDocument/2006/customXml" ds:itemID="{4B023D59-82BC-4D0F-A651-C98E01C1F15C}">
+  <ds:schemaRefs>
+    <ds:schemaRef ds:uri="http://www.w3.org/2003/InkML"/>
+  </ds:schemaRefs>
+</ds:datastoreItem>
+</file>
+
+<file path=customXml/itemProps3.xml><?xml version="1.0" encoding="utf-8"?>
+<ds:datastoreItem xmlns:ds="http://schemas.openxmlformats.org/officeDocument/2006/customXml" ds:itemID="{CE199482-6225-420D-8982-84EA3B0C446C}">
+  <ds:schemaRefs>
+    <ds:schemaRef ds:uri="http://schemas.microsoft.com/office/2006/metadata/properties"/>
+    <ds:schemaRef ds:uri="http://schemas.microsoft.com/office/infopath/2007/PartnerControls"/>
+  </ds:schemaRefs>
+</ds:datastoreItem>
+</file>
+
+<file path=customXml/itemProps4.xml><?xml version="1.0" encoding="utf-8"?>
 <ds:datastoreItem xmlns:ds="http://schemas.openxmlformats.org/officeDocument/2006/customXml" ds:itemID="{388DC5E6-2739-4AA0-B31E-B1557B724BE3}">
   <ds:schemaRefs>
     <ds:schemaRef ds:uri="http://schemas.openxmlformats.org/officeDocument/2006/bibliography"/>
@@ -32464,10 +32343,26 @@
 </ds:datastoreItem>
 </file>
 
-<file path=customXml/itemProps7.xml><?xml version="1.0" encoding="utf-8"?>
+<file path=customXml/itemProps5.xml><?xml version="1.0" encoding="utf-8"?>
+<ds:datastoreItem xmlns:ds="http://schemas.openxmlformats.org/officeDocument/2006/customXml" ds:itemID="{4B023D59-82BC-4D0F-A651-C98E01C1F15C}">
+  <ds:schemaRefs>
+    <ds:schemaRef ds:uri="http://www.w3.org/2003/InkML"/>
+  </ds:schemaRefs>
+</ds:datastoreItem>
+</file>
+
+<file path=customXml/itemProps6.xml><?xml version="1.0" encoding="utf-8"?>
 <ds:datastoreItem xmlns:ds="http://schemas.openxmlformats.org/officeDocument/2006/customXml" ds:itemID="{178CF787-86F4-4FA3-9771-51388ADE129B}">
   <ds:schemaRefs>
     <ds:schemaRef ds:uri="http://schemas.openxmlformats.org/officeDocument/2006/bibliography"/>
   </ds:schemaRefs>
 </ds:datastoreItem>
+</file>
+
+<file path=customXml/itemProps7.xml><?xml version="1.0" encoding="utf-8"?>
+<ds:datastoreItem xmlns:ds="http://schemas.openxmlformats.org/officeDocument/2006/customXml" ds:itemID="{6A655C0C-F4A3-4931-9F7F-84CBD61DCE8F}">
+  <ds:schemaRefs>
+    <ds:schemaRef ds:uri="http://schemas.microsoft.com/sharepoint/v3/contenttype/forms"/>
+  </ds:schemaRefs>
+</ds:datastoreItem>
 </file>
</xml_diff>